<commit_message>
docs: simplify auth overview and clarify external IDP flows
Signed-off-by: Everett Williams <everett@medplum.com>
</commit_message>
<xml_diff>
--- a/packages/docs/static/decision-guides/authentication.docx
+++ b/packages/docs/static/decision-guides/authentication.docx
@@ -11,18 +11,18 @@
           <wp:inline>
             <wp:extent cx="5943600" cy="1289649"/>
             <wp:effectExtent b="0" l="0" r="0" t="0"/>
-            <wp:docPr descr="Medplum" title="" id="21" name="Picture"/>
+            <wp:docPr descr="Medplum" title="" id="10" name="Picture"/>
             <a:graphic>
               <a:graphicData uri="http://schemas.openxmlformats.org/drawingml/2006/picture">
                 <pic:pic>
                   <pic:nvPicPr>
-                    <pic:cNvPr descr="medplum-wordmark-grape.png" id="22" name="Picture"/>
+                    <pic:cNvPr descr="medplum-wordmark-grape.png" id="11" name="Picture"/>
                     <pic:cNvPicPr>
                       <a:picLocks noChangeArrowheads="1" noChangeAspect="1"/>
                     </pic:cNvPicPr>
                   </pic:nvPicPr>
                   <pic:blipFill>
-                    <a:blip r:embed="rId20"/>
+                    <a:blip r:embed="rId9"/>
                     <a:stretch>
                       <a:fillRect/>
                     </a:stretch>
@@ -49,7 +49,7 @@
         </w:drawing>
       </w:r>
     </w:p>
-    <w:bookmarkStart w:id="70" w:name="authentication-decision-guide"/>
+    <w:bookmarkStart w:id="56" w:name="authentication-decision-guide"/>
     <w:p>
       <w:pPr>
         <w:pStyle w:val="Heading1"/>
@@ -72,94 +72,94 @@
       </w:pPr>
       <w:r>
         <w:rPr>
+          <w:i/>
           <w:iCs/>
+        </w:rPr>
+        <w:t xml:space="preserve">Companion to the</w:t>
+      </w:r>
+      <w:r>
+        <w:rPr>
           <w:i/>
-        </w:rPr>
-        <w:t xml:space="preserve">Companion to the</w:t>
-      </w:r>
-      <w:r>
-        <w:rPr>
           <w:iCs/>
-          <w:i/>
-        </w:rPr>
-        <w:t xml:space="preserve"> </w:t>
-      </w:r>
-      <w:hyperlink r:id="rId23">
+        </w:rPr>
+        <w:t xml:space="preserve"> </w:t>
+      </w:r>
+      <w:hyperlink r:id="rId12">
         <w:r>
           <w:rPr>
             <w:rStyle w:val="Hyperlink"/>
+            <w:i/>
             <w:iCs/>
-            <w:i/>
           </w:rPr>
           <w:t xml:space="preserve">Authentication</w:t>
         </w:r>
       </w:hyperlink>
       <w:r>
         <w:rPr>
+          <w:i/>
           <w:iCs/>
+        </w:rPr>
+        <w:t xml:space="preserve"> </w:t>
+      </w:r>
+      <w:r>
+        <w:rPr>
           <w:i/>
-        </w:rPr>
-        <w:t xml:space="preserve"> </w:t>
-      </w:r>
-      <w:r>
-        <w:rPr>
           <w:iCs/>
+        </w:rPr>
+        <w:t xml:space="preserve">and</w:t>
+      </w:r>
+      <w:r>
+        <w:rPr>
           <w:i/>
-        </w:rPr>
-        <w:t xml:space="preserve">and</w:t>
-      </w:r>
-      <w:r>
-        <w:rPr>
           <w:iCs/>
-          <w:i/>
-        </w:rPr>
-        <w:t xml:space="preserve"> </w:t>
-      </w:r>
-      <w:hyperlink r:id="rId24">
+        </w:rPr>
+        <w:t xml:space="preserve"> </w:t>
+      </w:r>
+      <w:hyperlink r:id="rId13">
         <w:r>
           <w:rPr>
             <w:rStyle w:val="Hyperlink"/>
+            <w:i/>
             <w:iCs/>
-            <w:i/>
           </w:rPr>
           <w:t xml:space="preserve">User Management</w:t>
         </w:r>
       </w:hyperlink>
       <w:r>
         <w:rPr>
+          <w:i/>
           <w:iCs/>
+        </w:rPr>
+        <w:t xml:space="preserve"> </w:t>
+      </w:r>
+      <w:r>
+        <w:rPr>
           <w:i/>
-        </w:rPr>
-        <w:t xml:space="preserve"> </w:t>
-      </w:r>
-      <w:r>
-        <w:rPr>
           <w:iCs/>
+        </w:rPr>
+        <w:t xml:space="preserve">docs. Builds on</w:t>
+      </w:r>
+      <w:r>
+        <w:rPr>
           <w:i/>
-        </w:rPr>
-        <w:t xml:space="preserve">docs. Builds on</w:t>
-      </w:r>
-      <w:r>
-        <w:rPr>
           <w:iCs/>
-          <w:i/>
-        </w:rPr>
-        <w:t xml:space="preserve"> </w:t>
-      </w:r>
-      <w:hyperlink r:id="rId25">
+        </w:rPr>
+        <w:t xml:space="preserve"> </w:t>
+      </w:r>
+      <w:hyperlink r:id="rId14">
         <w:r>
           <w:rPr>
             <w:rStyle w:val="Hyperlink"/>
+            <w:i/>
             <w:iCs/>
-            <w:i/>
           </w:rPr>
           <w:t xml:space="preserve">Identity Management: A Practical Guide</w:t>
         </w:r>
       </w:hyperlink>
       <w:r>
         <w:rPr>
+          <w:i/>
           <w:iCs/>
-          <w:i/>
         </w:rPr>
         <w:t xml:space="preserve">.</w:t>
       </w:r>
@@ -176,21 +176,21 @@
       </w:r>
       <w:r>
         <w:rPr>
+          <w:b/>
           <w:bCs/>
+        </w:rPr>
+        <w:t xml:space="preserve">who a user is</w:t>
+      </w:r>
+      <w:r>
+        <w:t xml:space="preserve">. Authorization determines</w:t>
+      </w:r>
+      <w:r>
+        <w:t xml:space="preserve"> </w:t>
+      </w:r>
+      <w:r>
+        <w:rPr>
           <w:b/>
-        </w:rPr>
-        <w:t xml:space="preserve">who a user is</w:t>
-      </w:r>
-      <w:r>
-        <w:t xml:space="preserve">. Authorization determines</w:t>
-      </w:r>
-      <w:r>
-        <w:t xml:space="preserve"> </w:t>
-      </w:r>
-      <w:r>
-        <w:rPr>
           <w:bCs/>
-          <w:b/>
         </w:rPr>
         <w:t xml:space="preserve">what that user can access</w:t>
       </w:r>
@@ -200,7 +200,7 @@
       <w:r>
         <w:t xml:space="preserve"> </w:t>
       </w:r>
-      <w:hyperlink r:id="rId26">
+      <w:hyperlink r:id="rId15">
         <w:r>
           <w:rPr>
             <w:rStyle w:val="Hyperlink"/>
@@ -220,136 +220,232 @@
         <w:pStyle w:val="BodyText"/>
       </w:pPr>
       <w:r>
-        <w:t xml:space="preserve">Your staff, partner clinicians, patients, and caregivers may need different approaches. Identify those populations and any existing identity systems before making the three decisions below.</w:t>
-      </w:r>
-    </w:p>
-    <w:bookmarkStart w:id="32" w:name="Xa2fe6bcae4b21083a9372930aac9d896e240e22"/>
-    <w:p>
-      <w:pPr>
-        <w:pStyle w:val="Heading2"/>
-      </w:pPr>
-      <w:r>
-        <w:t xml:space="preserve">Decision 1: What is your user identification strategy?</w:t>
-      </w:r>
-    </w:p>
-    <w:p>
-      <w:pPr>
-        <w:pStyle w:val="FirstParagraph"/>
-      </w:pPr>
-      <w:r>
-        <w:t xml:space="preserve">Choose the identifier that connects a login to the correct Medplum account. This is separate from choosing an identity provider: an external IDP can still use email matching.</w:t>
-      </w:r>
-    </w:p>
-    <w:p>
-      <w:pPr>
-        <w:pStyle w:val="BodyText"/>
-      </w:pPr>
-      <w:r>
-        <w:rPr>
-          <w:bCs/>
-          <w:b/>
-        </w:rPr>
-        <w:t xml:space="preserve">Questions:</w:t>
-      </w:r>
-      <w:r>
-        <w:t xml:space="preserve"> </w:t>
-      </w:r>
-      <w:r>
-        <w:t xml:space="preserve">Is email unique for each user? How often does it change? Can different people share a contact email? Do you already have a stable identifier from an IDP?</w:t>
-      </w:r>
-    </w:p>
-    <w:bookmarkStart w:id="27" w:name="option-a-email-matching"/>
-    <w:p>
-      <w:pPr>
-        <w:pStyle w:val="Heading3"/>
-      </w:pPr>
-      <w:r>
-        <w:t xml:space="preserve">Option A: Email matching</w:t>
-      </w:r>
-    </w:p>
-    <w:p>
-      <w:pPr>
-        <w:pStyle w:val="FirstParagraph"/>
-      </w:pPr>
-      <w:r>
-        <w:t xml:space="preserve">Medplum uses email matching by default, including when authenticating through an external IDP.</w:t>
-      </w:r>
-    </w:p>
-    <w:p>
-      <w:pPr>
+        <w:t xml:space="preserve">Your staff, partner clinicians, patients, and caregivers may need different approaches. Identify those populations and any existing identity systems, then work through these three decisions in order for each population:</w:t>
+      </w:r>
+    </w:p>
+    <w:p>
+      <w:pPr>
+        <w:pStyle w:val="Compact"/>
         <w:numPr>
           <w:ilvl w:val="0"/>
           <w:numId w:val="1001"/>
         </w:numPr>
-        <w:pStyle w:val="Compact"/>
-      </w:pPr>
-      <w:r>
-        <w:rPr>
+      </w:pPr>
+      <w:hyperlink w:anchor="Xa2fe6bcae4b21083a9372930aac9d896e240e22">
+        <w:r>
+          <w:rPr>
+            <w:rStyle w:val="Hyperlink"/>
+            <w:b/>
+            <w:bCs/>
+          </w:rPr>
+          <w:t xml:space="preserve">User identification</w:t>
+        </w:r>
+      </w:hyperlink>
+      <w:r>
+        <w:rPr>
+          <w:b/>
           <w:bCs/>
-          <w:b/>
-        </w:rPr>
-        <w:t xml:space="preserve">Advantages:</w:t>
-      </w:r>
-    </w:p>
-    <w:p>
-      <w:pPr>
-        <w:numPr>
-          <w:ilvl w:val="1"/>
-          <w:numId w:val="1002"/>
-        </w:numPr>
-        <w:pStyle w:val="Compact"/>
-      </w:pPr>
-      <w:r>
-        <w:t xml:space="preserve">Simple to configure when each person has a distinct email and changes are infrequent.</w:t>
-      </w:r>
-    </w:p>
-    <w:p>
-      <w:pPr>
-        <w:numPr>
-          <w:ilvl w:val="1"/>
-          <w:numId w:val="1002"/>
-        </w:numPr>
-        <w:pStyle w:val="Compact"/>
-      </w:pPr>
-      <w:r>
-        <w:t xml:space="preserve">Works with external IDPs as well as Medplum-managed authentication.</w:t>
-      </w:r>
-    </w:p>
-    <w:p>
-      <w:pPr>
+        </w:rPr>
+        <w:t xml:space="preserve">:</w:t>
+      </w:r>
+      <w:r>
+        <w:t xml:space="preserve"> </w:t>
+      </w:r>
+      <w:r>
+        <w:t xml:space="preserve">What identifier connects the login to the correct Medplum account: email or an external ID?</w:t>
+      </w:r>
+    </w:p>
+    <w:p>
+      <w:pPr>
+        <w:pStyle w:val="Compact"/>
         <w:numPr>
           <w:ilvl w:val="0"/>
           <w:numId w:val="1001"/>
         </w:numPr>
-        <w:pStyle w:val="Compact"/>
-      </w:pPr>
-      <w:r>
-        <w:rPr>
+      </w:pPr>
+      <w:hyperlink w:anchor="Xe73c9a75b182ec0997b5c83f0af59fcaf46a51e">
+        <w:r>
+          <w:rPr>
+            <w:rStyle w:val="Hyperlink"/>
+            <w:b/>
+            <w:bCs/>
+          </w:rPr>
+          <w:t xml:space="preserve">Identity provider</w:t>
+        </w:r>
+      </w:hyperlink>
+      <w:r>
+        <w:rPr>
+          <w:b/>
           <w:bCs/>
+        </w:rPr>
+        <w:t xml:space="preserve">:</w:t>
+      </w:r>
+      <w:r>
+        <w:t xml:space="preserve"> </w:t>
+      </w:r>
+      <w:r>
+        <w:t xml:space="preserve">Who manages credentials, and how do users reach the correct provider?</w:t>
+      </w:r>
+    </w:p>
+    <w:p>
+      <w:pPr>
+        <w:pStyle w:val="Compact"/>
+        <w:numPr>
+          <w:ilvl w:val="0"/>
+          <w:numId w:val="1001"/>
+        </w:numPr>
+      </w:pPr>
+      <w:hyperlink w:anchor="Xe83cbdd7272abc64477498a6881e4d71cc6d800">
+        <w:r>
+          <w:rPr>
+            <w:rStyle w:val="Hyperlink"/>
+            <w:b/>
+            <w:bCs/>
+          </w:rPr>
+          <w:t xml:space="preserve">Token flow</w:t>
+        </w:r>
+      </w:hyperlink>
+      <w:r>
+        <w:rPr>
           <w:b/>
-        </w:rPr>
-        <w:t xml:space="preserve">Tradeoffs:</w:t>
-      </w:r>
-    </w:p>
-    <w:p>
-      <w:pPr>
+          <w:bCs/>
+        </w:rPr>
+        <w:t xml:space="preserve">:</w:t>
+      </w:r>
+      <w:r>
+        <w:t xml:space="preserve"> </w:t>
+      </w:r>
+      <w:r>
+        <w:t xml:space="preserve">How does the application obtain Medplum credentials, and will it use them in the client or backend?</w:t>
+      </w:r>
+    </w:p>
+    <w:bookmarkStart w:id="21" w:name="Xa2fe6bcae4b21083a9372930aac9d896e240e22"/>
+    <w:p>
+      <w:pPr>
+        <w:pStyle w:val="Heading2"/>
+      </w:pPr>
+      <w:r>
+        <w:t xml:space="preserve">Decision 1: What is your user identification strategy?</w:t>
+      </w:r>
+    </w:p>
+    <w:p>
+      <w:pPr>
+        <w:pStyle w:val="FirstParagraph"/>
+      </w:pPr>
+      <w:r>
+        <w:t xml:space="preserve">Choose the identifier that connects a login to the correct Medplum account. This is separate from choosing an identity provider: an external IDP can still use email matching.</w:t>
+      </w:r>
+    </w:p>
+    <w:p>
+      <w:pPr>
+        <w:pStyle w:val="BodyText"/>
+      </w:pPr>
+      <w:r>
+        <w:rPr>
+          <w:b/>
+          <w:bCs/>
+        </w:rPr>
+        <w:t xml:space="preserve">Questions:</w:t>
+      </w:r>
+      <w:r>
+        <w:t xml:space="preserve"> </w:t>
+      </w:r>
+      <w:r>
+        <w:t xml:space="preserve">Is email unique for each user? How often does it change? Can different people share a contact email? Do you already have a stable identifier from an IDP?</w:t>
+      </w:r>
+    </w:p>
+    <w:bookmarkStart w:id="16" w:name="option-a-email-matching"/>
+    <w:p>
+      <w:pPr>
+        <w:pStyle w:val="Heading3"/>
+      </w:pPr>
+      <w:r>
+        <w:t xml:space="preserve">Option A: Email matching</w:t>
+      </w:r>
+    </w:p>
+    <w:p>
+      <w:pPr>
+        <w:pStyle w:val="FirstParagraph"/>
+      </w:pPr>
+      <w:r>
+        <w:t xml:space="preserve">Medplum uses email matching by default, including when authenticating through an external IDP.</w:t>
+      </w:r>
+    </w:p>
+    <w:p>
+      <w:pPr>
+        <w:pStyle w:val="Compact"/>
+        <w:numPr>
+          <w:ilvl w:val="0"/>
+          <w:numId w:val="1002"/>
+        </w:numPr>
+      </w:pPr>
+      <w:r>
+        <w:rPr>
+          <w:b/>
+          <w:bCs/>
+        </w:rPr>
+        <w:t xml:space="preserve">Advantages:</w:t>
+      </w:r>
+    </w:p>
+    <w:p>
+      <w:pPr>
+        <w:pStyle w:val="Compact"/>
         <w:numPr>
           <w:ilvl w:val="1"/>
           <w:numId w:val="1003"/>
         </w:numPr>
-        <w:pStyle w:val="Compact"/>
-      </w:pPr>
-      <w:r>
-        <w:t xml:space="preserve">Email changes must also be reflected in the Medplum login account. Updating only the Patient or Practitioner contact email is insufficient.</w:t>
-      </w:r>
-    </w:p>
-    <w:p>
-      <w:pPr>
+      </w:pPr>
+      <w:r>
+        <w:t xml:space="preserve">Simple to configure when each person has a distinct email and changes are infrequent.</w:t>
+      </w:r>
+    </w:p>
+    <w:p>
+      <w:pPr>
+        <w:pStyle w:val="Compact"/>
         <w:numPr>
           <w:ilvl w:val="1"/>
           <w:numId w:val="1003"/>
         </w:numPr>
-        <w:pStyle w:val="Compact"/>
+      </w:pPr>
+      <w:r>
+        <w:t xml:space="preserve">Works with external IDPs as well as Medplum-managed authentication.</w:t>
+      </w:r>
+    </w:p>
+    <w:p>
+      <w:pPr>
+        <w:pStyle w:val="Compact"/>
+        <w:numPr>
+          <w:ilvl w:val="0"/>
+          <w:numId w:val="1002"/>
+        </w:numPr>
+      </w:pPr>
+      <w:r>
+        <w:rPr>
+          <w:b/>
+          <w:bCs/>
+        </w:rPr>
+        <w:t xml:space="preserve">Tradeoffs:</w:t>
+      </w:r>
+    </w:p>
+    <w:p>
+      <w:pPr>
+        <w:pStyle w:val="Compact"/>
+        <w:numPr>
+          <w:ilvl w:val="1"/>
+          <w:numId w:val="1004"/>
+        </w:numPr>
+      </w:pPr>
+      <w:r>
+        <w:t xml:space="preserve">Email changes must also be reflected in the Medplum login account. Updating only the Patient or Practitioner contact email is insufficient.</w:t>
+      </w:r>
+    </w:p>
+    <w:p>
+      <w:pPr>
+        <w:pStyle w:val="Compact"/>
+        <w:numPr>
+          <w:ilvl w:val="1"/>
+          <w:numId w:val="1004"/>
+        </w:numPr>
       </w:pPr>
       <w:r>
         <w:t xml:space="preserve">Shared addresses cannot reliably distinguish separate people.</w:t>
@@ -357,128 +453,128 @@
     </w:p>
     <w:p>
       <w:pPr>
+        <w:pStyle w:val="Compact"/>
         <w:numPr>
           <w:ilvl w:val="0"/>
-          <w:numId w:val="1001"/>
-        </w:numPr>
-        <w:pStyle w:val="Compact"/>
-      </w:pPr>
-      <w:r>
-        <w:rPr>
+          <w:numId w:val="1002"/>
+        </w:numPr>
+      </w:pPr>
+      <w:r>
+        <w:rPr>
+          <w:b/>
           <w:bCs/>
+        </w:rPr>
+        <w:t xml:space="preserve">Best fit:</w:t>
+      </w:r>
+      <w:r>
+        <w:t xml:space="preserve"> </w:t>
+      </w:r>
+      <w:r>
+        <w:t xml:space="preserve">Applications with straightforward identity requirements and an owner for occasional account updates.</w:t>
+      </w:r>
+    </w:p>
+    <w:bookmarkEnd w:id="16"/>
+    <w:bookmarkStart w:id="17" w:name="option-b-external-id-matching"/>
+    <w:p>
+      <w:pPr>
+        <w:pStyle w:val="Heading3"/>
+      </w:pPr>
+      <w:r>
+        <w:t xml:space="preserve">Option B: External ID matching</w:t>
+      </w:r>
+    </w:p>
+    <w:p>
+      <w:pPr>
+        <w:pStyle w:val="FirstParagraph"/>
+      </w:pPr>
+      <w:r>
+        <w:t xml:space="preserve">Use the IDP’s subject identifier to connect the external identity to Medplum. Configure subject-based matching (</w:t>
+      </w:r>
+      <w:r>
+        <w:rPr>
+          <w:rStyle w:val="VerbatimChar"/>
+        </w:rPr>
+        <w:t xml:space="preserve">useSubject</w:t>
+      </w:r>
+      <w:r>
+        <w:t xml:space="preserve">) and provision the corresponding external ID.</w:t>
+      </w:r>
+    </w:p>
+    <w:p>
+      <w:pPr>
+        <w:pStyle w:val="Compact"/>
+        <w:numPr>
+          <w:ilvl w:val="0"/>
+          <w:numId w:val="1005"/>
+        </w:numPr>
+      </w:pPr>
+      <w:r>
+        <w:rPr>
           <w:b/>
-        </w:rPr>
-        <w:t xml:space="preserve">Best fit:</w:t>
-      </w:r>
-      <w:r>
-        <w:t xml:space="preserve"> </w:t>
-      </w:r>
-      <w:r>
-        <w:t xml:space="preserve">Applications with straightforward identity requirements and an owner for occasional account updates.</w:t>
-      </w:r>
-    </w:p>
-    <w:bookmarkEnd w:id="27"/>
-    <w:bookmarkStart w:id="28" w:name="option-b-external-id-matching"/>
-    <w:p>
-      <w:pPr>
-        <w:pStyle w:val="Heading3"/>
-      </w:pPr>
-      <w:r>
-        <w:t xml:space="preserve">Option B: External ID matching</w:t>
-      </w:r>
-    </w:p>
-    <w:p>
-      <w:pPr>
-        <w:pStyle w:val="FirstParagraph"/>
-      </w:pPr>
-      <w:r>
-        <w:t xml:space="preserve">Use the IDP’s subject identifier to connect the external identity to Medplum. Configure subject-based matching (</w:t>
-      </w:r>
-      <w:r>
-        <w:rPr>
-          <w:rStyle w:val="VerbatimChar"/>
-        </w:rPr>
-        <w:t xml:space="preserve">useSubject</w:t>
-      </w:r>
-      <w:r>
-        <w:t xml:space="preserve">) and provision the corresponding external ID.</w:t>
-      </w:r>
-    </w:p>
-    <w:p>
-      <w:pPr>
-        <w:numPr>
-          <w:ilvl w:val="0"/>
-          <w:numId w:val="1004"/>
-        </w:numPr>
-        <w:pStyle w:val="Compact"/>
-      </w:pPr>
-      <w:r>
-        <w:rPr>
           <w:bCs/>
-          <w:b/>
         </w:rPr>
         <w:t xml:space="preserve">Advantages:</w:t>
       </w:r>
     </w:p>
     <w:p>
       <w:pPr>
-        <w:numPr>
-          <w:ilvl w:val="1"/>
-          <w:numId w:val="1005"/>
-        </w:numPr>
-        <w:pStyle w:val="Compact"/>
-      </w:pPr>
-      <w:r>
-        <w:t xml:space="preserve">Identity can remain stable when a person’s email changes.</w:t>
-      </w:r>
-    </w:p>
-    <w:p>
-      <w:pPr>
-        <w:numPr>
-          <w:ilvl w:val="1"/>
-          <w:numId w:val="1005"/>
-        </w:numPr>
-        <w:pStyle w:val="Compact"/>
-      </w:pPr>
-      <w:r>
-        <w:t xml:space="preserve">Supports distinct identities independently of contact email.</w:t>
-      </w:r>
-    </w:p>
-    <w:p>
-      <w:pPr>
-        <w:numPr>
-          <w:ilvl w:val="0"/>
-          <w:numId w:val="1004"/>
-        </w:numPr>
-        <w:pStyle w:val="Compact"/>
-      </w:pPr>
-      <w:r>
-        <w:rPr>
-          <w:bCs/>
-          <w:b/>
-        </w:rPr>
-        <w:t xml:space="preserve">Tradeoffs:</w:t>
-      </w:r>
-    </w:p>
-    <w:p>
-      <w:pPr>
+        <w:pStyle w:val="Compact"/>
         <w:numPr>
           <w:ilvl w:val="1"/>
           <w:numId w:val="1006"/>
         </w:numPr>
-        <w:pStyle w:val="Compact"/>
-      </w:pPr>
-      <w:r>
-        <w:t xml:space="preserve">Provisioning and login must use the same mapping; changing IDPs requires a migration plan.</w:t>
-      </w:r>
-    </w:p>
-    <w:p>
-      <w:pPr>
+      </w:pPr>
+      <w:r>
+        <w:t xml:space="preserve">Identity can remain stable when a person’s email changes.</w:t>
+      </w:r>
+    </w:p>
+    <w:p>
+      <w:pPr>
+        <w:pStyle w:val="Compact"/>
         <w:numPr>
           <w:ilvl w:val="1"/>
           <w:numId w:val="1006"/>
         </w:numPr>
-        <w:pStyle w:val="Compact"/>
+      </w:pPr>
+      <w:r>
+        <w:t xml:space="preserve">Supports distinct identities independently of contact email.</w:t>
+      </w:r>
+    </w:p>
+    <w:p>
+      <w:pPr>
+        <w:pStyle w:val="Compact"/>
+        <w:numPr>
+          <w:ilvl w:val="0"/>
+          <w:numId w:val="1005"/>
+        </w:numPr>
+      </w:pPr>
+      <w:r>
+        <w:rPr>
+          <w:b/>
+          <w:bCs/>
+        </w:rPr>
+        <w:t xml:space="preserve">Tradeoffs:</w:t>
+      </w:r>
+    </w:p>
+    <w:p>
+      <w:pPr>
+        <w:pStyle w:val="Compact"/>
+        <w:numPr>
+          <w:ilvl w:val="1"/>
+          <w:numId w:val="1007"/>
+        </w:numPr>
+      </w:pPr>
+      <w:r>
+        <w:t xml:space="preserve">Provisioning and login must use the same mapping; changing IDPs requires a migration plan.</w:t>
+      </w:r>
+    </w:p>
+    <w:p>
+      <w:pPr>
+        <w:pStyle w:val="Compact"/>
+        <w:numPr>
+          <w:ilvl w:val="1"/>
+          <w:numId w:val="1007"/>
+        </w:numPr>
       </w:pPr>
       <w:r>
         <w:t xml:space="preserve">Subject values belong to a provider context. Do not assume they are globally unique across unrelated IDPs.</w:t>
@@ -486,16 +582,16 @@
     </w:p>
     <w:p>
       <w:pPr>
+        <w:pStyle w:val="Compact"/>
         <w:numPr>
           <w:ilvl w:val="0"/>
-          <w:numId w:val="1004"/>
-        </w:numPr>
-        <w:pStyle w:val="Compact"/>
-      </w:pPr>
-      <w:r>
-        <w:rPr>
+          <w:numId w:val="1005"/>
+        </w:numPr>
+      </w:pPr>
+      <w:r>
+        <w:rPr>
+          <w:b/>
           <w:bCs/>
-          <w:b/>
         </w:rPr>
         <w:t xml:space="preserve">Best fit:</w:t>
       </w:r>
@@ -514,8 +610,8 @@
         <w:t xml:space="preserve">Verify the exact subject format against the selected Medplum flow before bulk provisioning.</w:t>
       </w:r>
     </w:p>
-    <w:bookmarkEnd w:id="28"/>
-    <w:bookmarkStart w:id="31" w:name="recommended-approach"/>
+    <w:bookmarkEnd w:id="17"/>
+    <w:bookmarkStart w:id="20" w:name="recommended-approach"/>
     <w:p>
       <w:pPr>
         <w:pStyle w:val="Heading3"/>
@@ -528,9 +624,8 @@
       <w:tblPr>
         <w:tblStyle w:val="Table"/>
         <w:tblW w:w="9360" w:type="dxa"/>
+        <w:tblLayout w:type="fixed"/>
         <w:tblLook w:firstRow="1" w:lastRow="0" w:firstColumn="0" w:lastColumn="0" w:noHBand="0" w:noVBand="0" w:val="0020"/>
-        <w:jc w:val="start"/>
-        <w:tblLayout w:type="fixed"/>
       </w:tblPr>
       <w:tblGrid>
         <w:gridCol w:w="4638"/>
@@ -539,14 +634,13 @@
       <w:tr>
         <w:trPr>
           <w:cantSplit/>
-          <w:tblHeader w:val="true"/>
+          <w:tblHeader w:val="on"/>
         </w:trPr>
         <w:tc>
           <w:tcPr/>
           <w:p>
             <w:pPr>
               <w:pStyle w:val="Compact"/>
-              <w:jc w:val="left"/>
             </w:pPr>
             <w:r>
               <w:t xml:space="preserve">Situation</w:t>
@@ -558,7 +652,6 @@
           <w:p>
             <w:pPr>
               <w:pStyle w:val="Compact"/>
-              <w:jc w:val="left"/>
             </w:pPr>
             <w:r>
               <w:t xml:space="preserve">Approach</w:t>
@@ -575,7 +668,6 @@
           <w:p>
             <w:pPr>
               <w:pStyle w:val="Compact"/>
-              <w:jc w:val="left"/>
             </w:pPr>
             <w:r>
               <w:t xml:space="preserve">Distinct emails and manageable account changes</w:t>
@@ -587,7 +679,6 @@
           <w:p>
             <w:pPr>
               <w:pStyle w:val="Compact"/>
-              <w:jc w:val="left"/>
             </w:pPr>
             <w:r>
               <w:t xml:space="preserve">Start with email matching. An external IDP alone is not a reason to change the matching key.</w:t>
@@ -604,7 +695,6 @@
           <w:p>
             <w:pPr>
               <w:pStyle w:val="Compact"/>
-              <w:jc w:val="left"/>
             </w:pPr>
             <w:r>
               <w:t xml:space="preserve">Established IDP identity that must survive email changes</w:t>
@@ -616,7 +706,6 @@
           <w:p>
             <w:pPr>
               <w:pStyle w:val="Compact"/>
-              <w:jc w:val="left"/>
             </w:pPr>
             <w:r>
               <w:t xml:space="preserve">Use external ID matching and define who maintains the mapping.</w:t>
@@ -633,7 +722,6 @@
           <w:p>
             <w:pPr>
               <w:pStyle w:val="Compact"/>
-              <w:jc w:val="left"/>
             </w:pPr>
             <w:r>
               <w:t xml:space="preserve">Staff and patients have different identity requirements</w:t>
@@ -645,7 +733,6 @@
           <w:p>
             <w:pPr>
               <w:pStyle w:val="Compact"/>
-              <w:jc w:val="left"/>
             </w:pPr>
             <w:r>
               <w:t xml:space="preserve">Choose separately for each population. For example, staff may use corporate subject IDs while patients use email matching.</w:t>
@@ -662,7 +749,6 @@
           <w:p>
             <w:pPr>
               <w:pStyle w:val="Compact"/>
-              <w:jc w:val="left"/>
             </w:pPr>
             <w:r>
               <w:t xml:space="preserve">Separate people share a contact email</w:t>
@@ -674,7 +760,6 @@
           <w:p>
             <w:pPr>
               <w:pStyle w:val="Compact"/>
-              <w:jc w:val="left"/>
             </w:pPr>
             <w:r>
               <w:t xml:space="preserve">Use distinct authenticated identities and evaluate external ID matching. Also design recovery and MFA so mailbox access does not allow recovery of both accounts.</w:t>
@@ -691,7 +776,6 @@
           <w:p>
             <w:pPr>
               <w:pStyle w:val="Compact"/>
-              <w:jc w:val="left"/>
             </w:pPr>
             <w:r>
               <w:t xml:space="preserve">Caregiver accesses another person’s records</w:t>
@@ -703,7 +787,6 @@
           <w:p>
             <w:pPr>
               <w:pStyle w:val="Compact"/>
-              <w:jc w:val="left"/>
             </w:pPr>
             <w:r>
               <w:t xml:space="preserve">Give the caregiver their own identity and explicit access. A shared email is not evidence of authorization.</w:t>
@@ -718,8 +801,8 @@
       </w:pPr>
       <w:r>
         <w:rPr>
+          <w:b/>
           <w:bCs/>
-          <w:b/>
         </w:rPr>
         <w:t xml:space="preserve">Record:</w:t>
       </w:r>
@@ -740,7 +823,7 @@
       <w:r>
         <w:t xml:space="preserve"> </w:t>
       </w:r>
-      <w:hyperlink r:id="rId29">
+      <w:hyperlink r:id="rId18">
         <w:r>
           <w:rPr>
             <w:rStyle w:val="Hyperlink"/>
@@ -754,7 +837,7 @@
       <w:r>
         <w:t xml:space="preserve"> </w:t>
       </w:r>
-      <w:hyperlink r:id="rId30">
+      <w:hyperlink r:id="rId19">
         <w:r>
           <w:rPr>
             <w:rStyle w:val="Hyperlink"/>
@@ -766,9 +849,9 @@
         <w:t xml:space="preserve">.</w:t>
       </w:r>
     </w:p>
-    <w:bookmarkEnd w:id="31"/>
-    <w:bookmarkEnd w:id="32"/>
-    <w:bookmarkStart w:id="41" w:name="Xe73c9a75b182ec0997b5c83f0af59fcaf46a51e"/>
+    <w:bookmarkEnd w:id="20"/>
+    <w:bookmarkEnd w:id="21"/>
+    <w:bookmarkStart w:id="30" w:name="Xe73c9a75b182ec0997b5c83f0af59fcaf46a51e"/>
     <w:p>
       <w:pPr>
         <w:pStyle w:val="Heading2"/>
@@ -791,110 +874,110 @@
       </w:pPr>
       <w:r>
         <w:rPr>
+          <w:b/>
           <w:bCs/>
+        </w:rPr>
+        <w:t xml:space="preserve">Questions:</w:t>
+      </w:r>
+      <w:r>
+        <w:t xml:space="preserve"> </w:t>
+      </w:r>
+      <w:r>
+        <w:t xml:space="preserve">Do you already use an IDP? Does everyone in an application use the same provider? Do customer organizations bring their own SSO? Does an existing identity broker already handle that routing?</w:t>
+      </w:r>
+    </w:p>
+    <w:bookmarkStart w:id="24" w:name="option-a-medplum-managed-authentication"/>
+    <w:p>
+      <w:pPr>
+        <w:pStyle w:val="Heading3"/>
+      </w:pPr>
+      <w:r>
+        <w:t xml:space="preserve">Option A: Medplum-managed authentication</w:t>
+      </w:r>
+    </w:p>
+    <w:p>
+      <w:pPr>
+        <w:pStyle w:val="FirstParagraph"/>
+      </w:pPr>
+      <w:r>
+        <w:t xml:space="preserve">Medplum manages user credentials, password resets, and authentication. Your application uses its supported login flows and components.</w:t>
+      </w:r>
+    </w:p>
+    <w:p>
+      <w:pPr>
+        <w:pStyle w:val="Compact"/>
+        <w:numPr>
+          <w:ilvl w:val="0"/>
+          <w:numId w:val="1008"/>
+        </w:numPr>
+      </w:pPr>
+      <w:r>
+        <w:rPr>
           <w:b/>
-        </w:rPr>
-        <w:t xml:space="preserve">Questions:</w:t>
-      </w:r>
-      <w:r>
-        <w:t xml:space="preserve"> </w:t>
-      </w:r>
-      <w:r>
-        <w:t xml:space="preserve">Do you already use an IDP? Does everyone in an application use the same provider? Do customer organizations bring their own SSO? Does an existing identity broker already handle that routing?</w:t>
-      </w:r>
-    </w:p>
-    <w:bookmarkStart w:id="35" w:name="option-a-medplum-managed-authentication"/>
-    <w:p>
-      <w:pPr>
-        <w:pStyle w:val="Heading3"/>
-      </w:pPr>
-      <w:r>
-        <w:t xml:space="preserve">Option A: Medplum-managed authentication</w:t>
-      </w:r>
-    </w:p>
-    <w:p>
-      <w:pPr>
-        <w:pStyle w:val="FirstParagraph"/>
-      </w:pPr>
-      <w:r>
-        <w:t xml:space="preserve">Medplum manages user credentials, password resets, and authentication. Your application uses its supported login flows and components.</w:t>
-      </w:r>
-    </w:p>
-    <w:p>
-      <w:pPr>
-        <w:numPr>
-          <w:ilvl w:val="0"/>
-          <w:numId w:val="1007"/>
-        </w:numPr>
-        <w:pStyle w:val="Compact"/>
-      </w:pPr>
-      <w:r>
-        <w:rPr>
           <w:bCs/>
-          <w:b/>
         </w:rPr>
         <w:t xml:space="preserve">Advantages:</w:t>
       </w:r>
     </w:p>
     <w:p>
       <w:pPr>
-        <w:numPr>
-          <w:ilvl w:val="1"/>
-          <w:numId w:val="1008"/>
-        </w:numPr>
-        <w:pStyle w:val="Compact"/>
-      </w:pPr>
-      <w:r>
-        <w:t xml:space="preserve">No separate IDP integration is needed.</w:t>
-      </w:r>
-    </w:p>
-    <w:p>
-      <w:pPr>
-        <w:numPr>
-          <w:ilvl w:val="1"/>
-          <w:numId w:val="1008"/>
-        </w:numPr>
-        <w:pStyle w:val="Compact"/>
-      </w:pPr>
-      <w:r>
-        <w:t xml:space="preserve">Medplum provides credential management and supported login components.</w:t>
-      </w:r>
-    </w:p>
-    <w:p>
-      <w:pPr>
-        <w:numPr>
-          <w:ilvl w:val="0"/>
-          <w:numId w:val="1007"/>
-        </w:numPr>
-        <w:pStyle w:val="Compact"/>
-      </w:pPr>
-      <w:r>
-        <w:rPr>
-          <w:bCs/>
-          <w:b/>
-        </w:rPr>
-        <w:t xml:space="preserve">Tradeoffs:</w:t>
-      </w:r>
-    </w:p>
-    <w:p>
-      <w:pPr>
+        <w:pStyle w:val="Compact"/>
         <w:numPr>
           <w:ilvl w:val="1"/>
           <w:numId w:val="1009"/>
         </w:numPr>
-        <w:pStyle w:val="Compact"/>
-      </w:pPr>
-      <w:r>
-        <w:t xml:space="preserve">Your product still needs decisions about registration, invitations, MFA, and recovery.</w:t>
-      </w:r>
-    </w:p>
-    <w:p>
-      <w:pPr>
+      </w:pPr>
+      <w:r>
+        <w:t xml:space="preserve">No separate IDP integration is needed.</w:t>
+      </w:r>
+    </w:p>
+    <w:p>
+      <w:pPr>
+        <w:pStyle w:val="Compact"/>
         <w:numPr>
           <w:ilvl w:val="1"/>
           <w:numId w:val="1009"/>
         </w:numPr>
-        <w:pStyle w:val="Compact"/>
+      </w:pPr>
+      <w:r>
+        <w:t xml:space="preserve">Medplum provides credential management and supported login components.</w:t>
+      </w:r>
+    </w:p>
+    <w:p>
+      <w:pPr>
+        <w:pStyle w:val="Compact"/>
+        <w:numPr>
+          <w:ilvl w:val="0"/>
+          <w:numId w:val="1008"/>
+        </w:numPr>
+      </w:pPr>
+      <w:r>
+        <w:rPr>
+          <w:b/>
+          <w:bCs/>
+        </w:rPr>
+        <w:t xml:space="preserve">Tradeoffs:</w:t>
+      </w:r>
+    </w:p>
+    <w:p>
+      <w:pPr>
+        <w:pStyle w:val="Compact"/>
+        <w:numPr>
+          <w:ilvl w:val="1"/>
+          <w:numId w:val="1010"/>
+        </w:numPr>
+      </w:pPr>
+      <w:r>
+        <w:t xml:space="preserve">Your product still needs decisions about registration, invitations, MFA, and recovery.</w:t>
+      </w:r>
+    </w:p>
+    <w:p>
+      <w:pPr>
+        <w:pStyle w:val="Compact"/>
+        <w:numPr>
+          <w:ilvl w:val="1"/>
+          <w:numId w:val="1010"/>
+        </w:numPr>
       </w:pPr>
       <w:r>
         <w:t xml:space="preserve">This does not satisfy a requirement to use an existing corporate IDP by itself.</w:t>
@@ -902,16 +985,16 @@
     </w:p>
     <w:p>
       <w:pPr>
+        <w:pStyle w:val="Compact"/>
         <w:numPr>
           <w:ilvl w:val="0"/>
-          <w:numId w:val="1007"/>
-        </w:numPr>
-        <w:pStyle w:val="Compact"/>
-      </w:pPr>
-      <w:r>
-        <w:rPr>
+          <w:numId w:val="1008"/>
+        </w:numPr>
+      </w:pPr>
+      <w:r>
+        <w:rPr>
+          <w:b/>
           <w:bCs/>
-          <w:b/>
         </w:rPr>
         <w:t xml:space="preserve">Best fit:</w:t>
       </w:r>
@@ -932,7 +1015,7 @@
       <w:r>
         <w:t xml:space="preserve"> </w:t>
       </w:r>
-      <w:hyperlink r:id="rId33">
+      <w:hyperlink r:id="rId22">
         <w:r>
           <w:rPr>
             <w:rStyle w:val="Hyperlink"/>
@@ -949,7 +1032,7 @@
       <w:r>
         <w:t xml:space="preserve"> </w:t>
       </w:r>
-      <w:hyperlink r:id="rId34">
+      <w:hyperlink r:id="rId23">
         <w:r>
           <w:rPr>
             <w:rStyle w:val="Hyperlink"/>
@@ -961,8 +1044,8 @@
         <w:t xml:space="preserve">. Choose the login presentation separately from who manages credentials.</w:t>
       </w:r>
     </w:p>
-    <w:bookmarkEnd w:id="35"/>
-    <w:bookmarkStart w:id="37" w:name="Xe8809dc97f953fef8ac90d1d3f41e2bb8c2302f"/>
+    <w:bookmarkEnd w:id="24"/>
+    <w:bookmarkStart w:id="26" w:name="Xe8809dc97f953fef8ac90d1d3f41e2bb8c2302f"/>
     <w:p>
       <w:pPr>
         <w:pStyle w:val="Heading3"/>
@@ -993,67 +1076,67 @@
     </w:p>
     <w:p>
       <w:pPr>
+        <w:pStyle w:val="Compact"/>
         <w:numPr>
           <w:ilvl w:val="0"/>
-          <w:numId w:val="1010"/>
-        </w:numPr>
-        <w:pStyle w:val="Compact"/>
-      </w:pPr>
-      <w:r>
-        <w:rPr>
+          <w:numId w:val="1011"/>
+        </w:numPr>
+      </w:pPr>
+      <w:r>
+        <w:rPr>
+          <w:b/>
           <w:bCs/>
-          <w:b/>
         </w:rPr>
         <w:t xml:space="preserve">Advantages:</w:t>
       </w:r>
     </w:p>
     <w:p>
       <w:pPr>
-        <w:numPr>
-          <w:ilvl w:val="1"/>
-          <w:numId w:val="1011"/>
-        </w:numPr>
-        <w:pStyle w:val="Compact"/>
-      </w:pPr>
-      <w:r>
-        <w:t xml:space="preserve">Reuses existing identity infrastructure.</w:t>
-      </w:r>
-    </w:p>
-    <w:p>
-      <w:pPr>
-        <w:numPr>
-          <w:ilvl w:val="1"/>
-          <w:numId w:val="1011"/>
-        </w:numPr>
-        <w:pStyle w:val="Compact"/>
-      </w:pPr>
-      <w:r>
-        <w:t xml:space="preserve">Different applications can use different providers.</w:t>
-      </w:r>
-    </w:p>
-    <w:p>
-      <w:pPr>
-        <w:numPr>
-          <w:ilvl w:val="0"/>
-          <w:numId w:val="1010"/>
-        </w:numPr>
-        <w:pStyle w:val="Compact"/>
-      </w:pPr>
-      <w:r>
-        <w:rPr>
-          <w:bCs/>
-          <w:b/>
-        </w:rPr>
-        <w:t xml:space="preserve">Tradeoffs:</w:t>
-      </w:r>
-    </w:p>
-    <w:p>
-      <w:pPr>
+        <w:pStyle w:val="Compact"/>
         <w:numPr>
           <w:ilvl w:val="1"/>
           <w:numId w:val="1012"/>
         </w:numPr>
-        <w:pStyle w:val="Compact"/>
+      </w:pPr>
+      <w:r>
+        <w:t xml:space="preserve">Reuses existing identity infrastructure.</w:t>
+      </w:r>
+    </w:p>
+    <w:p>
+      <w:pPr>
+        <w:pStyle w:val="Compact"/>
+        <w:numPr>
+          <w:ilvl w:val="1"/>
+          <w:numId w:val="1012"/>
+        </w:numPr>
+      </w:pPr>
+      <w:r>
+        <w:t xml:space="preserve">Different applications can use different providers.</w:t>
+      </w:r>
+    </w:p>
+    <w:p>
+      <w:pPr>
+        <w:pStyle w:val="Compact"/>
+        <w:numPr>
+          <w:ilvl w:val="0"/>
+          <w:numId w:val="1011"/>
+        </w:numPr>
+      </w:pPr>
+      <w:r>
+        <w:rPr>
+          <w:b/>
+          <w:bCs/>
+        </w:rPr>
+        <w:t xml:space="preserve">Tradeoffs:</w:t>
+      </w:r>
+    </w:p>
+    <w:p>
+      <w:pPr>
+        <w:pStyle w:val="Compact"/>
+        <w:numPr>
+          <w:ilvl w:val="1"/>
+          <w:numId w:val="1013"/>
+        </w:numPr>
       </w:pPr>
       <w:r>
         <w:t xml:space="preserve">If users of the same application need different upstream IDPs, define how that routing will happen, such as through an identity broker.</w:t>
@@ -1061,16 +1144,16 @@
     </w:p>
     <w:p>
       <w:pPr>
+        <w:pStyle w:val="Compact"/>
         <w:numPr>
           <w:ilvl w:val="0"/>
-          <w:numId w:val="1010"/>
-        </w:numPr>
-        <w:pStyle w:val="Compact"/>
-      </w:pPr>
-      <w:r>
-        <w:rPr>
+          <w:numId w:val="1011"/>
+        </w:numPr>
+      </w:pPr>
+      <w:r>
+        <w:rPr>
+          <w:b/>
           <w:bCs/>
-          <w:b/>
         </w:rPr>
         <w:t xml:space="preserve">Best fit:</w:t>
       </w:r>
@@ -1091,7 +1174,7 @@
       <w:r>
         <w:t xml:space="preserve"> </w:t>
       </w:r>
-      <w:hyperlink r:id="rId36">
+      <w:hyperlink r:id="rId25">
         <w:r>
           <w:rPr>
             <w:rStyle w:val="Hyperlink"/>
@@ -1103,8 +1186,8 @@
         <w:t xml:space="preserve">.</w:t>
       </w:r>
     </w:p>
-    <w:bookmarkEnd w:id="37"/>
-    <w:bookmarkStart w:id="39" w:name="X1f3b4712db7da41133a5c6556c0631e928b0632"/>
+    <w:bookmarkEnd w:id="26"/>
+    <w:bookmarkStart w:id="28" w:name="X1f3b4712db7da41133a5c6556c0631e928b0632"/>
     <w:p>
       <w:pPr>
         <w:pStyle w:val="Heading3"/>
@@ -1138,55 +1221,55 @@
     </w:p>
     <w:p>
       <w:pPr>
+        <w:pStyle w:val="Compact"/>
         <w:numPr>
           <w:ilvl w:val="0"/>
-          <w:numId w:val="1013"/>
-        </w:numPr>
-        <w:pStyle w:val="Compact"/>
-      </w:pPr>
-      <w:r>
-        <w:rPr>
+          <w:numId w:val="1014"/>
+        </w:numPr>
+      </w:pPr>
+      <w:r>
+        <w:rPr>
+          <w:b/>
           <w:bCs/>
-          <w:b/>
         </w:rPr>
         <w:t xml:space="preserve">Advantages:</w:t>
       </w:r>
     </w:p>
     <w:p>
       <w:pPr>
-        <w:numPr>
-          <w:ilvl w:val="1"/>
-          <w:numId w:val="1014"/>
-        </w:numPr>
-        <w:pStyle w:val="Compact"/>
-      </w:pPr>
-      <w:r>
-        <w:t xml:space="preserve">An organization’s SSO applies across Medplum applications, including the Medplum App.</w:t>
-      </w:r>
-    </w:p>
-    <w:p>
-      <w:pPr>
-        <w:numPr>
-          <w:ilvl w:val="0"/>
-          <w:numId w:val="1013"/>
-        </w:numPr>
-        <w:pStyle w:val="Compact"/>
-      </w:pPr>
-      <w:r>
-        <w:rPr>
-          <w:bCs/>
-          <w:b/>
-        </w:rPr>
-        <w:t xml:space="preserve">Tradeoffs:</w:t>
-      </w:r>
-    </w:p>
-    <w:p>
-      <w:pPr>
+        <w:pStyle w:val="Compact"/>
         <w:numPr>
           <w:ilvl w:val="1"/>
           <w:numId w:val="1015"/>
         </w:numPr>
-        <w:pStyle w:val="Compact"/>
+      </w:pPr>
+      <w:r>
+        <w:t xml:space="preserve">An organization’s SSO applies across Medplum applications, including the Medplum App.</w:t>
+      </w:r>
+    </w:p>
+    <w:p>
+      <w:pPr>
+        <w:pStyle w:val="Compact"/>
+        <w:numPr>
+          <w:ilvl w:val="0"/>
+          <w:numId w:val="1014"/>
+        </w:numPr>
+      </w:pPr>
+      <w:r>
+        <w:rPr>
+          <w:b/>
+          <w:bCs/>
+        </w:rPr>
+        <w:t xml:space="preserve">Tradeoffs:</w:t>
+      </w:r>
+    </w:p>
+    <w:p>
+      <w:pPr>
+        <w:pStyle w:val="Compact"/>
+        <w:numPr>
+          <w:ilvl w:val="1"/>
+          <w:numId w:val="1016"/>
+        </w:numPr>
       </w:pPr>
       <w:r>
         <w:t xml:space="preserve">Applies to all users of the domain, including developer accounts.</w:t>
@@ -1194,11 +1277,11 @@
     </w:p>
     <w:p>
       <w:pPr>
+        <w:pStyle w:val="Compact"/>
         <w:numPr>
           <w:ilvl w:val="1"/>
-          <w:numId w:val="1015"/>
-        </w:numPr>
-        <w:pStyle w:val="Compact"/>
+          <w:numId w:val="1016"/>
+        </w:numPr>
       </w:pPr>
       <w:r>
         <w:t xml:space="preserve">Hosted setup requires Enterprise and Medplum assistance; self-hosted setup requires super admin privileges.</w:t>
@@ -1206,16 +1289,16 @@
     </w:p>
     <w:p>
       <w:pPr>
+        <w:pStyle w:val="Compact"/>
         <w:numPr>
           <w:ilvl w:val="0"/>
-          <w:numId w:val="1013"/>
-        </w:numPr>
-        <w:pStyle w:val="Compact"/>
-      </w:pPr>
-      <w:r>
-        <w:rPr>
+          <w:numId w:val="1014"/>
+        </w:numPr>
+      </w:pPr>
+      <w:r>
+        <w:rPr>
+          <w:b/>
           <w:bCs/>
-          <w:b/>
         </w:rPr>
         <w:t xml:space="preserve">Best fit:</w:t>
       </w:r>
@@ -1236,7 +1319,7 @@
       <w:r>
         <w:t xml:space="preserve"> </w:t>
       </w:r>
-      <w:hyperlink r:id="rId38">
+      <w:hyperlink r:id="rId27">
         <w:r>
           <w:rPr>
             <w:rStyle w:val="Hyperlink"/>
@@ -1248,8 +1331,8 @@
         <w:t xml:space="preserve">.</w:t>
       </w:r>
     </w:p>
-    <w:bookmarkEnd w:id="39"/>
-    <w:bookmarkStart w:id="40" w:name="recommended-approach-1"/>
+    <w:bookmarkEnd w:id="28"/>
+    <w:bookmarkStart w:id="29" w:name="recommended-approach-1"/>
     <w:p>
       <w:pPr>
         <w:pStyle w:val="Heading3"/>
@@ -1271,7 +1354,7 @@
         <w:pStyle w:val="BodyText"/>
       </w:pPr>
       <w:r>
-        <w:t xml:space="preserve">If an existing identity broker already routes among customer IDPs, retain that routing and evaluate token exchange in Decision 3. Customer-controlled routing is separate from Medplum’s domain-level configuration.</w:t>
+        <w:t xml:space="preserve">If an existing identity broker already routes among customer IDPs, it can remain the upstream provider. In Decision 3, choose whether Medplum handles its authentication callback or your application obtains an external access token to exchange. Customer-controlled routing is separate from Medplum’s domain-level configuration.</w:t>
       </w:r>
     </w:p>
     <w:p>
@@ -1288,35 +1371,53 @@
       </w:pPr>
       <w:r>
         <w:rPr>
+          <w:b/>
           <w:bCs/>
+        </w:rPr>
+        <w:t xml:space="preserve">Record:</w:t>
+      </w:r>
+      <w:r>
+        <w:t xml:space="preserve"> </w:t>
+      </w:r>
+      <w:r>
+        <w:t xml:space="preserve">Credential owner and routing mechanism for each population.</w:t>
+      </w:r>
+    </w:p>
+    <w:bookmarkEnd w:id="29"/>
+    <w:bookmarkEnd w:id="30"/>
+    <w:bookmarkStart w:id="41" w:name="Xe83cbdd7272abc64477498a6881e4d71cc6d800"/>
+    <w:p>
+      <w:pPr>
+        <w:pStyle w:val="Heading2"/>
+      </w:pPr>
+      <w:r>
+        <w:t xml:space="preserve">Decision 3: What is your token flow architecture?</w:t>
+      </w:r>
+    </w:p>
+    <w:p>
+      <w:pPr>
+        <w:pStyle w:val="FirstParagraph"/>
+      </w:pPr>
+      <w:r>
+        <w:t xml:space="preserve">Choose how your application obtains a token for Medplum and where it uses that token. An external IDP access token and a Medplum access token serve different APIs; do not assume they are interchangeable.</w:t>
+      </w:r>
+    </w:p>
+    <w:p>
+      <w:pPr>
+        <w:pStyle w:val="BodyText"/>
+      </w:pPr>
+      <w:r>
+        <w:rPr>
           <w:b/>
-        </w:rPr>
-        <w:t xml:space="preserve">Record:</w:t>
-      </w:r>
-      <w:r>
-        <w:t xml:space="preserve"> </w:t>
-      </w:r>
-      <w:r>
-        <w:t xml:space="preserve">Credential owner and routing mechanism for each population.</w:t>
-      </w:r>
-    </w:p>
-    <w:bookmarkEnd w:id="40"/>
-    <w:bookmarkEnd w:id="41"/>
-    <w:bookmarkStart w:id="55" w:name="Xe83cbdd7272abc64477498a6881e4d71cc6d800"/>
-    <w:p>
-      <w:pPr>
-        <w:pStyle w:val="Heading2"/>
-      </w:pPr>
-      <w:r>
-        <w:t xml:space="preserve">Decision 3: What is your token flow architecture?</w:t>
-      </w:r>
-    </w:p>
-    <w:p>
-      <w:pPr>
-        <w:pStyle w:val="FirstParagraph"/>
-      </w:pPr>
-      <w:r>
-        <w:t xml:space="preserve">Choose how your application obtains a token for Medplum and where it uses that token. An external IDP access token and a Medplum access token serve different APIs; do not assume they are interchangeable.</w:t>
+          <w:bCs/>
+        </w:rPr>
+        <w:t xml:space="preserve">Questions:</w:t>
+      </w:r>
+      <w:r>
+        <w:t xml:space="preserve"> </w:t>
+      </w:r>
+      <w:r>
+        <w:t xml:space="preserve">Will Medplum handle the external IDP callback, or will your application obtain an external access token through its own login flow? Does the client need an external token for other services? Must it call Medplum directly, or should all Medplum access pass through your backend?</w:t>
       </w:r>
     </w:p>
     <w:p>
@@ -1324,60 +1425,12 @@
         <w:pStyle w:val="BodyText"/>
       </w:pPr>
       <w:r>
-        <w:rPr>
-          <w:bCs/>
-          <w:b/>
-        </w:rPr>
-        <w:t xml:space="preserve">Questions:</w:t>
-      </w:r>
-      <w:r>
-        <w:t xml:space="preserve"> </w:t>
-      </w:r>
-      <w:r>
-        <w:t xml:space="preserve">Does your application already authenticate users? Does the client need an external token for other services? Must it call Medplum directly, or should all Medplum access pass through your backend?</w:t>
-      </w:r>
-    </w:p>
-    <w:p>
-      <w:pPr>
-        <w:pStyle w:val="BodyText"/>
-      </w:pPr>
-      <w:r>
-        <w:t xml:space="preserve">“</w:t>
-      </w:r>
-      <w:r>
-        <w:t xml:space="preserve">Client</w:t>
-      </w:r>
-      <w:r>
-        <w:t xml:space="preserve">”</w:t>
-      </w:r>
-      <w:r>
-        <w:t xml:space="preserve"> </w:t>
-      </w:r>
-      <w:r>
-        <w:t xml:space="preserve">below means your browser or native application.</w:t>
-      </w:r>
-      <w:r>
-        <w:t xml:space="preserve"> </w:t>
-      </w:r>
-      <w:r>
-        <w:t xml:space="preserve">“</w:t>
-      </w:r>
-      <w:r>
-        <w:t xml:space="preserve">Server</w:t>
-      </w:r>
-      <w:r>
-        <w:t xml:space="preserve">”</w:t>
-      </w:r>
-      <w:r>
-        <w:t xml:space="preserve"> </w:t>
-      </w:r>
-      <w:r>
-        <w:t xml:space="preserve">means your trusted application backend. The options below primarily address external or existing authentication. If you chose Medplum-managed authentication, choose</w:t>
-      </w:r>
-      <w:r>
-        <w:t xml:space="preserve"> </w:t>
-      </w:r>
-      <w:hyperlink r:id="rId33">
+        <w:t xml:space="preserve">“Client” below means your browser or native application. “Server” means your trusted application backend. The options below primarily address external or existing authentication. If you chose Medplum-managed authentication, choose</w:t>
+      </w:r>
+      <w:r>
+        <w:t xml:space="preserve"> </w:t>
+      </w:r>
+      <w:hyperlink r:id="rId22">
         <w:r>
           <w:rPr>
             <w:rStyle w:val="Hyperlink"/>
@@ -1394,7 +1447,7 @@
       <w:r>
         <w:t xml:space="preserve"> </w:t>
       </w:r>
-      <w:hyperlink r:id="rId34">
+      <w:hyperlink r:id="rId23">
         <w:r>
           <w:rPr>
             <w:rStyle w:val="Hyperlink"/>
@@ -1411,57 +1464,20 @@
         <w:pStyle w:val="BodyText"/>
       </w:pPr>
       <w:r>
-        <w:t xml:space="preserve">Use this tree as a starting point for external-IDP user authentication. The options below explain the tradeoffs; specialized flows such as self-hosted direct external authentication are covered under Additional Decisions.</w:t>
-      </w:r>
-    </w:p>
-    <w:p>
-      <w:pPr>
-        <w:pStyle w:val="BodyText"/>
-      </w:pPr>
-      <w:r>
-        <w:drawing>
-          <wp:inline>
-            <wp:extent cx="5943600" cy="3913900"/>
-            <wp:effectExtent b="0" l="0" r="0" t="0"/>
-            <wp:docPr descr="External-IDP token-flow decision tree: start with authorization-code login when the app does not need to retain its existing login or external API credentials. Otherwise, evaluate token exchange and choose client or server token storage. If supported exchange is unavailable, evaluate On-Behalf-Of." title="" id="43" name="Picture"/>
-            <a:graphic>
-              <a:graphicData uri="http://schemas.openxmlformats.org/drawingml/2006/picture">
-                <pic:pic>
-                  <pic:nvPicPr>
-                    <pic:cNvPr descr="authentication-token-flow.png" id="44" name="Picture"/>
-                    <pic:cNvPicPr>
-                      <a:picLocks noChangeArrowheads="1" noChangeAspect="1"/>
-                    </pic:cNvPicPr>
-                  </pic:nvPicPr>
-                  <pic:blipFill>
-                    <a:blip r:embed="rId42"/>
-                    <a:stretch>
-                      <a:fillRect/>
-                    </a:stretch>
-                  </pic:blipFill>
-                  <pic:spPr bwMode="auto">
-                    <a:xfrm>
-                      <a:off x="0" y="0"/>
-                      <a:ext cx="5943600" cy="3913900"/>
-                    </a:xfrm>
-                    <a:prstGeom prst="rect">
-                      <a:avLst/>
-                    </a:prstGeom>
-                    <a:noFill/>
-                    <a:ln w="9525">
-                      <a:noFill/>
-                      <a:headEnd/>
-                      <a:tailEnd/>
-                    </a:ln>
-                  </pic:spPr>
-                </pic:pic>
-              </a:graphicData>
-            </a:graphic>
-          </wp:inline>
-        </w:drawing>
-      </w:r>
-    </w:p>
-    <w:bookmarkStart w:id="45" w:name="X06ef6992b4244c84c87e3bcb06a64645d3251f5"/>
+        <w:rPr>
+          <w:b/>
+          <w:bCs/>
+        </w:rPr>
+        <w:t xml:space="preserve">Both the authorization-code flow and token exchange use an external IDP.</w:t>
+      </w:r>
+      <w:r>
+        <w:t xml:space="preserve"> </w:t>
+      </w:r>
+      <w:r>
+        <w:t xml:space="preserve">The difference is how your application obtains its Medplum token: in Option A, Medplum handles the IDP callback and returns a Medplum authorization code to your application; in Option B, your application obtains an external access token through its own login flow and submits that token to Medplum for exchange. Keeping your existing IDP does not by itself favor either flow.</w:t>
+      </w:r>
+    </w:p>
+    <w:bookmarkStart w:id="31" w:name="X06ef6992b4244c84c87e3bcb06a64645d3251f5"/>
     <w:p>
       <w:pPr>
         <w:pStyle w:val="Heading3"/>
@@ -1482,8 +1498,8 @@
       </w:r>
       <w:r>
         <w:rPr>
+          <w:b/>
           <w:bCs/>
-          <w:b/>
         </w:rPr>
         <w:t xml:space="preserve">three-legged OAuth</w:t>
       </w:r>
@@ -1493,139 +1509,139 @@
     </w:p>
     <w:p>
       <w:pPr>
-        <w:numPr>
-          <w:ilvl w:val="0"/>
-          <w:numId w:val="1016"/>
-        </w:numPr>
-        <w:pStyle w:val="Compact"/>
-      </w:pPr>
-      <w:r>
-        <w:t xml:space="preserve">The user starts login and authenticates with the external IDP.</w:t>
-      </w:r>
-    </w:p>
-    <w:p>
-      <w:pPr>
-        <w:numPr>
-          <w:ilvl w:val="0"/>
-          <w:numId w:val="1016"/>
-        </w:numPr>
-        <w:pStyle w:val="Compact"/>
-      </w:pPr>
-      <w:r>
-        <w:t xml:space="preserve">The IDP redirects to Medplum’s external authentication callback.</w:t>
-      </w:r>
-    </w:p>
-    <w:p>
-      <w:pPr>
-        <w:numPr>
-          <w:ilvl w:val="0"/>
-          <w:numId w:val="1016"/>
-        </w:numPr>
-        <w:pStyle w:val="Compact"/>
-      </w:pPr>
-      <w:r>
-        <w:t xml:space="preserve">Medplum redirects to your application with a Medplum authorization code.</w:t>
-      </w:r>
-    </w:p>
-    <w:p>
-      <w:pPr>
-        <w:numPr>
-          <w:ilvl w:val="0"/>
-          <w:numId w:val="1016"/>
-        </w:numPr>
-        <w:pStyle w:val="Compact"/>
-      </w:pPr>
-      <w:r>
-        <w:t xml:space="preserve">Your application exchanges that code for Medplum tokens.</w:t>
-      </w:r>
-    </w:p>
-    <w:p>
-      <w:pPr>
+        <w:pStyle w:val="Compact"/>
         <w:numPr>
           <w:ilvl w:val="0"/>
           <w:numId w:val="1017"/>
         </w:numPr>
-        <w:pStyle w:val="Compact"/>
-      </w:pPr>
-      <w:r>
-        <w:rPr>
-          <w:bCs/>
-          <w:b/>
-        </w:rPr>
-        <w:t xml:space="preserve">Advantages:</w:t>
-      </w:r>
-    </w:p>
-    <w:p>
-      <w:pPr>
-        <w:numPr>
-          <w:ilvl w:val="1"/>
-          <w:numId w:val="1018"/>
-        </w:numPr>
-        <w:pStyle w:val="Compact"/>
-      </w:pPr>
-      <w:r>
-        <w:t xml:space="preserve">The client can call Medplum directly without retaining an external access token for this flow.</w:t>
-      </w:r>
-    </w:p>
-    <w:p>
-      <w:pPr>
-        <w:numPr>
-          <w:ilvl w:val="1"/>
-          <w:numId w:val="1018"/>
-        </w:numPr>
-        <w:pStyle w:val="Compact"/>
-      </w:pPr>
-      <w:r>
-        <w:t xml:space="preserve">Fits direct SDK and authenticated component use without a proxy for Medplum requests.</w:t>
-      </w:r>
-    </w:p>
-    <w:p>
-      <w:pPr>
+      </w:pPr>
+      <w:r>
+        <w:t xml:space="preserve">The user starts login and authenticates with the external IDP.</w:t>
+      </w:r>
+    </w:p>
+    <w:p>
+      <w:pPr>
+        <w:pStyle w:val="Compact"/>
         <w:numPr>
           <w:ilvl w:val="0"/>
           <w:numId w:val="1017"/>
         </w:numPr>
-        <w:pStyle w:val="Compact"/>
-      </w:pPr>
-      <w:r>
-        <w:rPr>
+      </w:pPr>
+      <w:r>
+        <w:t xml:space="preserve">The IDP redirects to Medplum’s external authentication callback.</w:t>
+      </w:r>
+    </w:p>
+    <w:p>
+      <w:pPr>
+        <w:pStyle w:val="Compact"/>
+        <w:numPr>
+          <w:ilvl w:val="0"/>
+          <w:numId w:val="1017"/>
+        </w:numPr>
+      </w:pPr>
+      <w:r>
+        <w:t xml:space="preserve">Medplum redirects to your application with a Medplum authorization code.</w:t>
+      </w:r>
+    </w:p>
+    <w:p>
+      <w:pPr>
+        <w:pStyle w:val="Compact"/>
+        <w:numPr>
+          <w:ilvl w:val="0"/>
+          <w:numId w:val="1017"/>
+        </w:numPr>
+      </w:pPr>
+      <w:r>
+        <w:t xml:space="preserve">Your application exchanges that code for Medplum tokens.</w:t>
+      </w:r>
+    </w:p>
+    <w:p>
+      <w:pPr>
+        <w:pStyle w:val="Compact"/>
+        <w:numPr>
+          <w:ilvl w:val="0"/>
+          <w:numId w:val="1018"/>
+        </w:numPr>
+      </w:pPr>
+      <w:r>
+        <w:rPr>
+          <w:b/>
           <w:bCs/>
-          <w:b/>
-        </w:rPr>
-        <w:t xml:space="preserve">Tradeoffs:</w:t>
-      </w:r>
-    </w:p>
-    <w:p>
-      <w:pPr>
+        </w:rPr>
+        <w:t xml:space="preserve">Advantages:</w:t>
+      </w:r>
+    </w:p>
+    <w:p>
+      <w:pPr>
+        <w:pStyle w:val="Compact"/>
         <w:numPr>
           <w:ilvl w:val="1"/>
           <w:numId w:val="1019"/>
         </w:numPr>
-        <w:pStyle w:val="Compact"/>
-      </w:pPr>
-      <w:r>
-        <w:t xml:space="preserve">Requires a redirect/callback flow and coordination of redirect settings with the IDP.</w:t>
-      </w:r>
-    </w:p>
-    <w:p>
-      <w:pPr>
+      </w:pPr>
+      <w:r>
+        <w:t xml:space="preserve">The client can call Medplum directly without retaining an external access token for this flow.</w:t>
+      </w:r>
+    </w:p>
+    <w:p>
+      <w:pPr>
+        <w:pStyle w:val="Compact"/>
         <w:numPr>
           <w:ilvl w:val="1"/>
           <w:numId w:val="1019"/>
         </w:numPr>
-        <w:pStyle w:val="Compact"/>
-      </w:pPr>
-      <w:r>
-        <w:t xml:space="preserve">Does not give the client an external access token to reuse with other services. An application with an established external login may fit token exchange better.</w:t>
-      </w:r>
-    </w:p>
-    <w:p>
-      <w:pPr>
+      </w:pPr>
+      <w:r>
+        <w:t xml:space="preserve">Fits direct SDK and authenticated component use without a proxy for Medplum requests.</w:t>
+      </w:r>
+    </w:p>
+    <w:p>
+      <w:pPr>
+        <w:pStyle w:val="Compact"/>
+        <w:numPr>
+          <w:ilvl w:val="0"/>
+          <w:numId w:val="1018"/>
+        </w:numPr>
+      </w:pPr>
+      <w:r>
+        <w:rPr>
+          <w:b/>
+          <w:bCs/>
+        </w:rPr>
+        <w:t xml:space="preserve">Tradeoffs:</w:t>
+      </w:r>
+    </w:p>
+    <w:p>
+      <w:pPr>
+        <w:pStyle w:val="Compact"/>
         <w:numPr>
           <w:ilvl w:val="1"/>
-          <w:numId w:val="1019"/>
-        </w:numPr>
-        <w:pStyle w:val="Compact"/>
+          <w:numId w:val="1020"/>
+        </w:numPr>
+      </w:pPr>
+      <w:r>
+        <w:t xml:space="preserve">Requires a redirect/callback flow and coordination of redirect settings with the IDP.</w:t>
+      </w:r>
+    </w:p>
+    <w:p>
+      <w:pPr>
+        <w:pStyle w:val="Compact"/>
+        <w:numPr>
+          <w:ilvl w:val="1"/>
+          <w:numId w:val="1020"/>
+        </w:numPr>
+      </w:pPr>
+      <w:r>
+        <w:t xml:space="preserve">Does not give the client an external access token to reuse with other services. If your application needs to obtain and manage that token through its own login flow, evaluate token exchange.</w:t>
+      </w:r>
+    </w:p>
+    <w:p>
+      <w:pPr>
+        <w:pStyle w:val="Compact"/>
+        <w:numPr>
+          <w:ilvl w:val="1"/>
+          <w:numId w:val="1020"/>
+        </w:numPr>
       </w:pPr>
       <w:r>
         <w:t xml:space="preserve">A Medplum logout does not by itself define what happens to the external IDP’s SSO session; choose whether users should be signed out there too.</w:t>
@@ -1633,16 +1649,16 @@
     </w:p>
     <w:p>
       <w:pPr>
+        <w:pStyle w:val="Compact"/>
         <w:numPr>
           <w:ilvl w:val="0"/>
-          <w:numId w:val="1017"/>
-        </w:numPr>
-        <w:pStyle w:val="Compact"/>
-      </w:pPr>
-      <w:r>
-        <w:rPr>
+          <w:numId w:val="1018"/>
+        </w:numPr>
+      </w:pPr>
+      <w:r>
+        <w:rPr>
+          <w:b/>
           <w:bCs/>
-          <w:b/>
         </w:rPr>
         <w:t xml:space="preserve">Best fit:</w:t>
       </w:r>
@@ -1663,7 +1679,7 @@
       <w:r>
         <w:t xml:space="preserve"> </w:t>
       </w:r>
-      <w:hyperlink r:id="rId36">
+      <w:hyperlink r:id="rId25">
         <w:r>
           <w:rPr>
             <w:rStyle w:val="Hyperlink"/>
@@ -1675,8 +1691,8 @@
         <w:t xml:space="preserve">.</w:t>
       </w:r>
     </w:p>
-    <w:bookmarkEnd w:id="45"/>
-    <w:bookmarkStart w:id="50" w:name="option-b-token-exchange"/>
+    <w:bookmarkEnd w:id="31"/>
+    <w:bookmarkStart w:id="36" w:name="option-b-token-exchange"/>
     <w:p>
       <w:pPr>
         <w:pStyle w:val="Heading3"/>
@@ -1695,103 +1711,103 @@
     </w:p>
     <w:p>
       <w:pPr>
+        <w:pStyle w:val="Compact"/>
         <w:numPr>
           <w:ilvl w:val="0"/>
-          <w:numId w:val="1020"/>
-        </w:numPr>
-        <w:pStyle w:val="Compact"/>
-      </w:pPr>
-      <w:r>
-        <w:rPr>
+          <w:numId w:val="1021"/>
+        </w:numPr>
+      </w:pPr>
+      <w:r>
+        <w:rPr>
+          <w:b/>
           <w:bCs/>
-          <w:b/>
         </w:rPr>
         <w:t xml:space="preserve">Advantages:</w:t>
       </w:r>
     </w:p>
     <w:p>
       <w:pPr>
-        <w:numPr>
-          <w:ilvl w:val="1"/>
-          <w:numId w:val="1021"/>
-        </w:numPr>
-        <w:pStyle w:val="Compact"/>
-      </w:pPr>
-      <w:r>
-        <w:t xml:space="preserve">Reuses a valid external login without a second interactive login to Medplum.</w:t>
-      </w:r>
-    </w:p>
-    <w:p>
-      <w:pPr>
-        <w:numPr>
-          <w:ilvl w:val="1"/>
-          <w:numId w:val="1021"/>
-        </w:numPr>
-        <w:pStyle w:val="Compact"/>
-      </w:pPr>
-      <w:r>
-        <w:t xml:space="preserve">Lets your application retain its existing login and IDP-routing logic.</w:t>
-      </w:r>
-    </w:p>
-    <w:p>
-      <w:pPr>
-        <w:numPr>
-          <w:ilvl w:val="1"/>
-          <w:numId w:val="1021"/>
-        </w:numPr>
-        <w:pStyle w:val="Compact"/>
-      </w:pPr>
-      <w:r>
-        <w:t xml:space="preserve">Produces a user-scoped Medplum token that can be used in either the client or backend.</w:t>
-      </w:r>
-    </w:p>
-    <w:p>
-      <w:pPr>
-        <w:numPr>
-          <w:ilvl w:val="0"/>
-          <w:numId w:val="1020"/>
-        </w:numPr>
-        <w:pStyle w:val="Compact"/>
-      </w:pPr>
-      <w:r>
-        <w:rPr>
-          <w:bCs/>
-          <w:b/>
-        </w:rPr>
-        <w:t xml:space="preserve">Tradeoffs:</w:t>
-      </w:r>
-    </w:p>
-    <w:p>
-      <w:pPr>
+        <w:pStyle w:val="Compact"/>
         <w:numPr>
           <w:ilvl w:val="1"/>
           <w:numId w:val="1022"/>
         </w:numPr>
-        <w:pStyle w:val="Compact"/>
-      </w:pPr>
-      <w:r>
-        <w:t xml:space="preserve">Requires a supported external access token and configured UserInfo validation. An ID token or arbitrary application session cookie is not an interchangeable input.</w:t>
-      </w:r>
-    </w:p>
-    <w:p>
-      <w:pPr>
+      </w:pPr>
+      <w:r>
+        <w:t xml:space="preserve">Reuses a valid external login without a second interactive login to Medplum.</w:t>
+      </w:r>
+    </w:p>
+    <w:p>
+      <w:pPr>
+        <w:pStyle w:val="Compact"/>
         <w:numPr>
           <w:ilvl w:val="1"/>
           <w:numId w:val="1022"/>
         </w:numPr>
-        <w:pStyle w:val="Compact"/>
-      </w:pPr>
-      <w:r>
-        <w:t xml:space="preserve">You must coordinate external and Medplum credential lifecycles and select the intended membership.</w:t>
-      </w:r>
-    </w:p>
-    <w:p>
-      <w:pPr>
+      </w:pPr>
+      <w:r>
+        <w:t xml:space="preserve">Lets your application continue handling the external IDP callback, token acquisition, and IDP-routing logic itself.</w:t>
+      </w:r>
+    </w:p>
+    <w:p>
+      <w:pPr>
+        <w:pStyle w:val="Compact"/>
         <w:numPr>
           <w:ilvl w:val="1"/>
           <w:numId w:val="1022"/>
         </w:numPr>
-        <w:pStyle w:val="Compact"/>
+      </w:pPr>
+      <w:r>
+        <w:t xml:space="preserve">Produces a user-scoped Medplum token that can be used in either the client or backend.</w:t>
+      </w:r>
+    </w:p>
+    <w:p>
+      <w:pPr>
+        <w:pStyle w:val="Compact"/>
+        <w:numPr>
+          <w:ilvl w:val="0"/>
+          <w:numId w:val="1021"/>
+        </w:numPr>
+      </w:pPr>
+      <w:r>
+        <w:rPr>
+          <w:b/>
+          <w:bCs/>
+        </w:rPr>
+        <w:t xml:space="preserve">Tradeoffs:</w:t>
+      </w:r>
+    </w:p>
+    <w:p>
+      <w:pPr>
+        <w:pStyle w:val="Compact"/>
+        <w:numPr>
+          <w:ilvl w:val="1"/>
+          <w:numId w:val="1023"/>
+        </w:numPr>
+      </w:pPr>
+      <w:r>
+        <w:t xml:space="preserve">Requires a supported external access token and configured UserInfo validation. An ID token or arbitrary application session cookie is not an interchangeable input.</w:t>
+      </w:r>
+    </w:p>
+    <w:p>
+      <w:pPr>
+        <w:pStyle w:val="Compact"/>
+        <w:numPr>
+          <w:ilvl w:val="1"/>
+          <w:numId w:val="1023"/>
+        </w:numPr>
+      </w:pPr>
+      <w:r>
+        <w:t xml:space="preserve">You must coordinate external and Medplum credential lifecycles and select the intended membership.</w:t>
+      </w:r>
+    </w:p>
+    <w:p>
+      <w:pPr>
+        <w:pStyle w:val="Compact"/>
+        <w:numPr>
+          <w:ilvl w:val="1"/>
+          <w:numId w:val="1023"/>
+        </w:numPr>
       </w:pPr>
       <w:r>
         <w:t xml:space="preserve">Other APIs must accept the appropriate credentials for their own audience and scopes; token exchange does not make one external token valid for every service.</w:t>
@@ -1799,24 +1815,71 @@
     </w:p>
     <w:p>
       <w:pPr>
+        <w:pStyle w:val="Compact"/>
         <w:numPr>
           <w:ilvl w:val="0"/>
-          <w:numId w:val="1020"/>
-        </w:numPr>
-        <w:pStyle w:val="Compact"/>
-      </w:pPr>
-      <w:r>
-        <w:rPr>
+          <w:numId w:val="1021"/>
+        </w:numPr>
+      </w:pPr>
+      <w:r>
+        <w:rPr>
+          <w:b/>
           <w:bCs/>
+        </w:rPr>
+        <w:t xml:space="preserve">Best fit:</w:t>
+      </w:r>
+      <w:r>
+        <w:t xml:space="preserve"> </w:t>
+      </w:r>
+      <w:r>
+        <w:t xml:space="preserve">Your application obtains a supported external access token through its own login flow and needs to add Medplum access, potentially alongside other services.</w:t>
+      </w:r>
+    </w:p>
+    <w:p>
+      <w:pPr>
+        <w:pStyle w:val="FirstParagraph"/>
+      </w:pPr>
+      <w:r>
+        <w:t xml:space="preserve">The presence of other integrations alone does not require token exchange. If those integrations run in Bots or your backend using service credentials, the client may still need only Medplum authentication.</w:t>
+      </w:r>
+    </w:p>
+    <w:bookmarkStart w:id="35" w:name="where-will-you-store-the-medplum-token"/>
+    <w:p>
+      <w:pPr>
+        <w:pStyle w:val="Heading4"/>
+      </w:pPr>
+      <w:r>
+        <w:t xml:space="preserve">Where will you store the Medplum token?</w:t>
+      </w:r>
+    </w:p>
+    <w:p>
+      <w:pPr>
+        <w:pStyle w:val="FirstParagraph"/>
+      </w:pPr>
+      <w:r>
+        <w:t xml:space="preserve">Once you choose token exchange, decide between these two placements. Both produce</w:t>
+      </w:r>
+      <w:r>
+        <w:t xml:space="preserve"> </w:t>
+      </w:r>
+      <w:r>
+        <w:rPr>
           <w:b/>
-        </w:rPr>
-        <w:t xml:space="preserve">Best fit:</w:t>
-      </w:r>
-      <w:r>
-        <w:t xml:space="preserve"> </w:t>
-      </w:r>
-      <w:r>
-        <w:t xml:space="preserve">An existing application owns login, or its client also needs external authentication for other services.</w:t>
+          <w:bCs/>
+        </w:rPr>
+        <w:t xml:space="preserve">user-scoped Medplum tokens</w:t>
+      </w:r>
+      <w:r>
+        <w:t xml:space="preserve">. The choice changes where credentials are managed and which system carries requests to Medplum.</w:t>
+      </w:r>
+    </w:p>
+    <w:bookmarkStart w:id="32" w:name="b1-keep-the-medplum-token-in-the-client"/>
+    <w:p>
+      <w:pPr>
+        <w:pStyle w:val="Heading5"/>
+      </w:pPr>
+      <w:r>
+        <w:t xml:space="preserve">B1: Keep the Medplum token in the client</w:t>
       </w:r>
     </w:p>
     <w:p>
@@ -1824,155 +1887,108 @@
         <w:pStyle w:val="FirstParagraph"/>
       </w:pPr>
       <w:r>
-        <w:t xml:space="preserve">The presence of other integrations alone does not require token exchange. If those integrations run in Bots or your backend using service credentials, the client may still need only Medplum authentication.</w:t>
-      </w:r>
-    </w:p>
-    <w:bookmarkStart w:id="49" w:name="where-will-you-store-the-medplum-token"/>
-    <w:p>
-      <w:pPr>
-        <w:pStyle w:val="Heading4"/>
-      </w:pPr>
-      <w:r>
-        <w:t xml:space="preserve">Where will you store the Medplum token?</w:t>
-      </w:r>
-    </w:p>
-    <w:p>
-      <w:pPr>
-        <w:pStyle w:val="FirstParagraph"/>
-      </w:pPr>
-      <w:r>
-        <w:t xml:space="preserve">Once you choose token exchange, decide between these two placements. Both produce</w:t>
-      </w:r>
-      <w:r>
-        <w:t xml:space="preserve"> </w:t>
-      </w:r>
-      <w:r>
-        <w:rPr>
+        <w:t xml:space="preserve">The client obtains a Medplum token through exchange and calls Medplum directly.</w:t>
+      </w:r>
+    </w:p>
+    <w:p>
+      <w:pPr>
+        <w:pStyle w:val="Compact"/>
+        <w:numPr>
+          <w:ilvl w:val="0"/>
+          <w:numId w:val="1024"/>
+        </w:numPr>
+      </w:pPr>
+      <w:r>
+        <w:rPr>
+          <w:b/>
           <w:bCs/>
-          <w:b/>
-        </w:rPr>
-        <w:t xml:space="preserve">user-scoped Medplum tokens</w:t>
-      </w:r>
-      <w:r>
-        <w:t xml:space="preserve">. The choice changes where credentials are managed and which system carries requests to Medplum.</w:t>
-      </w:r>
-    </w:p>
-    <w:bookmarkStart w:id="46" w:name="b1-keep-the-medplum-token-in-the-client"/>
-    <w:p>
-      <w:pPr>
-        <w:pStyle w:val="Heading5"/>
-      </w:pPr>
-      <w:r>
-        <w:t xml:space="preserve">B1: Keep the Medplum token in the client</w:t>
-      </w:r>
-    </w:p>
-    <w:p>
-      <w:pPr>
-        <w:pStyle w:val="FirstParagraph"/>
-      </w:pPr>
-      <w:r>
-        <w:t xml:space="preserve">The client obtains a Medplum token through exchange and calls Medplum directly.</w:t>
-      </w:r>
-    </w:p>
-    <w:p>
-      <w:pPr>
-        <w:numPr>
-          <w:ilvl w:val="0"/>
-          <w:numId w:val="1023"/>
-        </w:numPr>
-        <w:pStyle w:val="Compact"/>
-      </w:pPr>
-      <w:r>
-        <w:rPr>
-          <w:bCs/>
-          <w:b/>
         </w:rPr>
         <w:t xml:space="preserve">Advantages:</w:t>
       </w:r>
     </w:p>
     <w:p>
       <w:pPr>
-        <w:numPr>
-          <w:ilvl w:val="1"/>
-          <w:numId w:val="1024"/>
-        </w:numPr>
-        <w:pStyle w:val="Compact"/>
-      </w:pPr>
-      <w:r>
-        <w:t xml:space="preserve">Direct SDK/API access and authenticated React components fit naturally.</w:t>
-      </w:r>
-    </w:p>
-    <w:p>
-      <w:pPr>
-        <w:numPr>
-          <w:ilvl w:val="1"/>
-          <w:numId w:val="1024"/>
-        </w:numPr>
-        <w:pStyle w:val="Compact"/>
-      </w:pPr>
-      <w:r>
-        <w:t xml:space="preserve">WebSocket subscriptions connect directly to Medplum.</w:t>
-      </w:r>
-    </w:p>
-    <w:p>
-      <w:pPr>
-        <w:numPr>
-          <w:ilvl w:val="1"/>
-          <w:numId w:val="1024"/>
-        </w:numPr>
-        <w:pStyle w:val="Compact"/>
-      </w:pPr>
-      <w:r>
-        <w:t xml:space="preserve">No application proxy is needed for those requests.</w:t>
-      </w:r>
-    </w:p>
-    <w:p>
-      <w:pPr>
-        <w:numPr>
-          <w:ilvl w:val="0"/>
-          <w:numId w:val="1023"/>
-        </w:numPr>
-        <w:pStyle w:val="Compact"/>
-      </w:pPr>
-      <w:r>
-        <w:rPr>
-          <w:bCs/>
-          <w:b/>
-        </w:rPr>
-        <w:t xml:space="preserve">Tradeoffs:</w:t>
-      </w:r>
-    </w:p>
-    <w:p>
-      <w:pPr>
+        <w:pStyle w:val="Compact"/>
         <w:numPr>
           <w:ilvl w:val="1"/>
           <w:numId w:val="1025"/>
         </w:numPr>
-        <w:pStyle w:val="Compact"/>
-      </w:pPr>
-      <w:r>
-        <w:t xml:space="preserve">The client manages both external and Medplum credentials, including expiry, refresh, and logout.</w:t>
-      </w:r>
-    </w:p>
-    <w:p>
-      <w:pPr>
+      </w:pPr>
+      <w:r>
+        <w:t xml:space="preserve">Direct SDK/API access and authenticated React components fit naturally.</w:t>
+      </w:r>
+    </w:p>
+    <w:p>
+      <w:pPr>
+        <w:pStyle w:val="Compact"/>
         <w:numPr>
           <w:ilvl w:val="1"/>
           <w:numId w:val="1025"/>
         </w:numPr>
-        <w:pStyle w:val="Compact"/>
-      </w:pPr>
-      <w:r>
-        <w:t xml:space="preserve">Medplum credentials are present in the client. Choose storage and session controls appropriate to the browser or native platform.</w:t>
-      </w:r>
-    </w:p>
-    <w:p>
-      <w:pPr>
+      </w:pPr>
+      <w:r>
+        <w:t xml:space="preserve">WebSocket subscriptions connect directly to Medplum.</w:t>
+      </w:r>
+    </w:p>
+    <w:p>
+      <w:pPr>
+        <w:pStyle w:val="Compact"/>
         <w:numPr>
           <w:ilvl w:val="1"/>
           <w:numId w:val="1025"/>
         </w:numPr>
-        <w:pStyle w:val="Compact"/>
+      </w:pPr>
+      <w:r>
+        <w:t xml:space="preserve">No application proxy is needed for those requests.</w:t>
+      </w:r>
+    </w:p>
+    <w:p>
+      <w:pPr>
+        <w:pStyle w:val="Compact"/>
+        <w:numPr>
+          <w:ilvl w:val="0"/>
+          <w:numId w:val="1024"/>
+        </w:numPr>
+      </w:pPr>
+      <w:r>
+        <w:rPr>
+          <w:b/>
+          <w:bCs/>
+        </w:rPr>
+        <w:t xml:space="preserve">Tradeoffs:</w:t>
+      </w:r>
+    </w:p>
+    <w:p>
+      <w:pPr>
+        <w:pStyle w:val="Compact"/>
+        <w:numPr>
+          <w:ilvl w:val="1"/>
+          <w:numId w:val="1026"/>
+        </w:numPr>
+      </w:pPr>
+      <w:r>
+        <w:t xml:space="preserve">The client manages both external and Medplum credentials, including expiry, refresh, and logout.</w:t>
+      </w:r>
+    </w:p>
+    <w:p>
+      <w:pPr>
+        <w:pStyle w:val="Compact"/>
+        <w:numPr>
+          <w:ilvl w:val="1"/>
+          <w:numId w:val="1026"/>
+        </w:numPr>
+      </w:pPr>
+      <w:r>
+        <w:t xml:space="preserve">Medplum credentials are present in the client. Choose storage and session controls appropriate to the browser or native platform.</w:t>
+      </w:r>
+    </w:p>
+    <w:p>
+      <w:pPr>
+        <w:pStyle w:val="Compact"/>
+        <w:numPr>
+          <w:ilvl w:val="1"/>
+          <w:numId w:val="1026"/>
+        </w:numPr>
       </w:pPr>
       <w:r>
         <w:t xml:space="preserve">Every direct API request must be constrained by Medplum access policies; UI restrictions cannot enforce permissions.</w:t>
@@ -1980,143 +1996,143 @@
     </w:p>
     <w:p>
       <w:pPr>
+        <w:pStyle w:val="Compact"/>
         <w:numPr>
           <w:ilvl w:val="0"/>
-          <w:numId w:val="1023"/>
-        </w:numPr>
-        <w:pStyle w:val="Compact"/>
-      </w:pPr>
-      <w:r>
-        <w:rPr>
+          <w:numId w:val="1024"/>
+        </w:numPr>
+      </w:pPr>
+      <w:r>
+        <w:rPr>
+          <w:b/>
           <w:bCs/>
+        </w:rPr>
+        <w:t xml:space="preserve">Best fit:</w:t>
+      </w:r>
+      <w:r>
+        <w:t xml:space="preserve"> </w:t>
+      </w:r>
+      <w:r>
+        <w:t xml:space="preserve">Direct Medplum access is valuable and the client can manage both credential lifecycles.</w:t>
+      </w:r>
+    </w:p>
+    <w:bookmarkEnd w:id="32"/>
+    <w:bookmarkStart w:id="34" w:name="b2-keep-the-medplum-token-on-the-server"/>
+    <w:p>
+      <w:pPr>
+        <w:pStyle w:val="Heading5"/>
+      </w:pPr>
+      <w:r>
+        <w:t xml:space="preserve">B2: Keep the Medplum token on the server</w:t>
+      </w:r>
+    </w:p>
+    <w:p>
+      <w:pPr>
+        <w:pStyle w:val="FirstParagraph"/>
+      </w:pPr>
+      <w:r>
+        <w:t xml:space="preserve">Your backend exchanges the authenticated user’s external token, retains the resulting Medplum token, and uses it to fulfill the user’s requests. The client keeps its existing application authentication mechanism.</w:t>
+      </w:r>
+    </w:p>
+    <w:p>
+      <w:pPr>
+        <w:pStyle w:val="Compact"/>
+        <w:numPr>
+          <w:ilvl w:val="0"/>
+          <w:numId w:val="1027"/>
+        </w:numPr>
+      </w:pPr>
+      <w:r>
+        <w:rPr>
           <w:b/>
-        </w:rPr>
-        <w:t xml:space="preserve">Best fit:</w:t>
-      </w:r>
-      <w:r>
-        <w:t xml:space="preserve"> </w:t>
-      </w:r>
-      <w:r>
-        <w:t xml:space="preserve">Direct Medplum access is valuable and the client can manage both credential lifecycles.</w:t>
-      </w:r>
-    </w:p>
-    <w:bookmarkEnd w:id="46"/>
-    <w:bookmarkStart w:id="48" w:name="b2-keep-the-medplum-token-on-the-server"/>
-    <w:p>
-      <w:pPr>
-        <w:pStyle w:val="Heading5"/>
-      </w:pPr>
-      <w:r>
-        <w:t xml:space="preserve">B2: Keep the Medplum token on the server</w:t>
-      </w:r>
-    </w:p>
-    <w:p>
-      <w:pPr>
-        <w:pStyle w:val="FirstParagraph"/>
-      </w:pPr>
-      <w:r>
-        <w:t xml:space="preserve">Your backend exchanges the authenticated user’s external token, retains the resulting Medplum token, and uses it to fulfill the user’s requests. The client keeps its existing application authentication mechanism.</w:t>
-      </w:r>
-    </w:p>
-    <w:p>
-      <w:pPr>
-        <w:numPr>
-          <w:ilvl w:val="0"/>
-          <w:numId w:val="1026"/>
-        </w:numPr>
-        <w:pStyle w:val="Compact"/>
-      </w:pPr>
-      <w:r>
-        <w:rPr>
           <w:bCs/>
-          <w:b/>
         </w:rPr>
         <w:t xml:space="preserve">Advantages:</w:t>
       </w:r>
     </w:p>
     <w:p>
       <w:pPr>
-        <w:numPr>
-          <w:ilvl w:val="1"/>
-          <w:numId w:val="1027"/>
-        </w:numPr>
-        <w:pStyle w:val="Compact"/>
-      </w:pPr>
-      <w:r>
-        <w:t xml:space="preserve">Medplum credentials stay out of the client, so the client does not need to manage a second API credential lifecycle.</w:t>
-      </w:r>
-    </w:p>
-    <w:p>
-      <w:pPr>
-        <w:numPr>
-          <w:ilvl w:val="1"/>
-          <w:numId w:val="1027"/>
-        </w:numPr>
-        <w:pStyle w:val="Compact"/>
-      </w:pPr>
-      <w:r>
-        <w:t xml:space="preserve">Fits an existing backend that coordinates multiple services or deliberately mediates all data access.</w:t>
-      </w:r>
-    </w:p>
-    <w:p>
-      <w:pPr>
-        <w:numPr>
-          <w:ilvl w:val="1"/>
-          <w:numId w:val="1027"/>
-        </w:numPr>
-        <w:pStyle w:val="Compact"/>
-      </w:pPr>
-      <w:r>
-        <w:t xml:space="preserve">Medplum still enforces the resolved user’s access policy on the backend’s requests.</w:t>
-      </w:r>
-    </w:p>
-    <w:p>
-      <w:pPr>
-        <w:numPr>
-          <w:ilvl w:val="0"/>
-          <w:numId w:val="1026"/>
-        </w:numPr>
-        <w:pStyle w:val="Compact"/>
-      </w:pPr>
-      <w:r>
-        <w:rPr>
-          <w:bCs/>
-          <w:b/>
-        </w:rPr>
-        <w:t xml:space="preserve">Tradeoffs:</w:t>
-      </w:r>
-    </w:p>
-    <w:p>
-      <w:pPr>
+        <w:pStyle w:val="Compact"/>
         <w:numPr>
           <w:ilvl w:val="1"/>
           <w:numId w:val="1028"/>
         </w:numPr>
-        <w:pStyle w:val="Compact"/>
-      </w:pPr>
-      <w:r>
-        <w:t xml:space="preserve">Credential renewal and logout work move to the backend; they do not disappear.</w:t>
-      </w:r>
-    </w:p>
-    <w:p>
-      <w:pPr>
+      </w:pPr>
+      <w:r>
+        <w:t xml:space="preserve">Medplum credentials stay out of the client, so the client does not need to manage a second API credential lifecycle.</w:t>
+      </w:r>
+    </w:p>
+    <w:p>
+      <w:pPr>
+        <w:pStyle w:val="Compact"/>
         <w:numPr>
           <w:ilvl w:val="1"/>
           <w:numId w:val="1028"/>
         </w:numPr>
-        <w:pStyle w:val="Compact"/>
-      </w:pPr>
-      <w:r>
-        <w:t xml:space="preserve">Your team operates the proxy and per-user token cache. This adds a request hop and another service whose availability and capacity affect Medplum access.</w:t>
-      </w:r>
-    </w:p>
-    <w:p>
-      <w:pPr>
+      </w:pPr>
+      <w:r>
+        <w:t xml:space="preserve">Fits an existing backend that coordinates multiple services or deliberately mediates all data access.</w:t>
+      </w:r>
+    </w:p>
+    <w:p>
+      <w:pPr>
+        <w:pStyle w:val="Compact"/>
         <w:numPr>
           <w:ilvl w:val="1"/>
           <w:numId w:val="1028"/>
         </w:numPr>
-        <w:pStyle w:val="Compact"/>
+      </w:pPr>
+      <w:r>
+        <w:t xml:space="preserve">Medplum still enforces the resolved user’s access policy on the backend’s requests.</w:t>
+      </w:r>
+    </w:p>
+    <w:p>
+      <w:pPr>
+        <w:pStyle w:val="Compact"/>
+        <w:numPr>
+          <w:ilvl w:val="0"/>
+          <w:numId w:val="1027"/>
+        </w:numPr>
+      </w:pPr>
+      <w:r>
+        <w:rPr>
+          <w:b/>
+          <w:bCs/>
+        </w:rPr>
+        <w:t xml:space="preserve">Tradeoffs:</w:t>
+      </w:r>
+    </w:p>
+    <w:p>
+      <w:pPr>
+        <w:pStyle w:val="Compact"/>
+        <w:numPr>
+          <w:ilvl w:val="1"/>
+          <w:numId w:val="1029"/>
+        </w:numPr>
+      </w:pPr>
+      <w:r>
+        <w:t xml:space="preserve">Credential renewal and logout work move to the backend; they do not disappear.</w:t>
+      </w:r>
+    </w:p>
+    <w:p>
+      <w:pPr>
+        <w:pStyle w:val="Compact"/>
+        <w:numPr>
+          <w:ilvl w:val="1"/>
+          <w:numId w:val="1029"/>
+        </w:numPr>
+      </w:pPr>
+      <w:r>
+        <w:t xml:space="preserve">Your team operates the proxy and per-user token cache. This adds a request hop and another service whose availability and capacity affect Medplum access.</w:t>
+      </w:r>
+    </w:p>
+    <w:p>
+      <w:pPr>
+        <w:pStyle w:val="Compact"/>
+        <w:numPr>
+          <w:ilvl w:val="1"/>
+          <w:numId w:val="1029"/>
+        </w:numPr>
       </w:pPr>
       <w:r>
         <w:t xml:space="preserve">Live updates need a path from Medplum through your backend to the client. Components expecting a directly authenticated Medplum client need adaptation.</w:t>
@@ -2124,11 +2140,11 @@
     </w:p>
     <w:p>
       <w:pPr>
+        <w:pStyle w:val="Compact"/>
         <w:numPr>
           <w:ilvl w:val="1"/>
-          <w:numId w:val="1028"/>
-        </w:numPr>
-        <w:pStyle w:val="Compact"/>
+          <w:numId w:val="1029"/>
+        </w:numPr>
       </w:pPr>
       <w:r>
         <w:t xml:space="preserve">Every request must resolve to the correct user, membership, and cached token. A shared service token is not a substitute.</w:t>
@@ -2136,16 +2152,16 @@
     </w:p>
     <w:p>
       <w:pPr>
+        <w:pStyle w:val="Compact"/>
         <w:numPr>
           <w:ilvl w:val="0"/>
-          <w:numId w:val="1026"/>
-        </w:numPr>
-        <w:pStyle w:val="Compact"/>
-      </w:pPr>
-      <w:r>
-        <w:rPr>
+          <w:numId w:val="1027"/>
+        </w:numPr>
+      </w:pPr>
+      <w:r>
+        <w:rPr>
+          <w:b/>
           <w:bCs/>
-          <w:b/>
         </w:rPr>
         <w:t xml:space="preserve">Best fit:</w:t>
       </w:r>
@@ -2174,7 +2190,7 @@
       <w:r>
         <w:t xml:space="preserve"> </w:t>
       </w:r>
-      <w:hyperlink r:id="rId47">
+      <w:hyperlink r:id="rId33">
         <w:r>
           <w:rPr>
             <w:rStyle w:val="Hyperlink"/>
@@ -2186,10 +2202,10 @@
         <w:t xml:space="preserve">.</w:t>
       </w:r>
     </w:p>
-    <w:bookmarkEnd w:id="48"/>
-    <w:bookmarkEnd w:id="49"/>
-    <w:bookmarkEnd w:id="50"/>
-    <w:bookmarkStart w:id="53" w:name="option-c-on-behalf-of"/>
+    <w:bookmarkEnd w:id="34"/>
+    <w:bookmarkEnd w:id="35"/>
+    <w:bookmarkEnd w:id="36"/>
+    <w:bookmarkStart w:id="39" w:name="option-c-on-behalf-of"/>
     <w:p>
       <w:pPr>
         <w:pStyle w:val="Heading3"/>
@@ -2235,79 +2251,79 @@
     </w:p>
     <w:p>
       <w:pPr>
+        <w:pStyle w:val="Compact"/>
         <w:numPr>
           <w:ilvl w:val="0"/>
-          <w:numId w:val="1029"/>
-        </w:numPr>
-        <w:pStyle w:val="Compact"/>
-      </w:pPr>
-      <w:r>
-        <w:rPr>
+          <w:numId w:val="1030"/>
+        </w:numPr>
+      </w:pPr>
+      <w:r>
+        <w:rPr>
+          <w:b/>
           <w:bCs/>
-          <w:b/>
         </w:rPr>
         <w:t xml:space="preserve">Advantages:</w:t>
       </w:r>
     </w:p>
     <w:p>
       <w:pPr>
-        <w:numPr>
-          <w:ilvl w:val="1"/>
-          <w:numId w:val="1030"/>
-        </w:numPr>
-        <w:pStyle w:val="Compact"/>
-      </w:pPr>
-      <w:r>
-        <w:t xml:space="preserve">Supports a backend that owns user authentication but cannot exchange a supported external access token.</w:t>
-      </w:r>
-    </w:p>
-    <w:p>
-      <w:pPr>
-        <w:numPr>
-          <w:ilvl w:val="1"/>
-          <w:numId w:val="1030"/>
-        </w:numPr>
-        <w:pStyle w:val="Compact"/>
-      </w:pPr>
-      <w:r>
-        <w:t xml:space="preserve">Retains user attribution and policy enforcement when correctly configured.</w:t>
-      </w:r>
-    </w:p>
-    <w:p>
-      <w:pPr>
-        <w:numPr>
-          <w:ilvl w:val="0"/>
-          <w:numId w:val="1029"/>
-        </w:numPr>
-        <w:pStyle w:val="Compact"/>
-      </w:pPr>
-      <w:r>
-        <w:rPr>
-          <w:bCs/>
-          <w:b/>
-        </w:rPr>
-        <w:t xml:space="preserve">Tradeoffs:</w:t>
-      </w:r>
-    </w:p>
-    <w:p>
-      <w:pPr>
+        <w:pStyle w:val="Compact"/>
         <w:numPr>
           <w:ilvl w:val="1"/>
           <w:numId w:val="1031"/>
         </w:numPr>
-        <w:pStyle w:val="Compact"/>
-      </w:pPr>
-      <w:r>
-        <w:t xml:space="preserve">Requires an application with Project Admin rights and a trusted identity-to-membership mapping.</w:t>
-      </w:r>
-    </w:p>
-    <w:p>
-      <w:pPr>
+      </w:pPr>
+      <w:r>
+        <w:t xml:space="preserve">Supports a backend that owns user authentication but cannot exchange a supported external access token.</w:t>
+      </w:r>
+    </w:p>
+    <w:p>
+      <w:pPr>
+        <w:pStyle w:val="Compact"/>
         <w:numPr>
           <w:ilvl w:val="1"/>
           <w:numId w:val="1031"/>
         </w:numPr>
-        <w:pStyle w:val="Compact"/>
+      </w:pPr>
+      <w:r>
+        <w:t xml:space="preserve">Retains user attribution and policy enforcement when correctly configured.</w:t>
+      </w:r>
+    </w:p>
+    <w:p>
+      <w:pPr>
+        <w:pStyle w:val="Compact"/>
+        <w:numPr>
+          <w:ilvl w:val="0"/>
+          <w:numId w:val="1030"/>
+        </w:numPr>
+      </w:pPr>
+      <w:r>
+        <w:rPr>
+          <w:b/>
+          <w:bCs/>
+        </w:rPr>
+        <w:t xml:space="preserve">Tradeoffs:</w:t>
+      </w:r>
+    </w:p>
+    <w:p>
+      <w:pPr>
+        <w:pStyle w:val="Compact"/>
+        <w:numPr>
+          <w:ilvl w:val="1"/>
+          <w:numId w:val="1032"/>
+        </w:numPr>
+      </w:pPr>
+      <w:r>
+        <w:t xml:space="preserve">Requires an application with Project Admin rights and a trusted identity-to-membership mapping.</w:t>
+      </w:r>
+    </w:p>
+    <w:p>
+      <w:pPr>
+        <w:pStyle w:val="Compact"/>
+        <w:numPr>
+          <w:ilvl w:val="1"/>
+          <w:numId w:val="1032"/>
+        </w:numPr>
       </w:pPr>
       <w:r>
         <w:t xml:space="preserve">Without the header, requests use the application’s own access. A wrong valid membership can act for the wrong user.</w:t>
@@ -2315,11 +2331,11 @@
     </w:p>
     <w:p>
       <w:pPr>
+        <w:pStyle w:val="Compact"/>
         <w:numPr>
           <w:ilvl w:val="1"/>
-          <w:numId w:val="1031"/>
-        </w:numPr>
-        <w:pStyle w:val="Compact"/>
+          <w:numId w:val="1032"/>
+        </w:numPr>
       </w:pPr>
       <w:r>
         <w:t xml:space="preserve">Your backend is responsible for authenticating the person and choosing the delegation context; the header itself is not proof of the user’s identity.</w:t>
@@ -2327,40 +2343,40 @@
     </w:p>
     <w:p>
       <w:pPr>
+        <w:pStyle w:val="Compact"/>
         <w:numPr>
           <w:ilvl w:val="0"/>
-          <w:numId w:val="1029"/>
-        </w:numPr>
-        <w:pStyle w:val="Compact"/>
-      </w:pPr>
-      <w:r>
-        <w:rPr>
+          <w:numId w:val="1030"/>
+        </w:numPr>
+      </w:pPr>
+      <w:r>
+        <w:rPr>
+          <w:b/>
           <w:bCs/>
+        </w:rPr>
+        <w:t xml:space="preserve">Best fit:</w:t>
+      </w:r>
+      <w:r>
+        <w:t xml:space="preserve"> </w:t>
+      </w:r>
+      <w:r>
+        <w:t xml:space="preserve">A legacy backend requires this delegation model and cannot use user-scoped token exchange.</w:t>
+      </w:r>
+    </w:p>
+    <w:p>
+      <w:pPr>
+        <w:pStyle w:val="FirstParagraph"/>
+      </w:pPr>
+      <w:r>
+        <w:t xml:space="preserve">This differs from server-side token exchange: the underlying credential represents the</w:t>
+      </w:r>
+      <w:r>
+        <w:t xml:space="preserve"> </w:t>
+      </w:r>
+      <w:r>
+        <w:rPr>
           <w:b/>
-        </w:rPr>
-        <w:t xml:space="preserve">Best fit:</w:t>
-      </w:r>
-      <w:r>
-        <w:t xml:space="preserve"> </w:t>
-      </w:r>
-      <w:r>
-        <w:t xml:space="preserve">A legacy backend requires this delegation model and cannot use user-scoped token exchange.</w:t>
-      </w:r>
-    </w:p>
-    <w:p>
-      <w:pPr>
-        <w:pStyle w:val="FirstParagraph"/>
-      </w:pPr>
-      <w:r>
-        <w:t xml:space="preserve">This differs from server-side token exchange: the underlying credential represents the</w:t>
-      </w:r>
-      <w:r>
-        <w:t xml:space="preserve"> </w:t>
-      </w:r>
-      <w:r>
-        <w:rPr>
           <w:bCs/>
-          <w:b/>
         </w:rPr>
         <w:t xml:space="preserve">application</w:t>
       </w:r>
@@ -2378,7 +2394,7 @@
       <w:r>
         <w:t xml:space="preserve"> </w:t>
       </w:r>
-      <w:hyperlink r:id="rId51">
+      <w:hyperlink r:id="rId37">
         <w:r>
           <w:rPr>
             <w:rStyle w:val="Hyperlink"/>
@@ -2392,7 +2408,7 @@
       <w:r>
         <w:t xml:space="preserve"> </w:t>
       </w:r>
-      <w:hyperlink r:id="rId52">
+      <w:hyperlink r:id="rId38">
         <w:r>
           <w:rPr>
             <w:rStyle w:val="Hyperlink"/>
@@ -2407,8 +2423,8 @@
         <w:t xml:space="preserve">for attribution metadata and configuration.</w:t>
       </w:r>
     </w:p>
-    <w:bookmarkEnd w:id="53"/>
-    <w:bookmarkStart w:id="54" w:name="recommended-approach-2"/>
+    <w:bookmarkEnd w:id="39"/>
+    <w:bookmarkStart w:id="40" w:name="recommended-approach-2"/>
     <w:p>
       <w:pPr>
         <w:pStyle w:val="Heading3"/>
@@ -2421,25 +2437,23 @@
       <w:tblPr>
         <w:tblStyle w:val="Table"/>
         <w:tblW w:w="9360" w:type="dxa"/>
+        <w:tblLayout w:type="fixed"/>
         <w:tblLook w:firstRow="1" w:lastRow="0" w:firstColumn="0" w:lastColumn="0" w:noHBand="0" w:noVBand="0" w:val="0020"/>
-        <w:jc w:val="start"/>
-        <w:tblLayout w:type="fixed"/>
       </w:tblPr>
       <w:tblGrid>
-        <w:gridCol w:w="4631"/>
-        <w:gridCol w:w="4729"/>
+        <w:gridCol w:w="4586"/>
+        <w:gridCol w:w="4774"/>
       </w:tblGrid>
       <w:tr>
         <w:trPr>
           <w:cantSplit/>
-          <w:tblHeader w:val="true"/>
+          <w:tblHeader w:val="on"/>
         </w:trPr>
         <w:tc>
           <w:tcPr/>
           <w:p>
             <w:pPr>
               <w:pStyle w:val="Compact"/>
-              <w:jc w:val="left"/>
             </w:pPr>
             <w:r>
               <w:t xml:space="preserve">Situation</w:t>
@@ -2451,7 +2465,6 @@
           <w:p>
             <w:pPr>
               <w:pStyle w:val="Compact"/>
-              <w:jc w:val="left"/>
             </w:pPr>
             <w:r>
               <w:t xml:space="preserve">Approach</w:t>
@@ -2468,10 +2481,9 @@
           <w:p>
             <w:pPr>
               <w:pStyle w:val="Compact"/>
-              <w:jc w:val="left"/>
             </w:pPr>
             <w:r>
-              <w:t xml:space="preserve">External IDP, redirect login, and primarily Medplum client access</w:t>
+              <w:t xml:space="preserve">Medplum can handle the external IDP callback, and the client primarily needs Medplum access</w:t>
             </w:r>
           </w:p>
         </w:tc>
@@ -2480,7 +2492,6 @@
           <w:p>
             <w:pPr>
               <w:pStyle w:val="Compact"/>
-              <w:jc w:val="left"/>
             </w:pPr>
             <w:r>
               <w:t xml:space="preserve">Start with the authorization-code flow.</w:t>
@@ -2497,10 +2508,9 @@
           <w:p>
             <w:pPr>
               <w:pStyle w:val="Compact"/>
-              <w:jc w:val="left"/>
             </w:pPr>
             <w:r>
-              <w:t xml:space="preserve">Existing external login and direct Medplum client access</w:t>
+              <w:t xml:space="preserve">Application obtains a supported external access token through its own login flow and needs direct Medplum client access</w:t>
             </w:r>
           </w:p>
         </w:tc>
@@ -2509,7 +2519,6 @@
           <w:p>
             <w:pPr>
               <w:pStyle w:val="Compact"/>
-              <w:jc w:val="left"/>
             </w:pPr>
             <w:r>
               <w:t xml:space="preserve">Use token exchange with Medplum tokens in the client.</w:t>
@@ -2526,10 +2535,9 @@
           <w:p>
             <w:pPr>
               <w:pStyle w:val="Compact"/>
-              <w:jc w:val="left"/>
             </w:pPr>
             <w:r>
-              <w:t xml:space="preserve">Existing external login and backend-mediated Medplum access</w:t>
+              <w:t xml:space="preserve">Application obtains a supported external access token through its own login flow and mediates Medplum access through its backend</w:t>
             </w:r>
           </w:p>
         </w:tc>
@@ -2538,7 +2546,6 @@
           <w:p>
             <w:pPr>
               <w:pStyle w:val="Compact"/>
-              <w:jc w:val="left"/>
             </w:pPr>
             <w:r>
               <w:t xml:space="preserve">Use token exchange with Medplum tokens on the server.</w:t>
@@ -2555,7 +2562,6 @@
           <w:p>
             <w:pPr>
               <w:pStyle w:val="Compact"/>
-              <w:jc w:val="left"/>
             </w:pPr>
             <w:r>
               <w:t xml:space="preserve">Backend can use either user-scoped exchange or On-Behalf-Of</w:t>
@@ -2567,7 +2573,6 @@
           <w:p>
             <w:pPr>
               <w:pStyle w:val="Compact"/>
-              <w:jc w:val="left"/>
             </w:pPr>
             <w:r>
               <w:t xml:space="preserve">Prefer user-scoped exchange to avoid depending on a privileged application credential and a delegation header.</w:t>
@@ -2584,7 +2589,6 @@
           <w:p>
             <w:pPr>
               <w:pStyle w:val="Compact"/>
-              <w:jc w:val="left"/>
             </w:pPr>
             <w:r>
               <w:t xml:space="preserve">Legacy authentication prevents supported token exchange</w:t>
@@ -2596,7 +2600,6 @@
           <w:p>
             <w:pPr>
               <w:pStyle w:val="Compact"/>
-              <w:jc w:val="left"/>
             </w:pPr>
             <w:r>
               <w:t xml:space="preserve">Evaluate On-Behalf-Of with explicit ownership of authentication, mapping, and delegation controls.</w:t>
@@ -2611,8 +2614,8 @@
       </w:pPr>
       <w:r>
         <w:rPr>
+          <w:b/>
           <w:bCs/>
-          <w:b/>
         </w:rPr>
         <w:t xml:space="preserve">Record:</w:t>
       </w:r>
@@ -2623,9 +2626,9 @@
         <w:t xml:space="preserve">Token flow, token location, membership-selection rules, and ownership of proxy operations and credential lifecycles.</w:t>
       </w:r>
     </w:p>
-    <w:bookmarkEnd w:id="54"/>
-    <w:bookmarkEnd w:id="55"/>
-    <w:bookmarkStart w:id="68" w:name="additional-decisions"/>
+    <w:bookmarkEnd w:id="40"/>
+    <w:bookmarkEnd w:id="41"/>
+    <w:bookmarkStart w:id="54" w:name="additional-decisions"/>
     <w:p>
       <w:pPr>
         <w:pStyle w:val="Heading2"/>
@@ -2642,7 +2645,7 @@
         <w:t xml:space="preserve">Resolve these after choosing the main architecture. Use the technical docs for configuration details.</w:t>
       </w:r>
     </w:p>
-    <w:bookmarkStart w:id="57" w:name="X67940e01c9738229487d4098b5e4781eb267b97"/>
+    <w:bookmarkStart w:id="43" w:name="X67940e01c9738229487d4098b5e4781eb267b97"/>
     <w:p>
       <w:pPr>
         <w:pStyle w:val="Heading3"/>
@@ -2717,9 +2720,8 @@
       <w:tblPr>
         <w:tblStyle w:val="Table"/>
         <w:tblW w:w="9360" w:type="dxa"/>
+        <w:tblLayout w:type="fixed"/>
         <w:tblLook w:firstRow="1" w:lastRow="0" w:firstColumn="0" w:lastColumn="0" w:noHBand="0" w:noVBand="0" w:val="0020"/>
-        <w:jc w:val="start"/>
-        <w:tblLayout w:type="fixed"/>
       </w:tblPr>
       <w:tblGrid>
         <w:gridCol w:w="4611"/>
@@ -2728,14 +2730,13 @@
       <w:tr>
         <w:trPr>
           <w:cantSplit/>
-          <w:tblHeader w:val="true"/>
+          <w:tblHeader w:val="on"/>
         </w:trPr>
         <w:tc>
           <w:tcPr/>
           <w:p>
             <w:pPr>
               <w:pStyle w:val="Compact"/>
-              <w:jc w:val="left"/>
             </w:pPr>
             <w:r>
               <w:t xml:space="preserve">Situation</w:t>
@@ -2747,7 +2748,6 @@
           <w:p>
             <w:pPr>
               <w:pStyle w:val="Compact"/>
-              <w:jc w:val="left"/>
             </w:pPr>
             <w:r>
               <w:t xml:space="preserve">Approach</w:t>
@@ -2764,7 +2764,6 @@
           <w:p>
             <w:pPr>
               <w:pStyle w:val="Compact"/>
-              <w:jc w:val="left"/>
             </w:pPr>
             <w:r>
               <w:t xml:space="preserve">Patients and clinicians primarily use one production project</w:t>
@@ -2776,7 +2775,6 @@
           <w:p>
             <w:pPr>
               <w:pStyle w:val="Compact"/>
-              <w:jc w:val="left"/>
             </w:pPr>
             <w:r>
               <w:t xml:space="preserve">Explicitly choose project-scoped users; the Practitioner default is server-scoped.</w:t>
@@ -2793,7 +2791,6 @@
           <w:p>
             <w:pPr>
               <w:pStyle w:val="Compact"/>
-              <w:jc w:val="left"/>
             </w:pPr>
             <w:r>
               <w:t xml:space="preserve">Developers or administrators need multiple projects</w:t>
@@ -2805,7 +2802,6 @@
           <w:p>
             <w:pPr>
               <w:pStyle w:val="Compact"/>
-              <w:jc w:val="left"/>
             </w:pPr>
             <w:r>
               <w:t xml:space="preserve">Evaluate server-scoped users and the required memberships. Hosted administrative control differs by user scope.</w:t>
@@ -2822,7 +2818,6 @@
           <w:p>
             <w:pPr>
               <w:pStyle w:val="Compact"/>
-              <w:jc w:val="left"/>
             </w:pPr>
             <w:r>
               <w:t xml:space="preserve">Token exchange has multiple candidate memberships</w:t>
@@ -2834,7 +2829,6 @@
           <w:p>
             <w:pPr>
               <w:pStyle w:val="Compact"/>
-              <w:jc w:val="left"/>
             </w:pPr>
             <w:r>
               <w:t xml:space="preserve">Pass the intended</w:t>
@@ -2866,7 +2860,6 @@
           <w:p>
             <w:pPr>
               <w:pStyle w:val="Compact"/>
-              <w:jc w:val="left"/>
             </w:pPr>
             <w:r>
               <w:t xml:space="preserve">Exchange must reach another project</w:t>
@@ -2878,7 +2871,6 @@
           <w:p>
             <w:pPr>
               <w:pStyle w:val="Compact"/>
-              <w:jc w:val="left"/>
             </w:pPr>
             <w:r>
               <w:t xml:space="preserve">A per-</w:t>
@@ -2909,7 +2901,7 @@
       <w:r>
         <w:t xml:space="preserve"> </w:t>
       </w:r>
-      <w:hyperlink r:id="rId24">
+      <w:hyperlink r:id="rId13">
         <w:r>
           <w:rPr>
             <w:rStyle w:val="Hyperlink"/>
@@ -2923,7 +2915,7 @@
       <w:r>
         <w:t xml:space="preserve"> </w:t>
       </w:r>
-      <w:hyperlink r:id="rId56">
+      <w:hyperlink r:id="rId42">
         <w:r>
           <w:rPr>
             <w:rStyle w:val="Hyperlink"/>
@@ -2937,7 +2929,7 @@
       <w:r>
         <w:t xml:space="preserve"> </w:t>
       </w:r>
-      <w:hyperlink r:id="rId47">
+      <w:hyperlink r:id="rId33">
         <w:r>
           <w:rPr>
             <w:rStyle w:val="Hyperlink"/>
@@ -2949,8 +2941,8 @@
         <w:t xml:space="preserve">.</w:t>
       </w:r>
     </w:p>
-    <w:bookmarkEnd w:id="57"/>
-    <w:bookmarkStart w:id="61" w:name="Xf68f2466a7c976f836933c670cad8e62d95f1e6"/>
+    <w:bookmarkEnd w:id="43"/>
+    <w:bookmarkStart w:id="47" w:name="Xf68f2466a7c976f836933c670cad8e62d95f1e6"/>
     <w:p>
       <w:pPr>
         <w:pStyle w:val="Heading3"/>
@@ -2985,7 +2977,7 @@
       <w:r>
         <w:t xml:space="preserve"> </w:t>
       </w:r>
-      <w:hyperlink r:id="rId58">
+      <w:hyperlink r:id="rId44">
         <w:r>
           <w:rPr>
             <w:rStyle w:val="Hyperlink"/>
@@ -2999,7 +2991,7 @@
       <w:r>
         <w:t xml:space="preserve"> </w:t>
       </w:r>
-      <w:hyperlink r:id="rId59">
+      <w:hyperlink r:id="rId45">
         <w:r>
           <w:rPr>
             <w:rStyle w:val="Hyperlink"/>
@@ -3013,7 +3005,7 @@
       <w:r>
         <w:t xml:space="preserve"> </w:t>
       </w:r>
-      <w:hyperlink r:id="rId60">
+      <w:hyperlink r:id="rId46">
         <w:r>
           <w:rPr>
             <w:rStyle w:val="Hyperlink"/>
@@ -3025,8 +3017,8 @@
         <w:t xml:space="preserve">.</w:t>
       </w:r>
     </w:p>
-    <w:bookmarkEnd w:id="61"/>
-    <w:bookmarkStart w:id="67" w:name="do-you-need-a-specialized-flow"/>
+    <w:bookmarkEnd w:id="47"/>
+    <w:bookmarkStart w:id="53" w:name="do-you-need-a-specialized-flow"/>
     <w:p>
       <w:pPr>
         <w:pStyle w:val="Heading3"/>
@@ -3039,9 +3031,8 @@
       <w:tblPr>
         <w:tblStyle w:val="Table"/>
         <w:tblW w:w="9360" w:type="dxa"/>
+        <w:tblLayout w:type="fixed"/>
         <w:tblLook w:firstRow="1" w:lastRow="0" w:firstColumn="0" w:lastColumn="0" w:noHBand="0" w:noVBand="0" w:val="0020"/>
-        <w:jc w:val="start"/>
-        <w:tblLayout w:type="fixed"/>
       </w:tblPr>
       <w:tblGrid>
         <w:gridCol w:w="4705"/>
@@ -3050,14 +3041,13 @@
       <w:tr>
         <w:trPr>
           <w:cantSplit/>
-          <w:tblHeader w:val="true"/>
+          <w:tblHeader w:val="on"/>
         </w:trPr>
         <w:tc>
           <w:tcPr/>
           <w:p>
             <w:pPr>
               <w:pStyle w:val="Compact"/>
-              <w:jc w:val="left"/>
             </w:pPr>
             <w:r>
               <w:t xml:space="preserve">Situation</w:t>
@@ -3069,7 +3059,6 @@
           <w:p>
             <w:pPr>
               <w:pStyle w:val="Compact"/>
-              <w:jc w:val="left"/>
             </w:pPr>
             <w:r>
               <w:t xml:space="preserve">Approach</w:t>
@@ -3086,7 +3075,6 @@
           <w:p>
             <w:pPr>
               <w:pStyle w:val="Compact"/>
-              <w:jc w:val="left"/>
             </w:pPr>
             <w:r>
               <w:t xml:space="preserve">Background service acts as itself</w:t>
@@ -3098,7 +3086,6 @@
           <w:p>
             <w:pPr>
               <w:pStyle w:val="Compact"/>
-              <w:jc w:val="left"/>
             </w:pPr>
             <w:r>
               <w:t xml:space="preserve">Use</w:t>
@@ -3106,7 +3093,7 @@
             <w:r>
               <w:t xml:space="preserve"> </w:t>
             </w:r>
-            <w:hyperlink r:id="rId51">
+            <w:hyperlink r:id="rId37">
               <w:r>
                 <w:rPr>
                   <w:rStyle w:val="Hyperlink"/>
@@ -3144,7 +3131,6 @@
           <w:p>
             <w:pPr>
               <w:pStyle w:val="Compact"/>
-              <w:jc w:val="left"/>
             </w:pPr>
             <w:r>
               <w:t xml:space="preserve">Browser or native authorization-code client</w:t>
@@ -3156,7 +3142,6 @@
           <w:p>
             <w:pPr>
               <w:pStyle w:val="Compact"/>
-              <w:jc w:val="left"/>
             </w:pPr>
             <w:r>
               <w:t xml:space="preserve">Use PKCE and documented redirect protections. Native apps should authorize through the system browser. Never embed a confidential client secret in browser code or a mobile binary. See</w:t>
@@ -3164,7 +3149,7 @@
             <w:r>
               <w:t xml:space="preserve"> </w:t>
             </w:r>
-            <w:hyperlink r:id="rId62">
+            <w:hyperlink r:id="rId48">
               <w:r>
                 <w:rPr>
                   <w:rStyle w:val="Hyperlink"/>
@@ -3181,7 +3166,7 @@
             <w:r>
               <w:t xml:space="preserve"> </w:t>
             </w:r>
-            <w:hyperlink r:id="rId63">
+            <w:hyperlink r:id="rId49">
               <w:r>
                 <w:rPr>
                   <w:rStyle w:val="Hyperlink"/>
@@ -3204,7 +3189,6 @@
           <w:p>
             <w:pPr>
               <w:pStyle w:val="Compact"/>
-              <w:jc w:val="left"/>
             </w:pPr>
             <w:r>
               <w:t xml:space="preserve">Self-hosted deployment must accept external JWTs directly</w:t>
@@ -3216,7 +3200,6 @@
           <w:p>
             <w:pPr>
               <w:pStyle w:val="Compact"/>
-              <w:jc w:val="left"/>
             </w:pPr>
             <w:r>
               <w:t xml:space="preserve">Evaluate</w:t>
@@ -3224,7 +3207,7 @@
             <w:r>
               <w:t xml:space="preserve"> </w:t>
             </w:r>
-            <w:hyperlink r:id="rId64">
+            <w:hyperlink r:id="rId50">
               <w:r>
                 <w:rPr>
                   <w:rStyle w:val="Hyperlink"/>
@@ -3247,7 +3230,6 @@
           <w:p>
             <w:pPr>
               <w:pStyle w:val="Compact"/>
-              <w:jc w:val="left"/>
             </w:pPr>
             <w:r>
               <w:t xml:space="preserve">Third-party app needs a SMART launch</w:t>
@@ -3259,7 +3241,6 @@
           <w:p>
             <w:pPr>
               <w:pStyle w:val="Compact"/>
-              <w:jc w:val="left"/>
             </w:pPr>
             <w:r>
               <w:t xml:space="preserve">Use the</w:t>
@@ -3267,7 +3248,7 @@
             <w:r>
               <w:t xml:space="preserve"> </w:t>
             </w:r>
-            <w:hyperlink r:id="rId65">
+            <w:hyperlink r:id="rId51">
               <w:r>
                 <w:rPr>
                   <w:rStyle w:val="Hyperlink"/>
@@ -3290,7 +3271,6 @@
           <w:p>
             <w:pPr>
               <w:pStyle w:val="Compact"/>
-              <w:jc w:val="left"/>
             </w:pPr>
             <w:r>
               <w:t xml:space="preserve">Activation precedes account creation</w:t>
@@ -3302,7 +3282,6 @@
           <w:p>
             <w:pPr>
               <w:pStyle w:val="Compact"/>
-              <w:jc w:val="left"/>
             </w:pPr>
             <w:r>
               <w:t xml:space="preserve">Follow the</w:t>
@@ -3310,7 +3289,7 @@
             <w:r>
               <w:t xml:space="preserve"> </w:t>
             </w:r>
-            <w:hyperlink r:id="rId66">
+            <w:hyperlink r:id="rId52">
               <w:r>
                 <w:rPr>
                   <w:rStyle w:val="Hyperlink"/>
@@ -3325,9 +3304,9 @@
         </w:tc>
       </w:tr>
     </w:tbl>
-    <w:bookmarkEnd w:id="67"/>
-    <w:bookmarkEnd w:id="68"/>
-    <w:bookmarkStart w:id="69" w:name="before-you-implement"/>
+    <w:bookmarkEnd w:id="53"/>
+    <w:bookmarkEnd w:id="54"/>
+    <w:bookmarkStart w:id="55" w:name="before-you-implement"/>
     <w:p>
       <w:pPr>
         <w:pStyle w:val="Heading2"/>
@@ -3344,8 +3323,8 @@
         <w:t xml:space="preserve">Record the three architecture choices for each user population, then test first login, email change, account recovery, membership switching, token expiry, logout, and offboarding. For proxies, verify that missing user context fails without falling back to application credentials.</w:t>
       </w:r>
     </w:p>
-    <w:bookmarkEnd w:id="69"/>
-    <w:bookmarkEnd w:id="70"/>
+    <w:bookmarkEnd w:id="55"/>
+    <w:bookmarkEnd w:id="56"/>
     <w:sectPr>
       <w:pgSz w:h="15840" w:w="12240"/>
       <w:pgMar w:bottom="1440" w:footer="720" w:gutter="0" w:header="720" w:left="1440" w:right="1440" w:top="1440"/>
@@ -3383,14 +3362,14 @@
 <file path=word/numbering.xml><?xml version="1.0" encoding="utf-8"?>
 <w:numbering xmlns:w="http://schemas.openxmlformats.org/wordprocessingml/2006/main">
   <w:abstractNum w:abstractNumId="990">
-    <w:nsid w:val="A990"/>
+    <w:nsid w:val="0000A990"/>
     <w:multiLevelType w:val="multilevel"/>
     <w:lvl w:ilvl="0">
       <w:numFmt w:val="bullet"/>
       <w:lvlText w:val=" "/>
       <w:lvlJc w:val="left"/>
       <w:pPr>
-        <w:ind w:left="720" w:hanging="480"/>
+        <w:ind w:left="720" w:hanging="360"/>
       </w:pPr>
     </w:lvl>
     <w:lvl w:ilvl="1">
@@ -3398,7 +3377,7 @@
       <w:lvlText w:val=" "/>
       <w:lvlJc w:val="left"/>
       <w:pPr>
-        <w:ind w:left="1440" w:hanging="480"/>
+        <w:ind w:left="1440" w:hanging="360"/>
       </w:pPr>
     </w:lvl>
     <w:lvl w:ilvl="2">
@@ -3406,7 +3385,7 @@
       <w:lvlText w:val=" "/>
       <w:lvlJc w:val="left"/>
       <w:pPr>
-        <w:ind w:left="2160" w:hanging="480"/>
+        <w:ind w:left="2160" w:hanging="360"/>
       </w:pPr>
     </w:lvl>
     <w:lvl w:ilvl="3">
@@ -3414,7 +3393,7 @@
       <w:lvlText w:val=" "/>
       <w:lvlJc w:val="left"/>
       <w:pPr>
-        <w:ind w:left="2880" w:hanging="480"/>
+        <w:ind w:left="2880" w:hanging="360"/>
       </w:pPr>
     </w:lvl>
     <w:lvl w:ilvl="4">
@@ -3422,7 +3401,7 @@
       <w:lvlText w:val=" "/>
       <w:lvlJc w:val="left"/>
       <w:pPr>
-        <w:ind w:left="3600" w:hanging="480"/>
+        <w:ind w:left="3600" w:hanging="360"/>
       </w:pPr>
     </w:lvl>
     <w:lvl w:ilvl="5">
@@ -3430,7 +3409,7 @@
       <w:lvlText w:val=" "/>
       <w:lvlJc w:val="left"/>
       <w:pPr>
-        <w:ind w:left="4320" w:hanging="480"/>
+        <w:ind w:left="4320" w:hanging="360"/>
       </w:pPr>
     </w:lvl>
     <w:lvl w:ilvl="6">
@@ -3438,7 +3417,7 @@
       <w:lvlText w:val=" "/>
       <w:lvlJc w:val="left"/>
       <w:pPr>
-        <w:ind w:left="5040" w:hanging="480"/>
+        <w:ind w:left="5040" w:hanging="360"/>
       </w:pPr>
     </w:lvl>
     <w:lvl w:ilvl="7">
@@ -3446,7 +3425,7 @@
       <w:lvlText w:val=" "/>
       <w:lvlJc w:val="left"/>
       <w:pPr>
-        <w:ind w:left="5760" w:hanging="480"/>
+        <w:ind w:left="5760" w:hanging="360"/>
       </w:pPr>
     </w:lvl>
     <w:lvl w:ilvl="8">
@@ -3454,88 +3433,12 @@
       <w:lvlText w:val=" "/>
       <w:lvlJc w:val="left"/>
       <w:pPr>
-        <w:ind w:left="6480" w:hanging="480"/>
-      </w:pPr>
-    </w:lvl>
-  </w:abstractNum>
-  <w:abstractNum w:abstractNumId="991">
-    <w:nsid w:val="A991"/>
-    <w:multiLevelType w:val="multilevel"/>
-    <w:lvl w:ilvl="0">
-      <w:numFmt w:val="bullet"/>
-      <w:lvlText w:val="•"/>
-      <w:lvlJc w:val="left"/>
-      <w:pPr>
-        <w:ind w:left="720" w:hanging="480"/>
-      </w:pPr>
-    </w:lvl>
-    <w:lvl w:ilvl="1">
-      <w:numFmt w:val="bullet"/>
-      <w:lvlText w:val="–"/>
-      <w:lvlJc w:val="left"/>
-      <w:pPr>
-        <w:ind w:left="1440" w:hanging="480"/>
-      </w:pPr>
-    </w:lvl>
-    <w:lvl w:ilvl="2">
-      <w:numFmt w:val="bullet"/>
-      <w:lvlText w:val="•"/>
-      <w:lvlJc w:val="left"/>
-      <w:pPr>
-        <w:ind w:left="2160" w:hanging="480"/>
-      </w:pPr>
-    </w:lvl>
-    <w:lvl w:ilvl="3">
-      <w:numFmt w:val="bullet"/>
-      <w:lvlText w:val="–"/>
-      <w:lvlJc w:val="left"/>
-      <w:pPr>
-        <w:ind w:left="2880" w:hanging="480"/>
-      </w:pPr>
-    </w:lvl>
-    <w:lvl w:ilvl="4">
-      <w:numFmt w:val="bullet"/>
-      <w:lvlText w:val="•"/>
-      <w:lvlJc w:val="left"/>
-      <w:pPr>
-        <w:ind w:left="3600" w:hanging="480"/>
-      </w:pPr>
-    </w:lvl>
-    <w:lvl w:ilvl="5">
-      <w:numFmt w:val="bullet"/>
-      <w:lvlText w:val="–"/>
-      <w:lvlJc w:val="left"/>
-      <w:pPr>
-        <w:ind w:left="4320" w:hanging="480"/>
-      </w:pPr>
-    </w:lvl>
-    <w:lvl w:ilvl="6">
-      <w:numFmt w:val="bullet"/>
-      <w:lvlText w:val="•"/>
-      <w:lvlJc w:val="left"/>
-      <w:pPr>
-        <w:ind w:left="5040" w:hanging="480"/>
-      </w:pPr>
-    </w:lvl>
-    <w:lvl w:ilvl="7">
-      <w:numFmt w:val="bullet"/>
-      <w:lvlText w:val="–"/>
-      <w:lvlJc w:val="left"/>
-      <w:pPr>
-        <w:ind w:left="5760" w:hanging="480"/>
-      </w:pPr>
-    </w:lvl>
-    <w:lvl w:ilvl="8">
-      <w:numFmt w:val="bullet"/>
-      <w:lvlText w:val="•"/>
-      <w:lvlJc w:val="left"/>
-      <w:pPr>
-        <w:ind w:left="6480" w:hanging="480"/>
+        <w:ind w:left="6480" w:hanging="360"/>
       </w:pPr>
     </w:lvl>
   </w:abstractNum>
   <w:abstractNum w:abstractNumId="99411">
-    <w:nsid w:val="A99411"/>
+    <w:nsid w:val="00A99411"/>
     <w:multiLevelType w:val="multilevel"/>
     <w:lvl w:ilvl="0">
       <w:start w:val="1"/>
@@ -3543,7 +3446,7 @@
       <w:lvlText w:val="%1."/>
       <w:lvlJc w:val="left"/>
       <w:pPr>
-        <w:ind w:left="720" w:hanging="480"/>
+        <w:ind w:left="720" w:hanging="360"/>
       </w:pPr>
     </w:lvl>
     <w:lvl w:ilvl="1">
@@ -3552,7 +3455,7 @@
       <w:lvlText w:val="%2."/>
       <w:lvlJc w:val="left"/>
       <w:pPr>
-        <w:ind w:left="1440" w:hanging="480"/>
+        <w:ind w:left="1440" w:hanging="360"/>
       </w:pPr>
     </w:lvl>
     <w:lvl w:ilvl="2">
@@ -3561,7 +3464,7 @@
       <w:lvlText w:val="%3."/>
       <w:lvlJc w:val="left"/>
       <w:pPr>
-        <w:ind w:left="2160" w:hanging="480"/>
+        <w:ind w:left="2160" w:hanging="360"/>
       </w:pPr>
     </w:lvl>
     <w:lvl w:ilvl="3">
@@ -3570,7 +3473,7 @@
       <w:lvlText w:val="%4."/>
       <w:lvlJc w:val="left"/>
       <w:pPr>
-        <w:ind w:left="2880" w:hanging="480"/>
+        <w:ind w:left="2880" w:hanging="360"/>
       </w:pPr>
     </w:lvl>
     <w:lvl w:ilvl="4">
@@ -3579,7 +3482,7 @@
       <w:lvlText w:val="%5."/>
       <w:lvlJc w:val="left"/>
       <w:pPr>
-        <w:ind w:left="3600" w:hanging="480"/>
+        <w:ind w:left="3600" w:hanging="360"/>
       </w:pPr>
     </w:lvl>
     <w:lvl w:ilvl="5">
@@ -3588,7 +3491,7 @@
       <w:lvlText w:val="%6."/>
       <w:lvlJc w:val="left"/>
       <w:pPr>
-        <w:ind w:left="4320" w:hanging="480"/>
+        <w:ind w:left="4320" w:hanging="360"/>
       </w:pPr>
     </w:lvl>
     <w:lvl w:ilvl="6">
@@ -3597,7 +3500,7 @@
       <w:lvlText w:val="%7."/>
       <w:lvlJc w:val="left"/>
       <w:pPr>
-        <w:ind w:left="5040" w:hanging="480"/>
+        <w:ind w:left="5040" w:hanging="360"/>
       </w:pPr>
     </w:lvl>
     <w:lvl w:ilvl="7">
@@ -3606,7 +3509,7 @@
       <w:lvlText w:val="%8."/>
       <w:lvlJc w:val="left"/>
       <w:pPr>
-        <w:ind w:left="5760" w:hanging="480"/>
+        <w:ind w:left="5760" w:hanging="360"/>
       </w:pPr>
     </w:lvl>
     <w:lvl w:ilvl="8">
@@ -3615,15 +3518,145 @@
       <w:lvlText w:val="%9."/>
       <w:lvlJc w:val="left"/>
       <w:pPr>
-        <w:ind w:left="6480" w:hanging="480"/>
-      </w:pPr>
+        <w:ind w:left="6480" w:hanging="360"/>
+      </w:pPr>
+    </w:lvl>
+  </w:abstractNum>
+  <w:abstractNum w:abstractNumId="991">
+    <w:nsid w:val="0000A991"/>
+    <w:multiLevelType w:val="multilevel"/>
+    <w:lvl w:ilvl="0">
+      <w:numFmt w:val="bullet"/>
+      <w:lvlText w:val=""/>
+      <w:lvlJc w:val="left"/>
+      <w:pPr>
+        <w:ind w:left="720" w:hanging="360"/>
+      </w:pPr>
+      <w:rPr>
+        <w:rFonts w:ascii="Symbol" w:hAnsi="Symbol" w:cs="Symbol" w:hint="default"/>
+      </w:rPr>
+    </w:lvl>
+    <w:lvl w:ilvl="1">
+      <w:numFmt w:val="bullet"/>
+      <w:lvlText w:val="o"/>
+      <w:lvlJc w:val="left"/>
+      <w:pPr>
+        <w:ind w:left="1440" w:hanging="360"/>
+      </w:pPr>
+      <w:rPr>
+        <w:rFonts w:ascii="Courier New" w:hAnsi="Courier New" w:cs="Courier New" w:hint="default"/>
+      </w:rPr>
+    </w:lvl>
+    <w:lvl w:ilvl="2">
+      <w:numFmt w:val="bullet"/>
+      <w:lvlText w:val=""/>
+      <w:lvlJc w:val="left"/>
+      <w:pPr>
+        <w:ind w:left="2160" w:hanging="360"/>
+      </w:pPr>
+      <w:rPr>
+        <w:rFonts w:ascii="Wingdings" w:hAnsi="Wingdings" w:cs="Wingdings" w:hint="default"/>
+      </w:rPr>
+    </w:lvl>
+    <w:lvl w:ilvl="3">
+      <w:numFmt w:val="bullet"/>
+      <w:lvlText w:val=""/>
+      <w:lvlJc w:val="left"/>
+      <w:pPr>
+        <w:ind w:left="2880" w:hanging="360"/>
+      </w:pPr>
+      <w:rPr>
+        <w:rFonts w:ascii="Symbol" w:hAnsi="Symbol" w:cs="Symbol" w:hint="default"/>
+      </w:rPr>
+    </w:lvl>
+    <w:lvl w:ilvl="4">
+      <w:numFmt w:val="bullet"/>
+      <w:lvlText w:val="o"/>
+      <w:lvlJc w:val="left"/>
+      <w:pPr>
+        <w:ind w:left="3600" w:hanging="360"/>
+      </w:pPr>
+      <w:rPr>
+        <w:rFonts w:ascii="Courier New" w:hAnsi="Courier New" w:cs="Courier New" w:hint="default"/>
+      </w:rPr>
+    </w:lvl>
+    <w:lvl w:ilvl="5">
+      <w:numFmt w:val="bullet"/>
+      <w:lvlText w:val=""/>
+      <w:lvlJc w:val="left"/>
+      <w:pPr>
+        <w:ind w:left="4320" w:hanging="360"/>
+      </w:pPr>
+      <w:rPr>
+        <w:rFonts w:ascii="Wingdings" w:hAnsi="Wingdings" w:cs="Wingdings" w:hint="default"/>
+      </w:rPr>
+    </w:lvl>
+    <w:lvl w:ilvl="6">
+      <w:numFmt w:val="bullet"/>
+      <w:lvlText w:val=""/>
+      <w:lvlJc w:val="left"/>
+      <w:pPr>
+        <w:ind w:left="5040" w:hanging="360"/>
+      </w:pPr>
+      <w:rPr>
+        <w:rFonts w:ascii="Symbol" w:hAnsi="Symbol" w:cs="Symbol" w:hint="default"/>
+      </w:rPr>
+    </w:lvl>
+    <w:lvl w:ilvl="7">
+      <w:numFmt w:val="bullet"/>
+      <w:lvlText w:val="o"/>
+      <w:lvlJc w:val="left"/>
+      <w:pPr>
+        <w:ind w:left="5760" w:hanging="360"/>
+      </w:pPr>
+      <w:rPr>
+        <w:rFonts w:ascii="Courier New" w:hAnsi="Courier New" w:cs="Courier New" w:hint="default"/>
+      </w:rPr>
+    </w:lvl>
+    <w:lvl w:ilvl="8">
+      <w:numFmt w:val="bullet"/>
+      <w:lvlText w:val=""/>
+      <w:lvlJc w:val="left"/>
+      <w:pPr>
+        <w:ind w:left="6480" w:hanging="360"/>
+      </w:pPr>
+      <w:rPr>
+        <w:rFonts w:ascii="Wingdings" w:hAnsi="Wingdings" w:cs="Wingdings" w:hint="default"/>
+      </w:rPr>
     </w:lvl>
   </w:abstractNum>
   <w:num w:numId="1000">
     <w:abstractNumId w:val="990"/>
   </w:num>
   <w:num w:numId="1001">
-    <w:abstractNumId w:val="991"/>
+    <w:abstractNumId w:val="99411"/>
+    <w:lvlOverride w:ilvl="0">
+      <w:startOverride w:val="1"/>
+    </w:lvlOverride>
+    <w:lvlOverride w:ilvl="1">
+      <w:startOverride w:val="1"/>
+    </w:lvlOverride>
+    <w:lvlOverride w:ilvl="2">
+      <w:startOverride w:val="1"/>
+    </w:lvlOverride>
+    <w:lvlOverride w:ilvl="3">
+      <w:startOverride w:val="1"/>
+    </w:lvlOverride>
+    <w:lvlOverride w:ilvl="4">
+      <w:startOverride w:val="1"/>
+    </w:lvlOverride>
+    <w:lvlOverride w:ilvl="5">
+      <w:startOverride w:val="1"/>
+    </w:lvlOverride>
+    <w:lvlOverride w:ilvl="6">
+      <w:startOverride w:val="1"/>
+    </w:lvlOverride>
+    <w:lvlOverride w:ilvl="7">
+      <w:startOverride w:val="1"/>
+    </w:lvlOverride>
+    <w:lvlOverride w:ilvl="8">
+      <w:startOverride w:val="1"/>
+    </w:lvlOverride>
   </w:num>
   <w:num w:numId="1002">
     <w:abstractNumId w:val="991"/>
@@ -3668,6 +3701,9 @@
     <w:abstractNumId w:val="991"/>
   </w:num>
   <w:num w:numId="1016">
+    <w:abstractNumId w:val="991"/>
+  </w:num>
+  <w:num w:numId="1017">
     <w:abstractNumId w:val="99411"/>
     <w:lvlOverride w:ilvl="0">
       <w:startOverride w:val="1"/>
@@ -3696,9 +3732,6 @@
     <w:lvlOverride w:ilvl="8">
       <w:startOverride w:val="1"/>
     </w:lvlOverride>
-  </w:num>
-  <w:num w:numId="1017">
-    <w:abstractNumId w:val="991"/>
   </w:num>
   <w:num w:numId="1018">
     <w:abstractNumId w:val="991"/>
@@ -3742,6 +3775,9 @@
   <w:num w:numId="1031">
     <w:abstractNumId w:val="991"/>
   </w:num>
+  <w:num w:numId="1032">
+    <w:abstractNumId w:val="991"/>
+  </w:num>
 </w:numbering>
 </file>
 
@@ -4421,8 +4457,8 @@
     <w:name w:val="KeywordTok"/>
     <w:basedOn w:val="VerbatimChar"/>
     <w:rPr>
+      <w:b/>
       <w:color w:val="007020"/>
-      <w:b/>
     </w:rPr>
   </w:style>
   <w:style w:type="character" w:customStyle="1" w:styleId="DataTypeTok">
@@ -4499,42 +4535,42 @@
     <w:name w:val="ImportTok"/>
     <w:basedOn w:val="VerbatimChar"/>
     <w:rPr>
+      <w:b/>
       <w:color w:val="008000"/>
-      <w:b/>
     </w:rPr>
   </w:style>
   <w:style w:type="character" w:customStyle="1" w:styleId="CommentTok">
     <w:name w:val="CommentTok"/>
     <w:basedOn w:val="VerbatimChar"/>
     <w:rPr>
+      <w:i/>
       <w:color w:val="60a0b0"/>
-      <w:i/>
     </w:rPr>
   </w:style>
   <w:style w:type="character" w:customStyle="1" w:styleId="DocumentationTok">
     <w:name w:val="DocumentationTok"/>
     <w:basedOn w:val="VerbatimChar"/>
     <w:rPr>
+      <w:i/>
       <w:color w:val="ba2121"/>
-      <w:i/>
     </w:rPr>
   </w:style>
   <w:style w:type="character" w:customStyle="1" w:styleId="AnnotationTok">
     <w:name w:val="AnnotationTok"/>
     <w:basedOn w:val="VerbatimChar"/>
     <w:rPr>
-      <w:color w:val="60a0b0"/>
       <w:b/>
       <w:i/>
+      <w:color w:val="60a0b0"/>
     </w:rPr>
   </w:style>
   <w:style w:type="character" w:customStyle="1" w:styleId="CommentVarTok">
     <w:name w:val="CommentVarTok"/>
     <w:basedOn w:val="VerbatimChar"/>
     <w:rPr>
-      <w:color w:val="60a0b0"/>
       <w:b/>
       <w:i/>
+      <w:color w:val="60a0b0"/>
     </w:rPr>
   </w:style>
   <w:style w:type="character" w:customStyle="1" w:styleId="OtherTok">
@@ -4562,8 +4598,8 @@
     <w:name w:val="ControlFlowTok"/>
     <w:basedOn w:val="VerbatimChar"/>
     <w:rPr>
+      <w:b/>
       <w:color w:val="007020"/>
-      <w:b/>
     </w:rPr>
   </w:style>
   <w:style w:type="character" w:customStyle="1" w:styleId="OperatorTok">
@@ -4608,34 +4644,34 @@
     <w:name w:val="InformationTok"/>
     <w:basedOn w:val="VerbatimChar"/>
     <w:rPr>
-      <w:color w:val="60a0b0"/>
       <w:b/>
       <w:i/>
+      <w:color w:val="60a0b0"/>
     </w:rPr>
   </w:style>
   <w:style w:type="character" w:customStyle="1" w:styleId="WarningTok">
     <w:name w:val="WarningTok"/>
     <w:basedOn w:val="VerbatimChar"/>
     <w:rPr>
-      <w:color w:val="60a0b0"/>
       <w:b/>
       <w:i/>
+      <w:color w:val="60a0b0"/>
     </w:rPr>
   </w:style>
   <w:style w:type="character" w:customStyle="1" w:styleId="AlertTok">
     <w:name w:val="AlertTok"/>
     <w:basedOn w:val="VerbatimChar"/>
     <w:rPr>
+      <w:b/>
       <w:color w:val="ff0000"/>
-      <w:b/>
     </w:rPr>
   </w:style>
   <w:style w:type="character" w:customStyle="1" w:styleId="ErrorTok">
     <w:name w:val="ErrorTok"/>
     <w:basedOn w:val="VerbatimChar"/>
     <w:rPr>
+      <w:b/>
       <w:color w:val="ff0000"/>
-      <w:b/>
     </w:rPr>
   </w:style>
   <w:style w:type="character" w:customStyle="1" w:styleId="NormalTok">

</xml_diff>

<commit_message>
docs: separate authentication introduction from decisions
Signed-off-by: Everett Williams <everett@medplum.com>
</commit_message>
<xml_diff>
--- a/packages/docs/static/decision-guides/authentication.docx
+++ b/packages/docs/static/decision-guides/authentication.docx
@@ -11,18 +11,18 @@
           <wp:inline>
             <wp:extent cx="5943600" cy="1289649"/>
             <wp:effectExtent b="0" l="0" r="0" t="0"/>
-            <wp:docPr descr="Medplum" title="" id="21" name="Picture"/>
+            <wp:docPr descr="Medplum" title="" id="10" name="Picture"/>
             <a:graphic>
               <a:graphicData uri="http://schemas.openxmlformats.org/drawingml/2006/picture">
                 <pic:pic>
                   <pic:nvPicPr>
-                    <pic:cNvPr descr="medplum-wordmark-grape.png" id="22" name="Picture"/>
+                    <pic:cNvPr descr="medplum-wordmark-grape.png" id="11" name="Picture"/>
                     <pic:cNvPicPr>
                       <a:picLocks noChangeArrowheads="1" noChangeAspect="1"/>
                     </pic:cNvPicPr>
                   </pic:nvPicPr>
                   <pic:blipFill>
-                    <a:blip r:embed="rId20"/>
+                    <a:blip r:embed="rId9"/>
                     <a:stretch>
                       <a:fillRect/>
                     </a:stretch>
@@ -49,7 +49,7 @@
         </w:drawing>
       </w:r>
     </w:p>
-    <w:bookmarkStart w:id="67" w:name="authentication-decision-guide"/>
+    <w:bookmarkStart w:id="56" w:name="authentication-decision-guide"/>
     <w:p>
       <w:pPr>
         <w:pStyle w:val="Heading1"/>
@@ -72,94 +72,94 @@
       </w:pPr>
       <w:r>
         <w:rPr>
+          <w:i/>
           <w:iCs/>
+        </w:rPr>
+        <w:t xml:space="preserve">Companion to the</w:t>
+      </w:r>
+      <w:r>
+        <w:rPr>
           <w:i/>
-        </w:rPr>
-        <w:t xml:space="preserve">Companion to the</w:t>
-      </w:r>
-      <w:r>
-        <w:rPr>
           <w:iCs/>
-          <w:i/>
-        </w:rPr>
-        <w:t xml:space="preserve"> </w:t>
-      </w:r>
-      <w:hyperlink r:id="rId23">
+        </w:rPr>
+        <w:t xml:space="preserve"> </w:t>
+      </w:r>
+      <w:hyperlink r:id="rId12">
         <w:r>
           <w:rPr>
             <w:rStyle w:val="Hyperlink"/>
+            <w:i/>
             <w:iCs/>
-            <w:i/>
           </w:rPr>
           <w:t xml:space="preserve">Authentication</w:t>
         </w:r>
       </w:hyperlink>
       <w:r>
         <w:rPr>
+          <w:i/>
           <w:iCs/>
+        </w:rPr>
+        <w:t xml:space="preserve"> </w:t>
+      </w:r>
+      <w:r>
+        <w:rPr>
           <w:i/>
-        </w:rPr>
-        <w:t xml:space="preserve"> </w:t>
-      </w:r>
-      <w:r>
-        <w:rPr>
           <w:iCs/>
+        </w:rPr>
+        <w:t xml:space="preserve">and</w:t>
+      </w:r>
+      <w:r>
+        <w:rPr>
           <w:i/>
-        </w:rPr>
-        <w:t xml:space="preserve">and</w:t>
-      </w:r>
-      <w:r>
-        <w:rPr>
           <w:iCs/>
-          <w:i/>
-        </w:rPr>
-        <w:t xml:space="preserve"> </w:t>
-      </w:r>
-      <w:hyperlink r:id="rId24">
+        </w:rPr>
+        <w:t xml:space="preserve"> </w:t>
+      </w:r>
+      <w:hyperlink r:id="rId13">
         <w:r>
           <w:rPr>
             <w:rStyle w:val="Hyperlink"/>
+            <w:i/>
             <w:iCs/>
-            <w:i/>
           </w:rPr>
           <w:t xml:space="preserve">User Management</w:t>
         </w:r>
       </w:hyperlink>
       <w:r>
         <w:rPr>
+          <w:i/>
           <w:iCs/>
+        </w:rPr>
+        <w:t xml:space="preserve"> </w:t>
+      </w:r>
+      <w:r>
+        <w:rPr>
           <w:i/>
-        </w:rPr>
-        <w:t xml:space="preserve"> </w:t>
-      </w:r>
-      <w:r>
-        <w:rPr>
           <w:iCs/>
+        </w:rPr>
+        <w:t xml:space="preserve">docs. Builds on</w:t>
+      </w:r>
+      <w:r>
+        <w:rPr>
           <w:i/>
-        </w:rPr>
-        <w:t xml:space="preserve">docs. Builds on</w:t>
-      </w:r>
-      <w:r>
-        <w:rPr>
           <w:iCs/>
-          <w:i/>
-        </w:rPr>
-        <w:t xml:space="preserve"> </w:t>
-      </w:r>
-      <w:hyperlink r:id="rId25">
+        </w:rPr>
+        <w:t xml:space="preserve"> </w:t>
+      </w:r>
+      <w:hyperlink r:id="rId14">
         <w:r>
           <w:rPr>
             <w:rStyle w:val="Hyperlink"/>
+            <w:i/>
             <w:iCs/>
-            <w:i/>
           </w:rPr>
           <w:t xml:space="preserve">Identity Management: A Practical Guide</w:t>
         </w:r>
       </w:hyperlink>
       <w:r>
         <w:rPr>
+          <w:i/>
           <w:iCs/>
-          <w:i/>
         </w:rPr>
         <w:t xml:space="preserve">.</w:t>
       </w:r>
@@ -176,21 +176,21 @@
       </w:r>
       <w:r>
         <w:rPr>
+          <w:b/>
           <w:bCs/>
+        </w:rPr>
+        <w:t xml:space="preserve">who a user is</w:t>
+      </w:r>
+      <w:r>
+        <w:t xml:space="preserve">. Authorization determines</w:t>
+      </w:r>
+      <w:r>
+        <w:t xml:space="preserve"> </w:t>
+      </w:r>
+      <w:r>
+        <w:rPr>
           <w:b/>
-        </w:rPr>
-        <w:t xml:space="preserve">who a user is</w:t>
-      </w:r>
-      <w:r>
-        <w:t xml:space="preserve">. Authorization determines</w:t>
-      </w:r>
-      <w:r>
-        <w:t xml:space="preserve"> </w:t>
-      </w:r>
-      <w:r>
-        <w:rPr>
           <w:bCs/>
-          <w:b/>
         </w:rPr>
         <w:t xml:space="preserve">what that user can access</w:t>
       </w:r>
@@ -200,7 +200,7 @@
       <w:r>
         <w:t xml:space="preserve"> </w:t>
       </w:r>
-      <w:hyperlink r:id="rId26">
+      <w:hyperlink r:id="rId15">
         <w:r>
           <w:rPr>
             <w:rStyle w:val="Hyperlink"/>
@@ -225,26 +225,26 @@
     </w:p>
     <w:p>
       <w:pPr>
+        <w:pStyle w:val="Compact"/>
         <w:numPr>
           <w:ilvl w:val="0"/>
           <w:numId w:val="1001"/>
         </w:numPr>
-        <w:pStyle w:val="Compact"/>
       </w:pPr>
       <w:hyperlink w:anchor="Xa2fe6bcae4b21083a9372930aac9d896e240e22">
         <w:r>
           <w:rPr>
             <w:rStyle w:val="Hyperlink"/>
+            <w:b/>
             <w:bCs/>
-            <w:b/>
           </w:rPr>
           <w:t xml:space="preserve">User identification</w:t>
         </w:r>
       </w:hyperlink>
       <w:r>
         <w:rPr>
+          <w:b/>
           <w:bCs/>
-          <w:b/>
         </w:rPr>
         <w:t xml:space="preserve">:</w:t>
       </w:r>
@@ -257,26 +257,26 @@
     </w:p>
     <w:p>
       <w:pPr>
+        <w:pStyle w:val="Compact"/>
         <w:numPr>
           <w:ilvl w:val="0"/>
           <w:numId w:val="1001"/>
         </w:numPr>
-        <w:pStyle w:val="Compact"/>
       </w:pPr>
       <w:hyperlink w:anchor="Xe73c9a75b182ec0997b5c83f0af59fcaf46a51e">
         <w:r>
           <w:rPr>
             <w:rStyle w:val="Hyperlink"/>
+            <w:b/>
             <w:bCs/>
-            <w:b/>
           </w:rPr>
           <w:t xml:space="preserve">Identity provider</w:t>
         </w:r>
       </w:hyperlink>
       <w:r>
         <w:rPr>
+          <w:b/>
           <w:bCs/>
-          <w:b/>
         </w:rPr>
         <w:t xml:space="preserve">:</w:t>
       </w:r>
@@ -289,43 +289,85 @@
     </w:p>
     <w:p>
       <w:pPr>
+        <w:pStyle w:val="Compact"/>
         <w:numPr>
           <w:ilvl w:val="0"/>
           <w:numId w:val="1001"/>
         </w:numPr>
-        <w:pStyle w:val="Compact"/>
       </w:pPr>
       <w:hyperlink w:anchor="Xe83cbdd7272abc64477498a6881e4d71cc6d800">
         <w:r>
           <w:rPr>
             <w:rStyle w:val="Hyperlink"/>
+            <w:b/>
             <w:bCs/>
-            <w:b/>
           </w:rPr>
           <w:t xml:space="preserve">Token flow</w:t>
         </w:r>
       </w:hyperlink>
       <w:r>
         <w:rPr>
+          <w:b/>
           <w:bCs/>
+        </w:rPr>
+        <w:t xml:space="preserve">:</w:t>
+      </w:r>
+      <w:r>
+        <w:t xml:space="preserve"> </w:t>
+      </w:r>
+      <w:r>
+        <w:t xml:space="preserve">How does the application obtain Medplum credentials, and will it use them in the client or backend?</w:t>
+      </w:r>
+    </w:p>
+    <w:p>
+      <w:r>
+        <w:pict>
+          <v:rect style="width:0;height:1.5pt" o:hralign="center" o:hrstd="t" o:hr="t"/>
+        </w:pict>
+      </w:r>
+    </w:p>
+    <w:bookmarkStart w:id="21" w:name="Xa2fe6bcae4b21083a9372930aac9d896e240e22"/>
+    <w:p>
+      <w:pPr>
+        <w:pStyle w:val="Heading2"/>
+      </w:pPr>
+      <w:r>
+        <w:t xml:space="preserve">Decision 1: What is your user identification strategy?</w:t>
+      </w:r>
+    </w:p>
+    <w:p>
+      <w:pPr>
+        <w:pStyle w:val="FirstParagraph"/>
+      </w:pPr>
+      <w:r>
+        <w:t xml:space="preserve">Choose the identifier that connects a login to the correct Medplum account. This is separate from choosing an identity provider: an external IDP can still use email matching.</w:t>
+      </w:r>
+    </w:p>
+    <w:p>
+      <w:pPr>
+        <w:pStyle w:val="BodyText"/>
+      </w:pPr>
+      <w:r>
+        <w:rPr>
           <w:b/>
-        </w:rPr>
-        <w:t xml:space="preserve">:</w:t>
-      </w:r>
-      <w:r>
-        <w:t xml:space="preserve"> </w:t>
-      </w:r>
-      <w:r>
-        <w:t xml:space="preserve">How does the application obtain Medplum credentials, and will it use them in the client or backend?</w:t>
-      </w:r>
-    </w:p>
-    <w:bookmarkStart w:id="32" w:name="Xa2fe6bcae4b21083a9372930aac9d896e240e22"/>
-    <w:p>
-      <w:pPr>
-        <w:pStyle w:val="Heading2"/>
-      </w:pPr>
-      <w:r>
-        <w:t xml:space="preserve">Decision 1: What is your user identification strategy?</w:t>
+          <w:bCs/>
+        </w:rPr>
+        <w:t xml:space="preserve">Questions:</w:t>
+      </w:r>
+      <w:r>
+        <w:t xml:space="preserve"> </w:t>
+      </w:r>
+      <w:r>
+        <w:t xml:space="preserve">Is email unique for each user? How often does it change? Can different people share a contact email? Do you already have a stable identifier from an IDP?</w:t>
+      </w:r>
+    </w:p>
+    <w:bookmarkStart w:id="16" w:name="option-a-email-matching"/>
+    <w:p>
+      <w:pPr>
+        <w:pStyle w:val="Heading3"/>
+      </w:pPr>
+      <w:r>
+        <w:t xml:space="preserve">Option A: Email matching</w:t>
       </w:r>
     </w:p>
     <w:p>
@@ -333,67 +375,32 @@
         <w:pStyle w:val="FirstParagraph"/>
       </w:pPr>
       <w:r>
-        <w:t xml:space="preserve">Choose the identifier that connects a login to the correct Medplum account. This is separate from choosing an identity provider: an external IDP can still use email matching.</w:t>
-      </w:r>
-    </w:p>
-    <w:p>
-      <w:pPr>
-        <w:pStyle w:val="BodyText"/>
-      </w:pPr>
-      <w:r>
-        <w:rPr>
-          <w:bCs/>
-          <w:b/>
-        </w:rPr>
-        <w:t xml:space="preserve">Questions:</w:t>
-      </w:r>
-      <w:r>
-        <w:t xml:space="preserve"> </w:t>
-      </w:r>
-      <w:r>
-        <w:t xml:space="preserve">Is email unique for each user? How often does it change? Can different people share a contact email? Do you already have a stable identifier from an IDP?</w:t>
-      </w:r>
-    </w:p>
-    <w:bookmarkStart w:id="27" w:name="option-a-email-matching"/>
-    <w:p>
-      <w:pPr>
-        <w:pStyle w:val="Heading3"/>
-      </w:pPr>
-      <w:r>
-        <w:t xml:space="preserve">Option A: Email matching</w:t>
-      </w:r>
-    </w:p>
-    <w:p>
-      <w:pPr>
-        <w:pStyle w:val="FirstParagraph"/>
-      </w:pPr>
-      <w:r>
         <w:t xml:space="preserve">Medplum uses email matching by default, including when authenticating through an external IDP.</w:t>
       </w:r>
     </w:p>
     <w:p>
       <w:pPr>
+        <w:pStyle w:val="Compact"/>
         <w:numPr>
           <w:ilvl w:val="0"/>
           <w:numId w:val="1002"/>
         </w:numPr>
-        <w:pStyle w:val="Compact"/>
-      </w:pPr>
-      <w:r>
-        <w:rPr>
+      </w:pPr>
+      <w:r>
+        <w:rPr>
+          <w:b/>
           <w:bCs/>
-          <w:b/>
         </w:rPr>
         <w:t xml:space="preserve">Advantages:</w:t>
       </w:r>
     </w:p>
     <w:p>
       <w:pPr>
+        <w:pStyle w:val="Compact"/>
         <w:numPr>
           <w:ilvl w:val="1"/>
           <w:numId w:val="1003"/>
         </w:numPr>
-        <w:pStyle w:val="Compact"/>
       </w:pPr>
       <w:r>
         <w:t xml:space="preserve">Simple to configure when each person has a distinct email and changes are infrequent.</w:t>
@@ -401,11 +408,11 @@
     </w:p>
     <w:p>
       <w:pPr>
+        <w:pStyle w:val="Compact"/>
         <w:numPr>
           <w:ilvl w:val="1"/>
           <w:numId w:val="1003"/>
         </w:numPr>
-        <w:pStyle w:val="Compact"/>
       </w:pPr>
       <w:r>
         <w:t xml:space="preserve">Works with external IDPs as well as Medplum-managed authentication.</w:t>
@@ -413,27 +420,27 @@
     </w:p>
     <w:p>
       <w:pPr>
+        <w:pStyle w:val="Compact"/>
         <w:numPr>
           <w:ilvl w:val="0"/>
           <w:numId w:val="1002"/>
         </w:numPr>
-        <w:pStyle w:val="Compact"/>
-      </w:pPr>
-      <w:r>
-        <w:rPr>
+      </w:pPr>
+      <w:r>
+        <w:rPr>
+          <w:b/>
           <w:bCs/>
-          <w:b/>
         </w:rPr>
         <w:t xml:space="preserve">Tradeoffs:</w:t>
       </w:r>
     </w:p>
     <w:p>
       <w:pPr>
+        <w:pStyle w:val="Compact"/>
         <w:numPr>
           <w:ilvl w:val="1"/>
           <w:numId w:val="1004"/>
         </w:numPr>
-        <w:pStyle w:val="Compact"/>
       </w:pPr>
       <w:r>
         <w:t xml:space="preserve">Email changes must also be reflected in the Medplum login account. Updating only the Patient or Practitioner contact email is insufficient.</w:t>
@@ -441,11 +448,11 @@
     </w:p>
     <w:p>
       <w:pPr>
+        <w:pStyle w:val="Compact"/>
         <w:numPr>
           <w:ilvl w:val="1"/>
           <w:numId w:val="1004"/>
         </w:numPr>
-        <w:pStyle w:val="Compact"/>
       </w:pPr>
       <w:r>
         <w:t xml:space="preserve">Shared addresses cannot reliably distinguish separate people.</w:t>
@@ -453,16 +460,16 @@
     </w:p>
     <w:p>
       <w:pPr>
+        <w:pStyle w:val="Compact"/>
         <w:numPr>
           <w:ilvl w:val="0"/>
           <w:numId w:val="1002"/>
         </w:numPr>
-        <w:pStyle w:val="Compact"/>
-      </w:pPr>
-      <w:r>
-        <w:rPr>
+      </w:pPr>
+      <w:r>
+        <w:rPr>
+          <w:b/>
           <w:bCs/>
-          <w:b/>
         </w:rPr>
         <w:t xml:space="preserve">Best fit:</w:t>
       </w:r>
@@ -473,8 +480,8 @@
         <w:t xml:space="preserve">Applications with straightforward identity requirements and an owner for occasional account updates.</w:t>
       </w:r>
     </w:p>
-    <w:bookmarkEnd w:id="27"/>
-    <w:bookmarkStart w:id="28" w:name="option-b-external-id-matching"/>
+    <w:bookmarkEnd w:id="16"/>
+    <w:bookmarkStart w:id="17" w:name="option-b-external-id-matching"/>
     <w:p>
       <w:pPr>
         <w:pStyle w:val="Heading3"/>
@@ -502,27 +509,27 @@
     </w:p>
     <w:p>
       <w:pPr>
+        <w:pStyle w:val="Compact"/>
         <w:numPr>
           <w:ilvl w:val="0"/>
           <w:numId w:val="1005"/>
         </w:numPr>
-        <w:pStyle w:val="Compact"/>
-      </w:pPr>
-      <w:r>
-        <w:rPr>
+      </w:pPr>
+      <w:r>
+        <w:rPr>
+          <w:b/>
           <w:bCs/>
-          <w:b/>
         </w:rPr>
         <w:t xml:space="preserve">Advantages:</w:t>
       </w:r>
     </w:p>
     <w:p>
       <w:pPr>
+        <w:pStyle w:val="Compact"/>
         <w:numPr>
           <w:ilvl w:val="1"/>
           <w:numId w:val="1006"/>
         </w:numPr>
-        <w:pStyle w:val="Compact"/>
       </w:pPr>
       <w:r>
         <w:t xml:space="preserve">Identity can remain stable when a person’s email changes.</w:t>
@@ -530,11 +537,11 @@
     </w:p>
     <w:p>
       <w:pPr>
+        <w:pStyle w:val="Compact"/>
         <w:numPr>
           <w:ilvl w:val="1"/>
           <w:numId w:val="1006"/>
         </w:numPr>
-        <w:pStyle w:val="Compact"/>
       </w:pPr>
       <w:r>
         <w:t xml:space="preserve">Supports distinct identities independently of contact email.</w:t>
@@ -542,27 +549,27 @@
     </w:p>
     <w:p>
       <w:pPr>
+        <w:pStyle w:val="Compact"/>
         <w:numPr>
           <w:ilvl w:val="0"/>
           <w:numId w:val="1005"/>
         </w:numPr>
-        <w:pStyle w:val="Compact"/>
-      </w:pPr>
-      <w:r>
-        <w:rPr>
+      </w:pPr>
+      <w:r>
+        <w:rPr>
+          <w:b/>
           <w:bCs/>
-          <w:b/>
         </w:rPr>
         <w:t xml:space="preserve">Tradeoffs:</w:t>
       </w:r>
     </w:p>
     <w:p>
       <w:pPr>
+        <w:pStyle w:val="Compact"/>
         <w:numPr>
           <w:ilvl w:val="1"/>
           <w:numId w:val="1007"/>
         </w:numPr>
-        <w:pStyle w:val="Compact"/>
       </w:pPr>
       <w:r>
         <w:t xml:space="preserve">Provisioning and login must use the same mapping; changing IDPs requires a migration plan.</w:t>
@@ -570,11 +577,11 @@
     </w:p>
     <w:p>
       <w:pPr>
+        <w:pStyle w:val="Compact"/>
         <w:numPr>
           <w:ilvl w:val="1"/>
           <w:numId w:val="1007"/>
         </w:numPr>
-        <w:pStyle w:val="Compact"/>
       </w:pPr>
       <w:r>
         <w:t xml:space="preserve">Subject values belong to a provider context. Do not assume they are globally unique across unrelated IDPs.</w:t>
@@ -582,16 +589,16 @@
     </w:p>
     <w:p>
       <w:pPr>
+        <w:pStyle w:val="Compact"/>
         <w:numPr>
           <w:ilvl w:val="0"/>
           <w:numId w:val="1005"/>
         </w:numPr>
-        <w:pStyle w:val="Compact"/>
-      </w:pPr>
-      <w:r>
-        <w:rPr>
+      </w:pPr>
+      <w:r>
+        <w:rPr>
+          <w:b/>
           <w:bCs/>
-          <w:b/>
         </w:rPr>
         <w:t xml:space="preserve">Best fit:</w:t>
       </w:r>
@@ -610,8 +617,8 @@
         <w:t xml:space="preserve">Verify the exact subject format against the selected Medplum flow before bulk provisioning.</w:t>
       </w:r>
     </w:p>
-    <w:bookmarkEnd w:id="28"/>
-    <w:bookmarkStart w:id="31" w:name="recommended-approach"/>
+    <w:bookmarkEnd w:id="17"/>
+    <w:bookmarkStart w:id="20" w:name="recommended-approach"/>
     <w:p>
       <w:pPr>
         <w:pStyle w:val="Heading3"/>
@@ -624,9 +631,8 @@
       <w:tblPr>
         <w:tblStyle w:val="Table"/>
         <w:tblW w:w="9360" w:type="dxa"/>
+        <w:tblLayout w:type="fixed"/>
         <w:tblLook w:firstRow="1" w:lastRow="0" w:firstColumn="0" w:lastColumn="0" w:noHBand="0" w:noVBand="0" w:val="0020"/>
-        <w:jc w:val="start"/>
-        <w:tblLayout w:type="fixed"/>
       </w:tblPr>
       <w:tblGrid>
         <w:gridCol w:w="4638"/>
@@ -635,14 +641,13 @@
       <w:tr>
         <w:trPr>
           <w:cantSplit/>
-          <w:tblHeader w:val="true"/>
+          <w:tblHeader w:val="on"/>
         </w:trPr>
         <w:tc>
           <w:tcPr/>
           <w:p>
             <w:pPr>
               <w:pStyle w:val="Compact"/>
-              <w:jc w:val="left"/>
             </w:pPr>
             <w:r>
               <w:t xml:space="preserve">Situation</w:t>
@@ -654,7 +659,6 @@
           <w:p>
             <w:pPr>
               <w:pStyle w:val="Compact"/>
-              <w:jc w:val="left"/>
             </w:pPr>
             <w:r>
               <w:t xml:space="preserve">Approach</w:t>
@@ -671,7 +675,6 @@
           <w:p>
             <w:pPr>
               <w:pStyle w:val="Compact"/>
-              <w:jc w:val="left"/>
             </w:pPr>
             <w:r>
               <w:t xml:space="preserve">Distinct emails and manageable account changes</w:t>
@@ -683,7 +686,6 @@
           <w:p>
             <w:pPr>
               <w:pStyle w:val="Compact"/>
-              <w:jc w:val="left"/>
             </w:pPr>
             <w:r>
               <w:t xml:space="preserve">Start with email matching. An external IDP alone is not a reason to change the matching key.</w:t>
@@ -700,7 +702,6 @@
           <w:p>
             <w:pPr>
               <w:pStyle w:val="Compact"/>
-              <w:jc w:val="left"/>
             </w:pPr>
             <w:r>
               <w:t xml:space="preserve">Established IDP identity that must survive email changes</w:t>
@@ -712,7 +713,6 @@
           <w:p>
             <w:pPr>
               <w:pStyle w:val="Compact"/>
-              <w:jc w:val="left"/>
             </w:pPr>
             <w:r>
               <w:t xml:space="preserve">Use external ID matching and define who maintains the mapping.</w:t>
@@ -729,7 +729,6 @@
           <w:p>
             <w:pPr>
               <w:pStyle w:val="Compact"/>
-              <w:jc w:val="left"/>
             </w:pPr>
             <w:r>
               <w:t xml:space="preserve">Staff and patients have different identity requirements</w:t>
@@ -741,7 +740,6 @@
           <w:p>
             <w:pPr>
               <w:pStyle w:val="Compact"/>
-              <w:jc w:val="left"/>
             </w:pPr>
             <w:r>
               <w:t xml:space="preserve">Choose separately for each population. For example, staff may use corporate subject IDs while patients use email matching.</w:t>
@@ -758,7 +756,6 @@
           <w:p>
             <w:pPr>
               <w:pStyle w:val="Compact"/>
-              <w:jc w:val="left"/>
             </w:pPr>
             <w:r>
               <w:t xml:space="preserve">Separate people share a contact email</w:t>
@@ -770,7 +767,6 @@
           <w:p>
             <w:pPr>
               <w:pStyle w:val="Compact"/>
-              <w:jc w:val="left"/>
             </w:pPr>
             <w:r>
               <w:t xml:space="preserve">Use distinct authenticated identities and evaluate external ID matching. Also design recovery and MFA so mailbox access does not allow recovery of both accounts.</w:t>
@@ -787,7 +783,6 @@
           <w:p>
             <w:pPr>
               <w:pStyle w:val="Compact"/>
-              <w:jc w:val="left"/>
             </w:pPr>
             <w:r>
               <w:t xml:space="preserve">Caregiver accesses another person’s records</w:t>
@@ -799,7 +794,6 @@
           <w:p>
             <w:pPr>
               <w:pStyle w:val="Compact"/>
-              <w:jc w:val="left"/>
             </w:pPr>
             <w:r>
               <w:t xml:space="preserve">Give the caregiver their own identity and explicit access. A shared email is not evidence of authorization.</w:t>
@@ -814,8 +808,8 @@
       </w:pPr>
       <w:r>
         <w:rPr>
+          <w:b/>
           <w:bCs/>
-          <w:b/>
         </w:rPr>
         <w:t xml:space="preserve">Record:</w:t>
       </w:r>
@@ -836,7 +830,7 @@
       <w:r>
         <w:t xml:space="preserve"> </w:t>
       </w:r>
-      <w:hyperlink r:id="rId29">
+      <w:hyperlink r:id="rId18">
         <w:r>
           <w:rPr>
             <w:rStyle w:val="Hyperlink"/>
@@ -850,7 +844,7 @@
       <w:r>
         <w:t xml:space="preserve"> </w:t>
       </w:r>
-      <w:hyperlink r:id="rId30">
+      <w:hyperlink r:id="rId19">
         <w:r>
           <w:rPr>
             <w:rStyle w:val="Hyperlink"/>
@@ -862,9 +856,9 @@
         <w:t xml:space="preserve">.</w:t>
       </w:r>
     </w:p>
-    <w:bookmarkEnd w:id="31"/>
-    <w:bookmarkEnd w:id="32"/>
-    <w:bookmarkStart w:id="41" w:name="Xe73c9a75b182ec0997b5c83f0af59fcaf46a51e"/>
+    <w:bookmarkEnd w:id="20"/>
+    <w:bookmarkEnd w:id="21"/>
+    <w:bookmarkStart w:id="30" w:name="Xe73c9a75b182ec0997b5c83f0af59fcaf46a51e"/>
     <w:p>
       <w:pPr>
         <w:pStyle w:val="Heading2"/>
@@ -887,8 +881,8 @@
       </w:pPr>
       <w:r>
         <w:rPr>
+          <w:b/>
           <w:bCs/>
-          <w:b/>
         </w:rPr>
         <w:t xml:space="preserve">Questions:</w:t>
       </w:r>
@@ -899,7 +893,7 @@
         <w:t xml:space="preserve">Do you already use an IDP? Does everyone in an application use the same provider? Do customer organizations bring their own SSO? Does an existing identity broker already handle that routing?</w:t>
       </w:r>
     </w:p>
-    <w:bookmarkStart w:id="35" w:name="option-a-medplum-managed-authentication"/>
+    <w:bookmarkStart w:id="24" w:name="option-a-medplum-managed-authentication"/>
     <w:p>
       <w:pPr>
         <w:pStyle w:val="Heading3"/>
@@ -918,27 +912,27 @@
     </w:p>
     <w:p>
       <w:pPr>
+        <w:pStyle w:val="Compact"/>
         <w:numPr>
           <w:ilvl w:val="0"/>
           <w:numId w:val="1008"/>
         </w:numPr>
-        <w:pStyle w:val="Compact"/>
-      </w:pPr>
-      <w:r>
-        <w:rPr>
+      </w:pPr>
+      <w:r>
+        <w:rPr>
+          <w:b/>
           <w:bCs/>
-          <w:b/>
         </w:rPr>
         <w:t xml:space="preserve">Advantages:</w:t>
       </w:r>
     </w:p>
     <w:p>
       <w:pPr>
+        <w:pStyle w:val="Compact"/>
         <w:numPr>
           <w:ilvl w:val="1"/>
           <w:numId w:val="1009"/>
         </w:numPr>
-        <w:pStyle w:val="Compact"/>
       </w:pPr>
       <w:r>
         <w:t xml:space="preserve">No separate IDP integration is needed.</w:t>
@@ -946,11 +940,11 @@
     </w:p>
     <w:p>
       <w:pPr>
+        <w:pStyle w:val="Compact"/>
         <w:numPr>
           <w:ilvl w:val="1"/>
           <w:numId w:val="1009"/>
         </w:numPr>
-        <w:pStyle w:val="Compact"/>
       </w:pPr>
       <w:r>
         <w:t xml:space="preserve">Medplum provides credential management and supported login components.</w:t>
@@ -958,27 +952,27 @@
     </w:p>
     <w:p>
       <w:pPr>
+        <w:pStyle w:val="Compact"/>
         <w:numPr>
           <w:ilvl w:val="0"/>
           <w:numId w:val="1008"/>
         </w:numPr>
-        <w:pStyle w:val="Compact"/>
-      </w:pPr>
-      <w:r>
-        <w:rPr>
+      </w:pPr>
+      <w:r>
+        <w:rPr>
+          <w:b/>
           <w:bCs/>
-          <w:b/>
         </w:rPr>
         <w:t xml:space="preserve">Tradeoffs:</w:t>
       </w:r>
     </w:p>
     <w:p>
       <w:pPr>
+        <w:pStyle w:val="Compact"/>
         <w:numPr>
           <w:ilvl w:val="1"/>
           <w:numId w:val="1010"/>
         </w:numPr>
-        <w:pStyle w:val="Compact"/>
       </w:pPr>
       <w:r>
         <w:t xml:space="preserve">Your product still needs decisions about registration, invitations, MFA, and recovery.</w:t>
@@ -986,11 +980,11 @@
     </w:p>
     <w:p>
       <w:pPr>
+        <w:pStyle w:val="Compact"/>
         <w:numPr>
           <w:ilvl w:val="1"/>
           <w:numId w:val="1010"/>
         </w:numPr>
-        <w:pStyle w:val="Compact"/>
       </w:pPr>
       <w:r>
         <w:t xml:space="preserve">This does not satisfy a requirement to use an existing corporate IDP by itself.</w:t>
@@ -998,16 +992,16 @@
     </w:p>
     <w:p>
       <w:pPr>
+        <w:pStyle w:val="Compact"/>
         <w:numPr>
           <w:ilvl w:val="0"/>
           <w:numId w:val="1008"/>
         </w:numPr>
-        <w:pStyle w:val="Compact"/>
-      </w:pPr>
-      <w:r>
-        <w:rPr>
+      </w:pPr>
+      <w:r>
+        <w:rPr>
+          <w:b/>
           <w:bCs/>
-          <w:b/>
         </w:rPr>
         <w:t xml:space="preserve">Best fit:</w:t>
       </w:r>
@@ -1028,7 +1022,7 @@
       <w:r>
         <w:t xml:space="preserve"> </w:t>
       </w:r>
-      <w:hyperlink r:id="rId33">
+      <w:hyperlink r:id="rId22">
         <w:r>
           <w:rPr>
             <w:rStyle w:val="Hyperlink"/>
@@ -1045,7 +1039,7 @@
       <w:r>
         <w:t xml:space="preserve"> </w:t>
       </w:r>
-      <w:hyperlink r:id="rId34">
+      <w:hyperlink r:id="rId23">
         <w:r>
           <w:rPr>
             <w:rStyle w:val="Hyperlink"/>
@@ -1057,8 +1051,8 @@
         <w:t xml:space="preserve">. Choose the login presentation separately from who manages credentials.</w:t>
       </w:r>
     </w:p>
-    <w:bookmarkEnd w:id="35"/>
-    <w:bookmarkStart w:id="37" w:name="Xe8809dc97f953fef8ac90d1d3f41e2bb8c2302f"/>
+    <w:bookmarkEnd w:id="24"/>
+    <w:bookmarkStart w:id="26" w:name="Xe8809dc97f953fef8ac90d1d3f41e2bb8c2302f"/>
     <w:p>
       <w:pPr>
         <w:pStyle w:val="Heading3"/>
@@ -1089,27 +1083,27 @@
     </w:p>
     <w:p>
       <w:pPr>
+        <w:pStyle w:val="Compact"/>
         <w:numPr>
           <w:ilvl w:val="0"/>
           <w:numId w:val="1011"/>
         </w:numPr>
-        <w:pStyle w:val="Compact"/>
-      </w:pPr>
-      <w:r>
-        <w:rPr>
+      </w:pPr>
+      <w:r>
+        <w:rPr>
+          <w:b/>
           <w:bCs/>
-          <w:b/>
         </w:rPr>
         <w:t xml:space="preserve">Advantages:</w:t>
       </w:r>
     </w:p>
     <w:p>
       <w:pPr>
+        <w:pStyle w:val="Compact"/>
         <w:numPr>
           <w:ilvl w:val="1"/>
           <w:numId w:val="1012"/>
         </w:numPr>
-        <w:pStyle w:val="Compact"/>
       </w:pPr>
       <w:r>
         <w:t xml:space="preserve">Reuses existing identity infrastructure.</w:t>
@@ -1117,11 +1111,11 @@
     </w:p>
     <w:p>
       <w:pPr>
+        <w:pStyle w:val="Compact"/>
         <w:numPr>
           <w:ilvl w:val="1"/>
           <w:numId w:val="1012"/>
         </w:numPr>
-        <w:pStyle w:val="Compact"/>
       </w:pPr>
       <w:r>
         <w:t xml:space="preserve">Different applications can use different providers.</w:t>
@@ -1129,27 +1123,27 @@
     </w:p>
     <w:p>
       <w:pPr>
+        <w:pStyle w:val="Compact"/>
         <w:numPr>
           <w:ilvl w:val="0"/>
           <w:numId w:val="1011"/>
         </w:numPr>
-        <w:pStyle w:val="Compact"/>
-      </w:pPr>
-      <w:r>
-        <w:rPr>
+      </w:pPr>
+      <w:r>
+        <w:rPr>
+          <w:b/>
           <w:bCs/>
-          <w:b/>
         </w:rPr>
         <w:t xml:space="preserve">Tradeoffs:</w:t>
       </w:r>
     </w:p>
     <w:p>
       <w:pPr>
+        <w:pStyle w:val="Compact"/>
         <w:numPr>
           <w:ilvl w:val="1"/>
           <w:numId w:val="1013"/>
         </w:numPr>
-        <w:pStyle w:val="Compact"/>
       </w:pPr>
       <w:r>
         <w:t xml:space="preserve">If users of the same application need different upstream IDPs, define how that routing will happen, such as through an identity broker.</w:t>
@@ -1157,16 +1151,16 @@
     </w:p>
     <w:p>
       <w:pPr>
+        <w:pStyle w:val="Compact"/>
         <w:numPr>
           <w:ilvl w:val="0"/>
           <w:numId w:val="1011"/>
         </w:numPr>
-        <w:pStyle w:val="Compact"/>
-      </w:pPr>
-      <w:r>
-        <w:rPr>
+      </w:pPr>
+      <w:r>
+        <w:rPr>
+          <w:b/>
           <w:bCs/>
-          <w:b/>
         </w:rPr>
         <w:t xml:space="preserve">Best fit:</w:t>
       </w:r>
@@ -1187,7 +1181,7 @@
       <w:r>
         <w:t xml:space="preserve"> </w:t>
       </w:r>
-      <w:hyperlink r:id="rId36">
+      <w:hyperlink r:id="rId25">
         <w:r>
           <w:rPr>
             <w:rStyle w:val="Hyperlink"/>
@@ -1199,8 +1193,8 @@
         <w:t xml:space="preserve">.</w:t>
       </w:r>
     </w:p>
-    <w:bookmarkEnd w:id="37"/>
-    <w:bookmarkStart w:id="39" w:name="X1f3b4712db7da41133a5c6556c0631e928b0632"/>
+    <w:bookmarkEnd w:id="26"/>
+    <w:bookmarkStart w:id="28" w:name="X1f3b4712db7da41133a5c6556c0631e928b0632"/>
     <w:p>
       <w:pPr>
         <w:pStyle w:val="Heading3"/>
@@ -1234,27 +1228,27 @@
     </w:p>
     <w:p>
       <w:pPr>
+        <w:pStyle w:val="Compact"/>
         <w:numPr>
           <w:ilvl w:val="0"/>
           <w:numId w:val="1014"/>
         </w:numPr>
-        <w:pStyle w:val="Compact"/>
-      </w:pPr>
-      <w:r>
-        <w:rPr>
+      </w:pPr>
+      <w:r>
+        <w:rPr>
+          <w:b/>
           <w:bCs/>
-          <w:b/>
         </w:rPr>
         <w:t xml:space="preserve">Advantages:</w:t>
       </w:r>
     </w:p>
     <w:p>
       <w:pPr>
+        <w:pStyle w:val="Compact"/>
         <w:numPr>
           <w:ilvl w:val="1"/>
           <w:numId w:val="1015"/>
         </w:numPr>
-        <w:pStyle w:val="Compact"/>
       </w:pPr>
       <w:r>
         <w:t xml:space="preserve">An organization’s SSO applies across Medplum applications, including the Medplum App.</w:t>
@@ -1262,27 +1256,27 @@
     </w:p>
     <w:p>
       <w:pPr>
+        <w:pStyle w:val="Compact"/>
         <w:numPr>
           <w:ilvl w:val="0"/>
           <w:numId w:val="1014"/>
         </w:numPr>
-        <w:pStyle w:val="Compact"/>
-      </w:pPr>
-      <w:r>
-        <w:rPr>
+      </w:pPr>
+      <w:r>
+        <w:rPr>
+          <w:b/>
           <w:bCs/>
-          <w:b/>
         </w:rPr>
         <w:t xml:space="preserve">Tradeoffs:</w:t>
       </w:r>
     </w:p>
     <w:p>
       <w:pPr>
+        <w:pStyle w:val="Compact"/>
         <w:numPr>
           <w:ilvl w:val="1"/>
           <w:numId w:val="1016"/>
         </w:numPr>
-        <w:pStyle w:val="Compact"/>
       </w:pPr>
       <w:r>
         <w:t xml:space="preserve">Applies to all users of the domain, including developer accounts.</w:t>
@@ -1290,11 +1284,11 @@
     </w:p>
     <w:p>
       <w:pPr>
+        <w:pStyle w:val="Compact"/>
         <w:numPr>
           <w:ilvl w:val="1"/>
           <w:numId w:val="1016"/>
         </w:numPr>
-        <w:pStyle w:val="Compact"/>
       </w:pPr>
       <w:r>
         <w:t xml:space="preserve">Hosted setup requires Enterprise and Medplum assistance; self-hosted setup requires super admin privileges.</w:t>
@@ -1302,16 +1296,16 @@
     </w:p>
     <w:p>
       <w:pPr>
+        <w:pStyle w:val="Compact"/>
         <w:numPr>
           <w:ilvl w:val="0"/>
           <w:numId w:val="1014"/>
         </w:numPr>
-        <w:pStyle w:val="Compact"/>
-      </w:pPr>
-      <w:r>
-        <w:rPr>
+      </w:pPr>
+      <w:r>
+        <w:rPr>
+          <w:b/>
           <w:bCs/>
-          <w:b/>
         </w:rPr>
         <w:t xml:space="preserve">Best fit:</w:t>
       </w:r>
@@ -1332,7 +1326,7 @@
       <w:r>
         <w:t xml:space="preserve"> </w:t>
       </w:r>
-      <w:hyperlink r:id="rId38">
+      <w:hyperlink r:id="rId27">
         <w:r>
           <w:rPr>
             <w:rStyle w:val="Hyperlink"/>
@@ -1344,8 +1338,8 @@
         <w:t xml:space="preserve">.</w:t>
       </w:r>
     </w:p>
-    <w:bookmarkEnd w:id="39"/>
-    <w:bookmarkStart w:id="40" w:name="recommended-approach-1"/>
+    <w:bookmarkEnd w:id="28"/>
+    <w:bookmarkStart w:id="29" w:name="recommended-approach-1"/>
     <w:p>
       <w:pPr>
         <w:pStyle w:val="Heading3"/>
@@ -1384,35 +1378,53 @@
       </w:pPr>
       <w:r>
         <w:rPr>
+          <w:b/>
           <w:bCs/>
+        </w:rPr>
+        <w:t xml:space="preserve">Record:</w:t>
+      </w:r>
+      <w:r>
+        <w:t xml:space="preserve"> </w:t>
+      </w:r>
+      <w:r>
+        <w:t xml:space="preserve">Credential owner and routing mechanism for each population.</w:t>
+      </w:r>
+    </w:p>
+    <w:bookmarkEnd w:id="29"/>
+    <w:bookmarkEnd w:id="30"/>
+    <w:bookmarkStart w:id="41" w:name="Xe83cbdd7272abc64477498a6881e4d71cc6d800"/>
+    <w:p>
+      <w:pPr>
+        <w:pStyle w:val="Heading2"/>
+      </w:pPr>
+      <w:r>
+        <w:t xml:space="preserve">Decision 3: What is your token flow architecture?</w:t>
+      </w:r>
+    </w:p>
+    <w:p>
+      <w:pPr>
+        <w:pStyle w:val="FirstParagraph"/>
+      </w:pPr>
+      <w:r>
+        <w:t xml:space="preserve">Choose how your application obtains a token for Medplum and where it uses that token. An external IDP access token and a Medplum access token serve different APIs; do not assume they are interchangeable.</w:t>
+      </w:r>
+    </w:p>
+    <w:p>
+      <w:pPr>
+        <w:pStyle w:val="BodyText"/>
+      </w:pPr>
+      <w:r>
+        <w:rPr>
           <w:b/>
-        </w:rPr>
-        <w:t xml:space="preserve">Record:</w:t>
-      </w:r>
-      <w:r>
-        <w:t xml:space="preserve"> </w:t>
-      </w:r>
-      <w:r>
-        <w:t xml:space="preserve">Credential owner and routing mechanism for each population.</w:t>
-      </w:r>
-    </w:p>
-    <w:bookmarkEnd w:id="40"/>
-    <w:bookmarkEnd w:id="41"/>
-    <w:bookmarkStart w:id="52" w:name="Xe83cbdd7272abc64477498a6881e4d71cc6d800"/>
-    <w:p>
-      <w:pPr>
-        <w:pStyle w:val="Heading2"/>
-      </w:pPr>
-      <w:r>
-        <w:t xml:space="preserve">Decision 3: What is your token flow architecture?</w:t>
-      </w:r>
-    </w:p>
-    <w:p>
-      <w:pPr>
-        <w:pStyle w:val="FirstParagraph"/>
-      </w:pPr>
-      <w:r>
-        <w:t xml:space="preserve">Choose how your application obtains a token for Medplum and where it uses that token. An external IDP access token and a Medplum access token serve different APIs; do not assume they are interchangeable.</w:t>
+          <w:bCs/>
+        </w:rPr>
+        <w:t xml:space="preserve">Questions:</w:t>
+      </w:r>
+      <w:r>
+        <w:t xml:space="preserve"> </w:t>
+      </w:r>
+      <w:r>
+        <w:t xml:space="preserve">Will Medplum handle the external IDP callback, or will your application obtain an external access token through its own login flow? Does the client need an external token for other services? Must it call Medplum directly, or should all Medplum access pass through your backend?</w:t>
       </w:r>
     </w:p>
     <w:p>
@@ -1420,60 +1432,12 @@
         <w:pStyle w:val="BodyText"/>
       </w:pPr>
       <w:r>
-        <w:rPr>
-          <w:bCs/>
-          <w:b/>
-        </w:rPr>
-        <w:t xml:space="preserve">Questions:</w:t>
-      </w:r>
-      <w:r>
-        <w:t xml:space="preserve"> </w:t>
-      </w:r>
-      <w:r>
-        <w:t xml:space="preserve">Will Medplum handle the external IDP callback, or will your application obtain an external access token through its own login flow? Does the client need an external token for other services? Must it call Medplum directly, or should all Medplum access pass through your backend?</w:t>
-      </w:r>
-    </w:p>
-    <w:p>
-      <w:pPr>
-        <w:pStyle w:val="BodyText"/>
-      </w:pPr>
-      <w:r>
-        <w:t xml:space="preserve">“</w:t>
-      </w:r>
-      <w:r>
-        <w:t xml:space="preserve">Client</w:t>
-      </w:r>
-      <w:r>
-        <w:t xml:space="preserve">”</w:t>
-      </w:r>
-      <w:r>
-        <w:t xml:space="preserve"> </w:t>
-      </w:r>
-      <w:r>
-        <w:t xml:space="preserve">below means your browser or native application.</w:t>
-      </w:r>
-      <w:r>
-        <w:t xml:space="preserve"> </w:t>
-      </w:r>
-      <w:r>
-        <w:t xml:space="preserve">“</w:t>
-      </w:r>
-      <w:r>
-        <w:t xml:space="preserve">Server</w:t>
-      </w:r>
-      <w:r>
-        <w:t xml:space="preserve">”</w:t>
-      </w:r>
-      <w:r>
-        <w:t xml:space="preserve"> </w:t>
-      </w:r>
-      <w:r>
-        <w:t xml:space="preserve">means your trusted application backend. The options below primarily address external or existing authentication. If you chose Medplum-managed authentication, choose</w:t>
-      </w:r>
-      <w:r>
-        <w:t xml:space="preserve"> </w:t>
-      </w:r>
-      <w:hyperlink r:id="rId33">
+        <w:t xml:space="preserve">“Client” below means your browser or native application. “Server” means your trusted application backend. The options below primarily address external or existing authentication. If you chose Medplum-managed authentication, choose</w:t>
+      </w:r>
+      <w:r>
+        <w:t xml:space="preserve"> </w:t>
+      </w:r>
+      <w:hyperlink r:id="rId22">
         <w:r>
           <w:rPr>
             <w:rStyle w:val="Hyperlink"/>
@@ -1490,7 +1454,7 @@
       <w:r>
         <w:t xml:space="preserve"> </w:t>
       </w:r>
-      <w:hyperlink r:id="rId34">
+      <w:hyperlink r:id="rId23">
         <w:r>
           <w:rPr>
             <w:rStyle w:val="Hyperlink"/>
@@ -1508,41 +1472,41 @@
       </w:pPr>
       <w:r>
         <w:rPr>
+          <w:b/>
           <w:bCs/>
+        </w:rPr>
+        <w:t xml:space="preserve">Both the authorization-code flow and token exchange use an external IDP.</w:t>
+      </w:r>
+      <w:r>
+        <w:t xml:space="preserve"> </w:t>
+      </w:r>
+      <w:r>
+        <w:t xml:space="preserve">The difference is how your application obtains its Medplum token: in Option A, Medplum handles the IDP callback and returns a Medplum authorization code to your application; in Option B, your application obtains an external access token through its own login flow and submits that token to Medplum for exchange. Keeping your existing IDP does not by itself favor either flow.</w:t>
+      </w:r>
+    </w:p>
+    <w:bookmarkStart w:id="31" w:name="X06ef6992b4244c84c87e3bcb06a64645d3251f5"/>
+    <w:p>
+      <w:pPr>
+        <w:pStyle w:val="Heading3"/>
+      </w:pPr>
+      <w:r>
+        <w:t xml:space="preserve">Option A: External IDP authorization-code flow</w:t>
+      </w:r>
+    </w:p>
+    <w:p>
+      <w:pPr>
+        <w:pStyle w:val="FirstParagraph"/>
+      </w:pPr>
+      <w:r>
+        <w:t xml:space="preserve">Often called</w:t>
+      </w:r>
+      <w:r>
+        <w:t xml:space="preserve"> </w:t>
+      </w:r>
+      <w:r>
+        <w:rPr>
           <w:b/>
-        </w:rPr>
-        <w:t xml:space="preserve">Both the authorization-code flow and token exchange use an external IDP.</w:t>
-      </w:r>
-      <w:r>
-        <w:t xml:space="preserve"> </w:t>
-      </w:r>
-      <w:r>
-        <w:t xml:space="preserve">The difference is how your application obtains its Medplum token: in Option A, Medplum handles the IDP callback and returns a Medplum authorization code to your application; in Option B, your application obtains an external access token through its own login flow and submits that token to Medplum for exchange. Keeping your existing IDP does not by itself favor either flow.</w:t>
-      </w:r>
-    </w:p>
-    <w:bookmarkStart w:id="42" w:name="X06ef6992b4244c84c87e3bcb06a64645d3251f5"/>
-    <w:p>
-      <w:pPr>
-        <w:pStyle w:val="Heading3"/>
-      </w:pPr>
-      <w:r>
-        <w:t xml:space="preserve">Option A: External IDP authorization-code flow</w:t>
-      </w:r>
-    </w:p>
-    <w:p>
-      <w:pPr>
-        <w:pStyle w:val="FirstParagraph"/>
-      </w:pPr>
-      <w:r>
-        <w:t xml:space="preserve">Often called</w:t>
-      </w:r>
-      <w:r>
-        <w:t xml:space="preserve"> </w:t>
-      </w:r>
-      <w:r>
-        <w:rPr>
           <w:bCs/>
-          <w:b/>
         </w:rPr>
         <w:t xml:space="preserve">three-legged OAuth</w:t>
       </w:r>
@@ -1552,11 +1516,11 @@
     </w:p>
     <w:p>
       <w:pPr>
+        <w:pStyle w:val="Compact"/>
         <w:numPr>
           <w:ilvl w:val="0"/>
           <w:numId w:val="1017"/>
         </w:numPr>
-        <w:pStyle w:val="Compact"/>
       </w:pPr>
       <w:r>
         <w:t xml:space="preserve">The user starts login and authenticates with the external IDP.</w:t>
@@ -1564,11 +1528,11 @@
     </w:p>
     <w:p>
       <w:pPr>
+        <w:pStyle w:val="Compact"/>
         <w:numPr>
           <w:ilvl w:val="0"/>
           <w:numId w:val="1017"/>
         </w:numPr>
-        <w:pStyle w:val="Compact"/>
       </w:pPr>
       <w:r>
         <w:t xml:space="preserve">The IDP redirects to Medplum’s external authentication callback.</w:t>
@@ -1576,11 +1540,11 @@
     </w:p>
     <w:p>
       <w:pPr>
+        <w:pStyle w:val="Compact"/>
         <w:numPr>
           <w:ilvl w:val="0"/>
           <w:numId w:val="1017"/>
         </w:numPr>
-        <w:pStyle w:val="Compact"/>
       </w:pPr>
       <w:r>
         <w:t xml:space="preserve">Medplum redirects to your application with a Medplum authorization code.</w:t>
@@ -1588,11 +1552,11 @@
     </w:p>
     <w:p>
       <w:pPr>
+        <w:pStyle w:val="Compact"/>
         <w:numPr>
           <w:ilvl w:val="0"/>
           <w:numId w:val="1017"/>
         </w:numPr>
-        <w:pStyle w:val="Compact"/>
       </w:pPr>
       <w:r>
         <w:t xml:space="preserve">Your application exchanges that code for Medplum tokens.</w:t>
@@ -1600,27 +1564,27 @@
     </w:p>
     <w:p>
       <w:pPr>
+        <w:pStyle w:val="Compact"/>
         <w:numPr>
           <w:ilvl w:val="0"/>
           <w:numId w:val="1018"/>
         </w:numPr>
-        <w:pStyle w:val="Compact"/>
-      </w:pPr>
-      <w:r>
-        <w:rPr>
+      </w:pPr>
+      <w:r>
+        <w:rPr>
+          <w:b/>
           <w:bCs/>
-          <w:b/>
         </w:rPr>
         <w:t xml:space="preserve">Advantages:</w:t>
       </w:r>
     </w:p>
     <w:p>
       <w:pPr>
+        <w:pStyle w:val="Compact"/>
         <w:numPr>
           <w:ilvl w:val="1"/>
           <w:numId w:val="1019"/>
         </w:numPr>
-        <w:pStyle w:val="Compact"/>
       </w:pPr>
       <w:r>
         <w:t xml:space="preserve">The client can call Medplum directly without retaining an external access token for this flow.</w:t>
@@ -1628,11 +1592,11 @@
     </w:p>
     <w:p>
       <w:pPr>
+        <w:pStyle w:val="Compact"/>
         <w:numPr>
           <w:ilvl w:val="1"/>
           <w:numId w:val="1019"/>
         </w:numPr>
-        <w:pStyle w:val="Compact"/>
       </w:pPr>
       <w:r>
         <w:t xml:space="preserve">Fits direct SDK and authenticated component use without a proxy for Medplum requests.</w:t>
@@ -1640,27 +1604,27 @@
     </w:p>
     <w:p>
       <w:pPr>
+        <w:pStyle w:val="Compact"/>
         <w:numPr>
           <w:ilvl w:val="0"/>
           <w:numId w:val="1018"/>
         </w:numPr>
-        <w:pStyle w:val="Compact"/>
-      </w:pPr>
-      <w:r>
-        <w:rPr>
+      </w:pPr>
+      <w:r>
+        <w:rPr>
+          <w:b/>
           <w:bCs/>
-          <w:b/>
         </w:rPr>
         <w:t xml:space="preserve">Tradeoffs:</w:t>
       </w:r>
     </w:p>
     <w:p>
       <w:pPr>
+        <w:pStyle w:val="Compact"/>
         <w:numPr>
           <w:ilvl w:val="1"/>
           <w:numId w:val="1020"/>
         </w:numPr>
-        <w:pStyle w:val="Compact"/>
       </w:pPr>
       <w:r>
         <w:t xml:space="preserve">Requires a redirect/callback flow and coordination of redirect settings with the IDP.</w:t>
@@ -1668,11 +1632,11 @@
     </w:p>
     <w:p>
       <w:pPr>
+        <w:pStyle w:val="Compact"/>
         <w:numPr>
           <w:ilvl w:val="1"/>
           <w:numId w:val="1020"/>
         </w:numPr>
-        <w:pStyle w:val="Compact"/>
       </w:pPr>
       <w:r>
         <w:t xml:space="preserve">Does not give the client an external access token to reuse with other services. If your application needs to obtain and manage that token through its own login flow, evaluate token exchange.</w:t>
@@ -1680,11 +1644,11 @@
     </w:p>
     <w:p>
       <w:pPr>
+        <w:pStyle w:val="Compact"/>
         <w:numPr>
           <w:ilvl w:val="1"/>
           <w:numId w:val="1020"/>
         </w:numPr>
-        <w:pStyle w:val="Compact"/>
       </w:pPr>
       <w:r>
         <w:t xml:space="preserve">A Medplum logout does not by itself define what happens to the external IDP’s SSO session; choose whether users should be signed out there too.</w:t>
@@ -1692,16 +1656,16 @@
     </w:p>
     <w:p>
       <w:pPr>
+        <w:pStyle w:val="Compact"/>
         <w:numPr>
           <w:ilvl w:val="0"/>
           <w:numId w:val="1018"/>
         </w:numPr>
-        <w:pStyle w:val="Compact"/>
-      </w:pPr>
-      <w:r>
-        <w:rPr>
+      </w:pPr>
+      <w:r>
+        <w:rPr>
+          <w:b/>
           <w:bCs/>
-          <w:b/>
         </w:rPr>
         <w:t xml:space="preserve">Best fit:</w:t>
       </w:r>
@@ -1722,7 +1686,7 @@
       <w:r>
         <w:t xml:space="preserve"> </w:t>
       </w:r>
-      <w:hyperlink r:id="rId36">
+      <w:hyperlink r:id="rId25">
         <w:r>
           <w:rPr>
             <w:rStyle w:val="Hyperlink"/>
@@ -1734,8 +1698,8 @@
         <w:t xml:space="preserve">.</w:t>
       </w:r>
     </w:p>
-    <w:bookmarkEnd w:id="42"/>
-    <w:bookmarkStart w:id="47" w:name="option-b-token-exchange"/>
+    <w:bookmarkEnd w:id="31"/>
+    <w:bookmarkStart w:id="36" w:name="option-b-token-exchange"/>
     <w:p>
       <w:pPr>
         <w:pStyle w:val="Heading3"/>
@@ -1754,27 +1718,27 @@
     </w:p>
     <w:p>
       <w:pPr>
+        <w:pStyle w:val="Compact"/>
         <w:numPr>
           <w:ilvl w:val="0"/>
           <w:numId w:val="1021"/>
         </w:numPr>
-        <w:pStyle w:val="Compact"/>
-      </w:pPr>
-      <w:r>
-        <w:rPr>
+      </w:pPr>
+      <w:r>
+        <w:rPr>
+          <w:b/>
           <w:bCs/>
-          <w:b/>
         </w:rPr>
         <w:t xml:space="preserve">Advantages:</w:t>
       </w:r>
     </w:p>
     <w:p>
       <w:pPr>
+        <w:pStyle w:val="Compact"/>
         <w:numPr>
           <w:ilvl w:val="1"/>
           <w:numId w:val="1022"/>
         </w:numPr>
-        <w:pStyle w:val="Compact"/>
       </w:pPr>
       <w:r>
         <w:t xml:space="preserve">Reuses a valid external login without a second interactive login to Medplum.</w:t>
@@ -1782,11 +1746,11 @@
     </w:p>
     <w:p>
       <w:pPr>
+        <w:pStyle w:val="Compact"/>
         <w:numPr>
           <w:ilvl w:val="1"/>
           <w:numId w:val="1022"/>
         </w:numPr>
-        <w:pStyle w:val="Compact"/>
       </w:pPr>
       <w:r>
         <w:t xml:space="preserve">Lets your application continue handling the external IDP callback, token acquisition, and IDP-routing logic itself.</w:t>
@@ -1794,11 +1758,11 @@
     </w:p>
     <w:p>
       <w:pPr>
+        <w:pStyle w:val="Compact"/>
         <w:numPr>
           <w:ilvl w:val="1"/>
           <w:numId w:val="1022"/>
         </w:numPr>
-        <w:pStyle w:val="Compact"/>
       </w:pPr>
       <w:r>
         <w:t xml:space="preserve">Produces a user-scoped Medplum token that can be used in either the client or backend.</w:t>
@@ -1806,27 +1770,27 @@
     </w:p>
     <w:p>
       <w:pPr>
+        <w:pStyle w:val="Compact"/>
         <w:numPr>
           <w:ilvl w:val="0"/>
           <w:numId w:val="1021"/>
         </w:numPr>
-        <w:pStyle w:val="Compact"/>
-      </w:pPr>
-      <w:r>
-        <w:rPr>
+      </w:pPr>
+      <w:r>
+        <w:rPr>
+          <w:b/>
           <w:bCs/>
-          <w:b/>
         </w:rPr>
         <w:t xml:space="preserve">Tradeoffs:</w:t>
       </w:r>
     </w:p>
     <w:p>
       <w:pPr>
+        <w:pStyle w:val="Compact"/>
         <w:numPr>
           <w:ilvl w:val="1"/>
           <w:numId w:val="1023"/>
         </w:numPr>
-        <w:pStyle w:val="Compact"/>
       </w:pPr>
       <w:r>
         <w:t xml:space="preserve">Requires a supported external access token and configured UserInfo validation. An ID token or arbitrary application session cookie is not an interchangeable input.</w:t>
@@ -1834,11 +1798,11 @@
     </w:p>
     <w:p>
       <w:pPr>
+        <w:pStyle w:val="Compact"/>
         <w:numPr>
           <w:ilvl w:val="1"/>
           <w:numId w:val="1023"/>
         </w:numPr>
-        <w:pStyle w:val="Compact"/>
       </w:pPr>
       <w:r>
         <w:t xml:space="preserve">You must coordinate external and Medplum credential lifecycles and select the intended membership.</w:t>
@@ -1846,11 +1810,11 @@
     </w:p>
     <w:p>
       <w:pPr>
+        <w:pStyle w:val="Compact"/>
         <w:numPr>
           <w:ilvl w:val="1"/>
           <w:numId w:val="1023"/>
         </w:numPr>
-        <w:pStyle w:val="Compact"/>
       </w:pPr>
       <w:r>
         <w:t xml:space="preserve">Other APIs must accept the appropriate credentials for their own audience and scopes; token exchange does not make one external token valid for every service.</w:t>
@@ -1858,24 +1822,71 @@
     </w:p>
     <w:p>
       <w:pPr>
+        <w:pStyle w:val="Compact"/>
         <w:numPr>
           <w:ilvl w:val="0"/>
           <w:numId w:val="1021"/>
         </w:numPr>
-        <w:pStyle w:val="Compact"/>
-      </w:pPr>
-      <w:r>
-        <w:rPr>
+      </w:pPr>
+      <w:r>
+        <w:rPr>
+          <w:b/>
           <w:bCs/>
+        </w:rPr>
+        <w:t xml:space="preserve">Best fit:</w:t>
+      </w:r>
+      <w:r>
+        <w:t xml:space="preserve"> </w:t>
+      </w:r>
+      <w:r>
+        <w:t xml:space="preserve">Your application obtains a supported external access token through its own login flow and needs to add Medplum access, potentially alongside other services.</w:t>
+      </w:r>
+    </w:p>
+    <w:p>
+      <w:pPr>
+        <w:pStyle w:val="FirstParagraph"/>
+      </w:pPr>
+      <w:r>
+        <w:t xml:space="preserve">The presence of other integrations alone does not require token exchange. If those integrations run in Bots or your backend using service credentials, the client may still need only Medplum authentication.</w:t>
+      </w:r>
+    </w:p>
+    <w:bookmarkStart w:id="35" w:name="where-will-you-store-the-medplum-token"/>
+    <w:p>
+      <w:pPr>
+        <w:pStyle w:val="Heading4"/>
+      </w:pPr>
+      <w:r>
+        <w:t xml:space="preserve">Where will you store the Medplum token?</w:t>
+      </w:r>
+    </w:p>
+    <w:p>
+      <w:pPr>
+        <w:pStyle w:val="FirstParagraph"/>
+      </w:pPr>
+      <w:r>
+        <w:t xml:space="preserve">Once you choose token exchange, decide between these two placements. Both produce</w:t>
+      </w:r>
+      <w:r>
+        <w:t xml:space="preserve"> </w:t>
+      </w:r>
+      <w:r>
+        <w:rPr>
           <w:b/>
-        </w:rPr>
-        <w:t xml:space="preserve">Best fit:</w:t>
-      </w:r>
-      <w:r>
-        <w:t xml:space="preserve"> </w:t>
-      </w:r>
-      <w:r>
-        <w:t xml:space="preserve">Your application obtains a supported external access token through its own login flow and needs to add Medplum access, potentially alongside other services.</w:t>
+          <w:bCs/>
+        </w:rPr>
+        <w:t xml:space="preserve">user-scoped Medplum tokens</w:t>
+      </w:r>
+      <w:r>
+        <w:t xml:space="preserve">. The choice changes where credentials are managed and which system carries requests to Medplum.</w:t>
+      </w:r>
+    </w:p>
+    <w:bookmarkStart w:id="32" w:name="b1-keep-the-medplum-token-in-the-client"/>
+    <w:p>
+      <w:pPr>
+        <w:pStyle w:val="Heading5"/>
+      </w:pPr>
+      <w:r>
+        <w:t xml:space="preserve">B1: Keep the Medplum token in the client</w:t>
       </w:r>
     </w:p>
     <w:p>
@@ -1883,79 +1894,32 @@
         <w:pStyle w:val="FirstParagraph"/>
       </w:pPr>
       <w:r>
-        <w:t xml:space="preserve">The presence of other integrations alone does not require token exchange. If those integrations run in Bots or your backend using service credentials, the client may still need only Medplum authentication.</w:t>
-      </w:r>
-    </w:p>
-    <w:bookmarkStart w:id="46" w:name="where-will-you-store-the-medplum-token"/>
-    <w:p>
-      <w:pPr>
-        <w:pStyle w:val="Heading4"/>
-      </w:pPr>
-      <w:r>
-        <w:t xml:space="preserve">Where will you store the Medplum token?</w:t>
-      </w:r>
-    </w:p>
-    <w:p>
-      <w:pPr>
-        <w:pStyle w:val="FirstParagraph"/>
-      </w:pPr>
-      <w:r>
-        <w:t xml:space="preserve">Once you choose token exchange, decide between these two placements. Both produce</w:t>
-      </w:r>
-      <w:r>
-        <w:t xml:space="preserve"> </w:t>
-      </w:r>
-      <w:r>
-        <w:rPr>
-          <w:bCs/>
-          <w:b/>
-        </w:rPr>
-        <w:t xml:space="preserve">user-scoped Medplum tokens</w:t>
-      </w:r>
-      <w:r>
-        <w:t xml:space="preserve">. The choice changes where credentials are managed and which system carries requests to Medplum.</w:t>
-      </w:r>
-    </w:p>
-    <w:bookmarkStart w:id="43" w:name="b1-keep-the-medplum-token-in-the-client"/>
-    <w:p>
-      <w:pPr>
-        <w:pStyle w:val="Heading5"/>
-      </w:pPr>
-      <w:r>
-        <w:t xml:space="preserve">B1: Keep the Medplum token in the client</w:t>
-      </w:r>
-    </w:p>
-    <w:p>
-      <w:pPr>
-        <w:pStyle w:val="FirstParagraph"/>
-      </w:pPr>
-      <w:r>
         <w:t xml:space="preserve">The client obtains a Medplum token through exchange and calls Medplum directly.</w:t>
       </w:r>
     </w:p>
     <w:p>
       <w:pPr>
+        <w:pStyle w:val="Compact"/>
         <w:numPr>
           <w:ilvl w:val="0"/>
           <w:numId w:val="1024"/>
         </w:numPr>
-        <w:pStyle w:val="Compact"/>
-      </w:pPr>
-      <w:r>
-        <w:rPr>
+      </w:pPr>
+      <w:r>
+        <w:rPr>
+          <w:b/>
           <w:bCs/>
-          <w:b/>
         </w:rPr>
         <w:t xml:space="preserve">Advantages:</w:t>
       </w:r>
     </w:p>
     <w:p>
       <w:pPr>
+        <w:pStyle w:val="Compact"/>
         <w:numPr>
           <w:ilvl w:val="1"/>
           <w:numId w:val="1025"/>
         </w:numPr>
-        <w:pStyle w:val="Compact"/>
       </w:pPr>
       <w:r>
         <w:t xml:space="preserve">Direct SDK/API access and authenticated React components fit naturally.</w:t>
@@ -1963,11 +1927,11 @@
     </w:p>
     <w:p>
       <w:pPr>
+        <w:pStyle w:val="Compact"/>
         <w:numPr>
           <w:ilvl w:val="1"/>
           <w:numId w:val="1025"/>
         </w:numPr>
-        <w:pStyle w:val="Compact"/>
       </w:pPr>
       <w:r>
         <w:t xml:space="preserve">WebSocket subscriptions connect directly to Medplum.</w:t>
@@ -1975,11 +1939,11 @@
     </w:p>
     <w:p>
       <w:pPr>
+        <w:pStyle w:val="Compact"/>
         <w:numPr>
           <w:ilvl w:val="1"/>
           <w:numId w:val="1025"/>
         </w:numPr>
-        <w:pStyle w:val="Compact"/>
       </w:pPr>
       <w:r>
         <w:t xml:space="preserve">No application proxy is needed for those requests.</w:t>
@@ -1987,27 +1951,27 @@
     </w:p>
     <w:p>
       <w:pPr>
+        <w:pStyle w:val="Compact"/>
         <w:numPr>
           <w:ilvl w:val="0"/>
           <w:numId w:val="1024"/>
         </w:numPr>
-        <w:pStyle w:val="Compact"/>
-      </w:pPr>
-      <w:r>
-        <w:rPr>
+      </w:pPr>
+      <w:r>
+        <w:rPr>
+          <w:b/>
           <w:bCs/>
-          <w:b/>
         </w:rPr>
         <w:t xml:space="preserve">Tradeoffs:</w:t>
       </w:r>
     </w:p>
     <w:p>
       <w:pPr>
+        <w:pStyle w:val="Compact"/>
         <w:numPr>
           <w:ilvl w:val="1"/>
           <w:numId w:val="1026"/>
         </w:numPr>
-        <w:pStyle w:val="Compact"/>
       </w:pPr>
       <w:r>
         <w:t xml:space="preserve">The client manages both external and Medplum credentials, including expiry, refresh, and logout.</w:t>
@@ -2015,11 +1979,11 @@
     </w:p>
     <w:p>
       <w:pPr>
+        <w:pStyle w:val="Compact"/>
         <w:numPr>
           <w:ilvl w:val="1"/>
           <w:numId w:val="1026"/>
         </w:numPr>
-        <w:pStyle w:val="Compact"/>
       </w:pPr>
       <w:r>
         <w:t xml:space="preserve">Medplum credentials are present in the client. Choose storage and session controls appropriate to the browser or native platform.</w:t>
@@ -2027,11 +1991,11 @@
     </w:p>
     <w:p>
       <w:pPr>
+        <w:pStyle w:val="Compact"/>
         <w:numPr>
           <w:ilvl w:val="1"/>
           <w:numId w:val="1026"/>
         </w:numPr>
-        <w:pStyle w:val="Compact"/>
       </w:pPr>
       <w:r>
         <w:t xml:space="preserve">Every direct API request must be constrained by Medplum access policies; UI restrictions cannot enforce permissions.</w:t>
@@ -2039,16 +2003,16 @@
     </w:p>
     <w:p>
       <w:pPr>
+        <w:pStyle w:val="Compact"/>
         <w:numPr>
           <w:ilvl w:val="0"/>
           <w:numId w:val="1024"/>
         </w:numPr>
-        <w:pStyle w:val="Compact"/>
-      </w:pPr>
-      <w:r>
-        <w:rPr>
+      </w:pPr>
+      <w:r>
+        <w:rPr>
+          <w:b/>
           <w:bCs/>
-          <w:b/>
         </w:rPr>
         <w:t xml:space="preserve">Best fit:</w:t>
       </w:r>
@@ -2059,8 +2023,8 @@
         <w:t xml:space="preserve">Direct Medplum access is valuable and the client can manage both credential lifecycles.</w:t>
       </w:r>
     </w:p>
-    <w:bookmarkEnd w:id="43"/>
-    <w:bookmarkStart w:id="45" w:name="b2-keep-the-medplum-token-on-the-server"/>
+    <w:bookmarkEnd w:id="32"/>
+    <w:bookmarkStart w:id="34" w:name="b2-keep-the-medplum-token-on-the-server"/>
     <w:p>
       <w:pPr>
         <w:pStyle w:val="Heading5"/>
@@ -2079,27 +2043,27 @@
     </w:p>
     <w:p>
       <w:pPr>
+        <w:pStyle w:val="Compact"/>
         <w:numPr>
           <w:ilvl w:val="0"/>
           <w:numId w:val="1027"/>
         </w:numPr>
-        <w:pStyle w:val="Compact"/>
-      </w:pPr>
-      <w:r>
-        <w:rPr>
+      </w:pPr>
+      <w:r>
+        <w:rPr>
+          <w:b/>
           <w:bCs/>
-          <w:b/>
         </w:rPr>
         <w:t xml:space="preserve">Advantages:</w:t>
       </w:r>
     </w:p>
     <w:p>
       <w:pPr>
+        <w:pStyle w:val="Compact"/>
         <w:numPr>
           <w:ilvl w:val="1"/>
           <w:numId w:val="1028"/>
         </w:numPr>
-        <w:pStyle w:val="Compact"/>
       </w:pPr>
       <w:r>
         <w:t xml:space="preserve">Medplum credentials stay out of the client, so the client does not need to manage a second API credential lifecycle.</w:t>
@@ -2107,11 +2071,11 @@
     </w:p>
     <w:p>
       <w:pPr>
+        <w:pStyle w:val="Compact"/>
         <w:numPr>
           <w:ilvl w:val="1"/>
           <w:numId w:val="1028"/>
         </w:numPr>
-        <w:pStyle w:val="Compact"/>
       </w:pPr>
       <w:r>
         <w:t xml:space="preserve">Fits an existing backend that coordinates multiple services or deliberately mediates all data access.</w:t>
@@ -2119,11 +2083,11 @@
     </w:p>
     <w:p>
       <w:pPr>
+        <w:pStyle w:val="Compact"/>
         <w:numPr>
           <w:ilvl w:val="1"/>
           <w:numId w:val="1028"/>
         </w:numPr>
-        <w:pStyle w:val="Compact"/>
       </w:pPr>
       <w:r>
         <w:t xml:space="preserve">Medplum still enforces the resolved user’s access policy on the backend’s requests.</w:t>
@@ -2131,27 +2095,27 @@
     </w:p>
     <w:p>
       <w:pPr>
+        <w:pStyle w:val="Compact"/>
         <w:numPr>
           <w:ilvl w:val="0"/>
           <w:numId w:val="1027"/>
         </w:numPr>
-        <w:pStyle w:val="Compact"/>
-      </w:pPr>
-      <w:r>
-        <w:rPr>
+      </w:pPr>
+      <w:r>
+        <w:rPr>
+          <w:b/>
           <w:bCs/>
-          <w:b/>
         </w:rPr>
         <w:t xml:space="preserve">Tradeoffs:</w:t>
       </w:r>
     </w:p>
     <w:p>
       <w:pPr>
+        <w:pStyle w:val="Compact"/>
         <w:numPr>
           <w:ilvl w:val="1"/>
           <w:numId w:val="1029"/>
         </w:numPr>
-        <w:pStyle w:val="Compact"/>
       </w:pPr>
       <w:r>
         <w:t xml:space="preserve">Credential renewal and logout work move to the backend; they do not disappear.</w:t>
@@ -2159,11 +2123,11 @@
     </w:p>
     <w:p>
       <w:pPr>
+        <w:pStyle w:val="Compact"/>
         <w:numPr>
           <w:ilvl w:val="1"/>
           <w:numId w:val="1029"/>
         </w:numPr>
-        <w:pStyle w:val="Compact"/>
       </w:pPr>
       <w:r>
         <w:t xml:space="preserve">Your team operates the proxy and per-user token cache. This adds a request hop and another service whose availability and capacity affect Medplum access.</w:t>
@@ -2171,11 +2135,11 @@
     </w:p>
     <w:p>
       <w:pPr>
+        <w:pStyle w:val="Compact"/>
         <w:numPr>
           <w:ilvl w:val="1"/>
           <w:numId w:val="1029"/>
         </w:numPr>
-        <w:pStyle w:val="Compact"/>
       </w:pPr>
       <w:r>
         <w:t xml:space="preserve">Live updates need a path from Medplum through your backend to the client. Components expecting a directly authenticated Medplum client need adaptation.</w:t>
@@ -2183,11 +2147,11 @@
     </w:p>
     <w:p>
       <w:pPr>
+        <w:pStyle w:val="Compact"/>
         <w:numPr>
           <w:ilvl w:val="1"/>
           <w:numId w:val="1029"/>
         </w:numPr>
-        <w:pStyle w:val="Compact"/>
       </w:pPr>
       <w:r>
         <w:t xml:space="preserve">Every request must resolve to the correct user, membership, and cached token. A shared service token is not a substitute.</w:t>
@@ -2195,16 +2159,16 @@
     </w:p>
     <w:p>
       <w:pPr>
+        <w:pStyle w:val="Compact"/>
         <w:numPr>
           <w:ilvl w:val="0"/>
           <w:numId w:val="1027"/>
         </w:numPr>
-        <w:pStyle w:val="Compact"/>
-      </w:pPr>
-      <w:r>
-        <w:rPr>
+      </w:pPr>
+      <w:r>
+        <w:rPr>
+          <w:b/>
           <w:bCs/>
-          <w:b/>
         </w:rPr>
         <w:t xml:space="preserve">Best fit:</w:t>
       </w:r>
@@ -2233,7 +2197,7 @@
       <w:r>
         <w:t xml:space="preserve"> </w:t>
       </w:r>
-      <w:hyperlink r:id="rId44">
+      <w:hyperlink r:id="rId33">
         <w:r>
           <w:rPr>
             <w:rStyle w:val="Hyperlink"/>
@@ -2245,10 +2209,10 @@
         <w:t xml:space="preserve">.</w:t>
       </w:r>
     </w:p>
-    <w:bookmarkEnd w:id="45"/>
-    <w:bookmarkEnd w:id="46"/>
-    <w:bookmarkEnd w:id="47"/>
-    <w:bookmarkStart w:id="50" w:name="option-c-on-behalf-of"/>
+    <w:bookmarkEnd w:id="34"/>
+    <w:bookmarkEnd w:id="35"/>
+    <w:bookmarkEnd w:id="36"/>
+    <w:bookmarkStart w:id="39" w:name="option-c-on-behalf-of"/>
     <w:p>
       <w:pPr>
         <w:pStyle w:val="Heading3"/>
@@ -2294,27 +2258,27 @@
     </w:p>
     <w:p>
       <w:pPr>
+        <w:pStyle w:val="Compact"/>
         <w:numPr>
           <w:ilvl w:val="0"/>
           <w:numId w:val="1030"/>
         </w:numPr>
-        <w:pStyle w:val="Compact"/>
-      </w:pPr>
-      <w:r>
-        <w:rPr>
+      </w:pPr>
+      <w:r>
+        <w:rPr>
+          <w:b/>
           <w:bCs/>
-          <w:b/>
         </w:rPr>
         <w:t xml:space="preserve">Advantages:</w:t>
       </w:r>
     </w:p>
     <w:p>
       <w:pPr>
+        <w:pStyle w:val="Compact"/>
         <w:numPr>
           <w:ilvl w:val="1"/>
           <w:numId w:val="1031"/>
         </w:numPr>
-        <w:pStyle w:val="Compact"/>
       </w:pPr>
       <w:r>
         <w:t xml:space="preserve">Supports a backend that owns user authentication but cannot exchange a supported external access token.</w:t>
@@ -2322,11 +2286,11 @@
     </w:p>
     <w:p>
       <w:pPr>
+        <w:pStyle w:val="Compact"/>
         <w:numPr>
           <w:ilvl w:val="1"/>
           <w:numId w:val="1031"/>
         </w:numPr>
-        <w:pStyle w:val="Compact"/>
       </w:pPr>
       <w:r>
         <w:t xml:space="preserve">Retains user attribution and policy enforcement when correctly configured.</w:t>
@@ -2334,27 +2298,27 @@
     </w:p>
     <w:p>
       <w:pPr>
+        <w:pStyle w:val="Compact"/>
         <w:numPr>
           <w:ilvl w:val="0"/>
           <w:numId w:val="1030"/>
         </w:numPr>
-        <w:pStyle w:val="Compact"/>
-      </w:pPr>
-      <w:r>
-        <w:rPr>
+      </w:pPr>
+      <w:r>
+        <w:rPr>
+          <w:b/>
           <w:bCs/>
-          <w:b/>
         </w:rPr>
         <w:t xml:space="preserve">Tradeoffs:</w:t>
       </w:r>
     </w:p>
     <w:p>
       <w:pPr>
+        <w:pStyle w:val="Compact"/>
         <w:numPr>
           <w:ilvl w:val="1"/>
           <w:numId w:val="1032"/>
         </w:numPr>
-        <w:pStyle w:val="Compact"/>
       </w:pPr>
       <w:r>
         <w:t xml:space="preserve">Requires an application with Project Admin rights and a trusted identity-to-membership mapping.</w:t>
@@ -2362,11 +2326,11 @@
     </w:p>
     <w:p>
       <w:pPr>
+        <w:pStyle w:val="Compact"/>
         <w:numPr>
           <w:ilvl w:val="1"/>
           <w:numId w:val="1032"/>
         </w:numPr>
-        <w:pStyle w:val="Compact"/>
       </w:pPr>
       <w:r>
         <w:t xml:space="preserve">Without the header, requests use the application’s own access. A wrong valid membership can act for the wrong user.</w:t>
@@ -2374,11 +2338,11 @@
     </w:p>
     <w:p>
       <w:pPr>
+        <w:pStyle w:val="Compact"/>
         <w:numPr>
           <w:ilvl w:val="1"/>
           <w:numId w:val="1032"/>
         </w:numPr>
-        <w:pStyle w:val="Compact"/>
       </w:pPr>
       <w:r>
         <w:t xml:space="preserve">Your backend is responsible for authenticating the person and choosing the delegation context; the header itself is not proof of the user’s identity.</w:t>
@@ -2386,40 +2350,40 @@
     </w:p>
     <w:p>
       <w:pPr>
+        <w:pStyle w:val="Compact"/>
         <w:numPr>
           <w:ilvl w:val="0"/>
           <w:numId w:val="1030"/>
         </w:numPr>
-        <w:pStyle w:val="Compact"/>
-      </w:pPr>
-      <w:r>
-        <w:rPr>
+      </w:pPr>
+      <w:r>
+        <w:rPr>
+          <w:b/>
           <w:bCs/>
+        </w:rPr>
+        <w:t xml:space="preserve">Best fit:</w:t>
+      </w:r>
+      <w:r>
+        <w:t xml:space="preserve"> </w:t>
+      </w:r>
+      <w:r>
+        <w:t xml:space="preserve">A legacy backend requires this delegation model and cannot use user-scoped token exchange.</w:t>
+      </w:r>
+    </w:p>
+    <w:p>
+      <w:pPr>
+        <w:pStyle w:val="FirstParagraph"/>
+      </w:pPr>
+      <w:r>
+        <w:t xml:space="preserve">This differs from server-side token exchange: the underlying credential represents the</w:t>
+      </w:r>
+      <w:r>
+        <w:t xml:space="preserve"> </w:t>
+      </w:r>
+      <w:r>
+        <w:rPr>
           <w:b/>
-        </w:rPr>
-        <w:t xml:space="preserve">Best fit:</w:t>
-      </w:r>
-      <w:r>
-        <w:t xml:space="preserve"> </w:t>
-      </w:r>
-      <w:r>
-        <w:t xml:space="preserve">A legacy backend requires this delegation model and cannot use user-scoped token exchange.</w:t>
-      </w:r>
-    </w:p>
-    <w:p>
-      <w:pPr>
-        <w:pStyle w:val="FirstParagraph"/>
-      </w:pPr>
-      <w:r>
-        <w:t xml:space="preserve">This differs from server-side token exchange: the underlying credential represents the</w:t>
-      </w:r>
-      <w:r>
-        <w:t xml:space="preserve"> </w:t>
-      </w:r>
-      <w:r>
-        <w:rPr>
           <w:bCs/>
-          <w:b/>
         </w:rPr>
         <w:t xml:space="preserve">application</w:t>
       </w:r>
@@ -2437,7 +2401,7 @@
       <w:r>
         <w:t xml:space="preserve"> </w:t>
       </w:r>
-      <w:hyperlink r:id="rId48">
+      <w:hyperlink r:id="rId37">
         <w:r>
           <w:rPr>
             <w:rStyle w:val="Hyperlink"/>
@@ -2451,7 +2415,7 @@
       <w:r>
         <w:t xml:space="preserve"> </w:t>
       </w:r>
-      <w:hyperlink r:id="rId49">
+      <w:hyperlink r:id="rId38">
         <w:r>
           <w:rPr>
             <w:rStyle w:val="Hyperlink"/>
@@ -2466,8 +2430,8 @@
         <w:t xml:space="preserve">for attribution metadata and configuration.</w:t>
       </w:r>
     </w:p>
-    <w:bookmarkEnd w:id="50"/>
-    <w:bookmarkStart w:id="51" w:name="recommended-approach-2"/>
+    <w:bookmarkEnd w:id="39"/>
+    <w:bookmarkStart w:id="40" w:name="recommended-approach-2"/>
     <w:p>
       <w:pPr>
         <w:pStyle w:val="Heading3"/>
@@ -2480,9 +2444,8 @@
       <w:tblPr>
         <w:tblStyle w:val="Table"/>
         <w:tblW w:w="9360" w:type="dxa"/>
+        <w:tblLayout w:type="fixed"/>
         <w:tblLook w:firstRow="1" w:lastRow="0" w:firstColumn="0" w:lastColumn="0" w:noHBand="0" w:noVBand="0" w:val="0020"/>
-        <w:jc w:val="start"/>
-        <w:tblLayout w:type="fixed"/>
       </w:tblPr>
       <w:tblGrid>
         <w:gridCol w:w="4586"/>
@@ -2491,14 +2454,13 @@
       <w:tr>
         <w:trPr>
           <w:cantSplit/>
-          <w:tblHeader w:val="true"/>
+          <w:tblHeader w:val="on"/>
         </w:trPr>
         <w:tc>
           <w:tcPr/>
           <w:p>
             <w:pPr>
               <w:pStyle w:val="Compact"/>
-              <w:jc w:val="left"/>
             </w:pPr>
             <w:r>
               <w:t xml:space="preserve">Situation</w:t>
@@ -2510,7 +2472,6 @@
           <w:p>
             <w:pPr>
               <w:pStyle w:val="Compact"/>
-              <w:jc w:val="left"/>
             </w:pPr>
             <w:r>
               <w:t xml:space="preserve">Approach</w:t>
@@ -2527,7 +2488,6 @@
           <w:p>
             <w:pPr>
               <w:pStyle w:val="Compact"/>
-              <w:jc w:val="left"/>
             </w:pPr>
             <w:r>
               <w:t xml:space="preserve">Medplum can handle the external IDP callback, and the client primarily needs Medplum access</w:t>
@@ -2539,7 +2499,6 @@
           <w:p>
             <w:pPr>
               <w:pStyle w:val="Compact"/>
-              <w:jc w:val="left"/>
             </w:pPr>
             <w:r>
               <w:t xml:space="preserve">Start with the authorization-code flow.</w:t>
@@ -2556,7 +2515,6 @@
           <w:p>
             <w:pPr>
               <w:pStyle w:val="Compact"/>
-              <w:jc w:val="left"/>
             </w:pPr>
             <w:r>
               <w:t xml:space="preserve">Application obtains a supported external access token through its own login flow and needs direct Medplum client access</w:t>
@@ -2568,7 +2526,6 @@
           <w:p>
             <w:pPr>
               <w:pStyle w:val="Compact"/>
-              <w:jc w:val="left"/>
             </w:pPr>
             <w:r>
               <w:t xml:space="preserve">Use token exchange with Medplum tokens in the client.</w:t>
@@ -2585,7 +2542,6 @@
           <w:p>
             <w:pPr>
               <w:pStyle w:val="Compact"/>
-              <w:jc w:val="left"/>
             </w:pPr>
             <w:r>
               <w:t xml:space="preserve">Application obtains a supported external access token through its own login flow and mediates Medplum access through its backend</w:t>
@@ -2597,7 +2553,6 @@
           <w:p>
             <w:pPr>
               <w:pStyle w:val="Compact"/>
-              <w:jc w:val="left"/>
             </w:pPr>
             <w:r>
               <w:t xml:space="preserve">Use token exchange with Medplum tokens on the server.</w:t>
@@ -2614,7 +2569,6 @@
           <w:p>
             <w:pPr>
               <w:pStyle w:val="Compact"/>
-              <w:jc w:val="left"/>
             </w:pPr>
             <w:r>
               <w:t xml:space="preserve">Backend can use either user-scoped exchange or On-Behalf-Of</w:t>
@@ -2626,7 +2580,6 @@
           <w:p>
             <w:pPr>
               <w:pStyle w:val="Compact"/>
-              <w:jc w:val="left"/>
             </w:pPr>
             <w:r>
               <w:t xml:space="preserve">Prefer user-scoped exchange to avoid depending on a privileged application credential and a delegation header.</w:t>
@@ -2643,7 +2596,6 @@
           <w:p>
             <w:pPr>
               <w:pStyle w:val="Compact"/>
-              <w:jc w:val="left"/>
             </w:pPr>
             <w:r>
               <w:t xml:space="preserve">Legacy authentication prevents supported token exchange</w:t>
@@ -2655,7 +2607,6 @@
           <w:p>
             <w:pPr>
               <w:pStyle w:val="Compact"/>
-              <w:jc w:val="left"/>
             </w:pPr>
             <w:r>
               <w:t xml:space="preserve">Evaluate On-Behalf-Of with explicit ownership of authentication, mapping, and delegation controls.</w:t>
@@ -2670,8 +2621,8 @@
       </w:pPr>
       <w:r>
         <w:rPr>
+          <w:b/>
           <w:bCs/>
-          <w:b/>
         </w:rPr>
         <w:t xml:space="preserve">Record:</w:t>
       </w:r>
@@ -2682,9 +2633,9 @@
         <w:t xml:space="preserve">Token flow, token location, membership-selection rules, and ownership of proxy operations and credential lifecycles.</w:t>
       </w:r>
     </w:p>
-    <w:bookmarkEnd w:id="51"/>
-    <w:bookmarkEnd w:id="52"/>
-    <w:bookmarkStart w:id="65" w:name="additional-decisions"/>
+    <w:bookmarkEnd w:id="40"/>
+    <w:bookmarkEnd w:id="41"/>
+    <w:bookmarkStart w:id="54" w:name="additional-decisions"/>
     <w:p>
       <w:pPr>
         <w:pStyle w:val="Heading2"/>
@@ -2701,7 +2652,7 @@
         <w:t xml:space="preserve">Resolve these after choosing the main architecture. Use the technical docs for configuration details.</w:t>
       </w:r>
     </w:p>
-    <w:bookmarkStart w:id="54" w:name="X67940e01c9738229487d4098b5e4781eb267b97"/>
+    <w:bookmarkStart w:id="43" w:name="X67940e01c9738229487d4098b5e4781eb267b97"/>
     <w:p>
       <w:pPr>
         <w:pStyle w:val="Heading3"/>
@@ -2776,9 +2727,8 @@
       <w:tblPr>
         <w:tblStyle w:val="Table"/>
         <w:tblW w:w="9360" w:type="dxa"/>
+        <w:tblLayout w:type="fixed"/>
         <w:tblLook w:firstRow="1" w:lastRow="0" w:firstColumn="0" w:lastColumn="0" w:noHBand="0" w:noVBand="0" w:val="0020"/>
-        <w:jc w:val="start"/>
-        <w:tblLayout w:type="fixed"/>
       </w:tblPr>
       <w:tblGrid>
         <w:gridCol w:w="4611"/>
@@ -2787,14 +2737,13 @@
       <w:tr>
         <w:trPr>
           <w:cantSplit/>
-          <w:tblHeader w:val="true"/>
+          <w:tblHeader w:val="on"/>
         </w:trPr>
         <w:tc>
           <w:tcPr/>
           <w:p>
             <w:pPr>
               <w:pStyle w:val="Compact"/>
-              <w:jc w:val="left"/>
             </w:pPr>
             <w:r>
               <w:t xml:space="preserve">Situation</w:t>
@@ -2806,7 +2755,6 @@
           <w:p>
             <w:pPr>
               <w:pStyle w:val="Compact"/>
-              <w:jc w:val="left"/>
             </w:pPr>
             <w:r>
               <w:t xml:space="preserve">Approach</w:t>
@@ -2823,7 +2771,6 @@
           <w:p>
             <w:pPr>
               <w:pStyle w:val="Compact"/>
-              <w:jc w:val="left"/>
             </w:pPr>
             <w:r>
               <w:t xml:space="preserve">Patients and clinicians primarily use one production project</w:t>
@@ -2835,7 +2782,6 @@
           <w:p>
             <w:pPr>
               <w:pStyle w:val="Compact"/>
-              <w:jc w:val="left"/>
             </w:pPr>
             <w:r>
               <w:t xml:space="preserve">Explicitly choose project-scoped users; the Practitioner default is server-scoped.</w:t>
@@ -2852,7 +2798,6 @@
           <w:p>
             <w:pPr>
               <w:pStyle w:val="Compact"/>
-              <w:jc w:val="left"/>
             </w:pPr>
             <w:r>
               <w:t xml:space="preserve">Developers or administrators need multiple projects</w:t>
@@ -2864,7 +2809,6 @@
           <w:p>
             <w:pPr>
               <w:pStyle w:val="Compact"/>
-              <w:jc w:val="left"/>
             </w:pPr>
             <w:r>
               <w:t xml:space="preserve">Evaluate server-scoped users and the required memberships. Hosted administrative control differs by user scope.</w:t>
@@ -2881,7 +2825,6 @@
           <w:p>
             <w:pPr>
               <w:pStyle w:val="Compact"/>
-              <w:jc w:val="left"/>
             </w:pPr>
             <w:r>
               <w:t xml:space="preserve">Token exchange has multiple candidate memberships</w:t>
@@ -2893,7 +2836,6 @@
           <w:p>
             <w:pPr>
               <w:pStyle w:val="Compact"/>
-              <w:jc w:val="left"/>
             </w:pPr>
             <w:r>
               <w:t xml:space="preserve">Pass the intended</w:t>
@@ -2925,7 +2867,6 @@
           <w:p>
             <w:pPr>
               <w:pStyle w:val="Compact"/>
-              <w:jc w:val="left"/>
             </w:pPr>
             <w:r>
               <w:t xml:space="preserve">Exchange must reach another project</w:t>
@@ -2937,7 +2878,6 @@
           <w:p>
             <w:pPr>
               <w:pStyle w:val="Compact"/>
-              <w:jc w:val="left"/>
             </w:pPr>
             <w:r>
               <w:t xml:space="preserve">A per-</w:t>
@@ -2968,7 +2908,7 @@
       <w:r>
         <w:t xml:space="preserve"> </w:t>
       </w:r>
-      <w:hyperlink r:id="rId24">
+      <w:hyperlink r:id="rId13">
         <w:r>
           <w:rPr>
             <w:rStyle w:val="Hyperlink"/>
@@ -2982,7 +2922,7 @@
       <w:r>
         <w:t xml:space="preserve"> </w:t>
       </w:r>
-      <w:hyperlink r:id="rId53">
+      <w:hyperlink r:id="rId42">
         <w:r>
           <w:rPr>
             <w:rStyle w:val="Hyperlink"/>
@@ -2996,7 +2936,7 @@
       <w:r>
         <w:t xml:space="preserve"> </w:t>
       </w:r>
-      <w:hyperlink r:id="rId44">
+      <w:hyperlink r:id="rId33">
         <w:r>
           <w:rPr>
             <w:rStyle w:val="Hyperlink"/>
@@ -3008,8 +2948,8 @@
         <w:t xml:space="preserve">.</w:t>
       </w:r>
     </w:p>
-    <w:bookmarkEnd w:id="54"/>
-    <w:bookmarkStart w:id="58" w:name="Xf68f2466a7c976f836933c670cad8e62d95f1e6"/>
+    <w:bookmarkEnd w:id="43"/>
+    <w:bookmarkStart w:id="47" w:name="Xf68f2466a7c976f836933c670cad8e62d95f1e6"/>
     <w:p>
       <w:pPr>
         <w:pStyle w:val="Heading3"/>
@@ -3044,7 +2984,7 @@
       <w:r>
         <w:t xml:space="preserve"> </w:t>
       </w:r>
-      <w:hyperlink r:id="rId55">
+      <w:hyperlink r:id="rId44">
         <w:r>
           <w:rPr>
             <w:rStyle w:val="Hyperlink"/>
@@ -3058,7 +2998,7 @@
       <w:r>
         <w:t xml:space="preserve"> </w:t>
       </w:r>
-      <w:hyperlink r:id="rId56">
+      <w:hyperlink r:id="rId45">
         <w:r>
           <w:rPr>
             <w:rStyle w:val="Hyperlink"/>
@@ -3072,7 +3012,7 @@
       <w:r>
         <w:t xml:space="preserve"> </w:t>
       </w:r>
-      <w:hyperlink r:id="rId57">
+      <w:hyperlink r:id="rId46">
         <w:r>
           <w:rPr>
             <w:rStyle w:val="Hyperlink"/>
@@ -3084,8 +3024,8 @@
         <w:t xml:space="preserve">.</w:t>
       </w:r>
     </w:p>
-    <w:bookmarkEnd w:id="58"/>
-    <w:bookmarkStart w:id="64" w:name="do-you-need-a-specialized-flow"/>
+    <w:bookmarkEnd w:id="47"/>
+    <w:bookmarkStart w:id="53" w:name="do-you-need-a-specialized-flow"/>
     <w:p>
       <w:pPr>
         <w:pStyle w:val="Heading3"/>
@@ -3098,9 +3038,8 @@
       <w:tblPr>
         <w:tblStyle w:val="Table"/>
         <w:tblW w:w="9360" w:type="dxa"/>
+        <w:tblLayout w:type="fixed"/>
         <w:tblLook w:firstRow="1" w:lastRow="0" w:firstColumn="0" w:lastColumn="0" w:noHBand="0" w:noVBand="0" w:val="0020"/>
-        <w:jc w:val="start"/>
-        <w:tblLayout w:type="fixed"/>
       </w:tblPr>
       <w:tblGrid>
         <w:gridCol w:w="4705"/>
@@ -3109,14 +3048,13 @@
       <w:tr>
         <w:trPr>
           <w:cantSplit/>
-          <w:tblHeader w:val="true"/>
+          <w:tblHeader w:val="on"/>
         </w:trPr>
         <w:tc>
           <w:tcPr/>
           <w:p>
             <w:pPr>
               <w:pStyle w:val="Compact"/>
-              <w:jc w:val="left"/>
             </w:pPr>
             <w:r>
               <w:t xml:space="preserve">Situation</w:t>
@@ -3128,7 +3066,6 @@
           <w:p>
             <w:pPr>
               <w:pStyle w:val="Compact"/>
-              <w:jc w:val="left"/>
             </w:pPr>
             <w:r>
               <w:t xml:space="preserve">Approach</w:t>
@@ -3145,7 +3082,6 @@
           <w:p>
             <w:pPr>
               <w:pStyle w:val="Compact"/>
-              <w:jc w:val="left"/>
             </w:pPr>
             <w:r>
               <w:t xml:space="preserve">Background service acts as itself</w:t>
@@ -3157,7 +3093,6 @@
           <w:p>
             <w:pPr>
               <w:pStyle w:val="Compact"/>
-              <w:jc w:val="left"/>
             </w:pPr>
             <w:r>
               <w:t xml:space="preserve">Use</w:t>
@@ -3165,7 +3100,7 @@
             <w:r>
               <w:t xml:space="preserve"> </w:t>
             </w:r>
-            <w:hyperlink r:id="rId48">
+            <w:hyperlink r:id="rId37">
               <w:r>
                 <w:rPr>
                   <w:rStyle w:val="Hyperlink"/>
@@ -3203,7 +3138,6 @@
           <w:p>
             <w:pPr>
               <w:pStyle w:val="Compact"/>
-              <w:jc w:val="left"/>
             </w:pPr>
             <w:r>
               <w:t xml:space="preserve">Browser or native authorization-code client</w:t>
@@ -3215,7 +3149,6 @@
           <w:p>
             <w:pPr>
               <w:pStyle w:val="Compact"/>
-              <w:jc w:val="left"/>
             </w:pPr>
             <w:r>
               <w:t xml:space="preserve">Use PKCE and documented redirect protections. Native apps should authorize through the system browser. Never embed a confidential client secret in browser code or a mobile binary. See</w:t>
@@ -3223,7 +3156,7 @@
             <w:r>
               <w:t xml:space="preserve"> </w:t>
             </w:r>
-            <w:hyperlink r:id="rId59">
+            <w:hyperlink r:id="rId48">
               <w:r>
                 <w:rPr>
                   <w:rStyle w:val="Hyperlink"/>
@@ -3240,7 +3173,7 @@
             <w:r>
               <w:t xml:space="preserve"> </w:t>
             </w:r>
-            <w:hyperlink r:id="rId60">
+            <w:hyperlink r:id="rId49">
               <w:r>
                 <w:rPr>
                   <w:rStyle w:val="Hyperlink"/>
@@ -3263,7 +3196,6 @@
           <w:p>
             <w:pPr>
               <w:pStyle w:val="Compact"/>
-              <w:jc w:val="left"/>
             </w:pPr>
             <w:r>
               <w:t xml:space="preserve">Self-hosted deployment must accept external JWTs directly</w:t>
@@ -3275,7 +3207,6 @@
           <w:p>
             <w:pPr>
               <w:pStyle w:val="Compact"/>
-              <w:jc w:val="left"/>
             </w:pPr>
             <w:r>
               <w:t xml:space="preserve">Evaluate</w:t>
@@ -3283,7 +3214,7 @@
             <w:r>
               <w:t xml:space="preserve"> </w:t>
             </w:r>
-            <w:hyperlink r:id="rId61">
+            <w:hyperlink r:id="rId50">
               <w:r>
                 <w:rPr>
                   <w:rStyle w:val="Hyperlink"/>
@@ -3306,7 +3237,6 @@
           <w:p>
             <w:pPr>
               <w:pStyle w:val="Compact"/>
-              <w:jc w:val="left"/>
             </w:pPr>
             <w:r>
               <w:t xml:space="preserve">Third-party app needs a SMART launch</w:t>
@@ -3318,7 +3248,6 @@
           <w:p>
             <w:pPr>
               <w:pStyle w:val="Compact"/>
-              <w:jc w:val="left"/>
             </w:pPr>
             <w:r>
               <w:t xml:space="preserve">Use the</w:t>
@@ -3326,7 +3255,7 @@
             <w:r>
               <w:t xml:space="preserve"> </w:t>
             </w:r>
-            <w:hyperlink r:id="rId62">
+            <w:hyperlink r:id="rId51">
               <w:r>
                 <w:rPr>
                   <w:rStyle w:val="Hyperlink"/>
@@ -3349,7 +3278,6 @@
           <w:p>
             <w:pPr>
               <w:pStyle w:val="Compact"/>
-              <w:jc w:val="left"/>
             </w:pPr>
             <w:r>
               <w:t xml:space="preserve">Activation precedes account creation</w:t>
@@ -3361,7 +3289,6 @@
           <w:p>
             <w:pPr>
               <w:pStyle w:val="Compact"/>
-              <w:jc w:val="left"/>
             </w:pPr>
             <w:r>
               <w:t xml:space="preserve">Follow the</w:t>
@@ -3369,7 +3296,7 @@
             <w:r>
               <w:t xml:space="preserve"> </w:t>
             </w:r>
-            <w:hyperlink r:id="rId63">
+            <w:hyperlink r:id="rId52">
               <w:r>
                 <w:rPr>
                   <w:rStyle w:val="Hyperlink"/>
@@ -3384,9 +3311,9 @@
         </w:tc>
       </w:tr>
     </w:tbl>
-    <w:bookmarkEnd w:id="64"/>
-    <w:bookmarkEnd w:id="65"/>
-    <w:bookmarkStart w:id="66" w:name="before-you-implement"/>
+    <w:bookmarkEnd w:id="53"/>
+    <w:bookmarkEnd w:id="54"/>
+    <w:bookmarkStart w:id="55" w:name="before-you-implement"/>
     <w:p>
       <w:pPr>
         <w:pStyle w:val="Heading2"/>
@@ -3403,8 +3330,8 @@
         <w:t xml:space="preserve">Record the three architecture choices for each user population, then test first login, email change, account recovery, membership switching, token expiry, logout, and offboarding. For proxies, verify that missing user context fails without falling back to application credentials.</w:t>
       </w:r>
     </w:p>
-    <w:bookmarkEnd w:id="66"/>
-    <w:bookmarkEnd w:id="67"/>
+    <w:bookmarkEnd w:id="55"/>
+    <w:bookmarkEnd w:id="56"/>
     <w:sectPr>
       <w:pgSz w:h="15840" w:w="12240"/>
       <w:pgMar w:bottom="1440" w:footer="720" w:gutter="0" w:header="720" w:left="1440" w:right="1440" w:top="1440"/>
@@ -3442,14 +3369,14 @@
 <file path=word/numbering.xml><?xml version="1.0" encoding="utf-8"?>
 <w:numbering xmlns:w="http://schemas.openxmlformats.org/wordprocessingml/2006/main">
   <w:abstractNum w:abstractNumId="990">
-    <w:nsid w:val="A990"/>
+    <w:nsid w:val="0000A990"/>
     <w:multiLevelType w:val="multilevel"/>
     <w:lvl w:ilvl="0">
       <w:numFmt w:val="bullet"/>
       <w:lvlText w:val=" "/>
       <w:lvlJc w:val="left"/>
       <w:pPr>
-        <w:ind w:left="720" w:hanging="480"/>
+        <w:ind w:left="720" w:hanging="360"/>
       </w:pPr>
     </w:lvl>
     <w:lvl w:ilvl="1">
@@ -3457,7 +3384,7 @@
       <w:lvlText w:val=" "/>
       <w:lvlJc w:val="left"/>
       <w:pPr>
-        <w:ind w:left="1440" w:hanging="480"/>
+        <w:ind w:left="1440" w:hanging="360"/>
       </w:pPr>
     </w:lvl>
     <w:lvl w:ilvl="2">
@@ -3465,7 +3392,7 @@
       <w:lvlText w:val=" "/>
       <w:lvlJc w:val="left"/>
       <w:pPr>
-        <w:ind w:left="2160" w:hanging="480"/>
+        <w:ind w:left="2160" w:hanging="360"/>
       </w:pPr>
     </w:lvl>
     <w:lvl w:ilvl="3">
@@ -3473,7 +3400,7 @@
       <w:lvlText w:val=" "/>
       <w:lvlJc w:val="left"/>
       <w:pPr>
-        <w:ind w:left="2880" w:hanging="480"/>
+        <w:ind w:left="2880" w:hanging="360"/>
       </w:pPr>
     </w:lvl>
     <w:lvl w:ilvl="4">
@@ -3481,7 +3408,7 @@
       <w:lvlText w:val=" "/>
       <w:lvlJc w:val="left"/>
       <w:pPr>
-        <w:ind w:left="3600" w:hanging="480"/>
+        <w:ind w:left="3600" w:hanging="360"/>
       </w:pPr>
     </w:lvl>
     <w:lvl w:ilvl="5">
@@ -3489,7 +3416,7 @@
       <w:lvlText w:val=" "/>
       <w:lvlJc w:val="left"/>
       <w:pPr>
-        <w:ind w:left="4320" w:hanging="480"/>
+        <w:ind w:left="4320" w:hanging="360"/>
       </w:pPr>
     </w:lvl>
     <w:lvl w:ilvl="6">
@@ -3497,7 +3424,7 @@
       <w:lvlText w:val=" "/>
       <w:lvlJc w:val="left"/>
       <w:pPr>
-        <w:ind w:left="5040" w:hanging="480"/>
+        <w:ind w:left="5040" w:hanging="360"/>
       </w:pPr>
     </w:lvl>
     <w:lvl w:ilvl="7">
@@ -3505,7 +3432,7 @@
       <w:lvlText w:val=" "/>
       <w:lvlJc w:val="left"/>
       <w:pPr>
-        <w:ind w:left="5760" w:hanging="480"/>
+        <w:ind w:left="5760" w:hanging="360"/>
       </w:pPr>
     </w:lvl>
     <w:lvl w:ilvl="8">
@@ -3513,12 +3440,12 @@
       <w:lvlText w:val=" "/>
       <w:lvlJc w:val="left"/>
       <w:pPr>
-        <w:ind w:left="6480" w:hanging="480"/>
+        <w:ind w:left="6480" w:hanging="360"/>
       </w:pPr>
     </w:lvl>
   </w:abstractNum>
   <w:abstractNum w:abstractNumId="99411">
-    <w:nsid w:val="A99411"/>
+    <w:nsid w:val="00A99411"/>
     <w:multiLevelType w:val="multilevel"/>
     <w:lvl w:ilvl="0">
       <w:start w:val="1"/>
@@ -3526,7 +3453,7 @@
       <w:lvlText w:val="%1."/>
       <w:lvlJc w:val="left"/>
       <w:pPr>
-        <w:ind w:left="720" w:hanging="480"/>
+        <w:ind w:left="720" w:hanging="360"/>
       </w:pPr>
     </w:lvl>
     <w:lvl w:ilvl="1">
@@ -3535,7 +3462,7 @@
       <w:lvlText w:val="%2."/>
       <w:lvlJc w:val="left"/>
       <w:pPr>
-        <w:ind w:left="1440" w:hanging="480"/>
+        <w:ind w:left="1440" w:hanging="360"/>
       </w:pPr>
     </w:lvl>
     <w:lvl w:ilvl="2">
@@ -3544,7 +3471,7 @@
       <w:lvlText w:val="%3."/>
       <w:lvlJc w:val="left"/>
       <w:pPr>
-        <w:ind w:left="2160" w:hanging="480"/>
+        <w:ind w:left="2160" w:hanging="360"/>
       </w:pPr>
     </w:lvl>
     <w:lvl w:ilvl="3">
@@ -3553,7 +3480,7 @@
       <w:lvlText w:val="%4."/>
       <w:lvlJc w:val="left"/>
       <w:pPr>
-        <w:ind w:left="2880" w:hanging="480"/>
+        <w:ind w:left="2880" w:hanging="360"/>
       </w:pPr>
     </w:lvl>
     <w:lvl w:ilvl="4">
@@ -3562,7 +3489,7 @@
       <w:lvlText w:val="%5."/>
       <w:lvlJc w:val="left"/>
       <w:pPr>
-        <w:ind w:left="3600" w:hanging="480"/>
+        <w:ind w:left="3600" w:hanging="360"/>
       </w:pPr>
     </w:lvl>
     <w:lvl w:ilvl="5">
@@ -3571,7 +3498,7 @@
       <w:lvlText w:val="%6."/>
       <w:lvlJc w:val="left"/>
       <w:pPr>
-        <w:ind w:left="4320" w:hanging="480"/>
+        <w:ind w:left="4320" w:hanging="360"/>
       </w:pPr>
     </w:lvl>
     <w:lvl w:ilvl="6">
@@ -3580,7 +3507,7 @@
       <w:lvlText w:val="%7."/>
       <w:lvlJc w:val="left"/>
       <w:pPr>
-        <w:ind w:left="5040" w:hanging="480"/>
+        <w:ind w:left="5040" w:hanging="360"/>
       </w:pPr>
     </w:lvl>
     <w:lvl w:ilvl="7">
@@ -3589,7 +3516,7 @@
       <w:lvlText w:val="%8."/>
       <w:lvlJc w:val="left"/>
       <w:pPr>
-        <w:ind w:left="5760" w:hanging="480"/>
+        <w:ind w:left="5760" w:hanging="360"/>
       </w:pPr>
     </w:lvl>
     <w:lvl w:ilvl="8">
@@ -3598,84 +3525,111 @@
       <w:lvlText w:val="%9."/>
       <w:lvlJc w:val="left"/>
       <w:pPr>
-        <w:ind w:left="6480" w:hanging="480"/>
+        <w:ind w:left="6480" w:hanging="360"/>
       </w:pPr>
     </w:lvl>
   </w:abstractNum>
   <w:abstractNum w:abstractNumId="991">
-    <w:nsid w:val="A991"/>
+    <w:nsid w:val="0000A991"/>
     <w:multiLevelType w:val="multilevel"/>
     <w:lvl w:ilvl="0">
       <w:numFmt w:val="bullet"/>
-      <w:lvlText w:val="•"/>
+      <w:lvlText w:val=""/>
       <w:lvlJc w:val="left"/>
       <w:pPr>
-        <w:ind w:left="720" w:hanging="480"/>
-      </w:pPr>
+        <w:ind w:left="720" w:hanging="360"/>
+      </w:pPr>
+      <w:rPr>
+        <w:rFonts w:ascii="Symbol" w:hAnsi="Symbol" w:cs="Symbol" w:hint="default"/>
+      </w:rPr>
     </w:lvl>
     <w:lvl w:ilvl="1">
       <w:numFmt w:val="bullet"/>
-      <w:lvlText w:val="–"/>
+      <w:lvlText w:val="o"/>
       <w:lvlJc w:val="left"/>
       <w:pPr>
-        <w:ind w:left="1440" w:hanging="480"/>
-      </w:pPr>
+        <w:ind w:left="1440" w:hanging="360"/>
+      </w:pPr>
+      <w:rPr>
+        <w:rFonts w:ascii="Courier New" w:hAnsi="Courier New" w:cs="Courier New" w:hint="default"/>
+      </w:rPr>
     </w:lvl>
     <w:lvl w:ilvl="2">
       <w:numFmt w:val="bullet"/>
-      <w:lvlText w:val="•"/>
+      <w:lvlText w:val=""/>
       <w:lvlJc w:val="left"/>
       <w:pPr>
-        <w:ind w:left="2160" w:hanging="480"/>
-      </w:pPr>
+        <w:ind w:left="2160" w:hanging="360"/>
+      </w:pPr>
+      <w:rPr>
+        <w:rFonts w:ascii="Wingdings" w:hAnsi="Wingdings" w:cs="Wingdings" w:hint="default"/>
+      </w:rPr>
     </w:lvl>
     <w:lvl w:ilvl="3">
       <w:numFmt w:val="bullet"/>
-      <w:lvlText w:val="–"/>
+      <w:lvlText w:val=""/>
       <w:lvlJc w:val="left"/>
       <w:pPr>
-        <w:ind w:left="2880" w:hanging="480"/>
-      </w:pPr>
+        <w:ind w:left="2880" w:hanging="360"/>
+      </w:pPr>
+      <w:rPr>
+        <w:rFonts w:ascii="Symbol" w:hAnsi="Symbol" w:cs="Symbol" w:hint="default"/>
+      </w:rPr>
     </w:lvl>
     <w:lvl w:ilvl="4">
       <w:numFmt w:val="bullet"/>
-      <w:lvlText w:val="•"/>
+      <w:lvlText w:val="o"/>
       <w:lvlJc w:val="left"/>
       <w:pPr>
-        <w:ind w:left="3600" w:hanging="480"/>
-      </w:pPr>
+        <w:ind w:left="3600" w:hanging="360"/>
+      </w:pPr>
+      <w:rPr>
+        <w:rFonts w:ascii="Courier New" w:hAnsi="Courier New" w:cs="Courier New" w:hint="default"/>
+      </w:rPr>
     </w:lvl>
     <w:lvl w:ilvl="5">
       <w:numFmt w:val="bullet"/>
-      <w:lvlText w:val="–"/>
+      <w:lvlText w:val=""/>
       <w:lvlJc w:val="left"/>
       <w:pPr>
-        <w:ind w:left="4320" w:hanging="480"/>
-      </w:pPr>
+        <w:ind w:left="4320" w:hanging="360"/>
+      </w:pPr>
+      <w:rPr>
+        <w:rFonts w:ascii="Wingdings" w:hAnsi="Wingdings" w:cs="Wingdings" w:hint="default"/>
+      </w:rPr>
     </w:lvl>
     <w:lvl w:ilvl="6">
       <w:numFmt w:val="bullet"/>
-      <w:lvlText w:val="•"/>
+      <w:lvlText w:val=""/>
       <w:lvlJc w:val="left"/>
       <w:pPr>
-        <w:ind w:left="5040" w:hanging="480"/>
-      </w:pPr>
+        <w:ind w:left="5040" w:hanging="360"/>
+      </w:pPr>
+      <w:rPr>
+        <w:rFonts w:ascii="Symbol" w:hAnsi="Symbol" w:cs="Symbol" w:hint="default"/>
+      </w:rPr>
     </w:lvl>
     <w:lvl w:ilvl="7">
       <w:numFmt w:val="bullet"/>
-      <w:lvlText w:val="–"/>
+      <w:lvlText w:val="o"/>
       <w:lvlJc w:val="left"/>
       <w:pPr>
-        <w:ind w:left="5760" w:hanging="480"/>
-      </w:pPr>
+        <w:ind w:left="5760" w:hanging="360"/>
+      </w:pPr>
+      <w:rPr>
+        <w:rFonts w:ascii="Courier New" w:hAnsi="Courier New" w:cs="Courier New" w:hint="default"/>
+      </w:rPr>
     </w:lvl>
     <w:lvl w:ilvl="8">
       <w:numFmt w:val="bullet"/>
-      <w:lvlText w:val="•"/>
+      <w:lvlText w:val=""/>
       <w:lvlJc w:val="left"/>
       <w:pPr>
-        <w:ind w:left="6480" w:hanging="480"/>
-      </w:pPr>
+        <w:ind w:left="6480" w:hanging="360"/>
+      </w:pPr>
+      <w:rPr>
+        <w:rFonts w:ascii="Wingdings" w:hAnsi="Wingdings" w:cs="Wingdings" w:hint="default"/>
+      </w:rPr>
     </w:lvl>
   </w:abstractNum>
   <w:num w:numId="1000">
@@ -4510,8 +4464,8 @@
     <w:name w:val="KeywordTok"/>
     <w:basedOn w:val="VerbatimChar"/>
     <w:rPr>
+      <w:b/>
       <w:color w:val="007020"/>
-      <w:b/>
     </w:rPr>
   </w:style>
   <w:style w:type="character" w:customStyle="1" w:styleId="DataTypeTok">
@@ -4588,42 +4542,42 @@
     <w:name w:val="ImportTok"/>
     <w:basedOn w:val="VerbatimChar"/>
     <w:rPr>
+      <w:b/>
       <w:color w:val="008000"/>
-      <w:b/>
     </w:rPr>
   </w:style>
   <w:style w:type="character" w:customStyle="1" w:styleId="CommentTok">
     <w:name w:val="CommentTok"/>
     <w:basedOn w:val="VerbatimChar"/>
     <w:rPr>
+      <w:i/>
       <w:color w:val="60a0b0"/>
-      <w:i/>
     </w:rPr>
   </w:style>
   <w:style w:type="character" w:customStyle="1" w:styleId="DocumentationTok">
     <w:name w:val="DocumentationTok"/>
     <w:basedOn w:val="VerbatimChar"/>
     <w:rPr>
+      <w:i/>
       <w:color w:val="ba2121"/>
-      <w:i/>
     </w:rPr>
   </w:style>
   <w:style w:type="character" w:customStyle="1" w:styleId="AnnotationTok">
     <w:name w:val="AnnotationTok"/>
     <w:basedOn w:val="VerbatimChar"/>
     <w:rPr>
-      <w:color w:val="60a0b0"/>
       <w:b/>
       <w:i/>
+      <w:color w:val="60a0b0"/>
     </w:rPr>
   </w:style>
   <w:style w:type="character" w:customStyle="1" w:styleId="CommentVarTok">
     <w:name w:val="CommentVarTok"/>
     <w:basedOn w:val="VerbatimChar"/>
     <w:rPr>
-      <w:color w:val="60a0b0"/>
       <w:b/>
       <w:i/>
+      <w:color w:val="60a0b0"/>
     </w:rPr>
   </w:style>
   <w:style w:type="character" w:customStyle="1" w:styleId="OtherTok">
@@ -4651,8 +4605,8 @@
     <w:name w:val="ControlFlowTok"/>
     <w:basedOn w:val="VerbatimChar"/>
     <w:rPr>
+      <w:b/>
       <w:color w:val="007020"/>
-      <w:b/>
     </w:rPr>
   </w:style>
   <w:style w:type="character" w:customStyle="1" w:styleId="OperatorTok">
@@ -4697,34 +4651,34 @@
     <w:name w:val="InformationTok"/>
     <w:basedOn w:val="VerbatimChar"/>
     <w:rPr>
-      <w:color w:val="60a0b0"/>
       <w:b/>
       <w:i/>
+      <w:color w:val="60a0b0"/>
     </w:rPr>
   </w:style>
   <w:style w:type="character" w:customStyle="1" w:styleId="WarningTok">
     <w:name w:val="WarningTok"/>
     <w:basedOn w:val="VerbatimChar"/>
     <w:rPr>
-      <w:color w:val="60a0b0"/>
       <w:b/>
       <w:i/>
+      <w:color w:val="60a0b0"/>
     </w:rPr>
   </w:style>
   <w:style w:type="character" w:customStyle="1" w:styleId="AlertTok">
     <w:name w:val="AlertTok"/>
     <w:basedOn w:val="VerbatimChar"/>
     <w:rPr>
+      <w:b/>
       <w:color w:val="ff0000"/>
-      <w:b/>
     </w:rPr>
   </w:style>
   <w:style w:type="character" w:customStyle="1" w:styleId="ErrorTok">
     <w:name w:val="ErrorTok"/>
     <w:basedOn w:val="VerbatimChar"/>
     <w:rPr>
+      <w:b/>
       <w:color w:val="ff0000"/>
-      <w:b/>
     </w:rPr>
   </w:style>
   <w:style w:type="character" w:customStyle="1" w:styleId="NormalTok">

</xml_diff>

<commit_message>
docs: organize authentication implementation guides
Signed-off-by: Everett Williams <everett@medplum.com>
</commit_message>
<xml_diff>
--- a/packages/docs/static/decision-guides/authentication.docx
+++ b/packages/docs/static/decision-guides/authentication.docx
@@ -11,18 +11,18 @@
           <wp:inline>
             <wp:extent cx="5943600" cy="1289649"/>
             <wp:effectExtent b="0" l="0" r="0" t="0"/>
-            <wp:docPr descr="Medplum" title="" id="21" name="Picture"/>
+            <wp:docPr descr="Medplum" title="" id="10" name="Picture"/>
             <a:graphic>
               <a:graphicData uri="http://schemas.openxmlformats.org/drawingml/2006/picture">
                 <pic:pic>
                   <pic:nvPicPr>
-                    <pic:cNvPr descr="medplum-wordmark-grape.png" id="22" name="Picture"/>
+                    <pic:cNvPr descr="medplum-wordmark-grape.png" id="11" name="Picture"/>
                     <pic:cNvPicPr>
                       <a:picLocks noChangeArrowheads="1" noChangeAspect="1"/>
                     </pic:cNvPicPr>
                   </pic:nvPicPr>
                   <pic:blipFill>
-                    <a:blip r:embed="rId20"/>
+                    <a:blip r:embed="rId9"/>
                     <a:stretch>
                       <a:fillRect/>
                     </a:stretch>
@@ -49,7 +49,7 @@
         </w:drawing>
       </w:r>
     </w:p>
-    <w:bookmarkStart w:id="67" w:name="authentication-decision-guide"/>
+    <w:bookmarkStart w:id="60" w:name="authentication-decision-guide"/>
     <w:p>
       <w:pPr>
         <w:pStyle w:val="Heading1"/>
@@ -72,94 +72,94 @@
       </w:pPr>
       <w:r>
         <w:rPr>
+          <w:i/>
           <w:iCs/>
+        </w:rPr>
+        <w:t xml:space="preserve">Companion to the</w:t>
+      </w:r>
+      <w:r>
+        <w:rPr>
           <w:i/>
-        </w:rPr>
-        <w:t xml:space="preserve">Companion to the</w:t>
-      </w:r>
-      <w:r>
-        <w:rPr>
           <w:iCs/>
-          <w:i/>
-        </w:rPr>
-        <w:t xml:space="preserve"> </w:t>
-      </w:r>
-      <w:hyperlink r:id="rId23">
+        </w:rPr>
+        <w:t xml:space="preserve"> </w:t>
+      </w:r>
+      <w:hyperlink r:id="rId12">
         <w:r>
           <w:rPr>
             <w:rStyle w:val="Hyperlink"/>
+            <w:i/>
             <w:iCs/>
-            <w:i/>
           </w:rPr>
           <w:t xml:space="preserve">Authentication</w:t>
         </w:r>
       </w:hyperlink>
       <w:r>
         <w:rPr>
+          <w:i/>
           <w:iCs/>
+        </w:rPr>
+        <w:t xml:space="preserve"> </w:t>
+      </w:r>
+      <w:r>
+        <w:rPr>
           <w:i/>
-        </w:rPr>
-        <w:t xml:space="preserve"> </w:t>
-      </w:r>
-      <w:r>
-        <w:rPr>
           <w:iCs/>
+        </w:rPr>
+        <w:t xml:space="preserve">and</w:t>
+      </w:r>
+      <w:r>
+        <w:rPr>
           <w:i/>
-        </w:rPr>
-        <w:t xml:space="preserve">and</w:t>
-      </w:r>
-      <w:r>
-        <w:rPr>
           <w:iCs/>
-          <w:i/>
-        </w:rPr>
-        <w:t xml:space="preserve"> </w:t>
-      </w:r>
-      <w:hyperlink r:id="rId24">
+        </w:rPr>
+        <w:t xml:space="preserve"> </w:t>
+      </w:r>
+      <w:hyperlink r:id="rId13">
         <w:r>
           <w:rPr>
             <w:rStyle w:val="Hyperlink"/>
+            <w:i/>
             <w:iCs/>
-            <w:i/>
           </w:rPr>
           <w:t xml:space="preserve">User Management</w:t>
         </w:r>
       </w:hyperlink>
       <w:r>
         <w:rPr>
+          <w:i/>
           <w:iCs/>
+        </w:rPr>
+        <w:t xml:space="preserve"> </w:t>
+      </w:r>
+      <w:r>
+        <w:rPr>
           <w:i/>
-        </w:rPr>
-        <w:t xml:space="preserve"> </w:t>
-      </w:r>
-      <w:r>
-        <w:rPr>
           <w:iCs/>
+        </w:rPr>
+        <w:t xml:space="preserve">docs. Builds on</w:t>
+      </w:r>
+      <w:r>
+        <w:rPr>
           <w:i/>
-        </w:rPr>
-        <w:t xml:space="preserve">docs. Builds on</w:t>
-      </w:r>
-      <w:r>
-        <w:rPr>
           <w:iCs/>
-          <w:i/>
-        </w:rPr>
-        <w:t xml:space="preserve"> </w:t>
-      </w:r>
-      <w:hyperlink r:id="rId25">
+        </w:rPr>
+        <w:t xml:space="preserve"> </w:t>
+      </w:r>
+      <w:hyperlink r:id="rId14">
         <w:r>
           <w:rPr>
             <w:rStyle w:val="Hyperlink"/>
+            <w:i/>
             <w:iCs/>
-            <w:i/>
           </w:rPr>
           <w:t xml:space="preserve">Identity Management: A Practical Guide</w:t>
         </w:r>
       </w:hyperlink>
       <w:r>
         <w:rPr>
+          <w:i/>
           <w:iCs/>
-          <w:i/>
         </w:rPr>
         <w:t xml:space="preserve">.</w:t>
       </w:r>
@@ -176,21 +176,21 @@
       </w:r>
       <w:r>
         <w:rPr>
+          <w:b/>
           <w:bCs/>
+        </w:rPr>
+        <w:t xml:space="preserve">who a user is</w:t>
+      </w:r>
+      <w:r>
+        <w:t xml:space="preserve">. Authorization determines</w:t>
+      </w:r>
+      <w:r>
+        <w:t xml:space="preserve"> </w:t>
+      </w:r>
+      <w:r>
+        <w:rPr>
           <w:b/>
-        </w:rPr>
-        <w:t xml:space="preserve">who a user is</w:t>
-      </w:r>
-      <w:r>
-        <w:t xml:space="preserve">. Authorization determines</w:t>
-      </w:r>
-      <w:r>
-        <w:t xml:space="preserve"> </w:t>
-      </w:r>
-      <w:r>
-        <w:rPr>
           <w:bCs/>
-          <w:b/>
         </w:rPr>
         <w:t xml:space="preserve">what that user can access</w:t>
       </w:r>
@@ -200,7 +200,7 @@
       <w:r>
         <w:t xml:space="preserve"> </w:t>
       </w:r>
-      <w:hyperlink r:id="rId26">
+      <w:hyperlink r:id="rId15">
         <w:r>
           <w:rPr>
             <w:rStyle w:val="Hyperlink"/>
@@ -225,26 +225,26 @@
     </w:p>
     <w:p>
       <w:pPr>
+        <w:pStyle w:val="Compact"/>
         <w:numPr>
           <w:ilvl w:val="0"/>
           <w:numId w:val="1001"/>
         </w:numPr>
-        <w:pStyle w:val="Compact"/>
       </w:pPr>
       <w:hyperlink w:anchor="Xa2fe6bcae4b21083a9372930aac9d896e240e22">
         <w:r>
           <w:rPr>
             <w:rStyle w:val="Hyperlink"/>
+            <w:b/>
             <w:bCs/>
-            <w:b/>
           </w:rPr>
           <w:t xml:space="preserve">User identification</w:t>
         </w:r>
       </w:hyperlink>
       <w:r>
         <w:rPr>
+          <w:b/>
           <w:bCs/>
-          <w:b/>
         </w:rPr>
         <w:t xml:space="preserve">:</w:t>
       </w:r>
@@ -257,26 +257,26 @@
     </w:p>
     <w:p>
       <w:pPr>
+        <w:pStyle w:val="Compact"/>
         <w:numPr>
           <w:ilvl w:val="0"/>
           <w:numId w:val="1001"/>
         </w:numPr>
-        <w:pStyle w:val="Compact"/>
       </w:pPr>
       <w:hyperlink w:anchor="Xe73c9a75b182ec0997b5c83f0af59fcaf46a51e">
         <w:r>
           <w:rPr>
             <w:rStyle w:val="Hyperlink"/>
+            <w:b/>
             <w:bCs/>
-            <w:b/>
           </w:rPr>
           <w:t xml:space="preserve">Identity provider</w:t>
         </w:r>
       </w:hyperlink>
       <w:r>
         <w:rPr>
+          <w:b/>
           <w:bCs/>
-          <w:b/>
         </w:rPr>
         <w:t xml:space="preserve">:</w:t>
       </w:r>
@@ -289,26 +289,26 @@
     </w:p>
     <w:p>
       <w:pPr>
+        <w:pStyle w:val="Compact"/>
         <w:numPr>
           <w:ilvl w:val="0"/>
           <w:numId w:val="1001"/>
         </w:numPr>
-        <w:pStyle w:val="Compact"/>
       </w:pPr>
       <w:hyperlink w:anchor="Xe83cbdd7272abc64477498a6881e4d71cc6d800">
         <w:r>
           <w:rPr>
             <w:rStyle w:val="Hyperlink"/>
+            <w:b/>
             <w:bCs/>
-            <w:b/>
           </w:rPr>
           <w:t xml:space="preserve">Token flow</w:t>
         </w:r>
       </w:hyperlink>
       <w:r>
         <w:rPr>
+          <w:b/>
           <w:bCs/>
-          <w:b/>
         </w:rPr>
         <w:t xml:space="preserve">:</w:t>
       </w:r>
@@ -326,7 +326,7 @@
         </w:pict>
       </w:r>
     </w:p>
-    <w:bookmarkStart w:id="32" w:name="Xa2fe6bcae4b21083a9372930aac9d896e240e22"/>
+    <w:bookmarkStart w:id="21" w:name="Xa2fe6bcae4b21083a9372930aac9d896e240e22"/>
     <w:p>
       <w:pPr>
         <w:pStyle w:val="Heading2"/>
@@ -349,8 +349,8 @@
       </w:pPr>
       <w:r>
         <w:rPr>
+          <w:b/>
           <w:bCs/>
-          <w:b/>
         </w:rPr>
         <w:t xml:space="preserve">Questions:</w:t>
       </w:r>
@@ -361,7 +361,7 @@
         <w:t xml:space="preserve">Is email unique for each user? How often does it change? Can different people share a contact email? Do you already have a stable identifier from an IDP?</w:t>
       </w:r>
     </w:p>
-    <w:bookmarkStart w:id="27" w:name="option-a-email-matching"/>
+    <w:bookmarkStart w:id="16" w:name="option-a-email-matching"/>
     <w:p>
       <w:pPr>
         <w:pStyle w:val="Heading3"/>
@@ -380,27 +380,27 @@
     </w:p>
     <w:p>
       <w:pPr>
+        <w:pStyle w:val="Compact"/>
         <w:numPr>
           <w:ilvl w:val="0"/>
           <w:numId w:val="1002"/>
         </w:numPr>
-        <w:pStyle w:val="Compact"/>
-      </w:pPr>
-      <w:r>
-        <w:rPr>
+      </w:pPr>
+      <w:r>
+        <w:rPr>
+          <w:b/>
           <w:bCs/>
-          <w:b/>
         </w:rPr>
         <w:t xml:space="preserve">Advantages:</w:t>
       </w:r>
     </w:p>
     <w:p>
       <w:pPr>
+        <w:pStyle w:val="Compact"/>
         <w:numPr>
           <w:ilvl w:val="1"/>
           <w:numId w:val="1003"/>
         </w:numPr>
-        <w:pStyle w:val="Compact"/>
       </w:pPr>
       <w:r>
         <w:t xml:space="preserve">Simple to configure when each person has a distinct email and changes are infrequent.</w:t>
@@ -408,11 +408,11 @@
     </w:p>
     <w:p>
       <w:pPr>
+        <w:pStyle w:val="Compact"/>
         <w:numPr>
           <w:ilvl w:val="1"/>
           <w:numId w:val="1003"/>
         </w:numPr>
-        <w:pStyle w:val="Compact"/>
       </w:pPr>
       <w:r>
         <w:t xml:space="preserve">Works with external IDPs as well as Medplum-managed authentication.</w:t>
@@ -420,27 +420,27 @@
     </w:p>
     <w:p>
       <w:pPr>
+        <w:pStyle w:val="Compact"/>
         <w:numPr>
           <w:ilvl w:val="0"/>
           <w:numId w:val="1002"/>
         </w:numPr>
-        <w:pStyle w:val="Compact"/>
-      </w:pPr>
-      <w:r>
-        <w:rPr>
+      </w:pPr>
+      <w:r>
+        <w:rPr>
+          <w:b/>
           <w:bCs/>
-          <w:b/>
         </w:rPr>
         <w:t xml:space="preserve">Tradeoffs:</w:t>
       </w:r>
     </w:p>
     <w:p>
       <w:pPr>
+        <w:pStyle w:val="Compact"/>
         <w:numPr>
           <w:ilvl w:val="1"/>
           <w:numId w:val="1004"/>
         </w:numPr>
-        <w:pStyle w:val="Compact"/>
       </w:pPr>
       <w:r>
         <w:t xml:space="preserve">Email changes must also be reflected in the Medplum login account. Updating only the Patient or Practitioner contact email is insufficient.</w:t>
@@ -448,11 +448,11 @@
     </w:p>
     <w:p>
       <w:pPr>
+        <w:pStyle w:val="Compact"/>
         <w:numPr>
           <w:ilvl w:val="1"/>
           <w:numId w:val="1004"/>
         </w:numPr>
-        <w:pStyle w:val="Compact"/>
       </w:pPr>
       <w:r>
         <w:t xml:space="preserve">Shared addresses cannot reliably distinguish separate people.</w:t>
@@ -460,16 +460,16 @@
     </w:p>
     <w:p>
       <w:pPr>
+        <w:pStyle w:val="Compact"/>
         <w:numPr>
           <w:ilvl w:val="0"/>
           <w:numId w:val="1002"/>
         </w:numPr>
-        <w:pStyle w:val="Compact"/>
-      </w:pPr>
-      <w:r>
-        <w:rPr>
+      </w:pPr>
+      <w:r>
+        <w:rPr>
+          <w:b/>
           <w:bCs/>
-          <w:b/>
         </w:rPr>
         <w:t xml:space="preserve">Best fit:</w:t>
       </w:r>
@@ -480,8 +480,8 @@
         <w:t xml:space="preserve">Applications with straightforward identity requirements and an owner for occasional account updates.</w:t>
       </w:r>
     </w:p>
-    <w:bookmarkEnd w:id="27"/>
-    <w:bookmarkStart w:id="28" w:name="option-b-external-id-matching"/>
+    <w:bookmarkEnd w:id="16"/>
+    <w:bookmarkStart w:id="17" w:name="option-b-external-id-matching"/>
     <w:p>
       <w:pPr>
         <w:pStyle w:val="Heading3"/>
@@ -509,27 +509,27 @@
     </w:p>
     <w:p>
       <w:pPr>
+        <w:pStyle w:val="Compact"/>
         <w:numPr>
           <w:ilvl w:val="0"/>
           <w:numId w:val="1005"/>
         </w:numPr>
-        <w:pStyle w:val="Compact"/>
-      </w:pPr>
-      <w:r>
-        <w:rPr>
+      </w:pPr>
+      <w:r>
+        <w:rPr>
+          <w:b/>
           <w:bCs/>
-          <w:b/>
         </w:rPr>
         <w:t xml:space="preserve">Advantages:</w:t>
       </w:r>
     </w:p>
     <w:p>
       <w:pPr>
+        <w:pStyle w:val="Compact"/>
         <w:numPr>
           <w:ilvl w:val="1"/>
           <w:numId w:val="1006"/>
         </w:numPr>
-        <w:pStyle w:val="Compact"/>
       </w:pPr>
       <w:r>
         <w:t xml:space="preserve">Identity can remain stable when a person’s email changes.</w:t>
@@ -537,11 +537,11 @@
     </w:p>
     <w:p>
       <w:pPr>
+        <w:pStyle w:val="Compact"/>
         <w:numPr>
           <w:ilvl w:val="1"/>
           <w:numId w:val="1006"/>
         </w:numPr>
-        <w:pStyle w:val="Compact"/>
       </w:pPr>
       <w:r>
         <w:t xml:space="preserve">Supports distinct identities independently of contact email.</w:t>
@@ -549,27 +549,27 @@
     </w:p>
     <w:p>
       <w:pPr>
+        <w:pStyle w:val="Compact"/>
         <w:numPr>
           <w:ilvl w:val="0"/>
           <w:numId w:val="1005"/>
         </w:numPr>
-        <w:pStyle w:val="Compact"/>
-      </w:pPr>
-      <w:r>
-        <w:rPr>
+      </w:pPr>
+      <w:r>
+        <w:rPr>
+          <w:b/>
           <w:bCs/>
-          <w:b/>
         </w:rPr>
         <w:t xml:space="preserve">Tradeoffs:</w:t>
       </w:r>
     </w:p>
     <w:p>
       <w:pPr>
+        <w:pStyle w:val="Compact"/>
         <w:numPr>
           <w:ilvl w:val="1"/>
           <w:numId w:val="1007"/>
         </w:numPr>
-        <w:pStyle w:val="Compact"/>
       </w:pPr>
       <w:r>
         <w:t xml:space="preserve">Provisioning and login must use the same mapping; changing IDPs requires a migration plan.</w:t>
@@ -577,11 +577,11 @@
     </w:p>
     <w:p>
       <w:pPr>
+        <w:pStyle w:val="Compact"/>
         <w:numPr>
           <w:ilvl w:val="1"/>
           <w:numId w:val="1007"/>
         </w:numPr>
-        <w:pStyle w:val="Compact"/>
       </w:pPr>
       <w:r>
         <w:t xml:space="preserve">Subject values belong to a provider context. Do not assume they are globally unique across unrelated IDPs.</w:t>
@@ -589,16 +589,16 @@
     </w:p>
     <w:p>
       <w:pPr>
+        <w:pStyle w:val="Compact"/>
         <w:numPr>
           <w:ilvl w:val="0"/>
           <w:numId w:val="1005"/>
         </w:numPr>
-        <w:pStyle w:val="Compact"/>
-      </w:pPr>
-      <w:r>
-        <w:rPr>
+      </w:pPr>
+      <w:r>
+        <w:rPr>
+          <w:b/>
           <w:bCs/>
-          <w:b/>
         </w:rPr>
         <w:t xml:space="preserve">Best fit:</w:t>
       </w:r>
@@ -617,8 +617,8 @@
         <w:t xml:space="preserve">Verify the exact subject format against the selected Medplum flow before bulk provisioning.</w:t>
       </w:r>
     </w:p>
-    <w:bookmarkEnd w:id="28"/>
-    <w:bookmarkStart w:id="31" w:name="recommended-approach"/>
+    <w:bookmarkEnd w:id="17"/>
+    <w:bookmarkStart w:id="20" w:name="recommended-approach"/>
     <w:p>
       <w:pPr>
         <w:pStyle w:val="Heading3"/>
@@ -631,9 +631,8 @@
       <w:tblPr>
         <w:tblStyle w:val="Table"/>
         <w:tblW w:w="9360" w:type="dxa"/>
+        <w:tblLayout w:type="fixed"/>
         <w:tblLook w:firstRow="1" w:lastRow="0" w:firstColumn="0" w:lastColumn="0" w:noHBand="0" w:noVBand="0" w:val="0020"/>
-        <w:jc w:val="start"/>
-        <w:tblLayout w:type="fixed"/>
       </w:tblPr>
       <w:tblGrid>
         <w:gridCol w:w="4638"/>
@@ -642,14 +641,13 @@
       <w:tr>
         <w:trPr>
           <w:cantSplit/>
-          <w:tblHeader w:val="true"/>
+          <w:tblHeader w:val="on"/>
         </w:trPr>
         <w:tc>
           <w:tcPr/>
           <w:p>
             <w:pPr>
               <w:pStyle w:val="Compact"/>
-              <w:jc w:val="left"/>
             </w:pPr>
             <w:r>
               <w:t xml:space="preserve">Situation</w:t>
@@ -661,7 +659,6 @@
           <w:p>
             <w:pPr>
               <w:pStyle w:val="Compact"/>
-              <w:jc w:val="left"/>
             </w:pPr>
             <w:r>
               <w:t xml:space="preserve">Approach</w:t>
@@ -678,7 +675,6 @@
           <w:p>
             <w:pPr>
               <w:pStyle w:val="Compact"/>
-              <w:jc w:val="left"/>
             </w:pPr>
             <w:r>
               <w:t xml:space="preserve">Distinct emails and manageable account changes</w:t>
@@ -690,7 +686,6 @@
           <w:p>
             <w:pPr>
               <w:pStyle w:val="Compact"/>
-              <w:jc w:val="left"/>
             </w:pPr>
             <w:r>
               <w:t xml:space="preserve">Start with email matching. An external IDP alone is not a reason to change the matching key.</w:t>
@@ -707,7 +702,6 @@
           <w:p>
             <w:pPr>
               <w:pStyle w:val="Compact"/>
-              <w:jc w:val="left"/>
             </w:pPr>
             <w:r>
               <w:t xml:space="preserve">Established IDP identity that must survive email changes</w:t>
@@ -719,7 +713,6 @@
           <w:p>
             <w:pPr>
               <w:pStyle w:val="Compact"/>
-              <w:jc w:val="left"/>
             </w:pPr>
             <w:r>
               <w:t xml:space="preserve">Use external ID matching and define who maintains the mapping.</w:t>
@@ -736,7 +729,6 @@
           <w:p>
             <w:pPr>
               <w:pStyle w:val="Compact"/>
-              <w:jc w:val="left"/>
             </w:pPr>
             <w:r>
               <w:t xml:space="preserve">Staff and patients have different identity requirements</w:t>
@@ -748,7 +740,6 @@
           <w:p>
             <w:pPr>
               <w:pStyle w:val="Compact"/>
-              <w:jc w:val="left"/>
             </w:pPr>
             <w:r>
               <w:t xml:space="preserve">Choose separately for each population. For example, staff may use corporate subject IDs while patients use email matching.</w:t>
@@ -765,7 +756,6 @@
           <w:p>
             <w:pPr>
               <w:pStyle w:val="Compact"/>
-              <w:jc w:val="left"/>
             </w:pPr>
             <w:r>
               <w:t xml:space="preserve">Separate people share a contact email</w:t>
@@ -777,7 +767,6 @@
           <w:p>
             <w:pPr>
               <w:pStyle w:val="Compact"/>
-              <w:jc w:val="left"/>
             </w:pPr>
             <w:r>
               <w:t xml:space="preserve">Use distinct authenticated identities and evaluate external ID matching. Also design recovery and MFA so mailbox access does not allow recovery of both accounts.</w:t>
@@ -794,7 +783,6 @@
           <w:p>
             <w:pPr>
               <w:pStyle w:val="Compact"/>
-              <w:jc w:val="left"/>
             </w:pPr>
             <w:r>
               <w:t xml:space="preserve">Caregiver accesses another person’s records</w:t>
@@ -806,7 +794,6 @@
           <w:p>
             <w:pPr>
               <w:pStyle w:val="Compact"/>
-              <w:jc w:val="left"/>
             </w:pPr>
             <w:r>
               <w:t xml:space="preserve">Give the caregiver their own identity and explicit access. A shared email is not evidence of authorization.</w:t>
@@ -821,8 +808,8 @@
       </w:pPr>
       <w:r>
         <w:rPr>
+          <w:b/>
           <w:bCs/>
-          <w:b/>
         </w:rPr>
         <w:t xml:space="preserve">Record:</w:t>
       </w:r>
@@ -843,7 +830,7 @@
       <w:r>
         <w:t xml:space="preserve"> </w:t>
       </w:r>
-      <w:hyperlink r:id="rId29">
+      <w:hyperlink r:id="rId18">
         <w:r>
           <w:rPr>
             <w:rStyle w:val="Hyperlink"/>
@@ -857,7 +844,7 @@
       <w:r>
         <w:t xml:space="preserve"> </w:t>
       </w:r>
-      <w:hyperlink r:id="rId30">
+      <w:hyperlink r:id="rId19">
         <w:r>
           <w:rPr>
             <w:rStyle w:val="Hyperlink"/>
@@ -869,9 +856,9 @@
         <w:t xml:space="preserve">.</w:t>
       </w:r>
     </w:p>
-    <w:bookmarkEnd w:id="31"/>
-    <w:bookmarkEnd w:id="32"/>
-    <w:bookmarkStart w:id="41" w:name="Xe73c9a75b182ec0997b5c83f0af59fcaf46a51e"/>
+    <w:bookmarkEnd w:id="20"/>
+    <w:bookmarkEnd w:id="21"/>
+    <w:bookmarkStart w:id="30" w:name="Xe73c9a75b182ec0997b5c83f0af59fcaf46a51e"/>
     <w:p>
       <w:pPr>
         <w:pStyle w:val="Heading2"/>
@@ -894,8 +881,8 @@
       </w:pPr>
       <w:r>
         <w:rPr>
+          <w:b/>
           <w:bCs/>
-          <w:b/>
         </w:rPr>
         <w:t xml:space="preserve">Questions:</w:t>
       </w:r>
@@ -906,7 +893,7 @@
         <w:t xml:space="preserve">Do you already use an IDP? Does everyone in an application use the same provider? Do customer organizations bring their own SSO? Does an existing identity broker already handle that routing?</w:t>
       </w:r>
     </w:p>
-    <w:bookmarkStart w:id="35" w:name="option-a-medplum-managed-authentication"/>
+    <w:bookmarkStart w:id="24" w:name="option-a-medplum-managed-authentication"/>
     <w:p>
       <w:pPr>
         <w:pStyle w:val="Heading3"/>
@@ -925,27 +912,27 @@
     </w:p>
     <w:p>
       <w:pPr>
+        <w:pStyle w:val="Compact"/>
         <w:numPr>
           <w:ilvl w:val="0"/>
           <w:numId w:val="1008"/>
         </w:numPr>
-        <w:pStyle w:val="Compact"/>
-      </w:pPr>
-      <w:r>
-        <w:rPr>
+      </w:pPr>
+      <w:r>
+        <w:rPr>
+          <w:b/>
           <w:bCs/>
-          <w:b/>
         </w:rPr>
         <w:t xml:space="preserve">Advantages:</w:t>
       </w:r>
     </w:p>
     <w:p>
       <w:pPr>
+        <w:pStyle w:val="Compact"/>
         <w:numPr>
           <w:ilvl w:val="1"/>
           <w:numId w:val="1009"/>
         </w:numPr>
-        <w:pStyle w:val="Compact"/>
       </w:pPr>
       <w:r>
         <w:t xml:space="preserve">No separate IDP integration is needed.</w:t>
@@ -953,11 +940,11 @@
     </w:p>
     <w:p>
       <w:pPr>
+        <w:pStyle w:val="Compact"/>
         <w:numPr>
           <w:ilvl w:val="1"/>
           <w:numId w:val="1009"/>
         </w:numPr>
-        <w:pStyle w:val="Compact"/>
       </w:pPr>
       <w:r>
         <w:t xml:space="preserve">Medplum provides credential management and supported login components.</w:t>
@@ -965,27 +952,27 @@
     </w:p>
     <w:p>
       <w:pPr>
+        <w:pStyle w:val="Compact"/>
         <w:numPr>
           <w:ilvl w:val="0"/>
           <w:numId w:val="1008"/>
         </w:numPr>
-        <w:pStyle w:val="Compact"/>
-      </w:pPr>
-      <w:r>
-        <w:rPr>
+      </w:pPr>
+      <w:r>
+        <w:rPr>
+          <w:b/>
           <w:bCs/>
-          <w:b/>
         </w:rPr>
         <w:t xml:space="preserve">Tradeoffs:</w:t>
       </w:r>
     </w:p>
     <w:p>
       <w:pPr>
+        <w:pStyle w:val="Compact"/>
         <w:numPr>
           <w:ilvl w:val="1"/>
           <w:numId w:val="1010"/>
         </w:numPr>
-        <w:pStyle w:val="Compact"/>
       </w:pPr>
       <w:r>
         <w:t xml:space="preserve">Your product still needs decisions about registration, invitations, MFA, and recovery.</w:t>
@@ -993,11 +980,11 @@
     </w:p>
     <w:p>
       <w:pPr>
+        <w:pStyle w:val="Compact"/>
         <w:numPr>
           <w:ilvl w:val="1"/>
           <w:numId w:val="1010"/>
         </w:numPr>
-        <w:pStyle w:val="Compact"/>
       </w:pPr>
       <w:r>
         <w:t xml:space="preserve">This does not satisfy a requirement to use an existing corporate IDP by itself.</w:t>
@@ -1005,16 +992,16 @@
     </w:p>
     <w:p>
       <w:pPr>
+        <w:pStyle w:val="Compact"/>
         <w:numPr>
           <w:ilvl w:val="0"/>
           <w:numId w:val="1008"/>
         </w:numPr>
-        <w:pStyle w:val="Compact"/>
-      </w:pPr>
-      <w:r>
-        <w:rPr>
+      </w:pPr>
+      <w:r>
+        <w:rPr>
+          <w:b/>
           <w:bCs/>
-          <w:b/>
         </w:rPr>
         <w:t xml:space="preserve">Best fit:</w:t>
       </w:r>
@@ -1035,7 +1022,7 @@
       <w:r>
         <w:t xml:space="preserve"> </w:t>
       </w:r>
-      <w:hyperlink r:id="rId33">
+      <w:hyperlink r:id="rId22">
         <w:r>
           <w:rPr>
             <w:rStyle w:val="Hyperlink"/>
@@ -1052,7 +1039,7 @@
       <w:r>
         <w:t xml:space="preserve"> </w:t>
       </w:r>
-      <w:hyperlink r:id="rId34">
+      <w:hyperlink r:id="rId23">
         <w:r>
           <w:rPr>
             <w:rStyle w:val="Hyperlink"/>
@@ -1064,8 +1051,8 @@
         <w:t xml:space="preserve">. Choose the login presentation separately from who manages credentials.</w:t>
       </w:r>
     </w:p>
-    <w:bookmarkEnd w:id="35"/>
-    <w:bookmarkStart w:id="37" w:name="Xe8809dc97f953fef8ac90d1d3f41e2bb8c2302f"/>
+    <w:bookmarkEnd w:id="24"/>
+    <w:bookmarkStart w:id="26" w:name="Xe8809dc97f953fef8ac90d1d3f41e2bb8c2302f"/>
     <w:p>
       <w:pPr>
         <w:pStyle w:val="Heading3"/>
@@ -1096,27 +1083,27 @@
     </w:p>
     <w:p>
       <w:pPr>
+        <w:pStyle w:val="Compact"/>
         <w:numPr>
           <w:ilvl w:val="0"/>
           <w:numId w:val="1011"/>
         </w:numPr>
-        <w:pStyle w:val="Compact"/>
-      </w:pPr>
-      <w:r>
-        <w:rPr>
+      </w:pPr>
+      <w:r>
+        <w:rPr>
+          <w:b/>
           <w:bCs/>
-          <w:b/>
         </w:rPr>
         <w:t xml:space="preserve">Advantages:</w:t>
       </w:r>
     </w:p>
     <w:p>
       <w:pPr>
+        <w:pStyle w:val="Compact"/>
         <w:numPr>
           <w:ilvl w:val="1"/>
           <w:numId w:val="1012"/>
         </w:numPr>
-        <w:pStyle w:val="Compact"/>
       </w:pPr>
       <w:r>
         <w:t xml:space="preserve">Reuses existing identity infrastructure.</w:t>
@@ -1124,11 +1111,11 @@
     </w:p>
     <w:p>
       <w:pPr>
+        <w:pStyle w:val="Compact"/>
         <w:numPr>
           <w:ilvl w:val="1"/>
           <w:numId w:val="1012"/>
         </w:numPr>
-        <w:pStyle w:val="Compact"/>
       </w:pPr>
       <w:r>
         <w:t xml:space="preserve">Different applications can use different providers.</w:t>
@@ -1136,27 +1123,27 @@
     </w:p>
     <w:p>
       <w:pPr>
+        <w:pStyle w:val="Compact"/>
         <w:numPr>
           <w:ilvl w:val="0"/>
           <w:numId w:val="1011"/>
         </w:numPr>
-        <w:pStyle w:val="Compact"/>
-      </w:pPr>
-      <w:r>
-        <w:rPr>
+      </w:pPr>
+      <w:r>
+        <w:rPr>
+          <w:b/>
           <w:bCs/>
-          <w:b/>
         </w:rPr>
         <w:t xml:space="preserve">Tradeoffs:</w:t>
       </w:r>
     </w:p>
     <w:p>
       <w:pPr>
+        <w:pStyle w:val="Compact"/>
         <w:numPr>
           <w:ilvl w:val="1"/>
           <w:numId w:val="1013"/>
         </w:numPr>
-        <w:pStyle w:val="Compact"/>
       </w:pPr>
       <w:r>
         <w:t xml:space="preserve">If users of the same application need different upstream IDPs, define how that routing will happen, such as through an identity broker.</w:t>
@@ -1164,16 +1151,16 @@
     </w:p>
     <w:p>
       <w:pPr>
+        <w:pStyle w:val="Compact"/>
         <w:numPr>
           <w:ilvl w:val="0"/>
           <w:numId w:val="1011"/>
         </w:numPr>
-        <w:pStyle w:val="Compact"/>
-      </w:pPr>
-      <w:r>
-        <w:rPr>
+      </w:pPr>
+      <w:r>
+        <w:rPr>
+          <w:b/>
           <w:bCs/>
-          <w:b/>
         </w:rPr>
         <w:t xml:space="preserve">Best fit:</w:t>
       </w:r>
@@ -1194,20 +1181,20 @@
       <w:r>
         <w:t xml:space="preserve"> </w:t>
       </w:r>
-      <w:hyperlink r:id="rId36">
+      <w:hyperlink r:id="rId25">
         <w:r>
           <w:rPr>
             <w:rStyle w:val="Hyperlink"/>
           </w:rPr>
-          <w:t xml:space="preserve">External Identity Providers</w:t>
+          <w:t xml:space="preserve">Application-based routing</w:t>
         </w:r>
       </w:hyperlink>
       <w:r>
         <w:t xml:space="preserve">.</w:t>
       </w:r>
     </w:p>
-    <w:bookmarkEnd w:id="37"/>
-    <w:bookmarkStart w:id="39" w:name="X1f3b4712db7da41133a5c6556c0631e928b0632"/>
+    <w:bookmarkEnd w:id="26"/>
+    <w:bookmarkStart w:id="28" w:name="X1f3b4712db7da41133a5c6556c0631e928b0632"/>
     <w:p>
       <w:pPr>
         <w:pStyle w:val="Heading3"/>
@@ -1241,27 +1228,27 @@
     </w:p>
     <w:p>
       <w:pPr>
+        <w:pStyle w:val="Compact"/>
         <w:numPr>
           <w:ilvl w:val="0"/>
           <w:numId w:val="1014"/>
         </w:numPr>
-        <w:pStyle w:val="Compact"/>
-      </w:pPr>
-      <w:r>
-        <w:rPr>
+      </w:pPr>
+      <w:r>
+        <w:rPr>
+          <w:b/>
           <w:bCs/>
-          <w:b/>
         </w:rPr>
         <w:t xml:space="preserve">Advantages:</w:t>
       </w:r>
     </w:p>
     <w:p>
       <w:pPr>
+        <w:pStyle w:val="Compact"/>
         <w:numPr>
           <w:ilvl w:val="1"/>
           <w:numId w:val="1015"/>
         </w:numPr>
-        <w:pStyle w:val="Compact"/>
       </w:pPr>
       <w:r>
         <w:t xml:space="preserve">An organization’s SSO applies across Medplum applications, including the Medplum App.</w:t>
@@ -1269,27 +1256,27 @@
     </w:p>
     <w:p>
       <w:pPr>
+        <w:pStyle w:val="Compact"/>
         <w:numPr>
           <w:ilvl w:val="0"/>
           <w:numId w:val="1014"/>
         </w:numPr>
-        <w:pStyle w:val="Compact"/>
-      </w:pPr>
-      <w:r>
-        <w:rPr>
+      </w:pPr>
+      <w:r>
+        <w:rPr>
+          <w:b/>
           <w:bCs/>
-          <w:b/>
         </w:rPr>
         <w:t xml:space="preserve">Tradeoffs:</w:t>
       </w:r>
     </w:p>
     <w:p>
       <w:pPr>
+        <w:pStyle w:val="Compact"/>
         <w:numPr>
           <w:ilvl w:val="1"/>
           <w:numId w:val="1016"/>
         </w:numPr>
-        <w:pStyle w:val="Compact"/>
       </w:pPr>
       <w:r>
         <w:t xml:space="preserve">Applies to all users of the domain, including developer accounts.</w:t>
@@ -1297,11 +1284,11 @@
     </w:p>
     <w:p>
       <w:pPr>
+        <w:pStyle w:val="Compact"/>
         <w:numPr>
           <w:ilvl w:val="1"/>
           <w:numId w:val="1016"/>
         </w:numPr>
-        <w:pStyle w:val="Compact"/>
       </w:pPr>
       <w:r>
         <w:t xml:space="preserve">Hosted setup requires Enterprise and Medplum assistance; self-hosted setup requires super admin privileges.</w:t>
@@ -1309,16 +1296,16 @@
     </w:p>
     <w:p>
       <w:pPr>
+        <w:pStyle w:val="Compact"/>
         <w:numPr>
           <w:ilvl w:val="0"/>
           <w:numId w:val="1014"/>
         </w:numPr>
-        <w:pStyle w:val="Compact"/>
-      </w:pPr>
-      <w:r>
-        <w:rPr>
+      </w:pPr>
+      <w:r>
+        <w:rPr>
+          <w:b/>
           <w:bCs/>
-          <w:b/>
         </w:rPr>
         <w:t xml:space="preserve">Best fit:</w:t>
       </w:r>
@@ -1339,7 +1326,7 @@
       <w:r>
         <w:t xml:space="preserve"> </w:t>
       </w:r>
-      <w:hyperlink r:id="rId38">
+      <w:hyperlink r:id="rId27">
         <w:r>
           <w:rPr>
             <w:rStyle w:val="Hyperlink"/>
@@ -1351,8 +1338,8 @@
         <w:t xml:space="preserve">.</w:t>
       </w:r>
     </w:p>
-    <w:bookmarkEnd w:id="39"/>
-    <w:bookmarkStart w:id="40" w:name="recommended-approach-1"/>
+    <w:bookmarkEnd w:id="28"/>
+    <w:bookmarkStart w:id="29" w:name="recommended-approach-1"/>
     <w:p>
       <w:pPr>
         <w:pStyle w:val="Heading3"/>
@@ -1391,35 +1378,53 @@
       </w:pPr>
       <w:r>
         <w:rPr>
+          <w:b/>
           <w:bCs/>
+        </w:rPr>
+        <w:t xml:space="preserve">Record:</w:t>
+      </w:r>
+      <w:r>
+        <w:t xml:space="preserve"> </w:t>
+      </w:r>
+      <w:r>
+        <w:t xml:space="preserve">Credential owner and routing mechanism for each population.</w:t>
+      </w:r>
+    </w:p>
+    <w:bookmarkEnd w:id="29"/>
+    <w:bookmarkEnd w:id="30"/>
+    <w:bookmarkStart w:id="44" w:name="Xe83cbdd7272abc64477498a6881e4d71cc6d800"/>
+    <w:p>
+      <w:pPr>
+        <w:pStyle w:val="Heading2"/>
+      </w:pPr>
+      <w:r>
+        <w:t xml:space="preserve">Decision 3: What is your token flow architecture?</w:t>
+      </w:r>
+    </w:p>
+    <w:p>
+      <w:pPr>
+        <w:pStyle w:val="FirstParagraph"/>
+      </w:pPr>
+      <w:r>
+        <w:t xml:space="preserve">Choose how your application obtains a token for Medplum and where it uses that token. An external IDP access token and a Medplum access token serve different APIs; do not assume they are interchangeable.</w:t>
+      </w:r>
+    </w:p>
+    <w:p>
+      <w:pPr>
+        <w:pStyle w:val="BodyText"/>
+      </w:pPr>
+      <w:r>
+        <w:rPr>
           <w:b/>
-        </w:rPr>
-        <w:t xml:space="preserve">Record:</w:t>
-      </w:r>
-      <w:r>
-        <w:t xml:space="preserve"> </w:t>
-      </w:r>
-      <w:r>
-        <w:t xml:space="preserve">Credential owner and routing mechanism for each population.</w:t>
-      </w:r>
-    </w:p>
-    <w:bookmarkEnd w:id="40"/>
-    <w:bookmarkEnd w:id="41"/>
-    <w:bookmarkStart w:id="52" w:name="Xe83cbdd7272abc64477498a6881e4d71cc6d800"/>
-    <w:p>
-      <w:pPr>
-        <w:pStyle w:val="Heading2"/>
-      </w:pPr>
-      <w:r>
-        <w:t xml:space="preserve">Decision 3: What is your token flow architecture?</w:t>
-      </w:r>
-    </w:p>
-    <w:p>
-      <w:pPr>
-        <w:pStyle w:val="FirstParagraph"/>
-      </w:pPr>
-      <w:r>
-        <w:t xml:space="preserve">Choose how your application obtains a token for Medplum and where it uses that token. An external IDP access token and a Medplum access token serve different APIs; do not assume they are interchangeable.</w:t>
+          <w:bCs/>
+        </w:rPr>
+        <w:t xml:space="preserve">Questions:</w:t>
+      </w:r>
+      <w:r>
+        <w:t xml:space="preserve"> </w:t>
+      </w:r>
+      <w:r>
+        <w:t xml:space="preserve">Will Medplum handle the external IDP callback, or will your application obtain an external access token through its own login flow? Does the client need an external token for other services? Must it call Medplum directly, or should all Medplum access pass through your backend?</w:t>
       </w:r>
     </w:p>
     <w:p>
@@ -1427,60 +1432,12 @@
         <w:pStyle w:val="BodyText"/>
       </w:pPr>
       <w:r>
-        <w:rPr>
-          <w:bCs/>
-          <w:b/>
-        </w:rPr>
-        <w:t xml:space="preserve">Questions:</w:t>
-      </w:r>
-      <w:r>
-        <w:t xml:space="preserve"> </w:t>
-      </w:r>
-      <w:r>
-        <w:t xml:space="preserve">Will Medplum handle the external IDP callback, or will your application obtain an external access token through its own login flow? Does the client need an external token for other services? Must it call Medplum directly, or should all Medplum access pass through your backend?</w:t>
-      </w:r>
-    </w:p>
-    <w:p>
-      <w:pPr>
-        <w:pStyle w:val="BodyText"/>
-      </w:pPr>
-      <w:r>
-        <w:t xml:space="preserve">“</w:t>
-      </w:r>
-      <w:r>
-        <w:t xml:space="preserve">Client</w:t>
-      </w:r>
-      <w:r>
-        <w:t xml:space="preserve">”</w:t>
-      </w:r>
-      <w:r>
-        <w:t xml:space="preserve"> </w:t>
-      </w:r>
-      <w:r>
-        <w:t xml:space="preserve">below means your browser or native application.</w:t>
-      </w:r>
-      <w:r>
-        <w:t xml:space="preserve"> </w:t>
-      </w:r>
-      <w:r>
-        <w:t xml:space="preserve">“</w:t>
-      </w:r>
-      <w:r>
-        <w:t xml:space="preserve">Server</w:t>
-      </w:r>
-      <w:r>
-        <w:t xml:space="preserve">”</w:t>
-      </w:r>
-      <w:r>
-        <w:t xml:space="preserve"> </w:t>
-      </w:r>
-      <w:r>
-        <w:t xml:space="preserve">means your trusted application backend. The options below primarily address external or existing authentication. If you chose Medplum-managed authentication, choose</w:t>
-      </w:r>
-      <w:r>
-        <w:t xml:space="preserve"> </w:t>
-      </w:r>
-      <w:hyperlink r:id="rId33">
+        <w:t xml:space="preserve">“Client” below means your browser or native application. “Server” means your trusted application backend. The options below primarily address external or existing authentication. If you chose Medplum-managed authentication, choose</w:t>
+      </w:r>
+      <w:r>
+        <w:t xml:space="preserve"> </w:t>
+      </w:r>
+      <w:hyperlink r:id="rId22">
         <w:r>
           <w:rPr>
             <w:rStyle w:val="Hyperlink"/>
@@ -1497,7 +1454,7 @@
       <w:r>
         <w:t xml:space="preserve"> </w:t>
       </w:r>
-      <w:hyperlink r:id="rId34">
+      <w:hyperlink r:id="rId23">
         <w:r>
           <w:rPr>
             <w:rStyle w:val="Hyperlink"/>
@@ -1515,41 +1472,41 @@
       </w:pPr>
       <w:r>
         <w:rPr>
+          <w:b/>
           <w:bCs/>
+        </w:rPr>
+        <w:t xml:space="preserve">Both the authorization-code flow and token exchange use an external IDP.</w:t>
+      </w:r>
+      <w:r>
+        <w:t xml:space="preserve"> </w:t>
+      </w:r>
+      <w:r>
+        <w:t xml:space="preserve">The difference is how your application obtains its Medplum token: in Option A, Medplum handles the IDP callback and returns a Medplum authorization code to your application; in Option B, your application obtains an external access token through its own login flow and submits that token to Medplum for exchange. Keeping your existing IDP does not by itself favor either flow.</w:t>
+      </w:r>
+    </w:p>
+    <w:bookmarkStart w:id="32" w:name="X06ef6992b4244c84c87e3bcb06a64645d3251f5"/>
+    <w:p>
+      <w:pPr>
+        <w:pStyle w:val="Heading3"/>
+      </w:pPr>
+      <w:r>
+        <w:t xml:space="preserve">Option A: External IDP authorization-code flow</w:t>
+      </w:r>
+    </w:p>
+    <w:p>
+      <w:pPr>
+        <w:pStyle w:val="FirstParagraph"/>
+      </w:pPr>
+      <w:r>
+        <w:t xml:space="preserve">Often called</w:t>
+      </w:r>
+      <w:r>
+        <w:t xml:space="preserve"> </w:t>
+      </w:r>
+      <w:r>
+        <w:rPr>
           <w:b/>
-        </w:rPr>
-        <w:t xml:space="preserve">Both the authorization-code flow and token exchange use an external IDP.</w:t>
-      </w:r>
-      <w:r>
-        <w:t xml:space="preserve"> </w:t>
-      </w:r>
-      <w:r>
-        <w:t xml:space="preserve">The difference is how your application obtains its Medplum token: in Option A, Medplum handles the IDP callback and returns a Medplum authorization code to your application; in Option B, your application obtains an external access token through its own login flow and submits that token to Medplum for exchange. Keeping your existing IDP does not by itself favor either flow.</w:t>
-      </w:r>
-    </w:p>
-    <w:bookmarkStart w:id="42" w:name="X06ef6992b4244c84c87e3bcb06a64645d3251f5"/>
-    <w:p>
-      <w:pPr>
-        <w:pStyle w:val="Heading3"/>
-      </w:pPr>
-      <w:r>
-        <w:t xml:space="preserve">Option A: External IDP authorization-code flow</w:t>
-      </w:r>
-    </w:p>
-    <w:p>
-      <w:pPr>
-        <w:pStyle w:val="FirstParagraph"/>
-      </w:pPr>
-      <w:r>
-        <w:t xml:space="preserve">Often called</w:t>
-      </w:r>
-      <w:r>
-        <w:t xml:space="preserve"> </w:t>
-      </w:r>
-      <w:r>
-        <w:rPr>
           <w:bCs/>
-          <w:b/>
         </w:rPr>
         <w:t xml:space="preserve">three-legged OAuth</w:t>
       </w:r>
@@ -1559,11 +1516,11 @@
     </w:p>
     <w:p>
       <w:pPr>
+        <w:pStyle w:val="Compact"/>
         <w:numPr>
           <w:ilvl w:val="0"/>
           <w:numId w:val="1017"/>
         </w:numPr>
-        <w:pStyle w:val="Compact"/>
       </w:pPr>
       <w:r>
         <w:t xml:space="preserve">The user starts login and authenticates with the external IDP.</w:t>
@@ -1571,11 +1528,11 @@
     </w:p>
     <w:p>
       <w:pPr>
+        <w:pStyle w:val="Compact"/>
         <w:numPr>
           <w:ilvl w:val="0"/>
           <w:numId w:val="1017"/>
         </w:numPr>
-        <w:pStyle w:val="Compact"/>
       </w:pPr>
       <w:r>
         <w:t xml:space="preserve">The IDP redirects to Medplum’s external authentication callback.</w:t>
@@ -1583,11 +1540,11 @@
     </w:p>
     <w:p>
       <w:pPr>
+        <w:pStyle w:val="Compact"/>
         <w:numPr>
           <w:ilvl w:val="0"/>
           <w:numId w:val="1017"/>
         </w:numPr>
-        <w:pStyle w:val="Compact"/>
       </w:pPr>
       <w:r>
         <w:t xml:space="preserve">Medplum redirects to your application with a Medplum authorization code.</w:t>
@@ -1595,11 +1552,11 @@
     </w:p>
     <w:p>
       <w:pPr>
+        <w:pStyle w:val="Compact"/>
         <w:numPr>
           <w:ilvl w:val="0"/>
           <w:numId w:val="1017"/>
         </w:numPr>
-        <w:pStyle w:val="Compact"/>
       </w:pPr>
       <w:r>
         <w:t xml:space="preserve">Your application exchanges that code for Medplum tokens.</w:t>
@@ -1607,27 +1564,27 @@
     </w:p>
     <w:p>
       <w:pPr>
+        <w:pStyle w:val="Compact"/>
         <w:numPr>
           <w:ilvl w:val="0"/>
           <w:numId w:val="1018"/>
         </w:numPr>
-        <w:pStyle w:val="Compact"/>
-      </w:pPr>
-      <w:r>
-        <w:rPr>
+      </w:pPr>
+      <w:r>
+        <w:rPr>
+          <w:b/>
           <w:bCs/>
-          <w:b/>
         </w:rPr>
         <w:t xml:space="preserve">Advantages:</w:t>
       </w:r>
     </w:p>
     <w:p>
       <w:pPr>
+        <w:pStyle w:val="Compact"/>
         <w:numPr>
           <w:ilvl w:val="1"/>
           <w:numId w:val="1019"/>
         </w:numPr>
-        <w:pStyle w:val="Compact"/>
       </w:pPr>
       <w:r>
         <w:t xml:space="preserve">The client can call Medplum directly without retaining an external access token for this flow.</w:t>
@@ -1635,11 +1592,11 @@
     </w:p>
     <w:p>
       <w:pPr>
+        <w:pStyle w:val="Compact"/>
         <w:numPr>
           <w:ilvl w:val="1"/>
           <w:numId w:val="1019"/>
         </w:numPr>
-        <w:pStyle w:val="Compact"/>
       </w:pPr>
       <w:r>
         <w:t xml:space="preserve">Fits direct SDK and authenticated component use without a proxy for Medplum requests.</w:t>
@@ -1647,27 +1604,27 @@
     </w:p>
     <w:p>
       <w:pPr>
+        <w:pStyle w:val="Compact"/>
         <w:numPr>
           <w:ilvl w:val="0"/>
           <w:numId w:val="1018"/>
         </w:numPr>
-        <w:pStyle w:val="Compact"/>
-      </w:pPr>
-      <w:r>
-        <w:rPr>
+      </w:pPr>
+      <w:r>
+        <w:rPr>
+          <w:b/>
           <w:bCs/>
-          <w:b/>
         </w:rPr>
         <w:t xml:space="preserve">Tradeoffs:</w:t>
       </w:r>
     </w:p>
     <w:p>
       <w:pPr>
+        <w:pStyle w:val="Compact"/>
         <w:numPr>
           <w:ilvl w:val="1"/>
           <w:numId w:val="1020"/>
         </w:numPr>
-        <w:pStyle w:val="Compact"/>
       </w:pPr>
       <w:r>
         <w:t xml:space="preserve">Requires a redirect/callback flow and coordination of redirect settings with the IDP.</w:t>
@@ -1675,11 +1632,11 @@
     </w:p>
     <w:p>
       <w:pPr>
+        <w:pStyle w:val="Compact"/>
         <w:numPr>
           <w:ilvl w:val="1"/>
           <w:numId w:val="1020"/>
         </w:numPr>
-        <w:pStyle w:val="Compact"/>
       </w:pPr>
       <w:r>
         <w:t xml:space="preserve">Does not give the client an external access token to reuse with other services. If your application needs to obtain and manage that token through its own login flow, evaluate token exchange.</w:t>
@@ -1687,11 +1644,11 @@
     </w:p>
     <w:p>
       <w:pPr>
+        <w:pStyle w:val="Compact"/>
         <w:numPr>
           <w:ilvl w:val="1"/>
           <w:numId w:val="1020"/>
         </w:numPr>
-        <w:pStyle w:val="Compact"/>
       </w:pPr>
       <w:r>
         <w:t xml:space="preserve">A Medplum logout does not by itself define what happens to the external IDP’s SSO session; choose whether users should be signed out there too.</w:t>
@@ -1699,16 +1656,182 @@
     </w:p>
     <w:p>
       <w:pPr>
+        <w:pStyle w:val="Compact"/>
         <w:numPr>
           <w:ilvl w:val="0"/>
           <w:numId w:val="1018"/>
         </w:numPr>
-        <w:pStyle w:val="Compact"/>
-      </w:pPr>
-      <w:r>
-        <w:rPr>
+      </w:pPr>
+      <w:r>
+        <w:rPr>
+          <w:b/>
           <w:bCs/>
+        </w:rPr>
+        <w:t xml:space="preserve">Best fit:</w:t>
+      </w:r>
+      <w:r>
+        <w:t xml:space="preserve"> </w:t>
+      </w:r>
+      <w:r>
+        <w:t xml:space="preserve">A redirect login fits the application and Medplum is the primary client API.</w:t>
+      </w:r>
+    </w:p>
+    <w:p>
+      <w:pPr>
+        <w:pStyle w:val="FirstParagraph"/>
+      </w:pPr>
+      <w:r>
+        <w:t xml:space="preserve">Implementation:</w:t>
+      </w:r>
+      <w:r>
+        <w:t xml:space="preserve"> </w:t>
+      </w:r>
+      <w:hyperlink r:id="rId31">
+        <w:r>
+          <w:rPr>
+            <w:rStyle w:val="Hyperlink"/>
+          </w:rPr>
+          <w:t xml:space="preserve">External IDP authorization-code flow</w:t>
+        </w:r>
+      </w:hyperlink>
+      <w:r>
+        <w:t xml:space="preserve">.</w:t>
+      </w:r>
+    </w:p>
+    <w:bookmarkEnd w:id="32"/>
+    <w:bookmarkStart w:id="39" w:name="option-b-token-exchange"/>
+    <w:p>
+      <w:pPr>
+        <w:pStyle w:val="Heading3"/>
+      </w:pPr>
+      <w:r>
+        <w:t xml:space="preserve">Option B: Token exchange</w:t>
+      </w:r>
+    </w:p>
+    <w:p>
+      <w:pPr>
+        <w:pStyle w:val="FirstParagraph"/>
+      </w:pPr>
+      <w:r>
+        <w:t xml:space="preserve">Your application already has an external access token. Medplum validates it through the configured IDP and issues a Medplum token for the resolved user and membership. The configured provider must support validating that access token through its UserInfo endpoint.</w:t>
+      </w:r>
+    </w:p>
+    <w:p>
+      <w:pPr>
+        <w:pStyle w:val="Compact"/>
+        <w:numPr>
+          <w:ilvl w:val="0"/>
+          <w:numId w:val="1021"/>
+        </w:numPr>
+      </w:pPr>
+      <w:r>
+        <w:rPr>
           <w:b/>
+          <w:bCs/>
+        </w:rPr>
+        <w:t xml:space="preserve">Advantages:</w:t>
+      </w:r>
+    </w:p>
+    <w:p>
+      <w:pPr>
+        <w:pStyle w:val="Compact"/>
+        <w:numPr>
+          <w:ilvl w:val="1"/>
+          <w:numId w:val="1022"/>
+        </w:numPr>
+      </w:pPr>
+      <w:r>
+        <w:t xml:space="preserve">Reuses a valid external login without a second interactive login to Medplum.</w:t>
+      </w:r>
+    </w:p>
+    <w:p>
+      <w:pPr>
+        <w:pStyle w:val="Compact"/>
+        <w:numPr>
+          <w:ilvl w:val="1"/>
+          <w:numId w:val="1022"/>
+        </w:numPr>
+      </w:pPr>
+      <w:r>
+        <w:t xml:space="preserve">Lets your application continue handling the external IDP callback, token acquisition, and IDP-routing logic itself.</w:t>
+      </w:r>
+    </w:p>
+    <w:p>
+      <w:pPr>
+        <w:pStyle w:val="Compact"/>
+        <w:numPr>
+          <w:ilvl w:val="1"/>
+          <w:numId w:val="1022"/>
+        </w:numPr>
+      </w:pPr>
+      <w:r>
+        <w:t xml:space="preserve">Produces a user-scoped Medplum token that can be used in either the client or backend.</w:t>
+      </w:r>
+    </w:p>
+    <w:p>
+      <w:pPr>
+        <w:pStyle w:val="Compact"/>
+        <w:numPr>
+          <w:ilvl w:val="0"/>
+          <w:numId w:val="1021"/>
+        </w:numPr>
+      </w:pPr>
+      <w:r>
+        <w:rPr>
+          <w:b/>
+          <w:bCs/>
+        </w:rPr>
+        <w:t xml:space="preserve">Tradeoffs:</w:t>
+      </w:r>
+    </w:p>
+    <w:p>
+      <w:pPr>
+        <w:pStyle w:val="Compact"/>
+        <w:numPr>
+          <w:ilvl w:val="1"/>
+          <w:numId w:val="1023"/>
+        </w:numPr>
+      </w:pPr>
+      <w:r>
+        <w:t xml:space="preserve">Requires a supported external access token and configured UserInfo validation. An ID token or arbitrary application session cookie is not an interchangeable input.</w:t>
+      </w:r>
+    </w:p>
+    <w:p>
+      <w:pPr>
+        <w:pStyle w:val="Compact"/>
+        <w:numPr>
+          <w:ilvl w:val="1"/>
+          <w:numId w:val="1023"/>
+        </w:numPr>
+      </w:pPr>
+      <w:r>
+        <w:t xml:space="preserve">You must coordinate external and Medplum credential lifecycles and select the intended membership.</w:t>
+      </w:r>
+    </w:p>
+    <w:p>
+      <w:pPr>
+        <w:pStyle w:val="Compact"/>
+        <w:numPr>
+          <w:ilvl w:val="1"/>
+          <w:numId w:val="1023"/>
+        </w:numPr>
+      </w:pPr>
+      <w:r>
+        <w:t xml:space="preserve">Other APIs must accept the appropriate credentials for their own audience and scopes; token exchange does not make one external token valid for every service.</w:t>
+      </w:r>
+    </w:p>
+    <w:p>
+      <w:pPr>
+        <w:pStyle w:val="Compact"/>
+        <w:numPr>
+          <w:ilvl w:val="0"/>
+          <w:numId w:val="1021"/>
+        </w:numPr>
+      </w:pPr>
+      <w:r>
+        <w:rPr>
+          <w:b/>
+          <w:bCs/>
         </w:rPr>
         <w:t xml:space="preserve">Best fit:</w:t>
       </w:r>
@@ -1716,7 +1839,7 @@
         <w:t xml:space="preserve"> </w:t>
       </w:r>
       <w:r>
-        <w:t xml:space="preserve">A redirect login fits the application and Medplum is the primary client API.</w:t>
+        <w:t xml:space="preserve">Your application obtains a supported external access token through its own login flow and needs to add Medplum access, potentially alongside other services.</w:t>
       </w:r>
     </w:p>
     <w:p>
@@ -1724,7 +1847,380 @@
         <w:pStyle w:val="FirstParagraph"/>
       </w:pPr>
       <w:r>
+        <w:t xml:space="preserve">The presence of other integrations alone does not require token exchange. If those integrations run in Bots or your backend using service credentials, the client may still need only Medplum authentication.</w:t>
+      </w:r>
+    </w:p>
+    <w:bookmarkStart w:id="38" w:name="where-will-you-store-the-medplum-token"/>
+    <w:p>
+      <w:pPr>
+        <w:pStyle w:val="Heading4"/>
+      </w:pPr>
+      <w:r>
+        <w:t xml:space="preserve">Where will you store the Medplum token?</w:t>
+      </w:r>
+    </w:p>
+    <w:p>
+      <w:pPr>
+        <w:pStyle w:val="FirstParagraph"/>
+      </w:pPr>
+      <w:r>
+        <w:t xml:space="preserve">Once you choose token exchange, decide between these two placements. Both produce</w:t>
+      </w:r>
+      <w:r>
+        <w:t xml:space="preserve"> </w:t>
+      </w:r>
+      <w:r>
+        <w:rPr>
+          <w:b/>
+          <w:bCs/>
+        </w:rPr>
+        <w:t xml:space="preserve">user-scoped Medplum tokens</w:t>
+      </w:r>
+      <w:r>
+        <w:t xml:space="preserve">. The choice changes where credentials are managed and which system carries requests to Medplum.</w:t>
+      </w:r>
+    </w:p>
+    <w:bookmarkStart w:id="33" w:name="b1-keep-the-medplum-token-in-the-client"/>
+    <w:p>
+      <w:pPr>
+        <w:pStyle w:val="Heading5"/>
+      </w:pPr>
+      <w:r>
+        <w:t xml:space="preserve">B1: Keep the Medplum token in the client</w:t>
+      </w:r>
+    </w:p>
+    <w:p>
+      <w:pPr>
+        <w:pStyle w:val="FirstParagraph"/>
+      </w:pPr>
+      <w:r>
+        <w:t xml:space="preserve">The client obtains a Medplum token through exchange and calls Medplum directly.</w:t>
+      </w:r>
+    </w:p>
+    <w:p>
+      <w:pPr>
+        <w:pStyle w:val="Compact"/>
+        <w:numPr>
+          <w:ilvl w:val="0"/>
+          <w:numId w:val="1024"/>
+        </w:numPr>
+      </w:pPr>
+      <w:r>
+        <w:rPr>
+          <w:b/>
+          <w:bCs/>
+        </w:rPr>
+        <w:t xml:space="preserve">Advantages:</w:t>
+      </w:r>
+    </w:p>
+    <w:p>
+      <w:pPr>
+        <w:pStyle w:val="Compact"/>
+        <w:numPr>
+          <w:ilvl w:val="1"/>
+          <w:numId w:val="1025"/>
+        </w:numPr>
+      </w:pPr>
+      <w:r>
+        <w:t xml:space="preserve">Direct SDK/API access and authenticated React components fit naturally.</w:t>
+      </w:r>
+    </w:p>
+    <w:p>
+      <w:pPr>
+        <w:pStyle w:val="Compact"/>
+        <w:numPr>
+          <w:ilvl w:val="1"/>
+          <w:numId w:val="1025"/>
+        </w:numPr>
+      </w:pPr>
+      <w:r>
+        <w:t xml:space="preserve">WebSocket subscriptions connect directly to Medplum.</w:t>
+      </w:r>
+    </w:p>
+    <w:p>
+      <w:pPr>
+        <w:pStyle w:val="Compact"/>
+        <w:numPr>
+          <w:ilvl w:val="1"/>
+          <w:numId w:val="1025"/>
+        </w:numPr>
+      </w:pPr>
+      <w:r>
+        <w:t xml:space="preserve">No application proxy is needed for those requests.</w:t>
+      </w:r>
+    </w:p>
+    <w:p>
+      <w:pPr>
+        <w:pStyle w:val="Compact"/>
+        <w:numPr>
+          <w:ilvl w:val="0"/>
+          <w:numId w:val="1024"/>
+        </w:numPr>
+      </w:pPr>
+      <w:r>
+        <w:rPr>
+          <w:b/>
+          <w:bCs/>
+        </w:rPr>
+        <w:t xml:space="preserve">Tradeoffs:</w:t>
+      </w:r>
+    </w:p>
+    <w:p>
+      <w:pPr>
+        <w:pStyle w:val="Compact"/>
+        <w:numPr>
+          <w:ilvl w:val="1"/>
+          <w:numId w:val="1026"/>
+        </w:numPr>
+      </w:pPr>
+      <w:r>
+        <w:t xml:space="preserve">The client manages both external and Medplum credentials, including expiry, refresh, and logout.</w:t>
+      </w:r>
+    </w:p>
+    <w:p>
+      <w:pPr>
+        <w:pStyle w:val="Compact"/>
+        <w:numPr>
+          <w:ilvl w:val="1"/>
+          <w:numId w:val="1026"/>
+        </w:numPr>
+      </w:pPr>
+      <w:r>
+        <w:t xml:space="preserve">Medplum credentials are present in the client. Choose storage and session controls appropriate to the browser or native platform.</w:t>
+      </w:r>
+    </w:p>
+    <w:p>
+      <w:pPr>
+        <w:pStyle w:val="Compact"/>
+        <w:numPr>
+          <w:ilvl w:val="1"/>
+          <w:numId w:val="1026"/>
+        </w:numPr>
+      </w:pPr>
+      <w:r>
+        <w:t xml:space="preserve">Every direct API request must be constrained by Medplum access policies; UI restrictions cannot enforce permissions.</w:t>
+      </w:r>
+    </w:p>
+    <w:p>
+      <w:pPr>
+        <w:pStyle w:val="Compact"/>
+        <w:numPr>
+          <w:ilvl w:val="0"/>
+          <w:numId w:val="1024"/>
+        </w:numPr>
+      </w:pPr>
+      <w:r>
+        <w:rPr>
+          <w:b/>
+          <w:bCs/>
+        </w:rPr>
+        <w:t xml:space="preserve">Best fit:</w:t>
+      </w:r>
+      <w:r>
+        <w:t xml:space="preserve"> </w:t>
+      </w:r>
+      <w:r>
+        <w:t xml:space="preserve">Direct Medplum access is valuable and the client can manage both credential lifecycles.</w:t>
+      </w:r>
+    </w:p>
+    <w:bookmarkEnd w:id="33"/>
+    <w:bookmarkStart w:id="37" w:name="b2-keep-the-medplum-token-on-the-server"/>
+    <w:p>
+      <w:pPr>
+        <w:pStyle w:val="Heading5"/>
+      </w:pPr>
+      <w:r>
+        <w:t xml:space="preserve">B2: Keep the Medplum token on the server</w:t>
+      </w:r>
+    </w:p>
+    <w:p>
+      <w:pPr>
+        <w:pStyle w:val="FirstParagraph"/>
+      </w:pPr>
+      <w:r>
+        <w:t xml:space="preserve">Your backend exchanges the authenticated user’s external token, retains the resulting Medplum token, and uses it to fulfill the user’s requests. The client keeps its existing application authentication mechanism.</w:t>
+      </w:r>
+    </w:p>
+    <w:p>
+      <w:pPr>
+        <w:pStyle w:val="Compact"/>
+        <w:numPr>
+          <w:ilvl w:val="0"/>
+          <w:numId w:val="1027"/>
+        </w:numPr>
+      </w:pPr>
+      <w:r>
+        <w:rPr>
+          <w:b/>
+          <w:bCs/>
+        </w:rPr>
+        <w:t xml:space="preserve">Advantages:</w:t>
+      </w:r>
+    </w:p>
+    <w:p>
+      <w:pPr>
+        <w:pStyle w:val="Compact"/>
+        <w:numPr>
+          <w:ilvl w:val="1"/>
+          <w:numId w:val="1028"/>
+        </w:numPr>
+      </w:pPr>
+      <w:r>
+        <w:t xml:space="preserve">Medplum credentials stay out of the client, so the client does not need to manage a second API credential lifecycle.</w:t>
+      </w:r>
+    </w:p>
+    <w:p>
+      <w:pPr>
+        <w:pStyle w:val="Compact"/>
+        <w:numPr>
+          <w:ilvl w:val="1"/>
+          <w:numId w:val="1028"/>
+        </w:numPr>
+      </w:pPr>
+      <w:r>
+        <w:t xml:space="preserve">Fits an existing backend that coordinates multiple services or deliberately mediates all data access.</w:t>
+      </w:r>
+    </w:p>
+    <w:p>
+      <w:pPr>
+        <w:pStyle w:val="Compact"/>
+        <w:numPr>
+          <w:ilvl w:val="1"/>
+          <w:numId w:val="1028"/>
+        </w:numPr>
+      </w:pPr>
+      <w:r>
+        <w:t xml:space="preserve">Medplum still enforces the resolved user’s access policy on the backend’s requests.</w:t>
+      </w:r>
+    </w:p>
+    <w:p>
+      <w:pPr>
+        <w:pStyle w:val="Compact"/>
+        <w:numPr>
+          <w:ilvl w:val="0"/>
+          <w:numId w:val="1027"/>
+        </w:numPr>
+      </w:pPr>
+      <w:r>
+        <w:rPr>
+          <w:b/>
+          <w:bCs/>
+        </w:rPr>
+        <w:t xml:space="preserve">Tradeoffs:</w:t>
+      </w:r>
+    </w:p>
+    <w:p>
+      <w:pPr>
+        <w:pStyle w:val="Compact"/>
+        <w:numPr>
+          <w:ilvl w:val="1"/>
+          <w:numId w:val="1029"/>
+        </w:numPr>
+      </w:pPr>
+      <w:r>
+        <w:t xml:space="preserve">Credential renewal and logout work move to the backend; they do not disappear.</w:t>
+      </w:r>
+    </w:p>
+    <w:p>
+      <w:pPr>
+        <w:pStyle w:val="Compact"/>
+        <w:numPr>
+          <w:ilvl w:val="1"/>
+          <w:numId w:val="1029"/>
+        </w:numPr>
+      </w:pPr>
+      <w:r>
+        <w:t xml:space="preserve">Your team operates the proxy and per-user token cache. This adds a request hop and another service whose availability and capacity affect Medplum access.</w:t>
+      </w:r>
+    </w:p>
+    <w:p>
+      <w:pPr>
+        <w:pStyle w:val="Compact"/>
+        <w:numPr>
+          <w:ilvl w:val="1"/>
+          <w:numId w:val="1029"/>
+        </w:numPr>
+      </w:pPr>
+      <w:r>
+        <w:t xml:space="preserve">Live updates need a path from Medplum through your backend to the client. Components expecting a directly authenticated Medplum client need adaptation.</w:t>
+      </w:r>
+    </w:p>
+    <w:p>
+      <w:pPr>
+        <w:pStyle w:val="Compact"/>
+        <w:numPr>
+          <w:ilvl w:val="1"/>
+          <w:numId w:val="1029"/>
+        </w:numPr>
+      </w:pPr>
+      <w:r>
+        <w:t xml:space="preserve">Every request must resolve to the correct user, membership, and cached token. A shared service token is not a substitute.</w:t>
+      </w:r>
+    </w:p>
+    <w:p>
+      <w:pPr>
+        <w:pStyle w:val="Compact"/>
+        <w:numPr>
+          <w:ilvl w:val="0"/>
+          <w:numId w:val="1027"/>
+        </w:numPr>
+      </w:pPr>
+      <w:r>
+        <w:rPr>
+          <w:b/>
+          <w:bCs/>
+        </w:rPr>
+        <w:t xml:space="preserve">Best fit:</w:t>
+      </w:r>
+      <w:r>
+        <w:t xml:space="preserve"> </w:t>
+      </w:r>
+      <w:r>
+        <w:t xml:space="preserve">Backend mediation or keeping Medplum credentials on the server is an explicit architectural requirement, and your team can operate that layer.</w:t>
+      </w:r>
+    </w:p>
+    <w:p>
+      <w:pPr>
+        <w:pStyle w:val="FirstParagraph"/>
+      </w:pPr>
+      <w:r>
+        <w:t xml:space="preserve">For server storage, bind cached tokens to the authenticated identity, membership, and session context. Validate incoming requests and reject inconsistent mappings. Never reuse another user’s token or silently fall back to an application credential when user authentication fails.</w:t>
+      </w:r>
+    </w:p>
+    <w:p>
+      <w:pPr>
+        <w:pStyle w:val="BodyText"/>
+      </w:pPr>
+      <w:r>
         <w:t xml:space="preserve">Implementation:</w:t>
+      </w:r>
+      <w:r>
+        <w:t xml:space="preserve"> </w:t>
+      </w:r>
+      <w:hyperlink r:id="rId34">
+        <w:r>
+          <w:rPr>
+            <w:rStyle w:val="Hyperlink"/>
+          </w:rPr>
+          <w:t xml:space="preserve">Shared token exchange setup</w:t>
+        </w:r>
+      </w:hyperlink>
+      <w:r>
+        <w:t xml:space="preserve">,</w:t>
+      </w:r>
+      <w:r>
+        <w:t xml:space="preserve"> </w:t>
+      </w:r>
+      <w:hyperlink r:id="rId35">
+        <w:r>
+          <w:rPr>
+            <w:rStyle w:val="Hyperlink"/>
+          </w:rPr>
+          <w:t xml:space="preserve">client-held tokens</w:t>
+        </w:r>
+      </w:hyperlink>
+      <w:r>
+        <w:t xml:space="preserve">, and</w:t>
       </w:r>
       <w:r>
         <w:t xml:space="preserve"> </w:t>
@@ -1734,21 +2230,23 @@
           <w:rPr>
             <w:rStyle w:val="Hyperlink"/>
           </w:rPr>
-          <w:t xml:space="preserve">External Identity Providers</w:t>
+          <w:t xml:space="preserve">server-held tokens</w:t>
         </w:r>
       </w:hyperlink>
       <w:r>
         <w:t xml:space="preserve">.</w:t>
       </w:r>
     </w:p>
-    <w:bookmarkEnd w:id="42"/>
-    <w:bookmarkStart w:id="47" w:name="option-b-token-exchange"/>
+    <w:bookmarkEnd w:id="37"/>
+    <w:bookmarkEnd w:id="38"/>
+    <w:bookmarkEnd w:id="39"/>
+    <w:bookmarkStart w:id="42" w:name="option-c-on-behalf-of"/>
     <w:p>
       <w:pPr>
         <w:pStyle w:val="Heading3"/>
       </w:pPr>
       <w:r>
-        <w:t xml:space="preserve">Option B: Token exchange</w:t>
+        <w:t xml:space="preserve">Option C: On-Behalf-Of</w:t>
       </w:r>
     </w:p>
     <w:p>
@@ -1756,519 +2254,6 @@
         <w:pStyle w:val="FirstParagraph"/>
       </w:pPr>
       <w:r>
-        <w:t xml:space="preserve">Your application already has an external access token. Medplum validates it through the configured IDP and issues a Medplum token for the resolved user and membership. The configured provider must support validating that access token through its UserInfo endpoint.</w:t>
-      </w:r>
-    </w:p>
-    <w:p>
-      <w:pPr>
-        <w:numPr>
-          <w:ilvl w:val="0"/>
-          <w:numId w:val="1021"/>
-        </w:numPr>
-        <w:pStyle w:val="Compact"/>
-      </w:pPr>
-      <w:r>
-        <w:rPr>
-          <w:bCs/>
-          <w:b/>
-        </w:rPr>
-        <w:t xml:space="preserve">Advantages:</w:t>
-      </w:r>
-    </w:p>
-    <w:p>
-      <w:pPr>
-        <w:numPr>
-          <w:ilvl w:val="1"/>
-          <w:numId w:val="1022"/>
-        </w:numPr>
-        <w:pStyle w:val="Compact"/>
-      </w:pPr>
-      <w:r>
-        <w:t xml:space="preserve">Reuses a valid external login without a second interactive login to Medplum.</w:t>
-      </w:r>
-    </w:p>
-    <w:p>
-      <w:pPr>
-        <w:numPr>
-          <w:ilvl w:val="1"/>
-          <w:numId w:val="1022"/>
-        </w:numPr>
-        <w:pStyle w:val="Compact"/>
-      </w:pPr>
-      <w:r>
-        <w:t xml:space="preserve">Lets your application continue handling the external IDP callback, token acquisition, and IDP-routing logic itself.</w:t>
-      </w:r>
-    </w:p>
-    <w:p>
-      <w:pPr>
-        <w:numPr>
-          <w:ilvl w:val="1"/>
-          <w:numId w:val="1022"/>
-        </w:numPr>
-        <w:pStyle w:val="Compact"/>
-      </w:pPr>
-      <w:r>
-        <w:t xml:space="preserve">Produces a user-scoped Medplum token that can be used in either the client or backend.</w:t>
-      </w:r>
-    </w:p>
-    <w:p>
-      <w:pPr>
-        <w:numPr>
-          <w:ilvl w:val="0"/>
-          <w:numId w:val="1021"/>
-        </w:numPr>
-        <w:pStyle w:val="Compact"/>
-      </w:pPr>
-      <w:r>
-        <w:rPr>
-          <w:bCs/>
-          <w:b/>
-        </w:rPr>
-        <w:t xml:space="preserve">Tradeoffs:</w:t>
-      </w:r>
-    </w:p>
-    <w:p>
-      <w:pPr>
-        <w:numPr>
-          <w:ilvl w:val="1"/>
-          <w:numId w:val="1023"/>
-        </w:numPr>
-        <w:pStyle w:val="Compact"/>
-      </w:pPr>
-      <w:r>
-        <w:t xml:space="preserve">Requires a supported external access token and configured UserInfo validation. An ID token or arbitrary application session cookie is not an interchangeable input.</w:t>
-      </w:r>
-    </w:p>
-    <w:p>
-      <w:pPr>
-        <w:numPr>
-          <w:ilvl w:val="1"/>
-          <w:numId w:val="1023"/>
-        </w:numPr>
-        <w:pStyle w:val="Compact"/>
-      </w:pPr>
-      <w:r>
-        <w:t xml:space="preserve">You must coordinate external and Medplum credential lifecycles and select the intended membership.</w:t>
-      </w:r>
-    </w:p>
-    <w:p>
-      <w:pPr>
-        <w:numPr>
-          <w:ilvl w:val="1"/>
-          <w:numId w:val="1023"/>
-        </w:numPr>
-        <w:pStyle w:val="Compact"/>
-      </w:pPr>
-      <w:r>
-        <w:t xml:space="preserve">Other APIs must accept the appropriate credentials for their own audience and scopes; token exchange does not make one external token valid for every service.</w:t>
-      </w:r>
-    </w:p>
-    <w:p>
-      <w:pPr>
-        <w:numPr>
-          <w:ilvl w:val="0"/>
-          <w:numId w:val="1021"/>
-        </w:numPr>
-        <w:pStyle w:val="Compact"/>
-      </w:pPr>
-      <w:r>
-        <w:rPr>
-          <w:bCs/>
-          <w:b/>
-        </w:rPr>
-        <w:t xml:space="preserve">Best fit:</w:t>
-      </w:r>
-      <w:r>
-        <w:t xml:space="preserve"> </w:t>
-      </w:r>
-      <w:r>
-        <w:t xml:space="preserve">Your application obtains a supported external access token through its own login flow and needs to add Medplum access, potentially alongside other services.</w:t>
-      </w:r>
-    </w:p>
-    <w:p>
-      <w:pPr>
-        <w:pStyle w:val="FirstParagraph"/>
-      </w:pPr>
-      <w:r>
-        <w:t xml:space="preserve">The presence of other integrations alone does not require token exchange. If those integrations run in Bots or your backend using service credentials, the client may still need only Medplum authentication.</w:t>
-      </w:r>
-    </w:p>
-    <w:bookmarkStart w:id="46" w:name="where-will-you-store-the-medplum-token"/>
-    <w:p>
-      <w:pPr>
-        <w:pStyle w:val="Heading4"/>
-      </w:pPr>
-      <w:r>
-        <w:t xml:space="preserve">Where will you store the Medplum token?</w:t>
-      </w:r>
-    </w:p>
-    <w:p>
-      <w:pPr>
-        <w:pStyle w:val="FirstParagraph"/>
-      </w:pPr>
-      <w:r>
-        <w:t xml:space="preserve">Once you choose token exchange, decide between these two placements. Both produce</w:t>
-      </w:r>
-      <w:r>
-        <w:t xml:space="preserve"> </w:t>
-      </w:r>
-      <w:r>
-        <w:rPr>
-          <w:bCs/>
-          <w:b/>
-        </w:rPr>
-        <w:t xml:space="preserve">user-scoped Medplum tokens</w:t>
-      </w:r>
-      <w:r>
-        <w:t xml:space="preserve">. The choice changes where credentials are managed and which system carries requests to Medplum.</w:t>
-      </w:r>
-    </w:p>
-    <w:bookmarkStart w:id="43" w:name="b1-keep-the-medplum-token-in-the-client"/>
-    <w:p>
-      <w:pPr>
-        <w:pStyle w:val="Heading5"/>
-      </w:pPr>
-      <w:r>
-        <w:t xml:space="preserve">B1: Keep the Medplum token in the client</w:t>
-      </w:r>
-    </w:p>
-    <w:p>
-      <w:pPr>
-        <w:pStyle w:val="FirstParagraph"/>
-      </w:pPr>
-      <w:r>
-        <w:t xml:space="preserve">The client obtains a Medplum token through exchange and calls Medplum directly.</w:t>
-      </w:r>
-    </w:p>
-    <w:p>
-      <w:pPr>
-        <w:numPr>
-          <w:ilvl w:val="0"/>
-          <w:numId w:val="1024"/>
-        </w:numPr>
-        <w:pStyle w:val="Compact"/>
-      </w:pPr>
-      <w:r>
-        <w:rPr>
-          <w:bCs/>
-          <w:b/>
-        </w:rPr>
-        <w:t xml:space="preserve">Advantages:</w:t>
-      </w:r>
-    </w:p>
-    <w:p>
-      <w:pPr>
-        <w:numPr>
-          <w:ilvl w:val="1"/>
-          <w:numId w:val="1025"/>
-        </w:numPr>
-        <w:pStyle w:val="Compact"/>
-      </w:pPr>
-      <w:r>
-        <w:t xml:space="preserve">Direct SDK/API access and authenticated React components fit naturally.</w:t>
-      </w:r>
-    </w:p>
-    <w:p>
-      <w:pPr>
-        <w:numPr>
-          <w:ilvl w:val="1"/>
-          <w:numId w:val="1025"/>
-        </w:numPr>
-        <w:pStyle w:val="Compact"/>
-      </w:pPr>
-      <w:r>
-        <w:t xml:space="preserve">WebSocket subscriptions connect directly to Medplum.</w:t>
-      </w:r>
-    </w:p>
-    <w:p>
-      <w:pPr>
-        <w:numPr>
-          <w:ilvl w:val="1"/>
-          <w:numId w:val="1025"/>
-        </w:numPr>
-        <w:pStyle w:val="Compact"/>
-      </w:pPr>
-      <w:r>
-        <w:t xml:space="preserve">No application proxy is needed for those requests.</w:t>
-      </w:r>
-    </w:p>
-    <w:p>
-      <w:pPr>
-        <w:numPr>
-          <w:ilvl w:val="0"/>
-          <w:numId w:val="1024"/>
-        </w:numPr>
-        <w:pStyle w:val="Compact"/>
-      </w:pPr>
-      <w:r>
-        <w:rPr>
-          <w:bCs/>
-          <w:b/>
-        </w:rPr>
-        <w:t xml:space="preserve">Tradeoffs:</w:t>
-      </w:r>
-    </w:p>
-    <w:p>
-      <w:pPr>
-        <w:numPr>
-          <w:ilvl w:val="1"/>
-          <w:numId w:val="1026"/>
-        </w:numPr>
-        <w:pStyle w:val="Compact"/>
-      </w:pPr>
-      <w:r>
-        <w:t xml:space="preserve">The client manages both external and Medplum credentials, including expiry, refresh, and logout.</w:t>
-      </w:r>
-    </w:p>
-    <w:p>
-      <w:pPr>
-        <w:numPr>
-          <w:ilvl w:val="1"/>
-          <w:numId w:val="1026"/>
-        </w:numPr>
-        <w:pStyle w:val="Compact"/>
-      </w:pPr>
-      <w:r>
-        <w:t xml:space="preserve">Medplum credentials are present in the client. Choose storage and session controls appropriate to the browser or native platform.</w:t>
-      </w:r>
-    </w:p>
-    <w:p>
-      <w:pPr>
-        <w:numPr>
-          <w:ilvl w:val="1"/>
-          <w:numId w:val="1026"/>
-        </w:numPr>
-        <w:pStyle w:val="Compact"/>
-      </w:pPr>
-      <w:r>
-        <w:t xml:space="preserve">Every direct API request must be constrained by Medplum access policies; UI restrictions cannot enforce permissions.</w:t>
-      </w:r>
-    </w:p>
-    <w:p>
-      <w:pPr>
-        <w:numPr>
-          <w:ilvl w:val="0"/>
-          <w:numId w:val="1024"/>
-        </w:numPr>
-        <w:pStyle w:val="Compact"/>
-      </w:pPr>
-      <w:r>
-        <w:rPr>
-          <w:bCs/>
-          <w:b/>
-        </w:rPr>
-        <w:t xml:space="preserve">Best fit:</w:t>
-      </w:r>
-      <w:r>
-        <w:t xml:space="preserve"> </w:t>
-      </w:r>
-      <w:r>
-        <w:t xml:space="preserve">Direct Medplum access is valuable and the client can manage both credential lifecycles.</w:t>
-      </w:r>
-    </w:p>
-    <w:bookmarkEnd w:id="43"/>
-    <w:bookmarkStart w:id="45" w:name="b2-keep-the-medplum-token-on-the-server"/>
-    <w:p>
-      <w:pPr>
-        <w:pStyle w:val="Heading5"/>
-      </w:pPr>
-      <w:r>
-        <w:t xml:space="preserve">B2: Keep the Medplum token on the server</w:t>
-      </w:r>
-    </w:p>
-    <w:p>
-      <w:pPr>
-        <w:pStyle w:val="FirstParagraph"/>
-      </w:pPr>
-      <w:r>
-        <w:t xml:space="preserve">Your backend exchanges the authenticated user’s external token, retains the resulting Medplum token, and uses it to fulfill the user’s requests. The client keeps its existing application authentication mechanism.</w:t>
-      </w:r>
-    </w:p>
-    <w:p>
-      <w:pPr>
-        <w:numPr>
-          <w:ilvl w:val="0"/>
-          <w:numId w:val="1027"/>
-        </w:numPr>
-        <w:pStyle w:val="Compact"/>
-      </w:pPr>
-      <w:r>
-        <w:rPr>
-          <w:bCs/>
-          <w:b/>
-        </w:rPr>
-        <w:t xml:space="preserve">Advantages:</w:t>
-      </w:r>
-    </w:p>
-    <w:p>
-      <w:pPr>
-        <w:numPr>
-          <w:ilvl w:val="1"/>
-          <w:numId w:val="1028"/>
-        </w:numPr>
-        <w:pStyle w:val="Compact"/>
-      </w:pPr>
-      <w:r>
-        <w:t xml:space="preserve">Medplum credentials stay out of the client, so the client does not need to manage a second API credential lifecycle.</w:t>
-      </w:r>
-    </w:p>
-    <w:p>
-      <w:pPr>
-        <w:numPr>
-          <w:ilvl w:val="1"/>
-          <w:numId w:val="1028"/>
-        </w:numPr>
-        <w:pStyle w:val="Compact"/>
-      </w:pPr>
-      <w:r>
-        <w:t xml:space="preserve">Fits an existing backend that coordinates multiple services or deliberately mediates all data access.</w:t>
-      </w:r>
-    </w:p>
-    <w:p>
-      <w:pPr>
-        <w:numPr>
-          <w:ilvl w:val="1"/>
-          <w:numId w:val="1028"/>
-        </w:numPr>
-        <w:pStyle w:val="Compact"/>
-      </w:pPr>
-      <w:r>
-        <w:t xml:space="preserve">Medplum still enforces the resolved user’s access policy on the backend’s requests.</w:t>
-      </w:r>
-    </w:p>
-    <w:p>
-      <w:pPr>
-        <w:numPr>
-          <w:ilvl w:val="0"/>
-          <w:numId w:val="1027"/>
-        </w:numPr>
-        <w:pStyle w:val="Compact"/>
-      </w:pPr>
-      <w:r>
-        <w:rPr>
-          <w:bCs/>
-          <w:b/>
-        </w:rPr>
-        <w:t xml:space="preserve">Tradeoffs:</w:t>
-      </w:r>
-    </w:p>
-    <w:p>
-      <w:pPr>
-        <w:numPr>
-          <w:ilvl w:val="1"/>
-          <w:numId w:val="1029"/>
-        </w:numPr>
-        <w:pStyle w:val="Compact"/>
-      </w:pPr>
-      <w:r>
-        <w:t xml:space="preserve">Credential renewal and logout work move to the backend; they do not disappear.</w:t>
-      </w:r>
-    </w:p>
-    <w:p>
-      <w:pPr>
-        <w:numPr>
-          <w:ilvl w:val="1"/>
-          <w:numId w:val="1029"/>
-        </w:numPr>
-        <w:pStyle w:val="Compact"/>
-      </w:pPr>
-      <w:r>
-        <w:t xml:space="preserve">Your team operates the proxy and per-user token cache. This adds a request hop and another service whose availability and capacity affect Medplum access.</w:t>
-      </w:r>
-    </w:p>
-    <w:p>
-      <w:pPr>
-        <w:numPr>
-          <w:ilvl w:val="1"/>
-          <w:numId w:val="1029"/>
-        </w:numPr>
-        <w:pStyle w:val="Compact"/>
-      </w:pPr>
-      <w:r>
-        <w:t xml:space="preserve">Live updates need a path from Medplum through your backend to the client. Components expecting a directly authenticated Medplum client need adaptation.</w:t>
-      </w:r>
-    </w:p>
-    <w:p>
-      <w:pPr>
-        <w:numPr>
-          <w:ilvl w:val="1"/>
-          <w:numId w:val="1029"/>
-        </w:numPr>
-        <w:pStyle w:val="Compact"/>
-      </w:pPr>
-      <w:r>
-        <w:t xml:space="preserve">Every request must resolve to the correct user, membership, and cached token. A shared service token is not a substitute.</w:t>
-      </w:r>
-    </w:p>
-    <w:p>
-      <w:pPr>
-        <w:numPr>
-          <w:ilvl w:val="0"/>
-          <w:numId w:val="1027"/>
-        </w:numPr>
-        <w:pStyle w:val="Compact"/>
-      </w:pPr>
-      <w:r>
-        <w:rPr>
-          <w:bCs/>
-          <w:b/>
-        </w:rPr>
-        <w:t xml:space="preserve">Best fit:</w:t>
-      </w:r>
-      <w:r>
-        <w:t xml:space="preserve"> </w:t>
-      </w:r>
-      <w:r>
-        <w:t xml:space="preserve">Backend mediation or keeping Medplum credentials on the server is an explicit architectural requirement, and your team can operate that layer.</w:t>
-      </w:r>
-    </w:p>
-    <w:p>
-      <w:pPr>
-        <w:pStyle w:val="FirstParagraph"/>
-      </w:pPr>
-      <w:r>
-        <w:t xml:space="preserve">For server storage, bind cached tokens to the authenticated identity, membership, and session context. Validate incoming requests and reject inconsistent mappings. Never reuse another user’s token or silently fall back to an application credential when user authentication fails.</w:t>
-      </w:r>
-    </w:p>
-    <w:p>
-      <w:pPr>
-        <w:pStyle w:val="BodyText"/>
-      </w:pPr>
-      <w:r>
-        <w:t xml:space="preserve">Implementation:</w:t>
-      </w:r>
-      <w:r>
-        <w:t xml:space="preserve"> </w:t>
-      </w:r>
-      <w:hyperlink r:id="rId44">
-        <w:r>
-          <w:rPr>
-            <w:rStyle w:val="Hyperlink"/>
-          </w:rPr>
-          <w:t xml:space="preserve">Token Exchange</w:t>
-        </w:r>
-      </w:hyperlink>
-      <w:r>
-        <w:t xml:space="preserve">.</w:t>
-      </w:r>
-    </w:p>
-    <w:bookmarkEnd w:id="45"/>
-    <w:bookmarkEnd w:id="46"/>
-    <w:bookmarkEnd w:id="47"/>
-    <w:bookmarkStart w:id="50" w:name="option-c-on-behalf-of"/>
-    <w:p>
-      <w:pPr>
-        <w:pStyle w:val="Heading3"/>
-      </w:pPr>
-      <w:r>
-        <w:t xml:space="preserve">Option C: On-Behalf-Of</w:t>
-      </w:r>
-    </w:p>
-    <w:p>
-      <w:pPr>
-        <w:pStyle w:val="FirstParagraph"/>
-      </w:pPr>
-      <w:r>
         <w:t xml:space="preserve">Your backend authenticates to Medplum as an admin</w:t>
       </w:r>
       <w:r>
@@ -2301,27 +2286,27 @@
     </w:p>
     <w:p>
       <w:pPr>
+        <w:pStyle w:val="Compact"/>
         <w:numPr>
           <w:ilvl w:val="0"/>
           <w:numId w:val="1030"/>
         </w:numPr>
-        <w:pStyle w:val="Compact"/>
-      </w:pPr>
-      <w:r>
-        <w:rPr>
+      </w:pPr>
+      <w:r>
+        <w:rPr>
+          <w:b/>
           <w:bCs/>
-          <w:b/>
         </w:rPr>
         <w:t xml:space="preserve">Advantages:</w:t>
       </w:r>
     </w:p>
     <w:p>
       <w:pPr>
+        <w:pStyle w:val="Compact"/>
         <w:numPr>
           <w:ilvl w:val="1"/>
           <w:numId w:val="1031"/>
         </w:numPr>
-        <w:pStyle w:val="Compact"/>
       </w:pPr>
       <w:r>
         <w:t xml:space="preserve">Supports a backend that owns user authentication but cannot exchange a supported external access token.</w:t>
@@ -2329,11 +2314,11 @@
     </w:p>
     <w:p>
       <w:pPr>
+        <w:pStyle w:val="Compact"/>
         <w:numPr>
           <w:ilvl w:val="1"/>
           <w:numId w:val="1031"/>
         </w:numPr>
-        <w:pStyle w:val="Compact"/>
       </w:pPr>
       <w:r>
         <w:t xml:space="preserve">Retains user attribution and policy enforcement when correctly configured.</w:t>
@@ -2341,27 +2326,27 @@
     </w:p>
     <w:p>
       <w:pPr>
+        <w:pStyle w:val="Compact"/>
         <w:numPr>
           <w:ilvl w:val="0"/>
           <w:numId w:val="1030"/>
         </w:numPr>
-        <w:pStyle w:val="Compact"/>
-      </w:pPr>
-      <w:r>
-        <w:rPr>
+      </w:pPr>
+      <w:r>
+        <w:rPr>
+          <w:b/>
           <w:bCs/>
-          <w:b/>
         </w:rPr>
         <w:t xml:space="preserve">Tradeoffs:</w:t>
       </w:r>
     </w:p>
     <w:p>
       <w:pPr>
+        <w:pStyle w:val="Compact"/>
         <w:numPr>
           <w:ilvl w:val="1"/>
           <w:numId w:val="1032"/>
         </w:numPr>
-        <w:pStyle w:val="Compact"/>
       </w:pPr>
       <w:r>
         <w:t xml:space="preserve">Requires an application with Project Admin rights and a trusted identity-to-membership mapping.</w:t>
@@ -2369,11 +2354,11 @@
     </w:p>
     <w:p>
       <w:pPr>
+        <w:pStyle w:val="Compact"/>
         <w:numPr>
           <w:ilvl w:val="1"/>
           <w:numId w:val="1032"/>
         </w:numPr>
-        <w:pStyle w:val="Compact"/>
       </w:pPr>
       <w:r>
         <w:t xml:space="preserve">Without the header, requests use the application’s own access. A wrong valid membership can act for the wrong user.</w:t>
@@ -2381,11 +2366,11 @@
     </w:p>
     <w:p>
       <w:pPr>
+        <w:pStyle w:val="Compact"/>
         <w:numPr>
           <w:ilvl w:val="1"/>
           <w:numId w:val="1032"/>
         </w:numPr>
-        <w:pStyle w:val="Compact"/>
       </w:pPr>
       <w:r>
         <w:t xml:space="preserve">Your backend is responsible for authenticating the person and choosing the delegation context; the header itself is not proof of the user’s identity.</w:t>
@@ -2393,40 +2378,40 @@
     </w:p>
     <w:p>
       <w:pPr>
+        <w:pStyle w:val="Compact"/>
         <w:numPr>
           <w:ilvl w:val="0"/>
           <w:numId w:val="1030"/>
         </w:numPr>
-        <w:pStyle w:val="Compact"/>
-      </w:pPr>
-      <w:r>
-        <w:rPr>
+      </w:pPr>
+      <w:r>
+        <w:rPr>
+          <w:b/>
           <w:bCs/>
+        </w:rPr>
+        <w:t xml:space="preserve">Best fit:</w:t>
+      </w:r>
+      <w:r>
+        <w:t xml:space="preserve"> </w:t>
+      </w:r>
+      <w:r>
+        <w:t xml:space="preserve">A legacy backend requires this delegation model and cannot use user-scoped token exchange.</w:t>
+      </w:r>
+    </w:p>
+    <w:p>
+      <w:pPr>
+        <w:pStyle w:val="FirstParagraph"/>
+      </w:pPr>
+      <w:r>
+        <w:t xml:space="preserve">This differs from server-side token exchange: the underlying credential represents the</w:t>
+      </w:r>
+      <w:r>
+        <w:t xml:space="preserve"> </w:t>
+      </w:r>
+      <w:r>
+        <w:rPr>
           <w:b/>
-        </w:rPr>
-        <w:t xml:space="preserve">Best fit:</w:t>
-      </w:r>
-      <w:r>
-        <w:t xml:space="preserve"> </w:t>
-      </w:r>
-      <w:r>
-        <w:t xml:space="preserve">A legacy backend requires this delegation model and cannot use user-scoped token exchange.</w:t>
-      </w:r>
-    </w:p>
-    <w:p>
-      <w:pPr>
-        <w:pStyle w:val="FirstParagraph"/>
-      </w:pPr>
-      <w:r>
-        <w:t xml:space="preserve">This differs from server-side token exchange: the underlying credential represents the</w:t>
-      </w:r>
-      <w:r>
-        <w:t xml:space="preserve"> </w:t>
-      </w:r>
-      <w:r>
-        <w:rPr>
           <w:bCs/>
-          <w:b/>
         </w:rPr>
         <w:t xml:space="preserve">application</w:t>
       </w:r>
@@ -2444,7 +2429,7 @@
       <w:r>
         <w:t xml:space="preserve"> </w:t>
       </w:r>
-      <w:hyperlink r:id="rId48">
+      <w:hyperlink r:id="rId40">
         <w:r>
           <w:rPr>
             <w:rStyle w:val="Hyperlink"/>
@@ -2458,7 +2443,7 @@
       <w:r>
         <w:t xml:space="preserve"> </w:t>
       </w:r>
-      <w:hyperlink r:id="rId49">
+      <w:hyperlink r:id="rId41">
         <w:r>
           <w:rPr>
             <w:rStyle w:val="Hyperlink"/>
@@ -2473,8 +2458,8 @@
         <w:t xml:space="preserve">for attribution metadata and configuration.</w:t>
       </w:r>
     </w:p>
-    <w:bookmarkEnd w:id="50"/>
-    <w:bookmarkStart w:id="51" w:name="recommended-approach-2"/>
+    <w:bookmarkEnd w:id="42"/>
+    <w:bookmarkStart w:id="43" w:name="recommended-approach-2"/>
     <w:p>
       <w:pPr>
         <w:pStyle w:val="Heading3"/>
@@ -2487,9 +2472,8 @@
       <w:tblPr>
         <w:tblStyle w:val="Table"/>
         <w:tblW w:w="9360" w:type="dxa"/>
+        <w:tblLayout w:type="fixed"/>
         <w:tblLook w:firstRow="1" w:lastRow="0" w:firstColumn="0" w:lastColumn="0" w:noHBand="0" w:noVBand="0" w:val="0020"/>
-        <w:jc w:val="start"/>
-        <w:tblLayout w:type="fixed"/>
       </w:tblPr>
       <w:tblGrid>
         <w:gridCol w:w="4586"/>
@@ -2498,14 +2482,13 @@
       <w:tr>
         <w:trPr>
           <w:cantSplit/>
-          <w:tblHeader w:val="true"/>
+          <w:tblHeader w:val="on"/>
         </w:trPr>
         <w:tc>
           <w:tcPr/>
           <w:p>
             <w:pPr>
               <w:pStyle w:val="Compact"/>
-              <w:jc w:val="left"/>
             </w:pPr>
             <w:r>
               <w:t xml:space="preserve">Situation</w:t>
@@ -2517,7 +2500,6 @@
           <w:p>
             <w:pPr>
               <w:pStyle w:val="Compact"/>
-              <w:jc w:val="left"/>
             </w:pPr>
             <w:r>
               <w:t xml:space="preserve">Approach</w:t>
@@ -2534,7 +2516,6 @@
           <w:p>
             <w:pPr>
               <w:pStyle w:val="Compact"/>
-              <w:jc w:val="left"/>
             </w:pPr>
             <w:r>
               <w:t xml:space="preserve">Medplum can handle the external IDP callback, and the client primarily needs Medplum access</w:t>
@@ -2546,7 +2527,6 @@
           <w:p>
             <w:pPr>
               <w:pStyle w:val="Compact"/>
-              <w:jc w:val="left"/>
             </w:pPr>
             <w:r>
               <w:t xml:space="preserve">Start with the authorization-code flow.</w:t>
@@ -2563,7 +2543,6 @@
           <w:p>
             <w:pPr>
               <w:pStyle w:val="Compact"/>
-              <w:jc w:val="left"/>
             </w:pPr>
             <w:r>
               <w:t xml:space="preserve">Application obtains a supported external access token through its own login flow and needs direct Medplum client access</w:t>
@@ -2575,7 +2554,6 @@
           <w:p>
             <w:pPr>
               <w:pStyle w:val="Compact"/>
-              <w:jc w:val="left"/>
             </w:pPr>
             <w:r>
               <w:t xml:space="preserve">Use token exchange with Medplum tokens in the client.</w:t>
@@ -2592,7 +2570,6 @@
           <w:p>
             <w:pPr>
               <w:pStyle w:val="Compact"/>
-              <w:jc w:val="left"/>
             </w:pPr>
             <w:r>
               <w:t xml:space="preserve">Application obtains a supported external access token through its own login flow and mediates Medplum access through its backend</w:t>
@@ -2604,7 +2581,6 @@
           <w:p>
             <w:pPr>
               <w:pStyle w:val="Compact"/>
-              <w:jc w:val="left"/>
             </w:pPr>
             <w:r>
               <w:t xml:space="preserve">Use token exchange with Medplum tokens on the server.</w:t>
@@ -2621,7 +2597,6 @@
           <w:p>
             <w:pPr>
               <w:pStyle w:val="Compact"/>
-              <w:jc w:val="left"/>
             </w:pPr>
             <w:r>
               <w:t xml:space="preserve">Backend can use either user-scoped exchange or On-Behalf-Of</w:t>
@@ -2633,7 +2608,6 @@
           <w:p>
             <w:pPr>
               <w:pStyle w:val="Compact"/>
-              <w:jc w:val="left"/>
             </w:pPr>
             <w:r>
               <w:t xml:space="preserve">Prefer user-scoped exchange to avoid depending on a privileged application credential and a delegation header.</w:t>
@@ -2650,7 +2624,6 @@
           <w:p>
             <w:pPr>
               <w:pStyle w:val="Compact"/>
-              <w:jc w:val="left"/>
             </w:pPr>
             <w:r>
               <w:t xml:space="preserve">Legacy authentication prevents supported token exchange</w:t>
@@ -2662,7 +2635,6 @@
           <w:p>
             <w:pPr>
               <w:pStyle w:val="Compact"/>
-              <w:jc w:val="left"/>
             </w:pPr>
             <w:r>
               <w:t xml:space="preserve">Evaluate On-Behalf-Of with explicit ownership of authentication, mapping, and delegation controls.</w:t>
@@ -2677,8 +2649,8 @@
       </w:pPr>
       <w:r>
         <w:rPr>
+          <w:b/>
           <w:bCs/>
-          <w:b/>
         </w:rPr>
         <w:t xml:space="preserve">Record:</w:t>
       </w:r>
@@ -2689,9 +2661,9 @@
         <w:t xml:space="preserve">Token flow, token location, membership-selection rules, and ownership of proxy operations and credential lifecycles.</w:t>
       </w:r>
     </w:p>
-    <w:bookmarkEnd w:id="51"/>
-    <w:bookmarkEnd w:id="52"/>
-    <w:bookmarkStart w:id="65" w:name="additional-decisions"/>
+    <w:bookmarkEnd w:id="43"/>
+    <w:bookmarkEnd w:id="44"/>
+    <w:bookmarkStart w:id="58" w:name="additional-decisions"/>
     <w:p>
       <w:pPr>
         <w:pStyle w:val="Heading2"/>
@@ -2708,7 +2680,7 @@
         <w:t xml:space="preserve">Resolve these after choosing the main architecture. Use the technical docs for configuration details.</w:t>
       </w:r>
     </w:p>
-    <w:bookmarkStart w:id="54" w:name="X67940e01c9738229487d4098b5e4781eb267b97"/>
+    <w:bookmarkStart w:id="47" w:name="X67940e01c9738229487d4098b5e4781eb267b97"/>
     <w:p>
       <w:pPr>
         <w:pStyle w:val="Heading3"/>
@@ -2783,9 +2755,8 @@
       <w:tblPr>
         <w:tblStyle w:val="Table"/>
         <w:tblW w:w="9360" w:type="dxa"/>
+        <w:tblLayout w:type="fixed"/>
         <w:tblLook w:firstRow="1" w:lastRow="0" w:firstColumn="0" w:lastColumn="0" w:noHBand="0" w:noVBand="0" w:val="0020"/>
-        <w:jc w:val="start"/>
-        <w:tblLayout w:type="fixed"/>
       </w:tblPr>
       <w:tblGrid>
         <w:gridCol w:w="4611"/>
@@ -2794,14 +2765,13 @@
       <w:tr>
         <w:trPr>
           <w:cantSplit/>
-          <w:tblHeader w:val="true"/>
+          <w:tblHeader w:val="on"/>
         </w:trPr>
         <w:tc>
           <w:tcPr/>
           <w:p>
             <w:pPr>
               <w:pStyle w:val="Compact"/>
-              <w:jc w:val="left"/>
             </w:pPr>
             <w:r>
               <w:t xml:space="preserve">Situation</w:t>
@@ -2813,7 +2783,6 @@
           <w:p>
             <w:pPr>
               <w:pStyle w:val="Compact"/>
-              <w:jc w:val="left"/>
             </w:pPr>
             <w:r>
               <w:t xml:space="preserve">Approach</w:t>
@@ -2830,7 +2799,6 @@
           <w:p>
             <w:pPr>
               <w:pStyle w:val="Compact"/>
-              <w:jc w:val="left"/>
             </w:pPr>
             <w:r>
               <w:t xml:space="preserve">Patients and clinicians primarily use one production project</w:t>
@@ -2842,7 +2810,6 @@
           <w:p>
             <w:pPr>
               <w:pStyle w:val="Compact"/>
-              <w:jc w:val="left"/>
             </w:pPr>
             <w:r>
               <w:t xml:space="preserve">Explicitly choose project-scoped users; the Practitioner default is server-scoped.</w:t>
@@ -2859,7 +2826,6 @@
           <w:p>
             <w:pPr>
               <w:pStyle w:val="Compact"/>
-              <w:jc w:val="left"/>
             </w:pPr>
             <w:r>
               <w:t xml:space="preserve">Developers or administrators need multiple projects</w:t>
@@ -2871,7 +2837,6 @@
           <w:p>
             <w:pPr>
               <w:pStyle w:val="Compact"/>
-              <w:jc w:val="left"/>
             </w:pPr>
             <w:r>
               <w:t xml:space="preserve">Evaluate server-scoped users and the required memberships. Hosted administrative control differs by user scope.</w:t>
@@ -2888,7 +2853,6 @@
           <w:p>
             <w:pPr>
               <w:pStyle w:val="Compact"/>
-              <w:jc w:val="left"/>
             </w:pPr>
             <w:r>
               <w:t xml:space="preserve">Token exchange has multiple candidate memberships</w:t>
@@ -2900,7 +2864,6 @@
           <w:p>
             <w:pPr>
               <w:pStyle w:val="Compact"/>
-              <w:jc w:val="left"/>
             </w:pPr>
             <w:r>
               <w:t xml:space="preserve">Pass the intended</w:t>
@@ -2932,7 +2895,6 @@
           <w:p>
             <w:pPr>
               <w:pStyle w:val="Compact"/>
-              <w:jc w:val="left"/>
             </w:pPr>
             <w:r>
               <w:t xml:space="preserve">Exchange must reach another project</w:t>
@@ -2944,7 +2906,6 @@
           <w:p>
             <w:pPr>
               <w:pStyle w:val="Compact"/>
-              <w:jc w:val="left"/>
             </w:pPr>
             <w:r>
               <w:t xml:space="preserve">A per-</w:t>
@@ -2975,7 +2936,7 @@
       <w:r>
         <w:t xml:space="preserve"> </w:t>
       </w:r>
-      <w:hyperlink r:id="rId24">
+      <w:hyperlink r:id="rId13">
         <w:r>
           <w:rPr>
             <w:rStyle w:val="Hyperlink"/>
@@ -2989,7 +2950,7 @@
       <w:r>
         <w:t xml:space="preserve"> </w:t>
       </w:r>
-      <w:hyperlink r:id="rId53">
+      <w:hyperlink r:id="rId45">
         <w:r>
           <w:rPr>
             <w:rStyle w:val="Hyperlink"/>
@@ -3003,7 +2964,7 @@
       <w:r>
         <w:t xml:space="preserve"> </w:t>
       </w:r>
-      <w:hyperlink r:id="rId44">
+      <w:hyperlink r:id="rId46">
         <w:r>
           <w:rPr>
             <w:rStyle w:val="Hyperlink"/>
@@ -3015,8 +2976,8 @@
         <w:t xml:space="preserve">.</w:t>
       </w:r>
     </w:p>
-    <w:bookmarkEnd w:id="54"/>
-    <w:bookmarkStart w:id="58" w:name="Xf68f2466a7c976f836933c670cad8e62d95f1e6"/>
+    <w:bookmarkEnd w:id="47"/>
+    <w:bookmarkStart w:id="51" w:name="Xf68f2466a7c976f836933c670cad8e62d95f1e6"/>
     <w:p>
       <w:pPr>
         <w:pStyle w:val="Heading3"/>
@@ -3051,7 +3012,7 @@
       <w:r>
         <w:t xml:space="preserve"> </w:t>
       </w:r>
-      <w:hyperlink r:id="rId55">
+      <w:hyperlink r:id="rId48">
         <w:r>
           <w:rPr>
             <w:rStyle w:val="Hyperlink"/>
@@ -3065,7 +3026,7 @@
       <w:r>
         <w:t xml:space="preserve"> </w:t>
       </w:r>
-      <w:hyperlink r:id="rId56">
+      <w:hyperlink r:id="rId49">
         <w:r>
           <w:rPr>
             <w:rStyle w:val="Hyperlink"/>
@@ -3079,7 +3040,7 @@
       <w:r>
         <w:t xml:space="preserve"> </w:t>
       </w:r>
-      <w:hyperlink r:id="rId57">
+      <w:hyperlink r:id="rId50">
         <w:r>
           <w:rPr>
             <w:rStyle w:val="Hyperlink"/>
@@ -3091,8 +3052,8 @@
         <w:t xml:space="preserve">.</w:t>
       </w:r>
     </w:p>
-    <w:bookmarkEnd w:id="58"/>
-    <w:bookmarkStart w:id="64" w:name="do-you-need-a-specialized-flow"/>
+    <w:bookmarkEnd w:id="51"/>
+    <w:bookmarkStart w:id="57" w:name="do-you-need-a-specialized-flow"/>
     <w:p>
       <w:pPr>
         <w:pStyle w:val="Heading3"/>
@@ -3105,9 +3066,8 @@
       <w:tblPr>
         <w:tblStyle w:val="Table"/>
         <w:tblW w:w="9360" w:type="dxa"/>
+        <w:tblLayout w:type="fixed"/>
         <w:tblLook w:firstRow="1" w:lastRow="0" w:firstColumn="0" w:lastColumn="0" w:noHBand="0" w:noVBand="0" w:val="0020"/>
-        <w:jc w:val="start"/>
-        <w:tblLayout w:type="fixed"/>
       </w:tblPr>
       <w:tblGrid>
         <w:gridCol w:w="4705"/>
@@ -3116,14 +3076,13 @@
       <w:tr>
         <w:trPr>
           <w:cantSplit/>
-          <w:tblHeader w:val="true"/>
+          <w:tblHeader w:val="on"/>
         </w:trPr>
         <w:tc>
           <w:tcPr/>
           <w:p>
             <w:pPr>
               <w:pStyle w:val="Compact"/>
-              <w:jc w:val="left"/>
             </w:pPr>
             <w:r>
               <w:t xml:space="preserve">Situation</w:t>
@@ -3135,7 +3094,6 @@
           <w:p>
             <w:pPr>
               <w:pStyle w:val="Compact"/>
-              <w:jc w:val="left"/>
             </w:pPr>
             <w:r>
               <w:t xml:space="preserve">Approach</w:t>
@@ -3152,7 +3110,6 @@
           <w:p>
             <w:pPr>
               <w:pStyle w:val="Compact"/>
-              <w:jc w:val="left"/>
             </w:pPr>
             <w:r>
               <w:t xml:space="preserve">Background service acts as itself</w:t>
@@ -3164,7 +3121,6 @@
           <w:p>
             <w:pPr>
               <w:pStyle w:val="Compact"/>
-              <w:jc w:val="left"/>
             </w:pPr>
             <w:r>
               <w:t xml:space="preserve">Use</w:t>
@@ -3172,7 +3128,7 @@
             <w:r>
               <w:t xml:space="preserve"> </w:t>
             </w:r>
-            <w:hyperlink r:id="rId48">
+            <w:hyperlink r:id="rId40">
               <w:r>
                 <w:rPr>
                   <w:rStyle w:val="Hyperlink"/>
@@ -3210,7 +3166,6 @@
           <w:p>
             <w:pPr>
               <w:pStyle w:val="Compact"/>
-              <w:jc w:val="left"/>
             </w:pPr>
             <w:r>
               <w:t xml:space="preserve">Browser or native authorization-code client</w:t>
@@ -3222,7 +3177,6 @@
           <w:p>
             <w:pPr>
               <w:pStyle w:val="Compact"/>
-              <w:jc w:val="left"/>
             </w:pPr>
             <w:r>
               <w:t xml:space="preserve">Use PKCE and documented redirect protections. Native apps should authorize through the system browser. Never embed a confidential client secret in browser code or a mobile binary. See</w:t>
@@ -3230,7 +3184,7 @@
             <w:r>
               <w:t xml:space="preserve"> </w:t>
             </w:r>
-            <w:hyperlink r:id="rId59">
+            <w:hyperlink r:id="rId52">
               <w:r>
                 <w:rPr>
                   <w:rStyle w:val="Hyperlink"/>
@@ -3247,7 +3201,7 @@
             <w:r>
               <w:t xml:space="preserve"> </w:t>
             </w:r>
-            <w:hyperlink r:id="rId60">
+            <w:hyperlink r:id="rId53">
               <w:r>
                 <w:rPr>
                   <w:rStyle w:val="Hyperlink"/>
@@ -3270,7 +3224,6 @@
           <w:p>
             <w:pPr>
               <w:pStyle w:val="Compact"/>
-              <w:jc w:val="left"/>
             </w:pPr>
             <w:r>
               <w:t xml:space="preserve">Self-hosted deployment must accept external JWTs directly</w:t>
@@ -3282,7 +3235,6 @@
           <w:p>
             <w:pPr>
               <w:pStyle w:val="Compact"/>
-              <w:jc w:val="left"/>
             </w:pPr>
             <w:r>
               <w:t xml:space="preserve">Evaluate</w:t>
@@ -3290,7 +3242,7 @@
             <w:r>
               <w:t xml:space="preserve"> </w:t>
             </w:r>
-            <w:hyperlink r:id="rId61">
+            <w:hyperlink r:id="rId54">
               <w:r>
                 <w:rPr>
                   <w:rStyle w:val="Hyperlink"/>
@@ -3313,7 +3265,6 @@
           <w:p>
             <w:pPr>
               <w:pStyle w:val="Compact"/>
-              <w:jc w:val="left"/>
             </w:pPr>
             <w:r>
               <w:t xml:space="preserve">Third-party app needs a SMART launch</w:t>
@@ -3325,7 +3276,6 @@
           <w:p>
             <w:pPr>
               <w:pStyle w:val="Compact"/>
-              <w:jc w:val="left"/>
             </w:pPr>
             <w:r>
               <w:t xml:space="preserve">Use the</w:t>
@@ -3333,7 +3283,7 @@
             <w:r>
               <w:t xml:space="preserve"> </w:t>
             </w:r>
-            <w:hyperlink r:id="rId62">
+            <w:hyperlink r:id="rId55">
               <w:r>
                 <w:rPr>
                   <w:rStyle w:val="Hyperlink"/>
@@ -3356,7 +3306,6 @@
           <w:p>
             <w:pPr>
               <w:pStyle w:val="Compact"/>
-              <w:jc w:val="left"/>
             </w:pPr>
             <w:r>
               <w:t xml:space="preserve">Activation precedes account creation</w:t>
@@ -3368,7 +3317,6 @@
           <w:p>
             <w:pPr>
               <w:pStyle w:val="Compact"/>
-              <w:jc w:val="left"/>
             </w:pPr>
             <w:r>
               <w:t xml:space="preserve">Follow the</w:t>
@@ -3376,7 +3324,7 @@
             <w:r>
               <w:t xml:space="preserve"> </w:t>
             </w:r>
-            <w:hyperlink r:id="rId63">
+            <w:hyperlink r:id="rId56">
               <w:r>
                 <w:rPr>
                   <w:rStyle w:val="Hyperlink"/>
@@ -3391,9 +3339,9 @@
         </w:tc>
       </w:tr>
     </w:tbl>
-    <w:bookmarkEnd w:id="64"/>
-    <w:bookmarkEnd w:id="65"/>
-    <w:bookmarkStart w:id="66" w:name="before-you-implement"/>
+    <w:bookmarkEnd w:id="57"/>
+    <w:bookmarkEnd w:id="58"/>
+    <w:bookmarkStart w:id="59" w:name="before-you-implement"/>
     <w:p>
       <w:pPr>
         <w:pStyle w:val="Heading2"/>
@@ -3410,8 +3358,8 @@
         <w:t xml:space="preserve">Record the three architecture choices for each user population, then test first login, email change, account recovery, membership switching, token expiry, logout, and offboarding. For proxies, verify that missing user context fails without falling back to application credentials.</w:t>
       </w:r>
     </w:p>
-    <w:bookmarkEnd w:id="66"/>
-    <w:bookmarkEnd w:id="67"/>
+    <w:bookmarkEnd w:id="59"/>
+    <w:bookmarkEnd w:id="60"/>
     <w:sectPr>
       <w:pgSz w:h="15840" w:w="12240"/>
       <w:pgMar w:bottom="1440" w:footer="720" w:gutter="0" w:header="720" w:left="1440" w:right="1440" w:top="1440"/>
@@ -3449,14 +3397,14 @@
 <file path=word/numbering.xml><?xml version="1.0" encoding="utf-8"?>
 <w:numbering xmlns:w="http://schemas.openxmlformats.org/wordprocessingml/2006/main">
   <w:abstractNum w:abstractNumId="990">
-    <w:nsid w:val="A990"/>
+    <w:nsid w:val="0000A990"/>
     <w:multiLevelType w:val="multilevel"/>
     <w:lvl w:ilvl="0">
       <w:numFmt w:val="bullet"/>
       <w:lvlText w:val=" "/>
       <w:lvlJc w:val="left"/>
       <w:pPr>
-        <w:ind w:left="720" w:hanging="480"/>
+        <w:ind w:left="720" w:hanging="360"/>
       </w:pPr>
     </w:lvl>
     <w:lvl w:ilvl="1">
@@ -3464,7 +3412,7 @@
       <w:lvlText w:val=" "/>
       <w:lvlJc w:val="left"/>
       <w:pPr>
-        <w:ind w:left="1440" w:hanging="480"/>
+        <w:ind w:left="1440" w:hanging="360"/>
       </w:pPr>
     </w:lvl>
     <w:lvl w:ilvl="2">
@@ -3472,7 +3420,7 @@
       <w:lvlText w:val=" "/>
       <w:lvlJc w:val="left"/>
       <w:pPr>
-        <w:ind w:left="2160" w:hanging="480"/>
+        <w:ind w:left="2160" w:hanging="360"/>
       </w:pPr>
     </w:lvl>
     <w:lvl w:ilvl="3">
@@ -3480,7 +3428,7 @@
       <w:lvlText w:val=" "/>
       <w:lvlJc w:val="left"/>
       <w:pPr>
-        <w:ind w:left="2880" w:hanging="480"/>
+        <w:ind w:left="2880" w:hanging="360"/>
       </w:pPr>
     </w:lvl>
     <w:lvl w:ilvl="4">
@@ -3488,7 +3436,7 @@
       <w:lvlText w:val=" "/>
       <w:lvlJc w:val="left"/>
       <w:pPr>
-        <w:ind w:left="3600" w:hanging="480"/>
+        <w:ind w:left="3600" w:hanging="360"/>
       </w:pPr>
     </w:lvl>
     <w:lvl w:ilvl="5">
@@ -3496,7 +3444,7 @@
       <w:lvlText w:val=" "/>
       <w:lvlJc w:val="left"/>
       <w:pPr>
-        <w:ind w:left="4320" w:hanging="480"/>
+        <w:ind w:left="4320" w:hanging="360"/>
       </w:pPr>
     </w:lvl>
     <w:lvl w:ilvl="6">
@@ -3504,7 +3452,7 @@
       <w:lvlText w:val=" "/>
       <w:lvlJc w:val="left"/>
       <w:pPr>
-        <w:ind w:left="5040" w:hanging="480"/>
+        <w:ind w:left="5040" w:hanging="360"/>
       </w:pPr>
     </w:lvl>
     <w:lvl w:ilvl="7">
@@ -3512,7 +3460,7 @@
       <w:lvlText w:val=" "/>
       <w:lvlJc w:val="left"/>
       <w:pPr>
-        <w:ind w:left="5760" w:hanging="480"/>
+        <w:ind w:left="5760" w:hanging="360"/>
       </w:pPr>
     </w:lvl>
     <w:lvl w:ilvl="8">
@@ -3520,12 +3468,12 @@
       <w:lvlText w:val=" "/>
       <w:lvlJc w:val="left"/>
       <w:pPr>
-        <w:ind w:left="6480" w:hanging="480"/>
+        <w:ind w:left="6480" w:hanging="360"/>
       </w:pPr>
     </w:lvl>
   </w:abstractNum>
   <w:abstractNum w:abstractNumId="99411">
-    <w:nsid w:val="A99411"/>
+    <w:nsid w:val="00A99411"/>
     <w:multiLevelType w:val="multilevel"/>
     <w:lvl w:ilvl="0">
       <w:start w:val="1"/>
@@ -3533,7 +3481,7 @@
       <w:lvlText w:val="%1."/>
       <w:lvlJc w:val="left"/>
       <w:pPr>
-        <w:ind w:left="720" w:hanging="480"/>
+        <w:ind w:left="720" w:hanging="360"/>
       </w:pPr>
     </w:lvl>
     <w:lvl w:ilvl="1">
@@ -3542,7 +3490,7 @@
       <w:lvlText w:val="%2."/>
       <w:lvlJc w:val="left"/>
       <w:pPr>
-        <w:ind w:left="1440" w:hanging="480"/>
+        <w:ind w:left="1440" w:hanging="360"/>
       </w:pPr>
     </w:lvl>
     <w:lvl w:ilvl="2">
@@ -3551,7 +3499,7 @@
       <w:lvlText w:val="%3."/>
       <w:lvlJc w:val="left"/>
       <w:pPr>
-        <w:ind w:left="2160" w:hanging="480"/>
+        <w:ind w:left="2160" w:hanging="360"/>
       </w:pPr>
     </w:lvl>
     <w:lvl w:ilvl="3">
@@ -3560,7 +3508,7 @@
       <w:lvlText w:val="%4."/>
       <w:lvlJc w:val="left"/>
       <w:pPr>
-        <w:ind w:left="2880" w:hanging="480"/>
+        <w:ind w:left="2880" w:hanging="360"/>
       </w:pPr>
     </w:lvl>
     <w:lvl w:ilvl="4">
@@ -3569,7 +3517,7 @@
       <w:lvlText w:val="%5."/>
       <w:lvlJc w:val="left"/>
       <w:pPr>
-        <w:ind w:left="3600" w:hanging="480"/>
+        <w:ind w:left="3600" w:hanging="360"/>
       </w:pPr>
     </w:lvl>
     <w:lvl w:ilvl="5">
@@ -3578,7 +3526,7 @@
       <w:lvlText w:val="%6."/>
       <w:lvlJc w:val="left"/>
       <w:pPr>
-        <w:ind w:left="4320" w:hanging="480"/>
+        <w:ind w:left="4320" w:hanging="360"/>
       </w:pPr>
     </w:lvl>
     <w:lvl w:ilvl="6">
@@ -3587,7 +3535,7 @@
       <w:lvlText w:val="%7."/>
       <w:lvlJc w:val="left"/>
       <w:pPr>
-        <w:ind w:left="5040" w:hanging="480"/>
+        <w:ind w:left="5040" w:hanging="360"/>
       </w:pPr>
     </w:lvl>
     <w:lvl w:ilvl="7">
@@ -3596,7 +3544,7 @@
       <w:lvlText w:val="%8."/>
       <w:lvlJc w:val="left"/>
       <w:pPr>
-        <w:ind w:left="5760" w:hanging="480"/>
+        <w:ind w:left="5760" w:hanging="360"/>
       </w:pPr>
     </w:lvl>
     <w:lvl w:ilvl="8">
@@ -3605,84 +3553,111 @@
       <w:lvlText w:val="%9."/>
       <w:lvlJc w:val="left"/>
       <w:pPr>
-        <w:ind w:left="6480" w:hanging="480"/>
+        <w:ind w:left="6480" w:hanging="360"/>
       </w:pPr>
     </w:lvl>
   </w:abstractNum>
   <w:abstractNum w:abstractNumId="991">
-    <w:nsid w:val="A991"/>
+    <w:nsid w:val="0000A991"/>
     <w:multiLevelType w:val="multilevel"/>
     <w:lvl w:ilvl="0">
       <w:numFmt w:val="bullet"/>
-      <w:lvlText w:val="•"/>
+      <w:lvlText w:val=""/>
       <w:lvlJc w:val="left"/>
       <w:pPr>
-        <w:ind w:left="720" w:hanging="480"/>
-      </w:pPr>
+        <w:ind w:left="720" w:hanging="360"/>
+      </w:pPr>
+      <w:rPr>
+        <w:rFonts w:ascii="Symbol" w:hAnsi="Symbol" w:cs="Symbol" w:hint="default"/>
+      </w:rPr>
     </w:lvl>
     <w:lvl w:ilvl="1">
       <w:numFmt w:val="bullet"/>
-      <w:lvlText w:val="–"/>
+      <w:lvlText w:val="o"/>
       <w:lvlJc w:val="left"/>
       <w:pPr>
-        <w:ind w:left="1440" w:hanging="480"/>
-      </w:pPr>
+        <w:ind w:left="1440" w:hanging="360"/>
+      </w:pPr>
+      <w:rPr>
+        <w:rFonts w:ascii="Courier New" w:hAnsi="Courier New" w:cs="Courier New" w:hint="default"/>
+      </w:rPr>
     </w:lvl>
     <w:lvl w:ilvl="2">
       <w:numFmt w:val="bullet"/>
-      <w:lvlText w:val="•"/>
+      <w:lvlText w:val=""/>
       <w:lvlJc w:val="left"/>
       <w:pPr>
-        <w:ind w:left="2160" w:hanging="480"/>
-      </w:pPr>
+        <w:ind w:left="2160" w:hanging="360"/>
+      </w:pPr>
+      <w:rPr>
+        <w:rFonts w:ascii="Wingdings" w:hAnsi="Wingdings" w:cs="Wingdings" w:hint="default"/>
+      </w:rPr>
     </w:lvl>
     <w:lvl w:ilvl="3">
       <w:numFmt w:val="bullet"/>
-      <w:lvlText w:val="–"/>
+      <w:lvlText w:val=""/>
       <w:lvlJc w:val="left"/>
       <w:pPr>
-        <w:ind w:left="2880" w:hanging="480"/>
-      </w:pPr>
+        <w:ind w:left="2880" w:hanging="360"/>
+      </w:pPr>
+      <w:rPr>
+        <w:rFonts w:ascii="Symbol" w:hAnsi="Symbol" w:cs="Symbol" w:hint="default"/>
+      </w:rPr>
     </w:lvl>
     <w:lvl w:ilvl="4">
       <w:numFmt w:val="bullet"/>
-      <w:lvlText w:val="•"/>
+      <w:lvlText w:val="o"/>
       <w:lvlJc w:val="left"/>
       <w:pPr>
-        <w:ind w:left="3600" w:hanging="480"/>
-      </w:pPr>
+        <w:ind w:left="3600" w:hanging="360"/>
+      </w:pPr>
+      <w:rPr>
+        <w:rFonts w:ascii="Courier New" w:hAnsi="Courier New" w:cs="Courier New" w:hint="default"/>
+      </w:rPr>
     </w:lvl>
     <w:lvl w:ilvl="5">
       <w:numFmt w:val="bullet"/>
-      <w:lvlText w:val="–"/>
+      <w:lvlText w:val=""/>
       <w:lvlJc w:val="left"/>
       <w:pPr>
-        <w:ind w:left="4320" w:hanging="480"/>
-      </w:pPr>
+        <w:ind w:left="4320" w:hanging="360"/>
+      </w:pPr>
+      <w:rPr>
+        <w:rFonts w:ascii="Wingdings" w:hAnsi="Wingdings" w:cs="Wingdings" w:hint="default"/>
+      </w:rPr>
     </w:lvl>
     <w:lvl w:ilvl="6">
       <w:numFmt w:val="bullet"/>
-      <w:lvlText w:val="•"/>
+      <w:lvlText w:val=""/>
       <w:lvlJc w:val="left"/>
       <w:pPr>
-        <w:ind w:left="5040" w:hanging="480"/>
-      </w:pPr>
+        <w:ind w:left="5040" w:hanging="360"/>
+      </w:pPr>
+      <w:rPr>
+        <w:rFonts w:ascii="Symbol" w:hAnsi="Symbol" w:cs="Symbol" w:hint="default"/>
+      </w:rPr>
     </w:lvl>
     <w:lvl w:ilvl="7">
       <w:numFmt w:val="bullet"/>
-      <w:lvlText w:val="–"/>
+      <w:lvlText w:val="o"/>
       <w:lvlJc w:val="left"/>
       <w:pPr>
-        <w:ind w:left="5760" w:hanging="480"/>
-      </w:pPr>
+        <w:ind w:left="5760" w:hanging="360"/>
+      </w:pPr>
+      <w:rPr>
+        <w:rFonts w:ascii="Courier New" w:hAnsi="Courier New" w:cs="Courier New" w:hint="default"/>
+      </w:rPr>
     </w:lvl>
     <w:lvl w:ilvl="8">
       <w:numFmt w:val="bullet"/>
-      <w:lvlText w:val="•"/>
+      <w:lvlText w:val=""/>
       <w:lvlJc w:val="left"/>
       <w:pPr>
-        <w:ind w:left="6480" w:hanging="480"/>
-      </w:pPr>
+        <w:ind w:left="6480" w:hanging="360"/>
+      </w:pPr>
+      <w:rPr>
+        <w:rFonts w:ascii="Wingdings" w:hAnsi="Wingdings" w:cs="Wingdings" w:hint="default"/>
+      </w:rPr>
     </w:lvl>
   </w:abstractNum>
   <w:num w:numId="1000">
@@ -4517,8 +4492,8 @@
     <w:name w:val="KeywordTok"/>
     <w:basedOn w:val="VerbatimChar"/>
     <w:rPr>
+      <w:b/>
       <w:color w:val="007020"/>
-      <w:b/>
     </w:rPr>
   </w:style>
   <w:style w:type="character" w:customStyle="1" w:styleId="DataTypeTok">
@@ -4595,42 +4570,42 @@
     <w:name w:val="ImportTok"/>
     <w:basedOn w:val="VerbatimChar"/>
     <w:rPr>
+      <w:b/>
       <w:color w:val="008000"/>
-      <w:b/>
     </w:rPr>
   </w:style>
   <w:style w:type="character" w:customStyle="1" w:styleId="CommentTok">
     <w:name w:val="CommentTok"/>
     <w:basedOn w:val="VerbatimChar"/>
     <w:rPr>
+      <w:i/>
       <w:color w:val="60a0b0"/>
-      <w:i/>
     </w:rPr>
   </w:style>
   <w:style w:type="character" w:customStyle="1" w:styleId="DocumentationTok">
     <w:name w:val="DocumentationTok"/>
     <w:basedOn w:val="VerbatimChar"/>
     <w:rPr>
+      <w:i/>
       <w:color w:val="ba2121"/>
-      <w:i/>
     </w:rPr>
   </w:style>
   <w:style w:type="character" w:customStyle="1" w:styleId="AnnotationTok">
     <w:name w:val="AnnotationTok"/>
     <w:basedOn w:val="VerbatimChar"/>
     <w:rPr>
-      <w:color w:val="60a0b0"/>
       <w:b/>
       <w:i/>
+      <w:color w:val="60a0b0"/>
     </w:rPr>
   </w:style>
   <w:style w:type="character" w:customStyle="1" w:styleId="CommentVarTok">
     <w:name w:val="CommentVarTok"/>
     <w:basedOn w:val="VerbatimChar"/>
     <w:rPr>
-      <w:color w:val="60a0b0"/>
       <w:b/>
       <w:i/>
+      <w:color w:val="60a0b0"/>
     </w:rPr>
   </w:style>
   <w:style w:type="character" w:customStyle="1" w:styleId="OtherTok">
@@ -4658,8 +4633,8 @@
     <w:name w:val="ControlFlowTok"/>
     <w:basedOn w:val="VerbatimChar"/>
     <w:rPr>
+      <w:b/>
       <w:color w:val="007020"/>
-      <w:b/>
     </w:rPr>
   </w:style>
   <w:style w:type="character" w:customStyle="1" w:styleId="OperatorTok">
@@ -4704,34 +4679,34 @@
     <w:name w:val="InformationTok"/>
     <w:basedOn w:val="VerbatimChar"/>
     <w:rPr>
-      <w:color w:val="60a0b0"/>
       <w:b/>
       <w:i/>
+      <w:color w:val="60a0b0"/>
     </w:rPr>
   </w:style>
   <w:style w:type="character" w:customStyle="1" w:styleId="WarningTok">
     <w:name w:val="WarningTok"/>
     <w:basedOn w:val="VerbatimChar"/>
     <w:rPr>
-      <w:color w:val="60a0b0"/>
       <w:b/>
       <w:i/>
+      <w:color w:val="60a0b0"/>
     </w:rPr>
   </w:style>
   <w:style w:type="character" w:customStyle="1" w:styleId="AlertTok">
     <w:name w:val="AlertTok"/>
     <w:basedOn w:val="VerbatimChar"/>
     <w:rPr>
+      <w:b/>
       <w:color w:val="ff0000"/>
-      <w:b/>
     </w:rPr>
   </w:style>
   <w:style w:type="character" w:customStyle="1" w:styleId="ErrorTok">
     <w:name w:val="ErrorTok"/>
     <w:basedOn w:val="VerbatimChar"/>
     <w:rPr>
+      <w:b/>
       <w:color w:val="ff0000"/>
-      <w:b/>
     </w:rPr>
   </w:style>
   <w:style w:type="character" w:customStyle="1" w:styleId="NormalTok">

</xml_diff>

<commit_message>
docs: decision guide structure and accuracy fixes
Signed-off-by: Everett Williams <everett@medplum.com>
</commit_message>
<xml_diff>
--- a/packages/docs/static/decision-guides/authentication.docx
+++ b/packages/docs/static/decision-guides/authentication.docx
@@ -11,18 +11,18 @@
           <wp:inline>
             <wp:extent cx="5943600" cy="1289649"/>
             <wp:effectExtent b="0" l="0" r="0" t="0"/>
-            <wp:docPr descr="Medplum" title="" id="21" name="Picture"/>
+            <wp:docPr descr="Medplum" title="" id="10" name="Picture"/>
             <a:graphic>
               <a:graphicData uri="http://schemas.openxmlformats.org/drawingml/2006/picture">
                 <pic:pic>
                   <pic:nvPicPr>
-                    <pic:cNvPr descr="medplum-wordmark-grape.png" id="22" name="Picture"/>
+                    <pic:cNvPr descr="medplum-wordmark-grape.png" id="11" name="Picture"/>
                     <pic:cNvPicPr>
                       <a:picLocks noChangeArrowheads="1" noChangeAspect="1"/>
                     </pic:cNvPicPr>
                   </pic:nvPicPr>
                   <pic:blipFill>
-                    <a:blip r:embed="rId20"/>
+                    <a:blip r:embed="rId9"/>
                     <a:stretch>
                       <a:fillRect/>
                     </a:stretch>
@@ -49,7 +49,7 @@
         </w:drawing>
       </w:r>
     </w:p>
-    <w:bookmarkStart w:id="59" w:name="authentication-decision-guide"/>
+    <w:bookmarkStart w:id="51" w:name="authentication-decision-guide"/>
     <w:p>
       <w:pPr>
         <w:pStyle w:val="Heading1"/>
@@ -72,94 +72,94 @@
       </w:pPr>
       <w:r>
         <w:rPr>
+          <w:i/>
           <w:iCs/>
+        </w:rPr>
+        <w:t xml:space="preserve">Companion to the</w:t>
+      </w:r>
+      <w:r>
+        <w:rPr>
           <w:i/>
-        </w:rPr>
-        <w:t xml:space="preserve">Companion to the</w:t>
-      </w:r>
-      <w:r>
-        <w:rPr>
           <w:iCs/>
-          <w:i/>
-        </w:rPr>
-        <w:t xml:space="preserve"> </w:t>
-      </w:r>
-      <w:hyperlink r:id="rId23">
+        </w:rPr>
+        <w:t xml:space="preserve"> </w:t>
+      </w:r>
+      <w:hyperlink r:id="rId12">
         <w:r>
           <w:rPr>
             <w:rStyle w:val="Hyperlink"/>
+            <w:i/>
             <w:iCs/>
-            <w:i/>
           </w:rPr>
           <w:t xml:space="preserve">Authentication</w:t>
         </w:r>
       </w:hyperlink>
       <w:r>
         <w:rPr>
+          <w:i/>
           <w:iCs/>
+        </w:rPr>
+        <w:t xml:space="preserve"> </w:t>
+      </w:r>
+      <w:r>
+        <w:rPr>
           <w:i/>
-        </w:rPr>
-        <w:t xml:space="preserve"> </w:t>
-      </w:r>
-      <w:r>
-        <w:rPr>
           <w:iCs/>
+        </w:rPr>
+        <w:t xml:space="preserve">and</w:t>
+      </w:r>
+      <w:r>
+        <w:rPr>
           <w:i/>
-        </w:rPr>
-        <w:t xml:space="preserve">and</w:t>
-      </w:r>
-      <w:r>
-        <w:rPr>
           <w:iCs/>
-          <w:i/>
-        </w:rPr>
-        <w:t xml:space="preserve"> </w:t>
-      </w:r>
-      <w:hyperlink r:id="rId24">
+        </w:rPr>
+        <w:t xml:space="preserve"> </w:t>
+      </w:r>
+      <w:hyperlink r:id="rId13">
         <w:r>
           <w:rPr>
             <w:rStyle w:val="Hyperlink"/>
+            <w:i/>
             <w:iCs/>
-            <w:i/>
           </w:rPr>
           <w:t xml:space="preserve">User Management</w:t>
         </w:r>
       </w:hyperlink>
       <w:r>
         <w:rPr>
+          <w:i/>
           <w:iCs/>
+        </w:rPr>
+        <w:t xml:space="preserve"> </w:t>
+      </w:r>
+      <w:r>
+        <w:rPr>
           <w:i/>
-        </w:rPr>
-        <w:t xml:space="preserve"> </w:t>
-      </w:r>
-      <w:r>
-        <w:rPr>
           <w:iCs/>
+        </w:rPr>
+        <w:t xml:space="preserve">docs. Builds on</w:t>
+      </w:r>
+      <w:r>
+        <w:rPr>
           <w:i/>
-        </w:rPr>
-        <w:t xml:space="preserve">docs. Builds on</w:t>
-      </w:r>
-      <w:r>
-        <w:rPr>
           <w:iCs/>
-          <w:i/>
-        </w:rPr>
-        <w:t xml:space="preserve"> </w:t>
-      </w:r>
-      <w:hyperlink r:id="rId25">
+        </w:rPr>
+        <w:t xml:space="preserve"> </w:t>
+      </w:r>
+      <w:hyperlink r:id="rId14">
         <w:r>
           <w:rPr>
             <w:rStyle w:val="Hyperlink"/>
+            <w:i/>
             <w:iCs/>
-            <w:i/>
           </w:rPr>
           <w:t xml:space="preserve">Identity Management: A Practical Guide</w:t>
         </w:r>
       </w:hyperlink>
       <w:r>
         <w:rPr>
+          <w:i/>
           <w:iCs/>
-          <w:i/>
         </w:rPr>
         <w:t xml:space="preserve">.</w:t>
       </w:r>
@@ -174,26 +174,26 @@
     </w:p>
     <w:p>
       <w:pPr>
+        <w:pStyle w:val="Compact"/>
         <w:numPr>
           <w:ilvl w:val="0"/>
           <w:numId w:val="1001"/>
         </w:numPr>
-        <w:pStyle w:val="Compact"/>
       </w:pPr>
       <w:hyperlink w:anchor="X5c643f84501ad1ede1a9e8776bb91848ba9cdd6">
         <w:r>
           <w:rPr>
             <w:rStyle w:val="Hyperlink"/>
+            <w:b/>
             <w:bCs/>
-            <w:b/>
           </w:rPr>
           <w:t xml:space="preserve">Choose your identity provider</w:t>
         </w:r>
       </w:hyperlink>
       <w:r>
         <w:rPr>
+          <w:b/>
           <w:bCs/>
-          <w:b/>
         </w:rPr>
         <w:t xml:space="preserve">.</w:t>
       </w:r>
@@ -206,18 +206,18 @@
     </w:p>
     <w:p>
       <w:pPr>
+        <w:pStyle w:val="Compact"/>
         <w:numPr>
           <w:ilvl w:val="0"/>
           <w:numId w:val="1001"/>
         </w:numPr>
-        <w:pStyle w:val="Compact"/>
       </w:pPr>
       <w:hyperlink w:anchor="X2b39dfd4df54a7c9f4fe3b24536819fb0a2dcba">
         <w:r>
           <w:rPr>
             <w:rStyle w:val="Hyperlink"/>
+            <w:b/>
             <w:bCs/>
-            <w:b/>
           </w:rPr>
           <w:t xml:space="preserve">Choose your token flow</w:t>
         </w:r>
@@ -231,18 +231,18 @@
     </w:p>
     <w:p>
       <w:pPr>
+        <w:pStyle w:val="Compact"/>
         <w:numPr>
           <w:ilvl w:val="0"/>
           <w:numId w:val="1001"/>
         </w:numPr>
-        <w:pStyle w:val="Compact"/>
       </w:pPr>
       <w:hyperlink w:anchor="Xa2fe8c07881eb9416283f05100480535a9d42e6">
         <w:r>
           <w:rPr>
             <w:rStyle w:val="Hyperlink"/>
+            <w:b/>
             <w:bCs/>
-            <w:b/>
           </w:rPr>
           <w:t xml:space="preserve">Choose your matching key</w:t>
         </w:r>
@@ -278,7 +278,7 @@
       <w:r>
         <w:t xml:space="preserve"> </w:t>
       </w:r>
-      <w:hyperlink r:id="rId26">
+      <w:hyperlink r:id="rId15">
         <w:r>
           <w:rPr>
             <w:rStyle w:val="Hyperlink"/>
@@ -297,7 +297,7 @@
         </w:pict>
       </w:r>
     </w:p>
-    <w:bookmarkStart w:id="34" w:name="X5c643f84501ad1ede1a9e8776bb91848ba9cdd6"/>
+    <w:bookmarkStart w:id="24" w:name="X5c643f84501ad1ede1a9e8776bb91848ba9cdd6"/>
     <w:p>
       <w:pPr>
         <w:pStyle w:val="Heading2"/>
@@ -314,7 +314,7 @@
         <w:t xml:space="preserve">An identity provider (IDP) manages credentials and authenticates users. Choose based on your existing identity systems and SSO requirements.</w:t>
       </w:r>
     </w:p>
-    <w:bookmarkStart w:id="29" w:name="option-a-medplum-managed-authentication"/>
+    <w:bookmarkStart w:id="19" w:name="option-a-medplum-managed-authentication"/>
     <w:p>
       <w:pPr>
         <w:pStyle w:val="Heading3"/>
@@ -328,32 +328,32 @@
         <w:pStyle w:val="FirstParagraph"/>
       </w:pPr>
       <w:r>
-        <w:t xml:space="preserve">Medplum manages credentials, registration, password resets, and MFA.</w:t>
-      </w:r>
-    </w:p>
-    <w:p>
-      <w:pPr>
+        <w:t xml:space="preserve">Use Medplum’s built-in email/password login or Google sign-in. For password-based accounts, Medplum manages credentials, registration, password resets, and MFA.</w:t>
+      </w:r>
+    </w:p>
+    <w:p>
+      <w:pPr>
+        <w:pStyle w:val="Compact"/>
         <w:numPr>
           <w:ilvl w:val="0"/>
           <w:numId w:val="1002"/>
         </w:numPr>
-        <w:pStyle w:val="Compact"/>
-      </w:pPr>
-      <w:r>
-        <w:rPr>
+      </w:pPr>
+      <w:r>
+        <w:rPr>
+          <w:b/>
           <w:bCs/>
-          <w:b/>
         </w:rPr>
         <w:t xml:space="preserve">Advantages:</w:t>
       </w:r>
     </w:p>
     <w:p>
       <w:pPr>
+        <w:pStyle w:val="Compact"/>
         <w:numPr>
           <w:ilvl w:val="1"/>
           <w:numId w:val="1003"/>
         </w:numPr>
-        <w:pStyle w:val="Compact"/>
       </w:pPr>
       <w:r>
         <w:t xml:space="preserve">Built-in authentication and login components without a separate IDP integration.</w:t>
@@ -361,27 +361,27 @@
     </w:p>
     <w:p>
       <w:pPr>
+        <w:pStyle w:val="Compact"/>
         <w:numPr>
           <w:ilvl w:val="0"/>
           <w:numId w:val="1002"/>
         </w:numPr>
-        <w:pStyle w:val="Compact"/>
-      </w:pPr>
-      <w:r>
-        <w:rPr>
+      </w:pPr>
+      <w:r>
+        <w:rPr>
+          <w:b/>
           <w:bCs/>
-          <w:b/>
         </w:rPr>
         <w:t xml:space="preserve">Tradeoffs:</w:t>
       </w:r>
     </w:p>
     <w:p>
       <w:pPr>
+        <w:pStyle w:val="Compact"/>
         <w:numPr>
           <w:ilvl w:val="1"/>
           <w:numId w:val="1004"/>
         </w:numPr>
-        <w:pStyle w:val="Compact"/>
       </w:pPr>
       <w:r>
         <w:t xml:space="preserve">Does not meet a requirement to use an existing corporate IDP.</w:t>
@@ -389,16 +389,16 @@
     </w:p>
     <w:p>
       <w:pPr>
+        <w:pStyle w:val="Compact"/>
         <w:numPr>
           <w:ilvl w:val="0"/>
           <w:numId w:val="1002"/>
         </w:numPr>
-        <w:pStyle w:val="Compact"/>
-      </w:pPr>
-      <w:r>
-        <w:rPr>
+      </w:pPr>
+      <w:r>
+        <w:rPr>
+          <w:b/>
           <w:bCs/>
-          <w:b/>
         </w:rPr>
         <w:t xml:space="preserve">Best fit:</w:t>
       </w:r>
@@ -419,7 +419,7 @@
       <w:r>
         <w:t xml:space="preserve"> </w:t>
       </w:r>
-      <w:hyperlink r:id="rId27">
+      <w:hyperlink r:id="rId16">
         <w:r>
           <w:rPr>
             <w:rStyle w:val="Hyperlink"/>
@@ -428,15 +428,12 @@
         </w:r>
       </w:hyperlink>
       <w:r>
-        <w:t xml:space="preserve"> </w:t>
-      </w:r>
-      <w:r>
-        <w:t xml:space="preserve">or</w:t>
-      </w:r>
-      <w:r>
-        <w:t xml:space="preserve"> </w:t>
-      </w:r>
-      <w:hyperlink r:id="rId28">
+        <w:t xml:space="preserve">,</w:t>
+      </w:r>
+      <w:r>
+        <w:t xml:space="preserve"> </w:t>
+      </w:r>
+      <w:hyperlink r:id="rId17">
         <w:r>
           <w:rPr>
             <w:rStyle w:val="Hyperlink"/>
@@ -445,6 +442,20 @@
         </w:r>
       </w:hyperlink>
       <w:r>
+        <w:t xml:space="preserve">, and</w:t>
+      </w:r>
+      <w:r>
+        <w:t xml:space="preserve"> </w:t>
+      </w:r>
+      <w:hyperlink r:id="rId18">
+        <w:r>
+          <w:rPr>
+            <w:rStyle w:val="Hyperlink"/>
+          </w:rPr>
+          <w:t xml:space="preserve">Google sign-in</w:t>
+        </w:r>
+      </w:hyperlink>
+      <w:r>
         <w:t xml:space="preserve">.</w:t>
       </w:r>
     </w:p>
@@ -454,8 +465,8 @@
       </w:pPr>
       <w:r>
         <w:rPr>
+          <w:b/>
           <w:bCs/>
-          <w:b/>
         </w:rPr>
         <w:t xml:space="preserve">Next:</w:t>
       </w:r>
@@ -480,8 +491,8 @@
         <w:t xml:space="preserve">.</w:t>
       </w:r>
     </w:p>
-    <w:bookmarkEnd w:id="29"/>
-    <w:bookmarkStart w:id="31" w:name="Xe8809dc97f953fef8ac90d1d3f41e2bb8c2302f"/>
+    <w:bookmarkEnd w:id="19"/>
+    <w:bookmarkStart w:id="21" w:name="Xe8809dc97f953fef8ac90d1d3f41e2bb8c2302f"/>
     <w:p>
       <w:pPr>
         <w:pStyle w:val="Heading3"/>
@@ -512,27 +523,27 @@
     </w:p>
     <w:p>
       <w:pPr>
+        <w:pStyle w:val="Compact"/>
         <w:numPr>
           <w:ilvl w:val="0"/>
           <w:numId w:val="1005"/>
         </w:numPr>
-        <w:pStyle w:val="Compact"/>
-      </w:pPr>
-      <w:r>
-        <w:rPr>
+      </w:pPr>
+      <w:r>
+        <w:rPr>
+          <w:b/>
           <w:bCs/>
-          <w:b/>
         </w:rPr>
         <w:t xml:space="preserve">Advantages:</w:t>
       </w:r>
     </w:p>
     <w:p>
       <w:pPr>
+        <w:pStyle w:val="Compact"/>
         <w:numPr>
           <w:ilvl w:val="1"/>
           <w:numId w:val="1006"/>
         </w:numPr>
-        <w:pStyle w:val="Compact"/>
       </w:pPr>
       <w:r>
         <w:t xml:space="preserve">Reuses existing identities and advanced features from providers such as Okta or Auth0.</w:t>
@@ -540,11 +551,11 @@
     </w:p>
     <w:p>
       <w:pPr>
+        <w:pStyle w:val="Compact"/>
         <w:numPr>
           <w:ilvl w:val="1"/>
           <w:numId w:val="1006"/>
         </w:numPr>
-        <w:pStyle w:val="Compact"/>
       </w:pPr>
       <w:r>
         <w:t xml:space="preserve">Different applications can use different identity providers.</w:t>
@@ -552,27 +563,27 @@
     </w:p>
     <w:p>
       <w:pPr>
+        <w:pStyle w:val="Compact"/>
         <w:numPr>
           <w:ilvl w:val="0"/>
           <w:numId w:val="1005"/>
         </w:numPr>
-        <w:pStyle w:val="Compact"/>
-      </w:pPr>
-      <w:r>
-        <w:rPr>
+      </w:pPr>
+      <w:r>
+        <w:rPr>
+          <w:b/>
           <w:bCs/>
-          <w:b/>
         </w:rPr>
         <w:t xml:space="preserve">Tradeoffs:</w:t>
       </w:r>
     </w:p>
     <w:p>
       <w:pPr>
+        <w:pStyle w:val="Compact"/>
         <w:numPr>
           <w:ilvl w:val="1"/>
           <w:numId w:val="1007"/>
         </w:numPr>
-        <w:pStyle w:val="Compact"/>
       </w:pPr>
       <w:r>
         <w:t xml:space="preserve">Multiple upstream IDPs within one application need additional routing, such as an identity broker.</w:t>
@@ -580,16 +591,16 @@
     </w:p>
     <w:p>
       <w:pPr>
+        <w:pStyle w:val="Compact"/>
         <w:numPr>
           <w:ilvl w:val="0"/>
           <w:numId w:val="1005"/>
         </w:numPr>
-        <w:pStyle w:val="Compact"/>
-      </w:pPr>
-      <w:r>
-        <w:rPr>
+      </w:pPr>
+      <w:r>
+        <w:rPr>
+          <w:b/>
           <w:bCs/>
-          <w:b/>
         </w:rPr>
         <w:t xml:space="preserve">Best fit:</w:t>
       </w:r>
@@ -610,7 +621,7 @@
       <w:r>
         <w:t xml:space="preserve"> </w:t>
       </w:r>
-      <w:hyperlink r:id="rId30">
+      <w:hyperlink r:id="rId20">
         <w:r>
           <w:rPr>
             <w:rStyle w:val="Hyperlink"/>
@@ -622,8 +633,8 @@
         <w:t xml:space="preserve">.</w:t>
       </w:r>
     </w:p>
-    <w:bookmarkEnd w:id="31"/>
-    <w:bookmarkStart w:id="33" w:name="X1f3b4712db7da41133a5c6556c0631e928b0632"/>
+    <w:bookmarkEnd w:id="21"/>
+    <w:bookmarkStart w:id="23" w:name="X1f3b4712db7da41133a5c6556c0631e928b0632"/>
     <w:p>
       <w:pPr>
         <w:pStyle w:val="Heading3"/>
@@ -657,27 +668,27 @@
     </w:p>
     <w:p>
       <w:pPr>
+        <w:pStyle w:val="Compact"/>
         <w:numPr>
           <w:ilvl w:val="0"/>
           <w:numId w:val="1008"/>
         </w:numPr>
-        <w:pStyle w:val="Compact"/>
-      </w:pPr>
-      <w:r>
-        <w:rPr>
+      </w:pPr>
+      <w:r>
+        <w:rPr>
+          <w:b/>
           <w:bCs/>
-          <w:b/>
         </w:rPr>
         <w:t xml:space="preserve">Advantages:</w:t>
       </w:r>
     </w:p>
     <w:p>
       <w:pPr>
+        <w:pStyle w:val="Compact"/>
         <w:numPr>
           <w:ilvl w:val="1"/>
           <w:numId w:val="1009"/>
         </w:numPr>
-        <w:pStyle w:val="Compact"/>
       </w:pPr>
       <w:r>
         <w:t xml:space="preserve">An organization’s SSO applies across Medplum applications, including the Medplum App.</w:t>
@@ -685,27 +696,27 @@
     </w:p>
     <w:p>
       <w:pPr>
+        <w:pStyle w:val="Compact"/>
         <w:numPr>
           <w:ilvl w:val="0"/>
           <w:numId w:val="1008"/>
         </w:numPr>
-        <w:pStyle w:val="Compact"/>
-      </w:pPr>
-      <w:r>
-        <w:rPr>
+      </w:pPr>
+      <w:r>
+        <w:rPr>
+          <w:b/>
           <w:bCs/>
-          <w:b/>
         </w:rPr>
         <w:t xml:space="preserve">Tradeoffs:</w:t>
       </w:r>
     </w:p>
     <w:p>
       <w:pPr>
+        <w:pStyle w:val="Compact"/>
         <w:numPr>
           <w:ilvl w:val="1"/>
           <w:numId w:val="1010"/>
         </w:numPr>
-        <w:pStyle w:val="Compact"/>
       </w:pPr>
       <w:r>
         <w:t xml:space="preserve">Applies to all users of the domain, including developer accounts.</w:t>
@@ -713,11 +724,11 @@
     </w:p>
     <w:p>
       <w:pPr>
+        <w:pStyle w:val="Compact"/>
         <w:numPr>
           <w:ilvl w:val="1"/>
           <w:numId w:val="1010"/>
         </w:numPr>
-        <w:pStyle w:val="Compact"/>
       </w:pPr>
       <w:r>
         <w:t xml:space="preserve">Requires Medplum setup support for both hosted and self-hosted deployments. Hosted setup requires Enterprise.</w:t>
@@ -725,16 +736,16 @@
     </w:p>
     <w:p>
       <w:pPr>
+        <w:pStyle w:val="Compact"/>
         <w:numPr>
           <w:ilvl w:val="0"/>
           <w:numId w:val="1008"/>
         </w:numPr>
-        <w:pStyle w:val="Compact"/>
-      </w:pPr>
-      <w:r>
-        <w:rPr>
+      </w:pPr>
+      <w:r>
+        <w:rPr>
+          <w:b/>
           <w:bCs/>
-          <w:b/>
         </w:rPr>
         <w:t xml:space="preserve">Best fit:</w:t>
       </w:r>
@@ -755,7 +766,7 @@
       <w:r>
         <w:t xml:space="preserve"> </w:t>
       </w:r>
-      <w:hyperlink r:id="rId32">
+      <w:hyperlink r:id="rId22">
         <w:r>
           <w:rPr>
             <w:rStyle w:val="Hyperlink"/>
@@ -773,27 +784,86 @@
       </w:pPr>
       <w:r>
         <w:rPr>
+          <w:b/>
           <w:bCs/>
+        </w:rPr>
+        <w:t xml:space="preserve">Next for external IDPs:</w:t>
+      </w:r>
+      <w:r>
+        <w:t xml:space="preserve"> </w:t>
+      </w:r>
+      <w:r>
+        <w:t xml:space="preserve">Choose your token flow below.</w:t>
+      </w:r>
+    </w:p>
+    <w:bookmarkEnd w:id="23"/>
+    <w:bookmarkEnd w:id="24"/>
+    <w:bookmarkStart w:id="34" w:name="X2b39dfd4df54a7c9f4fe3b24536819fb0a2dcba"/>
+    <w:p>
+      <w:pPr>
+        <w:pStyle w:val="Heading2"/>
+      </w:pPr>
+      <w:r>
+        <w:t xml:space="preserve">Decision 2: What is your token flow architecture?</w:t>
+      </w:r>
+    </w:p>
+    <w:p>
+      <w:pPr>
+        <w:pStyle w:val="FirstParagraph"/>
+      </w:pPr>
+      <w:r>
+        <w:rPr>
           <w:b/>
-        </w:rPr>
-        <w:t xml:space="preserve">Next for external IDPs:</w:t>
-      </w:r>
-      <w:r>
-        <w:t xml:space="preserve"> </w:t>
-      </w:r>
-      <w:r>
-        <w:t xml:space="preserve">Choose your token flow below.</w:t>
-      </w:r>
-    </w:p>
-    <w:bookmarkEnd w:id="33"/>
-    <w:bookmarkEnd w:id="34"/>
-    <w:bookmarkStart w:id="43" w:name="X2b39dfd4df54a7c9f4fe3b24536819fb0a2dcba"/>
-    <w:p>
-      <w:pPr>
-        <w:pStyle w:val="Heading2"/>
-      </w:pPr>
-      <w:r>
-        <w:t xml:space="preserve">Decision 2: What is your token flow architecture?</w:t>
+          <w:bCs/>
+        </w:rPr>
+        <w:t xml:space="preserve">For applications using external or existing authentication.</w:t>
+      </w:r>
+      <w:r>
+        <w:t xml:space="preserve"> </w:t>
+      </w:r>
+      <w:r>
+        <w:t xml:space="preserve">Choose how the application obtains Medplum credentials. Here,</w:t>
+      </w:r>
+      <w:r>
+        <w:t xml:space="preserve"> </w:t>
+      </w:r>
+      <w:r>
+        <w:t xml:space="preserve">“client”</w:t>
+      </w:r>
+      <w:r>
+        <w:t xml:space="preserve"> </w:t>
+      </w:r>
+      <w:r>
+        <w:t xml:space="preserve">means your browser or native app;</w:t>
+      </w:r>
+      <w:r>
+        <w:t xml:space="preserve"> </w:t>
+      </w:r>
+      <w:r>
+        <w:t xml:space="preserve">“server”</w:t>
+      </w:r>
+      <w:r>
+        <w:t xml:space="preserve"> </w:t>
+      </w:r>
+      <w:r>
+        <w:t xml:space="preserve">means your application backend.</w:t>
+      </w:r>
+    </w:p>
+    <w:p>
+      <w:pPr>
+        <w:pStyle w:val="BodyText"/>
+      </w:pPr>
+      <w:r>
+        <w:t xml:space="preserve">Both the authorization-code flow and token exchange can use the same external IDP. The difference is whether Medplum handles the IDP callback or your application obtains an external access token and exchanges it.</w:t>
+      </w:r>
+    </w:p>
+    <w:bookmarkStart w:id="25" w:name="X5eacf9fb7cb611124f81ab68c944516496527c7"/>
+    <w:p>
+      <w:pPr>
+        <w:pStyle w:val="Heading3"/>
+      </w:pPr>
+      <w:r>
+        <w:t xml:space="preserve">Option A: External IDP authorization-code flow (three-legged OAuth)</w:t>
       </w:r>
     </w:p>
     <w:p>
@@ -801,103 +871,32 @@
         <w:pStyle w:val="FirstParagraph"/>
       </w:pPr>
       <w:r>
-        <w:rPr>
-          <w:bCs/>
-          <w:b/>
-        </w:rPr>
-        <w:t xml:space="preserve">For applications using external or existing authentication.</w:t>
-      </w:r>
-      <w:r>
-        <w:t xml:space="preserve"> </w:t>
-      </w:r>
-      <w:r>
-        <w:t xml:space="preserve">Choose how the application obtains Medplum credentials. Here,</w:t>
-      </w:r>
-      <w:r>
-        <w:t xml:space="preserve"> </w:t>
-      </w:r>
-      <w:r>
-        <w:t xml:space="preserve">“</w:t>
-      </w:r>
-      <w:r>
-        <w:t xml:space="preserve">client</w:t>
-      </w:r>
-      <w:r>
-        <w:t xml:space="preserve">”</w:t>
-      </w:r>
-      <w:r>
-        <w:t xml:space="preserve"> </w:t>
-      </w:r>
-      <w:r>
-        <w:t xml:space="preserve">means your browser or native app;</w:t>
-      </w:r>
-      <w:r>
-        <w:t xml:space="preserve"> </w:t>
-      </w:r>
-      <w:r>
-        <w:t xml:space="preserve">“</w:t>
-      </w:r>
-      <w:r>
-        <w:t xml:space="preserve">server</w:t>
-      </w:r>
-      <w:r>
-        <w:t xml:space="preserve">”</w:t>
-      </w:r>
-      <w:r>
-        <w:t xml:space="preserve"> </w:t>
-      </w:r>
-      <w:r>
-        <w:t xml:space="preserve">means your application backend.</w:t>
-      </w:r>
-    </w:p>
-    <w:p>
-      <w:pPr>
-        <w:pStyle w:val="BodyText"/>
-      </w:pPr>
-      <w:r>
-        <w:t xml:space="preserve">Both the authorization-code flow and token exchange can use the same external IDP. The difference is whether Medplum handles the IDP callback or your application obtains an external access token and exchanges it.</w:t>
-      </w:r>
-    </w:p>
-    <w:bookmarkStart w:id="35" w:name="X5eacf9fb7cb611124f81ab68c944516496527c7"/>
-    <w:p>
-      <w:pPr>
-        <w:pStyle w:val="Heading3"/>
-      </w:pPr>
-      <w:r>
-        <w:t xml:space="preserve">Option A: External IDP authorization-code flow (three-legged OAuth)</w:t>
-      </w:r>
-    </w:p>
-    <w:p>
-      <w:pPr>
-        <w:pStyle w:val="FirstParagraph"/>
-      </w:pPr>
-      <w:r>
         <w:t xml:space="preserve">Medplum handles the external IDP callback and returns an authorization code to your application, which exchanges it for Medplum tokens.</w:t>
       </w:r>
     </w:p>
     <w:p>
       <w:pPr>
+        <w:pStyle w:val="Compact"/>
         <w:numPr>
           <w:ilvl w:val="0"/>
           <w:numId w:val="1011"/>
         </w:numPr>
-        <w:pStyle w:val="Compact"/>
-      </w:pPr>
-      <w:r>
-        <w:rPr>
+      </w:pPr>
+      <w:r>
+        <w:rPr>
+          <w:b/>
           <w:bCs/>
-          <w:b/>
         </w:rPr>
         <w:t xml:space="preserve">Advantages:</w:t>
       </w:r>
     </w:p>
     <w:p>
       <w:pPr>
+        <w:pStyle w:val="Compact"/>
         <w:numPr>
           <w:ilvl w:val="1"/>
           <w:numId w:val="1012"/>
         </w:numPr>
-        <w:pStyle w:val="Compact"/>
       </w:pPr>
       <w:r>
         <w:t xml:space="preserve">The client can call Medplum directly using the SDK and authenticated components.</w:t>
@@ -905,11 +904,11 @@
     </w:p>
     <w:p>
       <w:pPr>
+        <w:pStyle w:val="Compact"/>
         <w:numPr>
           <w:ilvl w:val="1"/>
           <w:numId w:val="1012"/>
         </w:numPr>
-        <w:pStyle w:val="Compact"/>
       </w:pPr>
       <w:r>
         <w:t xml:space="preserve">The client does not need to retain an external access token for this flow.</w:t>
@@ -917,27 +916,27 @@
     </w:p>
     <w:p>
       <w:pPr>
+        <w:pStyle w:val="Compact"/>
         <w:numPr>
           <w:ilvl w:val="0"/>
           <w:numId w:val="1011"/>
         </w:numPr>
-        <w:pStyle w:val="Compact"/>
-      </w:pPr>
-      <w:r>
-        <w:rPr>
+      </w:pPr>
+      <w:r>
+        <w:rPr>
+          <w:b/>
           <w:bCs/>
-          <w:b/>
         </w:rPr>
         <w:t xml:space="preserve">Tradeoffs:</w:t>
       </w:r>
     </w:p>
     <w:p>
       <w:pPr>
+        <w:pStyle w:val="Compact"/>
         <w:numPr>
           <w:ilvl w:val="1"/>
           <w:numId w:val="1013"/>
         </w:numPr>
-        <w:pStyle w:val="Compact"/>
       </w:pPr>
       <w:r>
         <w:t xml:space="preserve">Requires redirect login and coordinated callback settings.</w:t>
@@ -945,11 +944,11 @@
     </w:p>
     <w:p>
       <w:pPr>
+        <w:pStyle w:val="Compact"/>
         <w:numPr>
           <w:ilvl w:val="1"/>
           <w:numId w:val="1013"/>
         </w:numPr>
-        <w:pStyle w:val="Compact"/>
       </w:pPr>
       <w:r>
         <w:t xml:space="preserve">Does not provide the client with an external access token for other services.</w:t>
@@ -957,16 +956,16 @@
     </w:p>
     <w:p>
       <w:pPr>
+        <w:pStyle w:val="Compact"/>
         <w:numPr>
           <w:ilvl w:val="0"/>
           <w:numId w:val="1011"/>
         </w:numPr>
-        <w:pStyle w:val="Compact"/>
-      </w:pPr>
-      <w:r>
-        <w:rPr>
+      </w:pPr>
+      <w:r>
+        <w:rPr>
+          <w:b/>
           <w:bCs/>
-          <w:b/>
         </w:rPr>
         <w:t xml:space="preserve">Best fit:</w:t>
       </w:r>
@@ -987,7 +986,7 @@
       <w:r>
         <w:t xml:space="preserve"> </w:t>
       </w:r>
-      <w:hyperlink r:id="rId30">
+      <w:hyperlink r:id="rId20">
         <w:r>
           <w:rPr>
             <w:rStyle w:val="Hyperlink"/>
@@ -999,8 +998,8 @@
         <w:t xml:space="preserve">.</w:t>
       </w:r>
     </w:p>
-    <w:bookmarkEnd w:id="35"/>
-    <w:bookmarkStart w:id="40" w:name="option-b-token-exchange"/>
+    <w:bookmarkEnd w:id="25"/>
+    <w:bookmarkStart w:id="31" w:name="option-b-token-exchange"/>
     <w:p>
       <w:pPr>
         <w:pStyle w:val="Heading3"/>
@@ -1019,27 +1018,27 @@
     </w:p>
     <w:p>
       <w:pPr>
+        <w:pStyle w:val="Compact"/>
         <w:numPr>
           <w:ilvl w:val="0"/>
           <w:numId w:val="1014"/>
         </w:numPr>
-        <w:pStyle w:val="Compact"/>
-      </w:pPr>
-      <w:r>
-        <w:rPr>
+      </w:pPr>
+      <w:r>
+        <w:rPr>
+          <w:b/>
           <w:bCs/>
-          <w:b/>
         </w:rPr>
         <w:t xml:space="preserve">Advantages:</w:t>
       </w:r>
     </w:p>
     <w:p>
       <w:pPr>
+        <w:pStyle w:val="Compact"/>
         <w:numPr>
           <w:ilvl w:val="1"/>
           <w:numId w:val="1015"/>
         </w:numPr>
-        <w:pStyle w:val="Compact"/>
       </w:pPr>
       <w:r>
         <w:t xml:space="preserve">Adds Medplum access to an existing login without a second interactive sign-in.</w:t>
@@ -1047,11 +1046,11 @@
     </w:p>
     <w:p>
       <w:pPr>
+        <w:pStyle w:val="Compact"/>
         <w:numPr>
           <w:ilvl w:val="1"/>
           <w:numId w:val="1015"/>
         </w:numPr>
-        <w:pStyle w:val="Compact"/>
       </w:pPr>
       <w:r>
         <w:t xml:space="preserve">Your application retains control of the external login and can use external credentials with other services that accept them.</w:t>
@@ -1059,27 +1058,27 @@
     </w:p>
     <w:p>
       <w:pPr>
+        <w:pStyle w:val="Compact"/>
         <w:numPr>
           <w:ilvl w:val="0"/>
           <w:numId w:val="1014"/>
         </w:numPr>
-        <w:pStyle w:val="Compact"/>
-      </w:pPr>
-      <w:r>
-        <w:rPr>
+      </w:pPr>
+      <w:r>
+        <w:rPr>
+          <w:b/>
           <w:bCs/>
-          <w:b/>
         </w:rPr>
         <w:t xml:space="preserve">Tradeoffs:</w:t>
       </w:r>
     </w:p>
     <w:p>
       <w:pPr>
+        <w:pStyle w:val="Compact"/>
         <w:numPr>
           <w:ilvl w:val="1"/>
           <w:numId w:val="1016"/>
         </w:numPr>
-        <w:pStyle w:val="Compact"/>
       </w:pPr>
       <w:r>
         <w:t xml:space="preserve">Requires an external access token that the IDP’s UserInfo endpoint can validate.</w:t>
@@ -1087,11 +1086,11 @@
     </w:p>
     <w:p>
       <w:pPr>
+        <w:pStyle w:val="Compact"/>
         <w:numPr>
           <w:ilvl w:val="1"/>
           <w:numId w:val="1016"/>
         </w:numPr>
-        <w:pStyle w:val="Compact"/>
       </w:pPr>
       <w:r>
         <w:t xml:space="preserve">Your application manages both external and Medplum credential lifecycles.</w:t>
@@ -1099,24 +1098,98 @@
     </w:p>
     <w:p>
       <w:pPr>
+        <w:pStyle w:val="Compact"/>
         <w:numPr>
           <w:ilvl w:val="0"/>
           <w:numId w:val="1014"/>
         </w:numPr>
-        <w:pStyle w:val="Compact"/>
-      </w:pPr>
-      <w:r>
-        <w:rPr>
+      </w:pPr>
+      <w:r>
+        <w:rPr>
+          <w:b/>
           <w:bCs/>
+        </w:rPr>
+        <w:t xml:space="preserve">Best fit:</w:t>
+      </w:r>
+      <w:r>
+        <w:t xml:space="preserve"> </w:t>
+      </w:r>
+      <w:r>
+        <w:t xml:space="preserve">Your application already obtains an external access token and needs to add Medplum access, potentially alongside other services.</w:t>
+      </w:r>
+    </w:p>
+    <w:p>
+      <w:pPr>
+        <w:pStyle w:val="FirstParagraph"/>
+      </w:pPr>
+      <w:r>
+        <w:rPr>
           <w:b/>
-        </w:rPr>
-        <w:t xml:space="preserve">Best fit:</w:t>
-      </w:r>
-      <w:r>
-        <w:t xml:space="preserve"> </w:t>
-      </w:r>
-      <w:r>
-        <w:t xml:space="preserve">Your application already obtains an external access token and needs to add Medplum access, potentially alongside other services.</w:t>
+          <w:bCs/>
+        </w:rPr>
+        <w:t xml:space="preserve">Other integrations alone do not require token exchange.</w:t>
+      </w:r>
+      <w:r>
+        <w:t xml:space="preserve"> </w:t>
+      </w:r>
+      <w:r>
+        <w:t xml:space="preserve">Integrations running in Bots or your backend with service credentials do not require the client to hold an external token.</w:t>
+      </w:r>
+    </w:p>
+    <w:p>
+      <w:pPr>
+        <w:pStyle w:val="BodyText"/>
+      </w:pPr>
+      <w:r>
+        <w:rPr>
+          <w:b/>
+          <w:bCs/>
+        </w:rPr>
+        <w:t xml:space="preserve">Select the intended membership.</w:t>
+      </w:r>
+      <w:r>
+        <w:t xml:space="preserve"> </w:t>
+      </w:r>
+      <w:r>
+        <w:t xml:space="preserve">A user can have several memberships in the client’s project. Pass</w:t>
+      </w:r>
+      <w:r>
+        <w:t xml:space="preserve"> </w:t>
+      </w:r>
+      <w:r>
+        <w:rPr>
+          <w:rStyle w:val="VerbatimChar"/>
+        </w:rPr>
+        <w:t xml:space="preserve">membership_id</w:t>
+      </w:r>
+      <w:r>
+        <w:t xml:space="preserve"> </w:t>
+      </w:r>
+      <w:r>
+        <w:t xml:space="preserve">when needed; otherwise token exchange selects the first matching membership. Bind token storage and caches to the user, selected membership, and application session so a tenant switch cannot reuse another membership’s token. Cross-project exchange has separate</w:t>
+      </w:r>
+      <w:r>
+        <w:t xml:space="preserve"> </w:t>
+      </w:r>
+      <w:hyperlink r:id="rId26">
+        <w:r>
+          <w:rPr>
+            <w:rStyle w:val="Hyperlink"/>
+          </w:rPr>
+          <w:t xml:space="preserve">server-level configuration requirements</w:t>
+        </w:r>
+      </w:hyperlink>
+      <w:r>
+        <w:t xml:space="preserve">.</w:t>
+      </w:r>
+    </w:p>
+    <w:bookmarkStart w:id="30" w:name="X95de43dca846ce5c7c9b504a509d368c636e063"/>
+    <w:p>
+      <w:pPr>
+        <w:pStyle w:val="Heading4"/>
+      </w:pPr>
+      <w:r>
+        <w:t xml:space="preserve">If you choose token exchange: where will you keep the Medplum token?</w:t>
       </w:r>
     </w:p>
     <w:p>
@@ -1124,26 +1197,29 @@
         <w:pStyle w:val="FirstParagraph"/>
       </w:pPr>
       <w:r>
-        <w:rPr>
+        <w:t xml:space="preserve">Both options below use</w:t>
+      </w:r>
+      <w:r>
+        <w:t xml:space="preserve"> </w:t>
+      </w:r>
+      <w:r>
+        <w:rPr>
+          <w:b/>
           <w:bCs/>
-          <w:b/>
-        </w:rPr>
-        <w:t xml:space="preserve">Other integrations alone do not require token exchange.</w:t>
-      </w:r>
-      <w:r>
-        <w:t xml:space="preserve"> </w:t>
-      </w:r>
-      <w:r>
-        <w:t xml:space="preserve">Integrations running in Bots or your backend with service credentials do not require the client to hold an external token.</w:t>
-      </w:r>
-    </w:p>
-    <w:bookmarkStart w:id="39" w:name="X95de43dca846ce5c7c9b504a509d368c636e063"/>
-    <w:p>
-      <w:pPr>
-        <w:pStyle w:val="Heading4"/>
-      </w:pPr>
-      <w:r>
-        <w:t xml:space="preserve">If you choose token exchange: where will you keep the Medplum token?</w:t>
+        </w:rPr>
+        <w:t xml:space="preserve">user-scoped Medplum tokens</w:t>
+      </w:r>
+      <w:r>
+        <w:t xml:space="preserve">. Choose based on whether the client should call Medplum directly or through your backend.</w:t>
+      </w:r>
+    </w:p>
+    <w:bookmarkStart w:id="27" w:name="b1-in-the-client"/>
+    <w:p>
+      <w:pPr>
+        <w:pStyle w:val="Heading5"/>
+      </w:pPr>
+      <w:r>
+        <w:t xml:space="preserve">B1: In the client</w:t>
       </w:r>
     </w:p>
     <w:p>
@@ -1151,62 +1227,32 @@
         <w:pStyle w:val="FirstParagraph"/>
       </w:pPr>
       <w:r>
-        <w:t xml:space="preserve">Both options below use</w:t>
-      </w:r>
-      <w:r>
-        <w:t xml:space="preserve"> </w:t>
-      </w:r>
-      <w:r>
-        <w:rPr>
-          <w:bCs/>
-          <w:b/>
-        </w:rPr>
-        <w:t xml:space="preserve">user-scoped Medplum tokens</w:t>
-      </w:r>
-      <w:r>
-        <w:t xml:space="preserve">. Choose based on whether the client should call Medplum directly or through your backend.</w:t>
-      </w:r>
-    </w:p>
-    <w:bookmarkStart w:id="36" w:name="b1-in-the-client"/>
-    <w:p>
-      <w:pPr>
-        <w:pStyle w:val="Heading5"/>
-      </w:pPr>
-      <w:r>
-        <w:t xml:space="preserve">B1: In the client</w:t>
-      </w:r>
-    </w:p>
-    <w:p>
-      <w:pPr>
-        <w:pStyle w:val="FirstParagraph"/>
-      </w:pPr>
-      <w:r>
         <w:t xml:space="preserve">The client retains the exchanged Medplum token and calls Medplum directly.</w:t>
       </w:r>
     </w:p>
     <w:p>
       <w:pPr>
+        <w:pStyle w:val="Compact"/>
         <w:numPr>
           <w:ilvl w:val="0"/>
           <w:numId w:val="1017"/>
         </w:numPr>
-        <w:pStyle w:val="Compact"/>
-      </w:pPr>
-      <w:r>
-        <w:rPr>
+      </w:pPr>
+      <w:r>
+        <w:rPr>
+          <w:b/>
           <w:bCs/>
-          <w:b/>
         </w:rPr>
         <w:t xml:space="preserve">Advantages:</w:t>
       </w:r>
     </w:p>
     <w:p>
       <w:pPr>
+        <w:pStyle w:val="Compact"/>
         <w:numPr>
           <w:ilvl w:val="1"/>
           <w:numId w:val="1018"/>
         </w:numPr>
-        <w:pStyle w:val="Compact"/>
       </w:pPr>
       <w:r>
         <w:t xml:space="preserve">Direct SDK, authenticated React component, and WebSocket subscription access.</w:t>
@@ -1214,11 +1260,11 @@
     </w:p>
     <w:p>
       <w:pPr>
+        <w:pStyle w:val="Compact"/>
         <w:numPr>
           <w:ilvl w:val="1"/>
           <w:numId w:val="1018"/>
         </w:numPr>
-        <w:pStyle w:val="Compact"/>
       </w:pPr>
       <w:r>
         <w:t xml:space="preserve">No application proxy for Medplum requests.</w:t>
@@ -1226,27 +1272,27 @@
     </w:p>
     <w:p>
       <w:pPr>
+        <w:pStyle w:val="Compact"/>
         <w:numPr>
           <w:ilvl w:val="0"/>
           <w:numId w:val="1017"/>
         </w:numPr>
-        <w:pStyle w:val="Compact"/>
-      </w:pPr>
-      <w:r>
-        <w:rPr>
+      </w:pPr>
+      <w:r>
+        <w:rPr>
+          <w:b/>
           <w:bCs/>
-          <w:b/>
         </w:rPr>
         <w:t xml:space="preserve">Tradeoffs:</w:t>
       </w:r>
     </w:p>
     <w:p>
       <w:pPr>
+        <w:pStyle w:val="Compact"/>
         <w:numPr>
           <w:ilvl w:val="1"/>
           <w:numId w:val="1019"/>
         </w:numPr>
-        <w:pStyle w:val="Compact"/>
       </w:pPr>
       <w:r>
         <w:t xml:space="preserve">The client manages both credentials, including expiry and logout, with storage appropriate to its platform.</w:t>
@@ -1254,16 +1300,16 @@
     </w:p>
     <w:p>
       <w:pPr>
+        <w:pStyle w:val="Compact"/>
         <w:numPr>
           <w:ilvl w:val="0"/>
           <w:numId w:val="1017"/>
         </w:numPr>
-        <w:pStyle w:val="Compact"/>
-      </w:pPr>
-      <w:r>
-        <w:rPr>
+      </w:pPr>
+      <w:r>
+        <w:rPr>
+          <w:b/>
           <w:bCs/>
-          <w:b/>
         </w:rPr>
         <w:t xml:space="preserve">Best fit:</w:t>
       </w:r>
@@ -1274,8 +1320,8 @@
         <w:t xml:space="preserve">Direct Medplum access is valuable and credentials can reside in the client.</w:t>
       </w:r>
     </w:p>
-    <w:bookmarkEnd w:id="36"/>
-    <w:bookmarkStart w:id="38" w:name="b2-on-the-server"/>
+    <w:bookmarkEnd w:id="27"/>
+    <w:bookmarkStart w:id="29" w:name="b2-on-the-server"/>
     <w:p>
       <w:pPr>
         <w:pStyle w:val="Heading5"/>
@@ -1294,27 +1340,27 @@
     </w:p>
     <w:p>
       <w:pPr>
+        <w:pStyle w:val="Compact"/>
         <w:numPr>
           <w:ilvl w:val="0"/>
           <w:numId w:val="1020"/>
         </w:numPr>
-        <w:pStyle w:val="Compact"/>
-      </w:pPr>
-      <w:r>
-        <w:rPr>
+      </w:pPr>
+      <w:r>
+        <w:rPr>
+          <w:b/>
           <w:bCs/>
-          <w:b/>
         </w:rPr>
         <w:t xml:space="preserve">Advantages:</w:t>
       </w:r>
     </w:p>
     <w:p>
       <w:pPr>
+        <w:pStyle w:val="Compact"/>
         <w:numPr>
           <w:ilvl w:val="1"/>
           <w:numId w:val="1021"/>
         </w:numPr>
-        <w:pStyle w:val="Compact"/>
       </w:pPr>
       <w:r>
         <w:t xml:space="preserve">Medplum credentials stay on the server.</w:t>
@@ -1322,11 +1368,11 @@
     </w:p>
     <w:p>
       <w:pPr>
+        <w:pStyle w:val="Compact"/>
         <w:numPr>
           <w:ilvl w:val="1"/>
           <w:numId w:val="1021"/>
         </w:numPr>
-        <w:pStyle w:val="Compact"/>
       </w:pPr>
       <w:r>
         <w:t xml:space="preserve">Fits an existing backend that coordinates multiple services, while preserving each user’s Medplum access policy.</w:t>
@@ -1334,27 +1380,27 @@
     </w:p>
     <w:p>
       <w:pPr>
+        <w:pStyle w:val="Compact"/>
         <w:numPr>
           <w:ilvl w:val="0"/>
           <w:numId w:val="1020"/>
         </w:numPr>
-        <w:pStyle w:val="Compact"/>
-      </w:pPr>
-      <w:r>
-        <w:rPr>
+      </w:pPr>
+      <w:r>
+        <w:rPr>
+          <w:b/>
           <w:bCs/>
-          <w:b/>
         </w:rPr>
         <w:t xml:space="preserve">Tradeoffs:</w:t>
       </w:r>
     </w:p>
     <w:p>
       <w:pPr>
+        <w:pStyle w:val="Compact"/>
         <w:numPr>
           <w:ilvl w:val="1"/>
           <w:numId w:val="1022"/>
         </w:numPr>
-        <w:pStyle w:val="Compact"/>
       </w:pPr>
       <w:r>
         <w:t xml:space="preserve">Your backend manages per-user tokens, renewal, and logout.</w:t>
@@ -1362,11 +1408,11 @@
     </w:p>
     <w:p>
       <w:pPr>
+        <w:pStyle w:val="Compact"/>
         <w:numPr>
           <w:ilvl w:val="1"/>
           <w:numId w:val="1022"/>
         </w:numPr>
-        <w:pStyle w:val="Compact"/>
       </w:pPr>
       <w:r>
         <w:t xml:space="preserve">Proxying adds latency and infrastructure to operate.</w:t>
@@ -1374,11 +1420,11 @@
     </w:p>
     <w:p>
       <w:pPr>
+        <w:pStyle w:val="Compact"/>
         <w:numPr>
           <w:ilvl w:val="1"/>
           <w:numId w:val="1022"/>
         </w:numPr>
-        <w:pStyle w:val="Compact"/>
       </w:pPr>
       <w:r>
         <w:t xml:space="preserve">Live updates need a backend-to-client delivery path; components expecting direct Medplum access need adaptation.</w:t>
@@ -1386,16 +1432,16 @@
     </w:p>
     <w:p>
       <w:pPr>
+        <w:pStyle w:val="Compact"/>
         <w:numPr>
           <w:ilvl w:val="0"/>
           <w:numId w:val="1020"/>
         </w:numPr>
-        <w:pStyle w:val="Compact"/>
-      </w:pPr>
-      <w:r>
-        <w:rPr>
+      </w:pPr>
+      <w:r>
+        <w:rPr>
+          <w:b/>
           <w:bCs/>
-          <w:b/>
         </w:rPr>
         <w:t xml:space="preserve">Best fit:</w:t>
       </w:r>
@@ -1416,7 +1462,7 @@
       <w:r>
         <w:t xml:space="preserve"> </w:t>
       </w:r>
-      <w:hyperlink r:id="rId37">
+      <w:hyperlink r:id="rId28">
         <w:r>
           <w:rPr>
             <w:rStyle w:val="Hyperlink"/>
@@ -1428,10 +1474,10 @@
         <w:t xml:space="preserve">.</w:t>
       </w:r>
     </w:p>
-    <w:bookmarkEnd w:id="38"/>
-    <w:bookmarkEnd w:id="39"/>
-    <w:bookmarkEnd w:id="40"/>
-    <w:bookmarkStart w:id="42" w:name="Xa8cebc728b0703db1ecaf2949140c77970671c8"/>
+    <w:bookmarkEnd w:id="29"/>
+    <w:bookmarkEnd w:id="30"/>
+    <w:bookmarkEnd w:id="31"/>
+    <w:bookmarkStart w:id="33" w:name="Xa8cebc728b0703db1ecaf2949140c77970671c8"/>
     <w:p>
       <w:pPr>
         <w:pStyle w:val="Heading3"/>
@@ -1459,27 +1505,27 @@
     </w:p>
     <w:p>
       <w:pPr>
+        <w:pStyle w:val="Compact"/>
         <w:numPr>
           <w:ilvl w:val="0"/>
           <w:numId w:val="1023"/>
         </w:numPr>
-        <w:pStyle w:val="Compact"/>
-      </w:pPr>
-      <w:r>
-        <w:rPr>
+      </w:pPr>
+      <w:r>
+        <w:rPr>
+          <w:b/>
           <w:bCs/>
-          <w:b/>
         </w:rPr>
         <w:t xml:space="preserve">Advantages:</w:t>
       </w:r>
     </w:p>
     <w:p>
       <w:pPr>
+        <w:pStyle w:val="Compact"/>
         <w:numPr>
           <w:ilvl w:val="1"/>
           <w:numId w:val="1024"/>
         </w:numPr>
-        <w:pStyle w:val="Compact"/>
       </w:pPr>
       <w:r>
         <w:t xml:space="preserve">Supports a backend that owns authentication without requiring external user tokens that Medplum can exchange.</w:t>
@@ -1487,11 +1533,11 @@
     </w:p>
     <w:p>
       <w:pPr>
+        <w:pStyle w:val="Compact"/>
         <w:numPr>
           <w:ilvl w:val="1"/>
           <w:numId w:val="1024"/>
         </w:numPr>
-        <w:pStyle w:val="Compact"/>
       </w:pPr>
       <w:r>
         <w:t xml:space="preserve">Preserves user-level access policies and attribution with one application credential.</w:t>
@@ -1499,51 +1545,78 @@
     </w:p>
     <w:p>
       <w:pPr>
+        <w:pStyle w:val="Compact"/>
         <w:numPr>
           <w:ilvl w:val="0"/>
           <w:numId w:val="1023"/>
         </w:numPr>
-        <w:pStyle w:val="Compact"/>
-      </w:pPr>
-      <w:r>
-        <w:rPr>
+      </w:pPr>
+      <w:r>
+        <w:rPr>
+          <w:b/>
           <w:bCs/>
-          <w:b/>
         </w:rPr>
         <w:t xml:space="preserve">Tradeoffs:</w:t>
       </w:r>
     </w:p>
     <w:p>
       <w:pPr>
+        <w:pStyle w:val="Compact"/>
         <w:numPr>
           <w:ilvl w:val="1"/>
           <w:numId w:val="1025"/>
         </w:numPr>
-        <w:pStyle w:val="Compact"/>
-      </w:pPr>
-      <w:r>
-        <w:t xml:space="preserve">Your backend must maintain user mappings and apply the correct user context to every request.</w:t>
-      </w:r>
-    </w:p>
-    <w:p>
-      <w:pPr>
+      </w:pPr>
+      <w:r>
+        <w:t xml:space="preserve">The backend’s</w:t>
+      </w:r>
+      <w:r>
+        <w:t xml:space="preserve"> </w:t>
+      </w:r>
+      <w:r>
+        <w:rPr>
+          <w:rStyle w:val="VerbatimChar"/>
+        </w:rPr>
+        <w:t xml:space="preserve">ClientApplication</w:t>
+      </w:r>
+      <w:r>
+        <w:t xml:space="preserve"> </w:t>
+      </w:r>
+      <w:r>
+        <w:t xml:space="preserve">requires Project Admin authority. Treat its credential as privileged.</w:t>
+      </w:r>
+    </w:p>
+    <w:p>
+      <w:pPr>
+        <w:pStyle w:val="Compact"/>
         <w:numPr>
           <w:ilvl w:val="1"/>
           <w:numId w:val="1025"/>
         </w:numPr>
-        <w:pStyle w:val="Compact"/>
-      </w:pPr>
-      <w:r>
-        <w:t xml:space="preserve">Proxying adds latency and infrastructure to operate.</w:t>
-      </w:r>
-    </w:p>
-    <w:p>
-      <w:pPr>
+      </w:pPr>
+      <w:r>
+        <w:t xml:space="preserve">Your backend must authorize each requested user context and reject missing or unauthorized contexts before calling Medplum; a request without the On-Behalf-Of header uses the application’s own permissions.</w:t>
+      </w:r>
+    </w:p>
+    <w:p>
+      <w:pPr>
+        <w:pStyle w:val="Compact"/>
         <w:numPr>
           <w:ilvl w:val="1"/>
           <w:numId w:val="1025"/>
         </w:numPr>
-        <w:pStyle w:val="Compact"/>
+      </w:pPr>
+      <w:r>
+        <w:t xml:space="preserve">Proxying adds latency and infrastructure to operate.</w:t>
+      </w:r>
+    </w:p>
+    <w:p>
+      <w:pPr>
+        <w:pStyle w:val="Compact"/>
+        <w:numPr>
+          <w:ilvl w:val="1"/>
+          <w:numId w:val="1025"/>
+        </w:numPr>
       </w:pPr>
       <w:r>
         <w:t xml:space="preserve">Medplum WebSocket subscriptions do not support this On-Behalf-Of pattern.</w:t>
@@ -1551,16 +1624,16 @@
     </w:p>
     <w:p>
       <w:pPr>
+        <w:pStyle w:val="Compact"/>
         <w:numPr>
           <w:ilvl w:val="0"/>
           <w:numId w:val="1023"/>
         </w:numPr>
-        <w:pStyle w:val="Compact"/>
-      </w:pPr>
-      <w:r>
-        <w:rPr>
+      </w:pPr>
+      <w:r>
+        <w:rPr>
+          <w:b/>
           <w:bCs/>
-          <w:b/>
         </w:rPr>
         <w:t xml:space="preserve">Best fit:</w:t>
       </w:r>
@@ -1589,7 +1662,7 @@
       <w:r>
         <w:t xml:space="preserve"> </w:t>
       </w:r>
-      <w:hyperlink r:id="rId41">
+      <w:hyperlink r:id="rId32">
         <w:r>
           <w:rPr>
             <w:rStyle w:val="Hyperlink"/>
@@ -1607,8 +1680,8 @@
       </w:pPr>
       <w:r>
         <w:rPr>
+          <w:b/>
           <w:bCs/>
-          <w:b/>
         </w:rPr>
         <w:t xml:space="preserve">Next:</w:t>
       </w:r>
@@ -1633,9 +1706,9 @@
         <w:t xml:space="preserve">.</w:t>
       </w:r>
     </w:p>
-    <w:bookmarkEnd w:id="42"/>
-    <w:bookmarkEnd w:id="43"/>
-    <w:bookmarkStart w:id="50" w:name="Xa2fe8c07881eb9416283f05100480535a9d42e6"/>
+    <w:bookmarkEnd w:id="33"/>
+    <w:bookmarkEnd w:id="34"/>
+    <w:bookmarkStart w:id="41" w:name="Xa2fe8c07881eb9416283f05100480535a9d42e6"/>
     <w:p>
       <w:pPr>
         <w:pStyle w:val="Heading2"/>
@@ -1650,8 +1723,8 @@
       </w:pPr>
       <w:r>
         <w:rPr>
+          <w:b/>
           <w:bCs/>
-          <w:b/>
         </w:rPr>
         <w:t xml:space="preserve">For external IDP authorization-code flow or token exchange.</w:t>
       </w:r>
@@ -1662,7 +1735,7 @@
         <w:t xml:space="preserve">Choose which identifier connects the external login to the correct Medplum account.</w:t>
       </w:r>
     </w:p>
-    <w:bookmarkStart w:id="44" w:name="option-a-email-matching"/>
+    <w:bookmarkStart w:id="35" w:name="option-a-email-matching"/>
     <w:p>
       <w:pPr>
         <w:pStyle w:val="Heading3"/>
@@ -1681,27 +1754,27 @@
     </w:p>
     <w:p>
       <w:pPr>
+        <w:pStyle w:val="Compact"/>
         <w:numPr>
           <w:ilvl w:val="0"/>
           <w:numId w:val="1026"/>
         </w:numPr>
-        <w:pStyle w:val="Compact"/>
-      </w:pPr>
-      <w:r>
-        <w:rPr>
+      </w:pPr>
+      <w:r>
+        <w:rPr>
+          <w:b/>
           <w:bCs/>
-          <w:b/>
         </w:rPr>
         <w:t xml:space="preserve">Advantages:</w:t>
       </w:r>
     </w:p>
     <w:p>
       <w:pPr>
+        <w:pStyle w:val="Compact"/>
         <w:numPr>
           <w:ilvl w:val="1"/>
           <w:numId w:val="1027"/>
         </w:numPr>
-        <w:pStyle w:val="Compact"/>
       </w:pPr>
       <w:r>
         <w:t xml:space="preserve">Simple when each person has a distinct email and changes are infrequent.</w:t>
@@ -1709,27 +1782,27 @@
     </w:p>
     <w:p>
       <w:pPr>
+        <w:pStyle w:val="Compact"/>
         <w:numPr>
           <w:ilvl w:val="0"/>
           <w:numId w:val="1026"/>
         </w:numPr>
-        <w:pStyle w:val="Compact"/>
-      </w:pPr>
-      <w:r>
-        <w:rPr>
+      </w:pPr>
+      <w:r>
+        <w:rPr>
+          <w:b/>
           <w:bCs/>
-          <w:b/>
         </w:rPr>
         <w:t xml:space="preserve">Tradeoffs:</w:t>
       </w:r>
     </w:p>
     <w:p>
       <w:pPr>
+        <w:pStyle w:val="Compact"/>
         <w:numPr>
           <w:ilvl w:val="1"/>
           <w:numId w:val="1028"/>
         </w:numPr>
-        <w:pStyle w:val="Compact"/>
       </w:pPr>
       <w:r>
         <w:t xml:space="preserve">Email changes require updating the Medplum login account, not just the clinical profile’s contact email.</w:t>
@@ -1737,11 +1810,11 @@
     </w:p>
     <w:p>
       <w:pPr>
+        <w:pStyle w:val="Compact"/>
         <w:numPr>
           <w:ilvl w:val="1"/>
           <w:numId w:val="1028"/>
         </w:numPr>
-        <w:pStyle w:val="Compact"/>
       </w:pPr>
       <w:r>
         <w:t xml:space="preserve">Shared email addresses cannot distinguish separate people.</w:t>
@@ -1749,16 +1822,16 @@
     </w:p>
     <w:p>
       <w:pPr>
+        <w:pStyle w:val="Compact"/>
         <w:numPr>
           <w:ilvl w:val="0"/>
           <w:numId w:val="1026"/>
         </w:numPr>
-        <w:pStyle w:val="Compact"/>
-      </w:pPr>
-      <w:r>
-        <w:rPr>
+      </w:pPr>
+      <w:r>
+        <w:rPr>
+          <w:b/>
           <w:bCs/>
-          <w:b/>
         </w:rPr>
         <w:t xml:space="preserve">Best fit:</w:t>
       </w:r>
@@ -1769,8 +1842,8 @@
         <w:t xml:space="preserve">Distinct emails and manageable account updates. An external IDP alone is not a reason to change the matching key.</w:t>
       </w:r>
     </w:p>
-    <w:bookmarkEnd w:id="44"/>
-    <w:bookmarkStart w:id="49" w:name="option-b-external-id-matching"/>
+    <w:bookmarkEnd w:id="35"/>
+    <w:bookmarkStart w:id="40" w:name="option-b-external-id-matching"/>
     <w:p>
       <w:pPr>
         <w:pStyle w:val="Heading3"/>
@@ -1804,7 +1877,7 @@
       <w:r>
         <w:t xml:space="preserve"> </w:t>
       </w:r>
-      <w:hyperlink r:id="rId45">
+      <w:hyperlink r:id="rId36">
         <w:r>
           <w:rPr>
             <w:rStyle w:val="Hyperlink"/>
@@ -1818,27 +1891,62 @@
     </w:p>
     <w:p>
       <w:pPr>
+        <w:pStyle w:val="BodyText"/>
+      </w:pPr>
+      <w:r>
+        <w:t xml:space="preserve">For token exchange with</w:t>
+      </w:r>
+      <w:r>
+        <w:t xml:space="preserve"> </w:t>
+      </w:r>
+      <w:r>
+        <w:rPr>
+          <w:rStyle w:val="VerbatimChar"/>
+        </w:rPr>
+        <w:t xml:space="preserve">useSubject</w:t>
+      </w:r>
+      <w:r>
+        <w:t xml:space="preserve">, provision the complete</w:t>
+      </w:r>
+      <w:r>
+        <w:t xml:space="preserve"> </w:t>
+      </w:r>
+      <w:r>
+        <w:rPr>
+          <w:rStyle w:val="VerbatimChar"/>
+        </w:rPr>
+        <w:t xml:space="preserve">sub</w:t>
+      </w:r>
+      <w:r>
+        <w:t xml:space="preserve"> </w:t>
+      </w:r>
+      <w:r>
+        <w:t xml:space="preserve">value, including any provider prefix. Do not strip an Auth0 prefix or otherwise transform it independently of the login flow.</w:t>
+      </w:r>
+    </w:p>
+    <w:p>
+      <w:pPr>
+        <w:pStyle w:val="Compact"/>
         <w:numPr>
           <w:ilvl w:val="0"/>
           <w:numId w:val="1029"/>
         </w:numPr>
-        <w:pStyle w:val="Compact"/>
-      </w:pPr>
-      <w:r>
-        <w:rPr>
+      </w:pPr>
+      <w:r>
+        <w:rPr>
+          <w:b/>
           <w:bCs/>
-          <w:b/>
         </w:rPr>
         <w:t xml:space="preserve">Advantages:</w:t>
       </w:r>
     </w:p>
     <w:p>
       <w:pPr>
+        <w:pStyle w:val="Compact"/>
         <w:numPr>
           <w:ilvl w:val="1"/>
           <w:numId w:val="1030"/>
         </w:numPr>
-        <w:pStyle w:val="Compact"/>
       </w:pPr>
       <w:r>
         <w:t xml:space="preserve">Identity remains stable when contact email changes.</w:t>
@@ -1846,11 +1954,11 @@
     </w:p>
     <w:p>
       <w:pPr>
+        <w:pStyle w:val="Compact"/>
         <w:numPr>
           <w:ilvl w:val="1"/>
           <w:numId w:val="1030"/>
         </w:numPr>
-        <w:pStyle w:val="Compact"/>
       </w:pPr>
       <w:r>
         <w:t xml:space="preserve">Separate people can have distinct identities even if they share a contact email.</w:t>
@@ -1858,27 +1966,27 @@
     </w:p>
     <w:p>
       <w:pPr>
+        <w:pStyle w:val="Compact"/>
         <w:numPr>
           <w:ilvl w:val="0"/>
           <w:numId w:val="1029"/>
         </w:numPr>
-        <w:pStyle w:val="Compact"/>
-      </w:pPr>
-      <w:r>
-        <w:rPr>
+      </w:pPr>
+      <w:r>
+        <w:rPr>
+          <w:b/>
           <w:bCs/>
-          <w:b/>
         </w:rPr>
         <w:t xml:space="preserve">Tradeoffs:</w:t>
       </w:r>
     </w:p>
     <w:p>
       <w:pPr>
+        <w:pStyle w:val="Compact"/>
         <w:numPr>
           <w:ilvl w:val="1"/>
           <w:numId w:val="1031"/>
         </w:numPr>
-        <w:pStyle w:val="Compact"/>
       </w:pPr>
       <w:r>
         <w:t xml:space="preserve">Provisioning and login must agree on the identifier; changing IDPs requires a migration plan.</w:t>
@@ -1886,16 +1994,16 @@
     </w:p>
     <w:p>
       <w:pPr>
+        <w:pStyle w:val="Compact"/>
         <w:numPr>
           <w:ilvl w:val="0"/>
           <w:numId w:val="1029"/>
         </w:numPr>
-        <w:pStyle w:val="Compact"/>
-      </w:pPr>
-      <w:r>
-        <w:rPr>
+      </w:pPr>
+      <w:r>
+        <w:rPr>
+          <w:b/>
           <w:bCs/>
-          <w:b/>
         </w:rPr>
         <w:t xml:space="preserve">Best fit:</w:t>
       </w:r>
@@ -1916,7 +2024,7 @@
       <w:r>
         <w:t xml:space="preserve"> </w:t>
       </w:r>
-      <w:hyperlink r:id="rId46">
+      <w:hyperlink r:id="rId37">
         <w:r>
           <w:rPr>
             <w:rStyle w:val="Hyperlink"/>
@@ -1941,7 +2049,7 @@
       <w:r>
         <w:t xml:space="preserve"> </w:t>
       </w:r>
-      <w:hyperlink r:id="rId47">
+      <w:hyperlink r:id="rId38">
         <w:r>
           <w:rPr>
             <w:rStyle w:val="Hyperlink"/>
@@ -1955,7 +2063,7 @@
       <w:r>
         <w:t xml:space="preserve"> </w:t>
       </w:r>
-      <w:hyperlink r:id="rId48">
+      <w:hyperlink r:id="rId39">
         <w:r>
           <w:rPr>
             <w:rStyle w:val="Hyperlink"/>
@@ -1967,9 +2075,9 @@
         <w:t xml:space="preserve">.</w:t>
       </w:r>
     </w:p>
-    <w:bookmarkEnd w:id="49"/>
-    <w:bookmarkEnd w:id="50"/>
-    <w:bookmarkStart w:id="58" w:name="before-you-implement"/>
+    <w:bookmarkEnd w:id="40"/>
+    <w:bookmarkEnd w:id="41"/>
+    <w:bookmarkStart w:id="50" w:name="before-you-implement"/>
     <w:p>
       <w:pPr>
         <w:pStyle w:val="Heading2"/>
@@ -1978,7 +2086,7 @@
         <w:t xml:space="preserve">Before You Implement</w:t>
       </w:r>
     </w:p>
-    <w:bookmarkStart w:id="53" w:name="how-will-users-join-your-application"/>
+    <w:bookmarkStart w:id="44" w:name="how-will-users-join-your-application"/>
     <w:p>
       <w:pPr>
         <w:pStyle w:val="Heading3"/>
@@ -2057,7 +2165,7 @@
       <w:r>
         <w:t xml:space="preserve"> </w:t>
       </w:r>
-      <w:hyperlink r:id="rId45">
+      <w:hyperlink r:id="rId36">
         <w:r>
           <w:rPr>
             <w:rStyle w:val="Hyperlink"/>
@@ -2074,7 +2182,7 @@
       <w:r>
         <w:t xml:space="preserve"> </w:t>
       </w:r>
-      <w:hyperlink r:id="rId46">
+      <w:hyperlink r:id="rId37">
         <w:r>
           <w:rPr>
             <w:rStyle w:val="Hyperlink"/>
@@ -2091,7 +2199,7 @@
       <w:r>
         <w:t xml:space="preserve"> </w:t>
       </w:r>
-      <w:hyperlink r:id="rId51">
+      <w:hyperlink r:id="rId42">
         <w:r>
           <w:rPr>
             <w:rStyle w:val="Hyperlink"/>
@@ -2113,7 +2221,7 @@
       <w:r>
         <w:t xml:space="preserve"> </w:t>
       </w:r>
-      <w:hyperlink r:id="rId52">
+      <w:hyperlink r:id="rId43">
         <w:r>
           <w:rPr>
             <w:rStyle w:val="Hyperlink"/>
@@ -2128,8 +2236,8 @@
         <w:t xml:space="preserve">based on whether identities belong to one project or need access across projects. For patient and caregiver applications, give each person their own identity and explicitly grant access to the appropriate records.</w:t>
       </w:r>
     </w:p>
-    <w:bookmarkEnd w:id="53"/>
-    <w:bookmarkStart w:id="57" w:name="who-manages-mfa-recovery-and-logout"/>
+    <w:bookmarkEnd w:id="44"/>
+    <w:bookmarkStart w:id="49" w:name="who-manages-mfa-recovery-and-logout"/>
     <w:p>
       <w:pPr>
         <w:pStyle w:val="Heading3"/>
@@ -2151,12 +2259,37 @@
         <w:pStyle w:val="BodyText"/>
       </w:pPr>
       <w:r>
+        <w:t xml:space="preserve">Medplum’s</w:t>
+      </w:r>
+      <w:r>
+        <w:t xml:space="preserve"> </w:t>
+      </w:r>
+      <w:hyperlink r:id="rId45">
+        <w:r>
+          <w:rPr>
+            <w:rStyle w:val="Hyperlink"/>
+          </w:rPr>
+          <w:t xml:space="preserve">MFA settings flows</w:t>
+        </w:r>
+      </w:hyperlink>
+      <w:r>
+        <w:t xml:space="preserve"> </w:t>
+      </w:r>
+      <w:r>
+        <w:t xml:space="preserve">require an authenticated human user without SMART resource scopes and do not accept On-Behalf-Of. If the app uses SMART-scoped clinical access, plan a supported user authentication context for account settings. Test both flows separately.</w:t>
+      </w:r>
+    </w:p>
+    <w:p>
+      <w:pPr>
+        <w:pStyle w:val="BodyText"/>
+      </w:pPr>
+      <w:r>
         <w:t xml:space="preserve">Implementation:</w:t>
       </w:r>
       <w:r>
         <w:t xml:space="preserve"> </w:t>
       </w:r>
-      <w:hyperlink r:id="rId54">
+      <w:hyperlink r:id="rId46">
         <w:r>
           <w:rPr>
             <w:rStyle w:val="Hyperlink"/>
@@ -2170,7 +2303,7 @@
       <w:r>
         <w:t xml:space="preserve"> </w:t>
       </w:r>
-      <w:hyperlink r:id="rId55">
+      <w:hyperlink r:id="rId47">
         <w:r>
           <w:rPr>
             <w:rStyle w:val="Hyperlink"/>
@@ -2184,7 +2317,7 @@
       <w:r>
         <w:t xml:space="preserve"> </w:t>
       </w:r>
-      <w:hyperlink r:id="rId56">
+      <w:hyperlink r:id="rId48">
         <w:r>
           <w:rPr>
             <w:rStyle w:val="Hyperlink"/>
@@ -2204,9 +2337,9 @@
         <w:t xml:space="preserve">Record your choices for each population. Test sign-in, account changes, recovery, token expiry, logout, and offboarding. If your backend mediates access, also verify that requests use the correct user’s context and fail when that context is missing.</w:t>
       </w:r>
     </w:p>
-    <w:bookmarkEnd w:id="57"/>
-    <w:bookmarkEnd w:id="58"/>
-    <w:bookmarkEnd w:id="59"/>
+    <w:bookmarkEnd w:id="49"/>
+    <w:bookmarkEnd w:id="50"/>
+    <w:bookmarkEnd w:id="51"/>
     <w:sectPr>
       <w:pgSz w:h="15840" w:w="12240"/>
       <w:pgMar w:bottom="1440" w:footer="720" w:gutter="0" w:header="720" w:left="1440" w:right="1440" w:top="1440"/>
@@ -2244,14 +2377,14 @@
 <file path=word/numbering.xml><?xml version="1.0" encoding="utf-8"?>
 <w:numbering xmlns:w="http://schemas.openxmlformats.org/wordprocessingml/2006/main">
   <w:abstractNum w:abstractNumId="990">
-    <w:nsid w:val="A990"/>
+    <w:nsid w:val="0000A990"/>
     <w:multiLevelType w:val="multilevel"/>
     <w:lvl w:ilvl="0">
       <w:numFmt w:val="bullet"/>
       <w:lvlText w:val=" "/>
       <w:lvlJc w:val="left"/>
       <w:pPr>
-        <w:ind w:left="720" w:hanging="480"/>
+        <w:ind w:left="720" w:hanging="360"/>
       </w:pPr>
     </w:lvl>
     <w:lvl w:ilvl="1">
@@ -2259,7 +2392,7 @@
       <w:lvlText w:val=" "/>
       <w:lvlJc w:val="left"/>
       <w:pPr>
-        <w:ind w:left="1440" w:hanging="480"/>
+        <w:ind w:left="1440" w:hanging="360"/>
       </w:pPr>
     </w:lvl>
     <w:lvl w:ilvl="2">
@@ -2267,7 +2400,7 @@
       <w:lvlText w:val=" "/>
       <w:lvlJc w:val="left"/>
       <w:pPr>
-        <w:ind w:left="2160" w:hanging="480"/>
+        <w:ind w:left="2160" w:hanging="360"/>
       </w:pPr>
     </w:lvl>
     <w:lvl w:ilvl="3">
@@ -2275,7 +2408,7 @@
       <w:lvlText w:val=" "/>
       <w:lvlJc w:val="left"/>
       <w:pPr>
-        <w:ind w:left="2880" w:hanging="480"/>
+        <w:ind w:left="2880" w:hanging="360"/>
       </w:pPr>
     </w:lvl>
     <w:lvl w:ilvl="4">
@@ -2283,7 +2416,7 @@
       <w:lvlText w:val=" "/>
       <w:lvlJc w:val="left"/>
       <w:pPr>
-        <w:ind w:left="3600" w:hanging="480"/>
+        <w:ind w:left="3600" w:hanging="360"/>
       </w:pPr>
     </w:lvl>
     <w:lvl w:ilvl="5">
@@ -2291,7 +2424,7 @@
       <w:lvlText w:val=" "/>
       <w:lvlJc w:val="left"/>
       <w:pPr>
-        <w:ind w:left="4320" w:hanging="480"/>
+        <w:ind w:left="4320" w:hanging="360"/>
       </w:pPr>
     </w:lvl>
     <w:lvl w:ilvl="6">
@@ -2299,7 +2432,7 @@
       <w:lvlText w:val=" "/>
       <w:lvlJc w:val="left"/>
       <w:pPr>
-        <w:ind w:left="5040" w:hanging="480"/>
+        <w:ind w:left="5040" w:hanging="360"/>
       </w:pPr>
     </w:lvl>
     <w:lvl w:ilvl="7">
@@ -2307,7 +2440,7 @@
       <w:lvlText w:val=" "/>
       <w:lvlJc w:val="left"/>
       <w:pPr>
-        <w:ind w:left="5760" w:hanging="480"/>
+        <w:ind w:left="5760" w:hanging="360"/>
       </w:pPr>
     </w:lvl>
     <w:lvl w:ilvl="8">
@@ -2315,12 +2448,12 @@
       <w:lvlText w:val=" "/>
       <w:lvlJc w:val="left"/>
       <w:pPr>
-        <w:ind w:left="6480" w:hanging="480"/>
+        <w:ind w:left="6480" w:hanging="360"/>
       </w:pPr>
     </w:lvl>
   </w:abstractNum>
   <w:abstractNum w:abstractNumId="99411">
-    <w:nsid w:val="A99411"/>
+    <w:nsid w:val="00A99411"/>
     <w:multiLevelType w:val="multilevel"/>
     <w:lvl w:ilvl="0">
       <w:start w:val="1"/>
@@ -2328,7 +2461,7 @@
       <w:lvlText w:val="%1."/>
       <w:lvlJc w:val="left"/>
       <w:pPr>
-        <w:ind w:left="720" w:hanging="480"/>
+        <w:ind w:left="720" w:hanging="360"/>
       </w:pPr>
     </w:lvl>
     <w:lvl w:ilvl="1">
@@ -2337,7 +2470,7 @@
       <w:lvlText w:val="%2."/>
       <w:lvlJc w:val="left"/>
       <w:pPr>
-        <w:ind w:left="1440" w:hanging="480"/>
+        <w:ind w:left="1440" w:hanging="360"/>
       </w:pPr>
     </w:lvl>
     <w:lvl w:ilvl="2">
@@ -2346,7 +2479,7 @@
       <w:lvlText w:val="%3."/>
       <w:lvlJc w:val="left"/>
       <w:pPr>
-        <w:ind w:left="2160" w:hanging="480"/>
+        <w:ind w:left="2160" w:hanging="360"/>
       </w:pPr>
     </w:lvl>
     <w:lvl w:ilvl="3">
@@ -2355,7 +2488,7 @@
       <w:lvlText w:val="%4."/>
       <w:lvlJc w:val="left"/>
       <w:pPr>
-        <w:ind w:left="2880" w:hanging="480"/>
+        <w:ind w:left="2880" w:hanging="360"/>
       </w:pPr>
     </w:lvl>
     <w:lvl w:ilvl="4">
@@ -2364,7 +2497,7 @@
       <w:lvlText w:val="%5."/>
       <w:lvlJc w:val="left"/>
       <w:pPr>
-        <w:ind w:left="3600" w:hanging="480"/>
+        <w:ind w:left="3600" w:hanging="360"/>
       </w:pPr>
     </w:lvl>
     <w:lvl w:ilvl="5">
@@ -2373,7 +2506,7 @@
       <w:lvlText w:val="%6."/>
       <w:lvlJc w:val="left"/>
       <w:pPr>
-        <w:ind w:left="4320" w:hanging="480"/>
+        <w:ind w:left="4320" w:hanging="360"/>
       </w:pPr>
     </w:lvl>
     <w:lvl w:ilvl="6">
@@ -2382,7 +2515,7 @@
       <w:lvlText w:val="%7."/>
       <w:lvlJc w:val="left"/>
       <w:pPr>
-        <w:ind w:left="5040" w:hanging="480"/>
+        <w:ind w:left="5040" w:hanging="360"/>
       </w:pPr>
     </w:lvl>
     <w:lvl w:ilvl="7">
@@ -2391,7 +2524,7 @@
       <w:lvlText w:val="%8."/>
       <w:lvlJc w:val="left"/>
       <w:pPr>
-        <w:ind w:left="5760" w:hanging="480"/>
+        <w:ind w:left="5760" w:hanging="360"/>
       </w:pPr>
     </w:lvl>
     <w:lvl w:ilvl="8">
@@ -2400,84 +2533,111 @@
       <w:lvlText w:val="%9."/>
       <w:lvlJc w:val="left"/>
       <w:pPr>
-        <w:ind w:left="6480" w:hanging="480"/>
+        <w:ind w:left="6480" w:hanging="360"/>
       </w:pPr>
     </w:lvl>
   </w:abstractNum>
   <w:abstractNum w:abstractNumId="991">
-    <w:nsid w:val="A991"/>
+    <w:nsid w:val="0000A991"/>
     <w:multiLevelType w:val="multilevel"/>
     <w:lvl w:ilvl="0">
       <w:numFmt w:val="bullet"/>
-      <w:lvlText w:val="•"/>
+      <w:lvlText w:val=""/>
       <w:lvlJc w:val="left"/>
       <w:pPr>
-        <w:ind w:left="720" w:hanging="480"/>
-      </w:pPr>
+        <w:ind w:left="720" w:hanging="360"/>
+      </w:pPr>
+      <w:rPr>
+        <w:rFonts w:ascii="Symbol" w:hAnsi="Symbol" w:cs="Symbol" w:hint="default"/>
+      </w:rPr>
     </w:lvl>
     <w:lvl w:ilvl="1">
       <w:numFmt w:val="bullet"/>
-      <w:lvlText w:val="–"/>
+      <w:lvlText w:val="o"/>
       <w:lvlJc w:val="left"/>
       <w:pPr>
-        <w:ind w:left="1440" w:hanging="480"/>
-      </w:pPr>
+        <w:ind w:left="1440" w:hanging="360"/>
+      </w:pPr>
+      <w:rPr>
+        <w:rFonts w:ascii="Courier New" w:hAnsi="Courier New" w:cs="Courier New" w:hint="default"/>
+      </w:rPr>
     </w:lvl>
     <w:lvl w:ilvl="2">
       <w:numFmt w:val="bullet"/>
-      <w:lvlText w:val="•"/>
+      <w:lvlText w:val=""/>
       <w:lvlJc w:val="left"/>
       <w:pPr>
-        <w:ind w:left="2160" w:hanging="480"/>
-      </w:pPr>
+        <w:ind w:left="2160" w:hanging="360"/>
+      </w:pPr>
+      <w:rPr>
+        <w:rFonts w:ascii="Wingdings" w:hAnsi="Wingdings" w:cs="Wingdings" w:hint="default"/>
+      </w:rPr>
     </w:lvl>
     <w:lvl w:ilvl="3">
       <w:numFmt w:val="bullet"/>
-      <w:lvlText w:val="–"/>
+      <w:lvlText w:val=""/>
       <w:lvlJc w:val="left"/>
       <w:pPr>
-        <w:ind w:left="2880" w:hanging="480"/>
-      </w:pPr>
+        <w:ind w:left="2880" w:hanging="360"/>
+      </w:pPr>
+      <w:rPr>
+        <w:rFonts w:ascii="Symbol" w:hAnsi="Symbol" w:cs="Symbol" w:hint="default"/>
+      </w:rPr>
     </w:lvl>
     <w:lvl w:ilvl="4">
       <w:numFmt w:val="bullet"/>
-      <w:lvlText w:val="•"/>
+      <w:lvlText w:val="o"/>
       <w:lvlJc w:val="left"/>
       <w:pPr>
-        <w:ind w:left="3600" w:hanging="480"/>
-      </w:pPr>
+        <w:ind w:left="3600" w:hanging="360"/>
+      </w:pPr>
+      <w:rPr>
+        <w:rFonts w:ascii="Courier New" w:hAnsi="Courier New" w:cs="Courier New" w:hint="default"/>
+      </w:rPr>
     </w:lvl>
     <w:lvl w:ilvl="5">
       <w:numFmt w:val="bullet"/>
-      <w:lvlText w:val="–"/>
+      <w:lvlText w:val=""/>
       <w:lvlJc w:val="left"/>
       <w:pPr>
-        <w:ind w:left="4320" w:hanging="480"/>
-      </w:pPr>
+        <w:ind w:left="4320" w:hanging="360"/>
+      </w:pPr>
+      <w:rPr>
+        <w:rFonts w:ascii="Wingdings" w:hAnsi="Wingdings" w:cs="Wingdings" w:hint="default"/>
+      </w:rPr>
     </w:lvl>
     <w:lvl w:ilvl="6">
       <w:numFmt w:val="bullet"/>
-      <w:lvlText w:val="•"/>
+      <w:lvlText w:val=""/>
       <w:lvlJc w:val="left"/>
       <w:pPr>
-        <w:ind w:left="5040" w:hanging="480"/>
-      </w:pPr>
+        <w:ind w:left="5040" w:hanging="360"/>
+      </w:pPr>
+      <w:rPr>
+        <w:rFonts w:ascii="Symbol" w:hAnsi="Symbol" w:cs="Symbol" w:hint="default"/>
+      </w:rPr>
     </w:lvl>
     <w:lvl w:ilvl="7">
       <w:numFmt w:val="bullet"/>
-      <w:lvlText w:val="–"/>
+      <w:lvlText w:val="o"/>
       <w:lvlJc w:val="left"/>
       <w:pPr>
-        <w:ind w:left="5760" w:hanging="480"/>
-      </w:pPr>
+        <w:ind w:left="5760" w:hanging="360"/>
+      </w:pPr>
+      <w:rPr>
+        <w:rFonts w:ascii="Courier New" w:hAnsi="Courier New" w:cs="Courier New" w:hint="default"/>
+      </w:rPr>
     </w:lvl>
     <w:lvl w:ilvl="8">
       <w:numFmt w:val="bullet"/>
-      <w:lvlText w:val="•"/>
+      <w:lvlText w:val=""/>
       <w:lvlJc w:val="left"/>
       <w:pPr>
-        <w:ind w:left="6480" w:hanging="480"/>
-      </w:pPr>
+        <w:ind w:left="6480" w:hanging="360"/>
+      </w:pPr>
+      <w:rPr>
+        <w:rFonts w:ascii="Wingdings" w:hAnsi="Wingdings" w:cs="Wingdings" w:hint="default"/>
+      </w:rPr>
     </w:lvl>
   </w:abstractNum>
   <w:num w:numId="1000">
@@ -3282,8 +3442,8 @@
     <w:name w:val="KeywordTok"/>
     <w:basedOn w:val="VerbatimChar"/>
     <w:rPr>
+      <w:b/>
       <w:color w:val="007020"/>
-      <w:b/>
     </w:rPr>
   </w:style>
   <w:style w:type="character" w:customStyle="1" w:styleId="DataTypeTok">
@@ -3360,42 +3520,42 @@
     <w:name w:val="ImportTok"/>
     <w:basedOn w:val="VerbatimChar"/>
     <w:rPr>
+      <w:b/>
       <w:color w:val="008000"/>
-      <w:b/>
     </w:rPr>
   </w:style>
   <w:style w:type="character" w:customStyle="1" w:styleId="CommentTok">
     <w:name w:val="CommentTok"/>
     <w:basedOn w:val="VerbatimChar"/>
     <w:rPr>
+      <w:i/>
       <w:color w:val="60a0b0"/>
-      <w:i/>
     </w:rPr>
   </w:style>
   <w:style w:type="character" w:customStyle="1" w:styleId="DocumentationTok">
     <w:name w:val="DocumentationTok"/>
     <w:basedOn w:val="VerbatimChar"/>
     <w:rPr>
+      <w:i/>
       <w:color w:val="ba2121"/>
-      <w:i/>
     </w:rPr>
   </w:style>
   <w:style w:type="character" w:customStyle="1" w:styleId="AnnotationTok">
     <w:name w:val="AnnotationTok"/>
     <w:basedOn w:val="VerbatimChar"/>
     <w:rPr>
-      <w:color w:val="60a0b0"/>
       <w:b/>
       <w:i/>
+      <w:color w:val="60a0b0"/>
     </w:rPr>
   </w:style>
   <w:style w:type="character" w:customStyle="1" w:styleId="CommentVarTok">
     <w:name w:val="CommentVarTok"/>
     <w:basedOn w:val="VerbatimChar"/>
     <w:rPr>
-      <w:color w:val="60a0b0"/>
       <w:b/>
       <w:i/>
+      <w:color w:val="60a0b0"/>
     </w:rPr>
   </w:style>
   <w:style w:type="character" w:customStyle="1" w:styleId="OtherTok">
@@ -3423,8 +3583,8 @@
     <w:name w:val="ControlFlowTok"/>
     <w:basedOn w:val="VerbatimChar"/>
     <w:rPr>
+      <w:b/>
       <w:color w:val="007020"/>
-      <w:b/>
     </w:rPr>
   </w:style>
   <w:style w:type="character" w:customStyle="1" w:styleId="OperatorTok">
@@ -3469,34 +3629,34 @@
     <w:name w:val="InformationTok"/>
     <w:basedOn w:val="VerbatimChar"/>
     <w:rPr>
-      <w:color w:val="60a0b0"/>
       <w:b/>
       <w:i/>
+      <w:color w:val="60a0b0"/>
     </w:rPr>
   </w:style>
   <w:style w:type="character" w:customStyle="1" w:styleId="WarningTok">
     <w:name w:val="WarningTok"/>
     <w:basedOn w:val="VerbatimChar"/>
     <w:rPr>
-      <w:color w:val="60a0b0"/>
       <w:b/>
       <w:i/>
+      <w:color w:val="60a0b0"/>
     </w:rPr>
   </w:style>
   <w:style w:type="character" w:customStyle="1" w:styleId="AlertTok">
     <w:name w:val="AlertTok"/>
     <w:basedOn w:val="VerbatimChar"/>
     <w:rPr>
+      <w:b/>
       <w:color w:val="ff0000"/>
-      <w:b/>
     </w:rPr>
   </w:style>
   <w:style w:type="character" w:customStyle="1" w:styleId="ErrorTok">
     <w:name w:val="ErrorTok"/>
     <w:basedOn w:val="VerbatimChar"/>
     <w:rPr>
+      <w:b/>
       <w:color w:val="ff0000"/>
-      <w:b/>
     </w:rPr>
   </w:style>
   <w:style w:type="character" w:customStyle="1" w:styleId="NormalTok">

</xml_diff>

<commit_message>
(Docs) Decision Guides Structure Tweaks + Accuracy Fixes (#11217)
* docs: decision guide structure and accuracy fixes

Signed-off-by: Everett Williams <everett@medplum.com>

* docs: fix migration guide cross-links after restructuring

Signed-off-by: Everett Williams <everett@medplum.com>

---------

Signed-off-by: Everett Williams <everett@medplum.com>
</commit_message>
<xml_diff>
--- a/packages/docs/static/decision-guides/authentication.docx
+++ b/packages/docs/static/decision-guides/authentication.docx
@@ -11,18 +11,18 @@
           <wp:inline>
             <wp:extent cx="5943600" cy="1289649"/>
             <wp:effectExtent b="0" l="0" r="0" t="0"/>
-            <wp:docPr descr="Medplum" title="" id="21" name="Picture"/>
+            <wp:docPr descr="Medplum" title="" id="10" name="Picture"/>
             <a:graphic>
               <a:graphicData uri="http://schemas.openxmlformats.org/drawingml/2006/picture">
                 <pic:pic>
                   <pic:nvPicPr>
-                    <pic:cNvPr descr="medplum-wordmark-grape.png" id="22" name="Picture"/>
+                    <pic:cNvPr descr="medplum-wordmark-grape.png" id="11" name="Picture"/>
                     <pic:cNvPicPr>
                       <a:picLocks noChangeArrowheads="1" noChangeAspect="1"/>
                     </pic:cNvPicPr>
                   </pic:nvPicPr>
                   <pic:blipFill>
-                    <a:blip r:embed="rId20"/>
+                    <a:blip r:embed="rId9"/>
                     <a:stretch>
                       <a:fillRect/>
                     </a:stretch>
@@ -49,7 +49,7 @@
         </w:drawing>
       </w:r>
     </w:p>
-    <w:bookmarkStart w:id="59" w:name="authentication-decision-guide"/>
+    <w:bookmarkStart w:id="51" w:name="authentication-decision-guide"/>
     <w:p>
       <w:pPr>
         <w:pStyle w:val="Heading1"/>
@@ -72,94 +72,94 @@
       </w:pPr>
       <w:r>
         <w:rPr>
+          <w:i/>
           <w:iCs/>
+        </w:rPr>
+        <w:t xml:space="preserve">Companion to the</w:t>
+      </w:r>
+      <w:r>
+        <w:rPr>
           <w:i/>
-        </w:rPr>
-        <w:t xml:space="preserve">Companion to the</w:t>
-      </w:r>
-      <w:r>
-        <w:rPr>
           <w:iCs/>
-          <w:i/>
-        </w:rPr>
-        <w:t xml:space="preserve"> </w:t>
-      </w:r>
-      <w:hyperlink r:id="rId23">
+        </w:rPr>
+        <w:t xml:space="preserve"> </w:t>
+      </w:r>
+      <w:hyperlink r:id="rId12">
         <w:r>
           <w:rPr>
             <w:rStyle w:val="Hyperlink"/>
+            <w:i/>
             <w:iCs/>
-            <w:i/>
           </w:rPr>
           <w:t xml:space="preserve">Authentication</w:t>
         </w:r>
       </w:hyperlink>
       <w:r>
         <w:rPr>
+          <w:i/>
           <w:iCs/>
+        </w:rPr>
+        <w:t xml:space="preserve"> </w:t>
+      </w:r>
+      <w:r>
+        <w:rPr>
           <w:i/>
-        </w:rPr>
-        <w:t xml:space="preserve"> </w:t>
-      </w:r>
-      <w:r>
-        <w:rPr>
           <w:iCs/>
+        </w:rPr>
+        <w:t xml:space="preserve">and</w:t>
+      </w:r>
+      <w:r>
+        <w:rPr>
           <w:i/>
-        </w:rPr>
-        <w:t xml:space="preserve">and</w:t>
-      </w:r>
-      <w:r>
-        <w:rPr>
           <w:iCs/>
-          <w:i/>
-        </w:rPr>
-        <w:t xml:space="preserve"> </w:t>
-      </w:r>
-      <w:hyperlink r:id="rId24">
+        </w:rPr>
+        <w:t xml:space="preserve"> </w:t>
+      </w:r>
+      <w:hyperlink r:id="rId13">
         <w:r>
           <w:rPr>
             <w:rStyle w:val="Hyperlink"/>
+            <w:i/>
             <w:iCs/>
-            <w:i/>
           </w:rPr>
           <w:t xml:space="preserve">User Management</w:t>
         </w:r>
       </w:hyperlink>
       <w:r>
         <w:rPr>
+          <w:i/>
           <w:iCs/>
+        </w:rPr>
+        <w:t xml:space="preserve"> </w:t>
+      </w:r>
+      <w:r>
+        <w:rPr>
           <w:i/>
-        </w:rPr>
-        <w:t xml:space="preserve"> </w:t>
-      </w:r>
-      <w:r>
-        <w:rPr>
           <w:iCs/>
+        </w:rPr>
+        <w:t xml:space="preserve">docs. Builds on</w:t>
+      </w:r>
+      <w:r>
+        <w:rPr>
           <w:i/>
-        </w:rPr>
-        <w:t xml:space="preserve">docs. Builds on</w:t>
-      </w:r>
-      <w:r>
-        <w:rPr>
           <w:iCs/>
-          <w:i/>
-        </w:rPr>
-        <w:t xml:space="preserve"> </w:t>
-      </w:r>
-      <w:hyperlink r:id="rId25">
+        </w:rPr>
+        <w:t xml:space="preserve"> </w:t>
+      </w:r>
+      <w:hyperlink r:id="rId14">
         <w:r>
           <w:rPr>
             <w:rStyle w:val="Hyperlink"/>
+            <w:i/>
             <w:iCs/>
-            <w:i/>
           </w:rPr>
           <w:t xml:space="preserve">Identity Management: A Practical Guide</w:t>
         </w:r>
       </w:hyperlink>
       <w:r>
         <w:rPr>
+          <w:i/>
           <w:iCs/>
-          <w:i/>
         </w:rPr>
         <w:t xml:space="preserve">.</w:t>
       </w:r>
@@ -174,26 +174,26 @@
     </w:p>
     <w:p>
       <w:pPr>
+        <w:pStyle w:val="Compact"/>
         <w:numPr>
           <w:ilvl w:val="0"/>
           <w:numId w:val="1001"/>
         </w:numPr>
-        <w:pStyle w:val="Compact"/>
       </w:pPr>
       <w:hyperlink w:anchor="X5c643f84501ad1ede1a9e8776bb91848ba9cdd6">
         <w:r>
           <w:rPr>
             <w:rStyle w:val="Hyperlink"/>
+            <w:b/>
             <w:bCs/>
-            <w:b/>
           </w:rPr>
           <w:t xml:space="preserve">Choose your identity provider</w:t>
         </w:r>
       </w:hyperlink>
       <w:r>
         <w:rPr>
+          <w:b/>
           <w:bCs/>
-          <w:b/>
         </w:rPr>
         <w:t xml:space="preserve">.</w:t>
       </w:r>
@@ -206,18 +206,18 @@
     </w:p>
     <w:p>
       <w:pPr>
+        <w:pStyle w:val="Compact"/>
         <w:numPr>
           <w:ilvl w:val="0"/>
           <w:numId w:val="1001"/>
         </w:numPr>
-        <w:pStyle w:val="Compact"/>
       </w:pPr>
       <w:hyperlink w:anchor="X2b39dfd4df54a7c9f4fe3b24536819fb0a2dcba">
         <w:r>
           <w:rPr>
             <w:rStyle w:val="Hyperlink"/>
+            <w:b/>
             <w:bCs/>
-            <w:b/>
           </w:rPr>
           <w:t xml:space="preserve">Choose your token flow</w:t>
         </w:r>
@@ -231,18 +231,18 @@
     </w:p>
     <w:p>
       <w:pPr>
+        <w:pStyle w:val="Compact"/>
         <w:numPr>
           <w:ilvl w:val="0"/>
           <w:numId w:val="1001"/>
         </w:numPr>
-        <w:pStyle w:val="Compact"/>
       </w:pPr>
       <w:hyperlink w:anchor="Xa2fe8c07881eb9416283f05100480535a9d42e6">
         <w:r>
           <w:rPr>
             <w:rStyle w:val="Hyperlink"/>
+            <w:b/>
             <w:bCs/>
-            <w:b/>
           </w:rPr>
           <w:t xml:space="preserve">Choose your matching key</w:t>
         </w:r>
@@ -278,7 +278,7 @@
       <w:r>
         <w:t xml:space="preserve"> </w:t>
       </w:r>
-      <w:hyperlink r:id="rId26">
+      <w:hyperlink r:id="rId15">
         <w:r>
           <w:rPr>
             <w:rStyle w:val="Hyperlink"/>
@@ -297,7 +297,7 @@
         </w:pict>
       </w:r>
     </w:p>
-    <w:bookmarkStart w:id="34" w:name="X5c643f84501ad1ede1a9e8776bb91848ba9cdd6"/>
+    <w:bookmarkStart w:id="24" w:name="X5c643f84501ad1ede1a9e8776bb91848ba9cdd6"/>
     <w:p>
       <w:pPr>
         <w:pStyle w:val="Heading2"/>
@@ -314,7 +314,7 @@
         <w:t xml:space="preserve">An identity provider (IDP) manages credentials and authenticates users. Choose based on your existing identity systems and SSO requirements.</w:t>
       </w:r>
     </w:p>
-    <w:bookmarkStart w:id="29" w:name="option-a-medplum-managed-authentication"/>
+    <w:bookmarkStart w:id="19" w:name="option-a-medplum-managed-authentication"/>
     <w:p>
       <w:pPr>
         <w:pStyle w:val="Heading3"/>
@@ -328,32 +328,32 @@
         <w:pStyle w:val="FirstParagraph"/>
       </w:pPr>
       <w:r>
-        <w:t xml:space="preserve">Medplum manages credentials, registration, password resets, and MFA.</w:t>
-      </w:r>
-    </w:p>
-    <w:p>
-      <w:pPr>
+        <w:t xml:space="preserve">Use Medplum’s built-in email/password login or Google sign-in. For password-based accounts, Medplum manages credentials, registration, password resets, and MFA.</w:t>
+      </w:r>
+    </w:p>
+    <w:p>
+      <w:pPr>
+        <w:pStyle w:val="Compact"/>
         <w:numPr>
           <w:ilvl w:val="0"/>
           <w:numId w:val="1002"/>
         </w:numPr>
-        <w:pStyle w:val="Compact"/>
-      </w:pPr>
-      <w:r>
-        <w:rPr>
+      </w:pPr>
+      <w:r>
+        <w:rPr>
+          <w:b/>
           <w:bCs/>
-          <w:b/>
         </w:rPr>
         <w:t xml:space="preserve">Advantages:</w:t>
       </w:r>
     </w:p>
     <w:p>
       <w:pPr>
+        <w:pStyle w:val="Compact"/>
         <w:numPr>
           <w:ilvl w:val="1"/>
           <w:numId w:val="1003"/>
         </w:numPr>
-        <w:pStyle w:val="Compact"/>
       </w:pPr>
       <w:r>
         <w:t xml:space="preserve">Built-in authentication and login components without a separate IDP integration.</w:t>
@@ -361,27 +361,27 @@
     </w:p>
     <w:p>
       <w:pPr>
+        <w:pStyle w:val="Compact"/>
         <w:numPr>
           <w:ilvl w:val="0"/>
           <w:numId w:val="1002"/>
         </w:numPr>
-        <w:pStyle w:val="Compact"/>
-      </w:pPr>
-      <w:r>
-        <w:rPr>
+      </w:pPr>
+      <w:r>
+        <w:rPr>
+          <w:b/>
           <w:bCs/>
-          <w:b/>
         </w:rPr>
         <w:t xml:space="preserve">Tradeoffs:</w:t>
       </w:r>
     </w:p>
     <w:p>
       <w:pPr>
+        <w:pStyle w:val="Compact"/>
         <w:numPr>
           <w:ilvl w:val="1"/>
           <w:numId w:val="1004"/>
         </w:numPr>
-        <w:pStyle w:val="Compact"/>
       </w:pPr>
       <w:r>
         <w:t xml:space="preserve">Does not meet a requirement to use an existing corporate IDP.</w:t>
@@ -389,16 +389,16 @@
     </w:p>
     <w:p>
       <w:pPr>
+        <w:pStyle w:val="Compact"/>
         <w:numPr>
           <w:ilvl w:val="0"/>
           <w:numId w:val="1002"/>
         </w:numPr>
-        <w:pStyle w:val="Compact"/>
-      </w:pPr>
-      <w:r>
-        <w:rPr>
+      </w:pPr>
+      <w:r>
+        <w:rPr>
+          <w:b/>
           <w:bCs/>
-          <w:b/>
         </w:rPr>
         <w:t xml:space="preserve">Best fit:</w:t>
       </w:r>
@@ -419,7 +419,7 @@
       <w:r>
         <w:t xml:space="preserve"> </w:t>
       </w:r>
-      <w:hyperlink r:id="rId27">
+      <w:hyperlink r:id="rId16">
         <w:r>
           <w:rPr>
             <w:rStyle w:val="Hyperlink"/>
@@ -428,15 +428,12 @@
         </w:r>
       </w:hyperlink>
       <w:r>
-        <w:t xml:space="preserve"> </w:t>
-      </w:r>
-      <w:r>
-        <w:t xml:space="preserve">or</w:t>
-      </w:r>
-      <w:r>
-        <w:t xml:space="preserve"> </w:t>
-      </w:r>
-      <w:hyperlink r:id="rId28">
+        <w:t xml:space="preserve">,</w:t>
+      </w:r>
+      <w:r>
+        <w:t xml:space="preserve"> </w:t>
+      </w:r>
+      <w:hyperlink r:id="rId17">
         <w:r>
           <w:rPr>
             <w:rStyle w:val="Hyperlink"/>
@@ -445,6 +442,20 @@
         </w:r>
       </w:hyperlink>
       <w:r>
+        <w:t xml:space="preserve">, and</w:t>
+      </w:r>
+      <w:r>
+        <w:t xml:space="preserve"> </w:t>
+      </w:r>
+      <w:hyperlink r:id="rId18">
+        <w:r>
+          <w:rPr>
+            <w:rStyle w:val="Hyperlink"/>
+          </w:rPr>
+          <w:t xml:space="preserve">Google sign-in</w:t>
+        </w:r>
+      </w:hyperlink>
+      <w:r>
         <w:t xml:space="preserve">.</w:t>
       </w:r>
     </w:p>
@@ -454,8 +465,8 @@
       </w:pPr>
       <w:r>
         <w:rPr>
+          <w:b/>
           <w:bCs/>
-          <w:b/>
         </w:rPr>
         <w:t xml:space="preserve">Next:</w:t>
       </w:r>
@@ -480,8 +491,8 @@
         <w:t xml:space="preserve">.</w:t>
       </w:r>
     </w:p>
-    <w:bookmarkEnd w:id="29"/>
-    <w:bookmarkStart w:id="31" w:name="Xe8809dc97f953fef8ac90d1d3f41e2bb8c2302f"/>
+    <w:bookmarkEnd w:id="19"/>
+    <w:bookmarkStart w:id="21" w:name="Xe8809dc97f953fef8ac90d1d3f41e2bb8c2302f"/>
     <w:p>
       <w:pPr>
         <w:pStyle w:val="Heading3"/>
@@ -512,27 +523,27 @@
     </w:p>
     <w:p>
       <w:pPr>
+        <w:pStyle w:val="Compact"/>
         <w:numPr>
           <w:ilvl w:val="0"/>
           <w:numId w:val="1005"/>
         </w:numPr>
-        <w:pStyle w:val="Compact"/>
-      </w:pPr>
-      <w:r>
-        <w:rPr>
+      </w:pPr>
+      <w:r>
+        <w:rPr>
+          <w:b/>
           <w:bCs/>
-          <w:b/>
         </w:rPr>
         <w:t xml:space="preserve">Advantages:</w:t>
       </w:r>
     </w:p>
     <w:p>
       <w:pPr>
+        <w:pStyle w:val="Compact"/>
         <w:numPr>
           <w:ilvl w:val="1"/>
           <w:numId w:val="1006"/>
         </w:numPr>
-        <w:pStyle w:val="Compact"/>
       </w:pPr>
       <w:r>
         <w:t xml:space="preserve">Reuses existing identities and advanced features from providers such as Okta or Auth0.</w:t>
@@ -540,11 +551,11 @@
     </w:p>
     <w:p>
       <w:pPr>
+        <w:pStyle w:val="Compact"/>
         <w:numPr>
           <w:ilvl w:val="1"/>
           <w:numId w:val="1006"/>
         </w:numPr>
-        <w:pStyle w:val="Compact"/>
       </w:pPr>
       <w:r>
         <w:t xml:space="preserve">Different applications can use different identity providers.</w:t>
@@ -552,27 +563,27 @@
     </w:p>
     <w:p>
       <w:pPr>
+        <w:pStyle w:val="Compact"/>
         <w:numPr>
           <w:ilvl w:val="0"/>
           <w:numId w:val="1005"/>
         </w:numPr>
-        <w:pStyle w:val="Compact"/>
-      </w:pPr>
-      <w:r>
-        <w:rPr>
+      </w:pPr>
+      <w:r>
+        <w:rPr>
+          <w:b/>
           <w:bCs/>
-          <w:b/>
         </w:rPr>
         <w:t xml:space="preserve">Tradeoffs:</w:t>
       </w:r>
     </w:p>
     <w:p>
       <w:pPr>
+        <w:pStyle w:val="Compact"/>
         <w:numPr>
           <w:ilvl w:val="1"/>
           <w:numId w:val="1007"/>
         </w:numPr>
-        <w:pStyle w:val="Compact"/>
       </w:pPr>
       <w:r>
         <w:t xml:space="preserve">Multiple upstream IDPs within one application need additional routing, such as an identity broker.</w:t>
@@ -580,16 +591,16 @@
     </w:p>
     <w:p>
       <w:pPr>
+        <w:pStyle w:val="Compact"/>
         <w:numPr>
           <w:ilvl w:val="0"/>
           <w:numId w:val="1005"/>
         </w:numPr>
-        <w:pStyle w:val="Compact"/>
-      </w:pPr>
-      <w:r>
-        <w:rPr>
+      </w:pPr>
+      <w:r>
+        <w:rPr>
+          <w:b/>
           <w:bCs/>
-          <w:b/>
         </w:rPr>
         <w:t xml:space="preserve">Best fit:</w:t>
       </w:r>
@@ -610,7 +621,7 @@
       <w:r>
         <w:t xml:space="preserve"> </w:t>
       </w:r>
-      <w:hyperlink r:id="rId30">
+      <w:hyperlink r:id="rId20">
         <w:r>
           <w:rPr>
             <w:rStyle w:val="Hyperlink"/>
@@ -622,8 +633,8 @@
         <w:t xml:space="preserve">.</w:t>
       </w:r>
     </w:p>
-    <w:bookmarkEnd w:id="31"/>
-    <w:bookmarkStart w:id="33" w:name="X1f3b4712db7da41133a5c6556c0631e928b0632"/>
+    <w:bookmarkEnd w:id="21"/>
+    <w:bookmarkStart w:id="23" w:name="X1f3b4712db7da41133a5c6556c0631e928b0632"/>
     <w:p>
       <w:pPr>
         <w:pStyle w:val="Heading3"/>
@@ -657,27 +668,27 @@
     </w:p>
     <w:p>
       <w:pPr>
+        <w:pStyle w:val="Compact"/>
         <w:numPr>
           <w:ilvl w:val="0"/>
           <w:numId w:val="1008"/>
         </w:numPr>
-        <w:pStyle w:val="Compact"/>
-      </w:pPr>
-      <w:r>
-        <w:rPr>
+      </w:pPr>
+      <w:r>
+        <w:rPr>
+          <w:b/>
           <w:bCs/>
-          <w:b/>
         </w:rPr>
         <w:t xml:space="preserve">Advantages:</w:t>
       </w:r>
     </w:p>
     <w:p>
       <w:pPr>
+        <w:pStyle w:val="Compact"/>
         <w:numPr>
           <w:ilvl w:val="1"/>
           <w:numId w:val="1009"/>
         </w:numPr>
-        <w:pStyle w:val="Compact"/>
       </w:pPr>
       <w:r>
         <w:t xml:space="preserve">An organization’s SSO applies across Medplum applications, including the Medplum App.</w:t>
@@ -685,27 +696,27 @@
     </w:p>
     <w:p>
       <w:pPr>
+        <w:pStyle w:val="Compact"/>
         <w:numPr>
           <w:ilvl w:val="0"/>
           <w:numId w:val="1008"/>
         </w:numPr>
-        <w:pStyle w:val="Compact"/>
-      </w:pPr>
-      <w:r>
-        <w:rPr>
+      </w:pPr>
+      <w:r>
+        <w:rPr>
+          <w:b/>
           <w:bCs/>
-          <w:b/>
         </w:rPr>
         <w:t xml:space="preserve">Tradeoffs:</w:t>
       </w:r>
     </w:p>
     <w:p>
       <w:pPr>
+        <w:pStyle w:val="Compact"/>
         <w:numPr>
           <w:ilvl w:val="1"/>
           <w:numId w:val="1010"/>
         </w:numPr>
-        <w:pStyle w:val="Compact"/>
       </w:pPr>
       <w:r>
         <w:t xml:space="preserve">Applies to all users of the domain, including developer accounts.</w:t>
@@ -713,11 +724,11 @@
     </w:p>
     <w:p>
       <w:pPr>
+        <w:pStyle w:val="Compact"/>
         <w:numPr>
           <w:ilvl w:val="1"/>
           <w:numId w:val="1010"/>
         </w:numPr>
-        <w:pStyle w:val="Compact"/>
       </w:pPr>
       <w:r>
         <w:t xml:space="preserve">Requires Medplum setup support for both hosted and self-hosted deployments. Hosted setup requires Enterprise.</w:t>
@@ -725,16 +736,16 @@
     </w:p>
     <w:p>
       <w:pPr>
+        <w:pStyle w:val="Compact"/>
         <w:numPr>
           <w:ilvl w:val="0"/>
           <w:numId w:val="1008"/>
         </w:numPr>
-        <w:pStyle w:val="Compact"/>
-      </w:pPr>
-      <w:r>
-        <w:rPr>
+      </w:pPr>
+      <w:r>
+        <w:rPr>
+          <w:b/>
           <w:bCs/>
-          <w:b/>
         </w:rPr>
         <w:t xml:space="preserve">Best fit:</w:t>
       </w:r>
@@ -755,7 +766,7 @@
       <w:r>
         <w:t xml:space="preserve"> </w:t>
       </w:r>
-      <w:hyperlink r:id="rId32">
+      <w:hyperlink r:id="rId22">
         <w:r>
           <w:rPr>
             <w:rStyle w:val="Hyperlink"/>
@@ -773,27 +784,86 @@
       </w:pPr>
       <w:r>
         <w:rPr>
+          <w:b/>
           <w:bCs/>
+        </w:rPr>
+        <w:t xml:space="preserve">Next for external IDPs:</w:t>
+      </w:r>
+      <w:r>
+        <w:t xml:space="preserve"> </w:t>
+      </w:r>
+      <w:r>
+        <w:t xml:space="preserve">Choose your token flow below.</w:t>
+      </w:r>
+    </w:p>
+    <w:bookmarkEnd w:id="23"/>
+    <w:bookmarkEnd w:id="24"/>
+    <w:bookmarkStart w:id="34" w:name="X2b39dfd4df54a7c9f4fe3b24536819fb0a2dcba"/>
+    <w:p>
+      <w:pPr>
+        <w:pStyle w:val="Heading2"/>
+      </w:pPr>
+      <w:r>
+        <w:t xml:space="preserve">Decision 2: What is your token flow architecture?</w:t>
+      </w:r>
+    </w:p>
+    <w:p>
+      <w:pPr>
+        <w:pStyle w:val="FirstParagraph"/>
+      </w:pPr>
+      <w:r>
+        <w:rPr>
           <w:b/>
-        </w:rPr>
-        <w:t xml:space="preserve">Next for external IDPs:</w:t>
-      </w:r>
-      <w:r>
-        <w:t xml:space="preserve"> </w:t>
-      </w:r>
-      <w:r>
-        <w:t xml:space="preserve">Choose your token flow below.</w:t>
-      </w:r>
-    </w:p>
-    <w:bookmarkEnd w:id="33"/>
-    <w:bookmarkEnd w:id="34"/>
-    <w:bookmarkStart w:id="43" w:name="X2b39dfd4df54a7c9f4fe3b24536819fb0a2dcba"/>
-    <w:p>
-      <w:pPr>
-        <w:pStyle w:val="Heading2"/>
-      </w:pPr>
-      <w:r>
-        <w:t xml:space="preserve">Decision 2: What is your token flow architecture?</w:t>
+          <w:bCs/>
+        </w:rPr>
+        <w:t xml:space="preserve">For applications using external or existing authentication.</w:t>
+      </w:r>
+      <w:r>
+        <w:t xml:space="preserve"> </w:t>
+      </w:r>
+      <w:r>
+        <w:t xml:space="preserve">Choose how the application obtains Medplum credentials. Here,</w:t>
+      </w:r>
+      <w:r>
+        <w:t xml:space="preserve"> </w:t>
+      </w:r>
+      <w:r>
+        <w:t xml:space="preserve">“client”</w:t>
+      </w:r>
+      <w:r>
+        <w:t xml:space="preserve"> </w:t>
+      </w:r>
+      <w:r>
+        <w:t xml:space="preserve">means your browser or native app;</w:t>
+      </w:r>
+      <w:r>
+        <w:t xml:space="preserve"> </w:t>
+      </w:r>
+      <w:r>
+        <w:t xml:space="preserve">“server”</w:t>
+      </w:r>
+      <w:r>
+        <w:t xml:space="preserve"> </w:t>
+      </w:r>
+      <w:r>
+        <w:t xml:space="preserve">means your application backend.</w:t>
+      </w:r>
+    </w:p>
+    <w:p>
+      <w:pPr>
+        <w:pStyle w:val="BodyText"/>
+      </w:pPr>
+      <w:r>
+        <w:t xml:space="preserve">Both the authorization-code flow and token exchange can use the same external IDP. The difference is whether Medplum handles the IDP callback or your application obtains an external access token and exchanges it.</w:t>
+      </w:r>
+    </w:p>
+    <w:bookmarkStart w:id="25" w:name="X5eacf9fb7cb611124f81ab68c944516496527c7"/>
+    <w:p>
+      <w:pPr>
+        <w:pStyle w:val="Heading3"/>
+      </w:pPr>
+      <w:r>
+        <w:t xml:space="preserve">Option A: External IDP authorization-code flow (three-legged OAuth)</w:t>
       </w:r>
     </w:p>
     <w:p>
@@ -801,103 +871,32 @@
         <w:pStyle w:val="FirstParagraph"/>
       </w:pPr>
       <w:r>
-        <w:rPr>
-          <w:bCs/>
-          <w:b/>
-        </w:rPr>
-        <w:t xml:space="preserve">For applications using external or existing authentication.</w:t>
-      </w:r>
-      <w:r>
-        <w:t xml:space="preserve"> </w:t>
-      </w:r>
-      <w:r>
-        <w:t xml:space="preserve">Choose how the application obtains Medplum credentials. Here,</w:t>
-      </w:r>
-      <w:r>
-        <w:t xml:space="preserve"> </w:t>
-      </w:r>
-      <w:r>
-        <w:t xml:space="preserve">“</w:t>
-      </w:r>
-      <w:r>
-        <w:t xml:space="preserve">client</w:t>
-      </w:r>
-      <w:r>
-        <w:t xml:space="preserve">”</w:t>
-      </w:r>
-      <w:r>
-        <w:t xml:space="preserve"> </w:t>
-      </w:r>
-      <w:r>
-        <w:t xml:space="preserve">means your browser or native app;</w:t>
-      </w:r>
-      <w:r>
-        <w:t xml:space="preserve"> </w:t>
-      </w:r>
-      <w:r>
-        <w:t xml:space="preserve">“</w:t>
-      </w:r>
-      <w:r>
-        <w:t xml:space="preserve">server</w:t>
-      </w:r>
-      <w:r>
-        <w:t xml:space="preserve">”</w:t>
-      </w:r>
-      <w:r>
-        <w:t xml:space="preserve"> </w:t>
-      </w:r>
-      <w:r>
-        <w:t xml:space="preserve">means your application backend.</w:t>
-      </w:r>
-    </w:p>
-    <w:p>
-      <w:pPr>
-        <w:pStyle w:val="BodyText"/>
-      </w:pPr>
-      <w:r>
-        <w:t xml:space="preserve">Both the authorization-code flow and token exchange can use the same external IDP. The difference is whether Medplum handles the IDP callback or your application obtains an external access token and exchanges it.</w:t>
-      </w:r>
-    </w:p>
-    <w:bookmarkStart w:id="35" w:name="X5eacf9fb7cb611124f81ab68c944516496527c7"/>
-    <w:p>
-      <w:pPr>
-        <w:pStyle w:val="Heading3"/>
-      </w:pPr>
-      <w:r>
-        <w:t xml:space="preserve">Option A: External IDP authorization-code flow (three-legged OAuth)</w:t>
-      </w:r>
-    </w:p>
-    <w:p>
-      <w:pPr>
-        <w:pStyle w:val="FirstParagraph"/>
-      </w:pPr>
-      <w:r>
         <w:t xml:space="preserve">Medplum handles the external IDP callback and returns an authorization code to your application, which exchanges it for Medplum tokens.</w:t>
       </w:r>
     </w:p>
     <w:p>
       <w:pPr>
+        <w:pStyle w:val="Compact"/>
         <w:numPr>
           <w:ilvl w:val="0"/>
           <w:numId w:val="1011"/>
         </w:numPr>
-        <w:pStyle w:val="Compact"/>
-      </w:pPr>
-      <w:r>
-        <w:rPr>
+      </w:pPr>
+      <w:r>
+        <w:rPr>
+          <w:b/>
           <w:bCs/>
-          <w:b/>
         </w:rPr>
         <w:t xml:space="preserve">Advantages:</w:t>
       </w:r>
     </w:p>
     <w:p>
       <w:pPr>
+        <w:pStyle w:val="Compact"/>
         <w:numPr>
           <w:ilvl w:val="1"/>
           <w:numId w:val="1012"/>
         </w:numPr>
-        <w:pStyle w:val="Compact"/>
       </w:pPr>
       <w:r>
         <w:t xml:space="preserve">The client can call Medplum directly using the SDK and authenticated components.</w:t>
@@ -905,11 +904,11 @@
     </w:p>
     <w:p>
       <w:pPr>
+        <w:pStyle w:val="Compact"/>
         <w:numPr>
           <w:ilvl w:val="1"/>
           <w:numId w:val="1012"/>
         </w:numPr>
-        <w:pStyle w:val="Compact"/>
       </w:pPr>
       <w:r>
         <w:t xml:space="preserve">The client does not need to retain an external access token for this flow.</w:t>
@@ -917,27 +916,27 @@
     </w:p>
     <w:p>
       <w:pPr>
+        <w:pStyle w:val="Compact"/>
         <w:numPr>
           <w:ilvl w:val="0"/>
           <w:numId w:val="1011"/>
         </w:numPr>
-        <w:pStyle w:val="Compact"/>
-      </w:pPr>
-      <w:r>
-        <w:rPr>
+      </w:pPr>
+      <w:r>
+        <w:rPr>
+          <w:b/>
           <w:bCs/>
-          <w:b/>
         </w:rPr>
         <w:t xml:space="preserve">Tradeoffs:</w:t>
       </w:r>
     </w:p>
     <w:p>
       <w:pPr>
+        <w:pStyle w:val="Compact"/>
         <w:numPr>
           <w:ilvl w:val="1"/>
           <w:numId w:val="1013"/>
         </w:numPr>
-        <w:pStyle w:val="Compact"/>
       </w:pPr>
       <w:r>
         <w:t xml:space="preserve">Requires redirect login and coordinated callback settings.</w:t>
@@ -945,11 +944,11 @@
     </w:p>
     <w:p>
       <w:pPr>
+        <w:pStyle w:val="Compact"/>
         <w:numPr>
           <w:ilvl w:val="1"/>
           <w:numId w:val="1013"/>
         </w:numPr>
-        <w:pStyle w:val="Compact"/>
       </w:pPr>
       <w:r>
         <w:t xml:space="preserve">Does not provide the client with an external access token for other services.</w:t>
@@ -957,16 +956,16 @@
     </w:p>
     <w:p>
       <w:pPr>
+        <w:pStyle w:val="Compact"/>
         <w:numPr>
           <w:ilvl w:val="0"/>
           <w:numId w:val="1011"/>
         </w:numPr>
-        <w:pStyle w:val="Compact"/>
-      </w:pPr>
-      <w:r>
-        <w:rPr>
+      </w:pPr>
+      <w:r>
+        <w:rPr>
+          <w:b/>
           <w:bCs/>
-          <w:b/>
         </w:rPr>
         <w:t xml:space="preserve">Best fit:</w:t>
       </w:r>
@@ -987,7 +986,7 @@
       <w:r>
         <w:t xml:space="preserve"> </w:t>
       </w:r>
-      <w:hyperlink r:id="rId30">
+      <w:hyperlink r:id="rId20">
         <w:r>
           <w:rPr>
             <w:rStyle w:val="Hyperlink"/>
@@ -999,8 +998,8 @@
         <w:t xml:space="preserve">.</w:t>
       </w:r>
     </w:p>
-    <w:bookmarkEnd w:id="35"/>
-    <w:bookmarkStart w:id="40" w:name="option-b-token-exchange"/>
+    <w:bookmarkEnd w:id="25"/>
+    <w:bookmarkStart w:id="31" w:name="option-b-token-exchange"/>
     <w:p>
       <w:pPr>
         <w:pStyle w:val="Heading3"/>
@@ -1019,27 +1018,27 @@
     </w:p>
     <w:p>
       <w:pPr>
+        <w:pStyle w:val="Compact"/>
         <w:numPr>
           <w:ilvl w:val="0"/>
           <w:numId w:val="1014"/>
         </w:numPr>
-        <w:pStyle w:val="Compact"/>
-      </w:pPr>
-      <w:r>
-        <w:rPr>
+      </w:pPr>
+      <w:r>
+        <w:rPr>
+          <w:b/>
           <w:bCs/>
-          <w:b/>
         </w:rPr>
         <w:t xml:space="preserve">Advantages:</w:t>
       </w:r>
     </w:p>
     <w:p>
       <w:pPr>
+        <w:pStyle w:val="Compact"/>
         <w:numPr>
           <w:ilvl w:val="1"/>
           <w:numId w:val="1015"/>
         </w:numPr>
-        <w:pStyle w:val="Compact"/>
       </w:pPr>
       <w:r>
         <w:t xml:space="preserve">Adds Medplum access to an existing login without a second interactive sign-in.</w:t>
@@ -1047,11 +1046,11 @@
     </w:p>
     <w:p>
       <w:pPr>
+        <w:pStyle w:val="Compact"/>
         <w:numPr>
           <w:ilvl w:val="1"/>
           <w:numId w:val="1015"/>
         </w:numPr>
-        <w:pStyle w:val="Compact"/>
       </w:pPr>
       <w:r>
         <w:t xml:space="preserve">Your application retains control of the external login and can use external credentials with other services that accept them.</w:t>
@@ -1059,27 +1058,27 @@
     </w:p>
     <w:p>
       <w:pPr>
+        <w:pStyle w:val="Compact"/>
         <w:numPr>
           <w:ilvl w:val="0"/>
           <w:numId w:val="1014"/>
         </w:numPr>
-        <w:pStyle w:val="Compact"/>
-      </w:pPr>
-      <w:r>
-        <w:rPr>
+      </w:pPr>
+      <w:r>
+        <w:rPr>
+          <w:b/>
           <w:bCs/>
-          <w:b/>
         </w:rPr>
         <w:t xml:space="preserve">Tradeoffs:</w:t>
       </w:r>
     </w:p>
     <w:p>
       <w:pPr>
+        <w:pStyle w:val="Compact"/>
         <w:numPr>
           <w:ilvl w:val="1"/>
           <w:numId w:val="1016"/>
         </w:numPr>
-        <w:pStyle w:val="Compact"/>
       </w:pPr>
       <w:r>
         <w:t xml:space="preserve">Requires an external access token that the IDP’s UserInfo endpoint can validate.</w:t>
@@ -1087,11 +1086,11 @@
     </w:p>
     <w:p>
       <w:pPr>
+        <w:pStyle w:val="Compact"/>
         <w:numPr>
           <w:ilvl w:val="1"/>
           <w:numId w:val="1016"/>
         </w:numPr>
-        <w:pStyle w:val="Compact"/>
       </w:pPr>
       <w:r>
         <w:t xml:space="preserve">Your application manages both external and Medplum credential lifecycles.</w:t>
@@ -1099,24 +1098,98 @@
     </w:p>
     <w:p>
       <w:pPr>
+        <w:pStyle w:val="Compact"/>
         <w:numPr>
           <w:ilvl w:val="0"/>
           <w:numId w:val="1014"/>
         </w:numPr>
-        <w:pStyle w:val="Compact"/>
-      </w:pPr>
-      <w:r>
-        <w:rPr>
+      </w:pPr>
+      <w:r>
+        <w:rPr>
+          <w:b/>
           <w:bCs/>
+        </w:rPr>
+        <w:t xml:space="preserve">Best fit:</w:t>
+      </w:r>
+      <w:r>
+        <w:t xml:space="preserve"> </w:t>
+      </w:r>
+      <w:r>
+        <w:t xml:space="preserve">Your application already obtains an external access token and needs to add Medplum access, potentially alongside other services.</w:t>
+      </w:r>
+    </w:p>
+    <w:p>
+      <w:pPr>
+        <w:pStyle w:val="FirstParagraph"/>
+      </w:pPr>
+      <w:r>
+        <w:rPr>
           <w:b/>
-        </w:rPr>
-        <w:t xml:space="preserve">Best fit:</w:t>
-      </w:r>
-      <w:r>
-        <w:t xml:space="preserve"> </w:t>
-      </w:r>
-      <w:r>
-        <w:t xml:space="preserve">Your application already obtains an external access token and needs to add Medplum access, potentially alongside other services.</w:t>
+          <w:bCs/>
+        </w:rPr>
+        <w:t xml:space="preserve">Other integrations alone do not require token exchange.</w:t>
+      </w:r>
+      <w:r>
+        <w:t xml:space="preserve"> </w:t>
+      </w:r>
+      <w:r>
+        <w:t xml:space="preserve">Integrations running in Bots or your backend with service credentials do not require the client to hold an external token.</w:t>
+      </w:r>
+    </w:p>
+    <w:p>
+      <w:pPr>
+        <w:pStyle w:val="BodyText"/>
+      </w:pPr>
+      <w:r>
+        <w:rPr>
+          <w:b/>
+          <w:bCs/>
+        </w:rPr>
+        <w:t xml:space="preserve">Select the intended membership.</w:t>
+      </w:r>
+      <w:r>
+        <w:t xml:space="preserve"> </w:t>
+      </w:r>
+      <w:r>
+        <w:t xml:space="preserve">A user can have several memberships in the client’s project. Pass</w:t>
+      </w:r>
+      <w:r>
+        <w:t xml:space="preserve"> </w:t>
+      </w:r>
+      <w:r>
+        <w:rPr>
+          <w:rStyle w:val="VerbatimChar"/>
+        </w:rPr>
+        <w:t xml:space="preserve">membership_id</w:t>
+      </w:r>
+      <w:r>
+        <w:t xml:space="preserve"> </w:t>
+      </w:r>
+      <w:r>
+        <w:t xml:space="preserve">when needed; otherwise token exchange selects the first matching membership. Bind token storage and caches to the user, selected membership, and application session so a tenant switch cannot reuse another membership’s token. Cross-project exchange has separate</w:t>
+      </w:r>
+      <w:r>
+        <w:t xml:space="preserve"> </w:t>
+      </w:r>
+      <w:hyperlink r:id="rId26">
+        <w:r>
+          <w:rPr>
+            <w:rStyle w:val="Hyperlink"/>
+          </w:rPr>
+          <w:t xml:space="preserve">server-level configuration requirements</w:t>
+        </w:r>
+      </w:hyperlink>
+      <w:r>
+        <w:t xml:space="preserve">.</w:t>
+      </w:r>
+    </w:p>
+    <w:bookmarkStart w:id="30" w:name="X95de43dca846ce5c7c9b504a509d368c636e063"/>
+    <w:p>
+      <w:pPr>
+        <w:pStyle w:val="Heading4"/>
+      </w:pPr>
+      <w:r>
+        <w:t xml:space="preserve">If you choose token exchange: where will you keep the Medplum token?</w:t>
       </w:r>
     </w:p>
     <w:p>
@@ -1124,26 +1197,29 @@
         <w:pStyle w:val="FirstParagraph"/>
       </w:pPr>
       <w:r>
-        <w:rPr>
+        <w:t xml:space="preserve">Both options below use</w:t>
+      </w:r>
+      <w:r>
+        <w:t xml:space="preserve"> </w:t>
+      </w:r>
+      <w:r>
+        <w:rPr>
+          <w:b/>
           <w:bCs/>
-          <w:b/>
-        </w:rPr>
-        <w:t xml:space="preserve">Other integrations alone do not require token exchange.</w:t>
-      </w:r>
-      <w:r>
-        <w:t xml:space="preserve"> </w:t>
-      </w:r>
-      <w:r>
-        <w:t xml:space="preserve">Integrations running in Bots or your backend with service credentials do not require the client to hold an external token.</w:t>
-      </w:r>
-    </w:p>
-    <w:bookmarkStart w:id="39" w:name="X95de43dca846ce5c7c9b504a509d368c636e063"/>
-    <w:p>
-      <w:pPr>
-        <w:pStyle w:val="Heading4"/>
-      </w:pPr>
-      <w:r>
-        <w:t xml:space="preserve">If you choose token exchange: where will you keep the Medplum token?</w:t>
+        </w:rPr>
+        <w:t xml:space="preserve">user-scoped Medplum tokens</w:t>
+      </w:r>
+      <w:r>
+        <w:t xml:space="preserve">. Choose based on whether the client should call Medplum directly or through your backend.</w:t>
+      </w:r>
+    </w:p>
+    <w:bookmarkStart w:id="27" w:name="b1-in-the-client"/>
+    <w:p>
+      <w:pPr>
+        <w:pStyle w:val="Heading5"/>
+      </w:pPr>
+      <w:r>
+        <w:t xml:space="preserve">B1: In the client</w:t>
       </w:r>
     </w:p>
     <w:p>
@@ -1151,62 +1227,32 @@
         <w:pStyle w:val="FirstParagraph"/>
       </w:pPr>
       <w:r>
-        <w:t xml:space="preserve">Both options below use</w:t>
-      </w:r>
-      <w:r>
-        <w:t xml:space="preserve"> </w:t>
-      </w:r>
-      <w:r>
-        <w:rPr>
-          <w:bCs/>
-          <w:b/>
-        </w:rPr>
-        <w:t xml:space="preserve">user-scoped Medplum tokens</w:t>
-      </w:r>
-      <w:r>
-        <w:t xml:space="preserve">. Choose based on whether the client should call Medplum directly or through your backend.</w:t>
-      </w:r>
-    </w:p>
-    <w:bookmarkStart w:id="36" w:name="b1-in-the-client"/>
-    <w:p>
-      <w:pPr>
-        <w:pStyle w:val="Heading5"/>
-      </w:pPr>
-      <w:r>
-        <w:t xml:space="preserve">B1: In the client</w:t>
-      </w:r>
-    </w:p>
-    <w:p>
-      <w:pPr>
-        <w:pStyle w:val="FirstParagraph"/>
-      </w:pPr>
-      <w:r>
         <w:t xml:space="preserve">The client retains the exchanged Medplum token and calls Medplum directly.</w:t>
       </w:r>
     </w:p>
     <w:p>
       <w:pPr>
+        <w:pStyle w:val="Compact"/>
         <w:numPr>
           <w:ilvl w:val="0"/>
           <w:numId w:val="1017"/>
         </w:numPr>
-        <w:pStyle w:val="Compact"/>
-      </w:pPr>
-      <w:r>
-        <w:rPr>
+      </w:pPr>
+      <w:r>
+        <w:rPr>
+          <w:b/>
           <w:bCs/>
-          <w:b/>
         </w:rPr>
         <w:t xml:space="preserve">Advantages:</w:t>
       </w:r>
     </w:p>
     <w:p>
       <w:pPr>
+        <w:pStyle w:val="Compact"/>
         <w:numPr>
           <w:ilvl w:val="1"/>
           <w:numId w:val="1018"/>
         </w:numPr>
-        <w:pStyle w:val="Compact"/>
       </w:pPr>
       <w:r>
         <w:t xml:space="preserve">Direct SDK, authenticated React component, and WebSocket subscription access.</w:t>
@@ -1214,11 +1260,11 @@
     </w:p>
     <w:p>
       <w:pPr>
+        <w:pStyle w:val="Compact"/>
         <w:numPr>
           <w:ilvl w:val="1"/>
           <w:numId w:val="1018"/>
         </w:numPr>
-        <w:pStyle w:val="Compact"/>
       </w:pPr>
       <w:r>
         <w:t xml:space="preserve">No application proxy for Medplum requests.</w:t>
@@ -1226,27 +1272,27 @@
     </w:p>
     <w:p>
       <w:pPr>
+        <w:pStyle w:val="Compact"/>
         <w:numPr>
           <w:ilvl w:val="0"/>
           <w:numId w:val="1017"/>
         </w:numPr>
-        <w:pStyle w:val="Compact"/>
-      </w:pPr>
-      <w:r>
-        <w:rPr>
+      </w:pPr>
+      <w:r>
+        <w:rPr>
+          <w:b/>
           <w:bCs/>
-          <w:b/>
         </w:rPr>
         <w:t xml:space="preserve">Tradeoffs:</w:t>
       </w:r>
     </w:p>
     <w:p>
       <w:pPr>
+        <w:pStyle w:val="Compact"/>
         <w:numPr>
           <w:ilvl w:val="1"/>
           <w:numId w:val="1019"/>
         </w:numPr>
-        <w:pStyle w:val="Compact"/>
       </w:pPr>
       <w:r>
         <w:t xml:space="preserve">The client manages both credentials, including expiry and logout, with storage appropriate to its platform.</w:t>
@@ -1254,16 +1300,16 @@
     </w:p>
     <w:p>
       <w:pPr>
+        <w:pStyle w:val="Compact"/>
         <w:numPr>
           <w:ilvl w:val="0"/>
           <w:numId w:val="1017"/>
         </w:numPr>
-        <w:pStyle w:val="Compact"/>
-      </w:pPr>
-      <w:r>
-        <w:rPr>
+      </w:pPr>
+      <w:r>
+        <w:rPr>
+          <w:b/>
           <w:bCs/>
-          <w:b/>
         </w:rPr>
         <w:t xml:space="preserve">Best fit:</w:t>
       </w:r>
@@ -1274,8 +1320,8 @@
         <w:t xml:space="preserve">Direct Medplum access is valuable and credentials can reside in the client.</w:t>
       </w:r>
     </w:p>
-    <w:bookmarkEnd w:id="36"/>
-    <w:bookmarkStart w:id="38" w:name="b2-on-the-server"/>
+    <w:bookmarkEnd w:id="27"/>
+    <w:bookmarkStart w:id="29" w:name="b2-on-the-server"/>
     <w:p>
       <w:pPr>
         <w:pStyle w:val="Heading5"/>
@@ -1294,27 +1340,27 @@
     </w:p>
     <w:p>
       <w:pPr>
+        <w:pStyle w:val="Compact"/>
         <w:numPr>
           <w:ilvl w:val="0"/>
           <w:numId w:val="1020"/>
         </w:numPr>
-        <w:pStyle w:val="Compact"/>
-      </w:pPr>
-      <w:r>
-        <w:rPr>
+      </w:pPr>
+      <w:r>
+        <w:rPr>
+          <w:b/>
           <w:bCs/>
-          <w:b/>
         </w:rPr>
         <w:t xml:space="preserve">Advantages:</w:t>
       </w:r>
     </w:p>
     <w:p>
       <w:pPr>
+        <w:pStyle w:val="Compact"/>
         <w:numPr>
           <w:ilvl w:val="1"/>
           <w:numId w:val="1021"/>
         </w:numPr>
-        <w:pStyle w:val="Compact"/>
       </w:pPr>
       <w:r>
         <w:t xml:space="preserve">Medplum credentials stay on the server.</w:t>
@@ -1322,11 +1368,11 @@
     </w:p>
     <w:p>
       <w:pPr>
+        <w:pStyle w:val="Compact"/>
         <w:numPr>
           <w:ilvl w:val="1"/>
           <w:numId w:val="1021"/>
         </w:numPr>
-        <w:pStyle w:val="Compact"/>
       </w:pPr>
       <w:r>
         <w:t xml:space="preserve">Fits an existing backend that coordinates multiple services, while preserving each user’s Medplum access policy.</w:t>
@@ -1334,27 +1380,27 @@
     </w:p>
     <w:p>
       <w:pPr>
+        <w:pStyle w:val="Compact"/>
         <w:numPr>
           <w:ilvl w:val="0"/>
           <w:numId w:val="1020"/>
         </w:numPr>
-        <w:pStyle w:val="Compact"/>
-      </w:pPr>
-      <w:r>
-        <w:rPr>
+      </w:pPr>
+      <w:r>
+        <w:rPr>
+          <w:b/>
           <w:bCs/>
-          <w:b/>
         </w:rPr>
         <w:t xml:space="preserve">Tradeoffs:</w:t>
       </w:r>
     </w:p>
     <w:p>
       <w:pPr>
+        <w:pStyle w:val="Compact"/>
         <w:numPr>
           <w:ilvl w:val="1"/>
           <w:numId w:val="1022"/>
         </w:numPr>
-        <w:pStyle w:val="Compact"/>
       </w:pPr>
       <w:r>
         <w:t xml:space="preserve">Your backend manages per-user tokens, renewal, and logout.</w:t>
@@ -1362,11 +1408,11 @@
     </w:p>
     <w:p>
       <w:pPr>
+        <w:pStyle w:val="Compact"/>
         <w:numPr>
           <w:ilvl w:val="1"/>
           <w:numId w:val="1022"/>
         </w:numPr>
-        <w:pStyle w:val="Compact"/>
       </w:pPr>
       <w:r>
         <w:t xml:space="preserve">Proxying adds latency and infrastructure to operate.</w:t>
@@ -1374,11 +1420,11 @@
     </w:p>
     <w:p>
       <w:pPr>
+        <w:pStyle w:val="Compact"/>
         <w:numPr>
           <w:ilvl w:val="1"/>
           <w:numId w:val="1022"/>
         </w:numPr>
-        <w:pStyle w:val="Compact"/>
       </w:pPr>
       <w:r>
         <w:t xml:space="preserve">Live updates need a backend-to-client delivery path; components expecting direct Medplum access need adaptation.</w:t>
@@ -1386,16 +1432,16 @@
     </w:p>
     <w:p>
       <w:pPr>
+        <w:pStyle w:val="Compact"/>
         <w:numPr>
           <w:ilvl w:val="0"/>
           <w:numId w:val="1020"/>
         </w:numPr>
-        <w:pStyle w:val="Compact"/>
-      </w:pPr>
-      <w:r>
-        <w:rPr>
+      </w:pPr>
+      <w:r>
+        <w:rPr>
+          <w:b/>
           <w:bCs/>
-          <w:b/>
         </w:rPr>
         <w:t xml:space="preserve">Best fit:</w:t>
       </w:r>
@@ -1416,7 +1462,7 @@
       <w:r>
         <w:t xml:space="preserve"> </w:t>
       </w:r>
-      <w:hyperlink r:id="rId37">
+      <w:hyperlink r:id="rId28">
         <w:r>
           <w:rPr>
             <w:rStyle w:val="Hyperlink"/>
@@ -1428,10 +1474,10 @@
         <w:t xml:space="preserve">.</w:t>
       </w:r>
     </w:p>
-    <w:bookmarkEnd w:id="38"/>
-    <w:bookmarkEnd w:id="39"/>
-    <w:bookmarkEnd w:id="40"/>
-    <w:bookmarkStart w:id="42" w:name="Xa8cebc728b0703db1ecaf2949140c77970671c8"/>
+    <w:bookmarkEnd w:id="29"/>
+    <w:bookmarkEnd w:id="30"/>
+    <w:bookmarkEnd w:id="31"/>
+    <w:bookmarkStart w:id="33" w:name="Xa8cebc728b0703db1ecaf2949140c77970671c8"/>
     <w:p>
       <w:pPr>
         <w:pStyle w:val="Heading3"/>
@@ -1459,27 +1505,27 @@
     </w:p>
     <w:p>
       <w:pPr>
+        <w:pStyle w:val="Compact"/>
         <w:numPr>
           <w:ilvl w:val="0"/>
           <w:numId w:val="1023"/>
         </w:numPr>
-        <w:pStyle w:val="Compact"/>
-      </w:pPr>
-      <w:r>
-        <w:rPr>
+      </w:pPr>
+      <w:r>
+        <w:rPr>
+          <w:b/>
           <w:bCs/>
-          <w:b/>
         </w:rPr>
         <w:t xml:space="preserve">Advantages:</w:t>
       </w:r>
     </w:p>
     <w:p>
       <w:pPr>
+        <w:pStyle w:val="Compact"/>
         <w:numPr>
           <w:ilvl w:val="1"/>
           <w:numId w:val="1024"/>
         </w:numPr>
-        <w:pStyle w:val="Compact"/>
       </w:pPr>
       <w:r>
         <w:t xml:space="preserve">Supports a backend that owns authentication without requiring external user tokens that Medplum can exchange.</w:t>
@@ -1487,11 +1533,11 @@
     </w:p>
     <w:p>
       <w:pPr>
+        <w:pStyle w:val="Compact"/>
         <w:numPr>
           <w:ilvl w:val="1"/>
           <w:numId w:val="1024"/>
         </w:numPr>
-        <w:pStyle w:val="Compact"/>
       </w:pPr>
       <w:r>
         <w:t xml:space="preserve">Preserves user-level access policies and attribution with one application credential.</w:t>
@@ -1499,51 +1545,78 @@
     </w:p>
     <w:p>
       <w:pPr>
+        <w:pStyle w:val="Compact"/>
         <w:numPr>
           <w:ilvl w:val="0"/>
           <w:numId w:val="1023"/>
         </w:numPr>
-        <w:pStyle w:val="Compact"/>
-      </w:pPr>
-      <w:r>
-        <w:rPr>
+      </w:pPr>
+      <w:r>
+        <w:rPr>
+          <w:b/>
           <w:bCs/>
-          <w:b/>
         </w:rPr>
         <w:t xml:space="preserve">Tradeoffs:</w:t>
       </w:r>
     </w:p>
     <w:p>
       <w:pPr>
+        <w:pStyle w:val="Compact"/>
         <w:numPr>
           <w:ilvl w:val="1"/>
           <w:numId w:val="1025"/>
         </w:numPr>
-        <w:pStyle w:val="Compact"/>
-      </w:pPr>
-      <w:r>
-        <w:t xml:space="preserve">Your backend must maintain user mappings and apply the correct user context to every request.</w:t>
-      </w:r>
-    </w:p>
-    <w:p>
-      <w:pPr>
+      </w:pPr>
+      <w:r>
+        <w:t xml:space="preserve">The backend’s</w:t>
+      </w:r>
+      <w:r>
+        <w:t xml:space="preserve"> </w:t>
+      </w:r>
+      <w:r>
+        <w:rPr>
+          <w:rStyle w:val="VerbatimChar"/>
+        </w:rPr>
+        <w:t xml:space="preserve">ClientApplication</w:t>
+      </w:r>
+      <w:r>
+        <w:t xml:space="preserve"> </w:t>
+      </w:r>
+      <w:r>
+        <w:t xml:space="preserve">requires Project Admin authority. Treat its credential as privileged.</w:t>
+      </w:r>
+    </w:p>
+    <w:p>
+      <w:pPr>
+        <w:pStyle w:val="Compact"/>
         <w:numPr>
           <w:ilvl w:val="1"/>
           <w:numId w:val="1025"/>
         </w:numPr>
-        <w:pStyle w:val="Compact"/>
-      </w:pPr>
-      <w:r>
-        <w:t xml:space="preserve">Proxying adds latency and infrastructure to operate.</w:t>
-      </w:r>
-    </w:p>
-    <w:p>
-      <w:pPr>
+      </w:pPr>
+      <w:r>
+        <w:t xml:space="preserve">Your backend must authorize each requested user context and reject missing or unauthorized contexts before calling Medplum; a request without the On-Behalf-Of header uses the application’s own permissions.</w:t>
+      </w:r>
+    </w:p>
+    <w:p>
+      <w:pPr>
+        <w:pStyle w:val="Compact"/>
         <w:numPr>
           <w:ilvl w:val="1"/>
           <w:numId w:val="1025"/>
         </w:numPr>
-        <w:pStyle w:val="Compact"/>
+      </w:pPr>
+      <w:r>
+        <w:t xml:space="preserve">Proxying adds latency and infrastructure to operate.</w:t>
+      </w:r>
+    </w:p>
+    <w:p>
+      <w:pPr>
+        <w:pStyle w:val="Compact"/>
+        <w:numPr>
+          <w:ilvl w:val="1"/>
+          <w:numId w:val="1025"/>
+        </w:numPr>
       </w:pPr>
       <w:r>
         <w:t xml:space="preserve">Medplum WebSocket subscriptions do not support this On-Behalf-Of pattern.</w:t>
@@ -1551,16 +1624,16 @@
     </w:p>
     <w:p>
       <w:pPr>
+        <w:pStyle w:val="Compact"/>
         <w:numPr>
           <w:ilvl w:val="0"/>
           <w:numId w:val="1023"/>
         </w:numPr>
-        <w:pStyle w:val="Compact"/>
-      </w:pPr>
-      <w:r>
-        <w:rPr>
+      </w:pPr>
+      <w:r>
+        <w:rPr>
+          <w:b/>
           <w:bCs/>
-          <w:b/>
         </w:rPr>
         <w:t xml:space="preserve">Best fit:</w:t>
       </w:r>
@@ -1589,7 +1662,7 @@
       <w:r>
         <w:t xml:space="preserve"> </w:t>
       </w:r>
-      <w:hyperlink r:id="rId41">
+      <w:hyperlink r:id="rId32">
         <w:r>
           <w:rPr>
             <w:rStyle w:val="Hyperlink"/>
@@ -1607,8 +1680,8 @@
       </w:pPr>
       <w:r>
         <w:rPr>
+          <w:b/>
           <w:bCs/>
-          <w:b/>
         </w:rPr>
         <w:t xml:space="preserve">Next:</w:t>
       </w:r>
@@ -1633,9 +1706,9 @@
         <w:t xml:space="preserve">.</w:t>
       </w:r>
     </w:p>
-    <w:bookmarkEnd w:id="42"/>
-    <w:bookmarkEnd w:id="43"/>
-    <w:bookmarkStart w:id="50" w:name="Xa2fe8c07881eb9416283f05100480535a9d42e6"/>
+    <w:bookmarkEnd w:id="33"/>
+    <w:bookmarkEnd w:id="34"/>
+    <w:bookmarkStart w:id="41" w:name="Xa2fe8c07881eb9416283f05100480535a9d42e6"/>
     <w:p>
       <w:pPr>
         <w:pStyle w:val="Heading2"/>
@@ -1650,8 +1723,8 @@
       </w:pPr>
       <w:r>
         <w:rPr>
+          <w:b/>
           <w:bCs/>
-          <w:b/>
         </w:rPr>
         <w:t xml:space="preserve">For external IDP authorization-code flow or token exchange.</w:t>
       </w:r>
@@ -1662,7 +1735,7 @@
         <w:t xml:space="preserve">Choose which identifier connects the external login to the correct Medplum account.</w:t>
       </w:r>
     </w:p>
-    <w:bookmarkStart w:id="44" w:name="option-a-email-matching"/>
+    <w:bookmarkStart w:id="35" w:name="option-a-email-matching"/>
     <w:p>
       <w:pPr>
         <w:pStyle w:val="Heading3"/>
@@ -1681,27 +1754,27 @@
     </w:p>
     <w:p>
       <w:pPr>
+        <w:pStyle w:val="Compact"/>
         <w:numPr>
           <w:ilvl w:val="0"/>
           <w:numId w:val="1026"/>
         </w:numPr>
-        <w:pStyle w:val="Compact"/>
-      </w:pPr>
-      <w:r>
-        <w:rPr>
+      </w:pPr>
+      <w:r>
+        <w:rPr>
+          <w:b/>
           <w:bCs/>
-          <w:b/>
         </w:rPr>
         <w:t xml:space="preserve">Advantages:</w:t>
       </w:r>
     </w:p>
     <w:p>
       <w:pPr>
+        <w:pStyle w:val="Compact"/>
         <w:numPr>
           <w:ilvl w:val="1"/>
           <w:numId w:val="1027"/>
         </w:numPr>
-        <w:pStyle w:val="Compact"/>
       </w:pPr>
       <w:r>
         <w:t xml:space="preserve">Simple when each person has a distinct email and changes are infrequent.</w:t>
@@ -1709,27 +1782,27 @@
     </w:p>
     <w:p>
       <w:pPr>
+        <w:pStyle w:val="Compact"/>
         <w:numPr>
           <w:ilvl w:val="0"/>
           <w:numId w:val="1026"/>
         </w:numPr>
-        <w:pStyle w:val="Compact"/>
-      </w:pPr>
-      <w:r>
-        <w:rPr>
+      </w:pPr>
+      <w:r>
+        <w:rPr>
+          <w:b/>
           <w:bCs/>
-          <w:b/>
         </w:rPr>
         <w:t xml:space="preserve">Tradeoffs:</w:t>
       </w:r>
     </w:p>
     <w:p>
       <w:pPr>
+        <w:pStyle w:val="Compact"/>
         <w:numPr>
           <w:ilvl w:val="1"/>
           <w:numId w:val="1028"/>
         </w:numPr>
-        <w:pStyle w:val="Compact"/>
       </w:pPr>
       <w:r>
         <w:t xml:space="preserve">Email changes require updating the Medplum login account, not just the clinical profile’s contact email.</w:t>
@@ -1737,11 +1810,11 @@
     </w:p>
     <w:p>
       <w:pPr>
+        <w:pStyle w:val="Compact"/>
         <w:numPr>
           <w:ilvl w:val="1"/>
           <w:numId w:val="1028"/>
         </w:numPr>
-        <w:pStyle w:val="Compact"/>
       </w:pPr>
       <w:r>
         <w:t xml:space="preserve">Shared email addresses cannot distinguish separate people.</w:t>
@@ -1749,16 +1822,16 @@
     </w:p>
     <w:p>
       <w:pPr>
+        <w:pStyle w:val="Compact"/>
         <w:numPr>
           <w:ilvl w:val="0"/>
           <w:numId w:val="1026"/>
         </w:numPr>
-        <w:pStyle w:val="Compact"/>
-      </w:pPr>
-      <w:r>
-        <w:rPr>
+      </w:pPr>
+      <w:r>
+        <w:rPr>
+          <w:b/>
           <w:bCs/>
-          <w:b/>
         </w:rPr>
         <w:t xml:space="preserve">Best fit:</w:t>
       </w:r>
@@ -1769,8 +1842,8 @@
         <w:t xml:space="preserve">Distinct emails and manageable account updates. An external IDP alone is not a reason to change the matching key.</w:t>
       </w:r>
     </w:p>
-    <w:bookmarkEnd w:id="44"/>
-    <w:bookmarkStart w:id="49" w:name="option-b-external-id-matching"/>
+    <w:bookmarkEnd w:id="35"/>
+    <w:bookmarkStart w:id="40" w:name="option-b-external-id-matching"/>
     <w:p>
       <w:pPr>
         <w:pStyle w:val="Heading3"/>
@@ -1804,7 +1877,7 @@
       <w:r>
         <w:t xml:space="preserve"> </w:t>
       </w:r>
-      <w:hyperlink r:id="rId45">
+      <w:hyperlink r:id="rId36">
         <w:r>
           <w:rPr>
             <w:rStyle w:val="Hyperlink"/>
@@ -1818,27 +1891,62 @@
     </w:p>
     <w:p>
       <w:pPr>
+        <w:pStyle w:val="BodyText"/>
+      </w:pPr>
+      <w:r>
+        <w:t xml:space="preserve">For token exchange with</w:t>
+      </w:r>
+      <w:r>
+        <w:t xml:space="preserve"> </w:t>
+      </w:r>
+      <w:r>
+        <w:rPr>
+          <w:rStyle w:val="VerbatimChar"/>
+        </w:rPr>
+        <w:t xml:space="preserve">useSubject</w:t>
+      </w:r>
+      <w:r>
+        <w:t xml:space="preserve">, provision the complete</w:t>
+      </w:r>
+      <w:r>
+        <w:t xml:space="preserve"> </w:t>
+      </w:r>
+      <w:r>
+        <w:rPr>
+          <w:rStyle w:val="VerbatimChar"/>
+        </w:rPr>
+        <w:t xml:space="preserve">sub</w:t>
+      </w:r>
+      <w:r>
+        <w:t xml:space="preserve"> </w:t>
+      </w:r>
+      <w:r>
+        <w:t xml:space="preserve">value, including any provider prefix. Do not strip an Auth0 prefix or otherwise transform it independently of the login flow.</w:t>
+      </w:r>
+    </w:p>
+    <w:p>
+      <w:pPr>
+        <w:pStyle w:val="Compact"/>
         <w:numPr>
           <w:ilvl w:val="0"/>
           <w:numId w:val="1029"/>
         </w:numPr>
-        <w:pStyle w:val="Compact"/>
-      </w:pPr>
-      <w:r>
-        <w:rPr>
+      </w:pPr>
+      <w:r>
+        <w:rPr>
+          <w:b/>
           <w:bCs/>
-          <w:b/>
         </w:rPr>
         <w:t xml:space="preserve">Advantages:</w:t>
       </w:r>
     </w:p>
     <w:p>
       <w:pPr>
+        <w:pStyle w:val="Compact"/>
         <w:numPr>
           <w:ilvl w:val="1"/>
           <w:numId w:val="1030"/>
         </w:numPr>
-        <w:pStyle w:val="Compact"/>
       </w:pPr>
       <w:r>
         <w:t xml:space="preserve">Identity remains stable when contact email changes.</w:t>
@@ -1846,11 +1954,11 @@
     </w:p>
     <w:p>
       <w:pPr>
+        <w:pStyle w:val="Compact"/>
         <w:numPr>
           <w:ilvl w:val="1"/>
           <w:numId w:val="1030"/>
         </w:numPr>
-        <w:pStyle w:val="Compact"/>
       </w:pPr>
       <w:r>
         <w:t xml:space="preserve">Separate people can have distinct identities even if they share a contact email.</w:t>
@@ -1858,27 +1966,27 @@
     </w:p>
     <w:p>
       <w:pPr>
+        <w:pStyle w:val="Compact"/>
         <w:numPr>
           <w:ilvl w:val="0"/>
           <w:numId w:val="1029"/>
         </w:numPr>
-        <w:pStyle w:val="Compact"/>
-      </w:pPr>
-      <w:r>
-        <w:rPr>
+      </w:pPr>
+      <w:r>
+        <w:rPr>
+          <w:b/>
           <w:bCs/>
-          <w:b/>
         </w:rPr>
         <w:t xml:space="preserve">Tradeoffs:</w:t>
       </w:r>
     </w:p>
     <w:p>
       <w:pPr>
+        <w:pStyle w:val="Compact"/>
         <w:numPr>
           <w:ilvl w:val="1"/>
           <w:numId w:val="1031"/>
         </w:numPr>
-        <w:pStyle w:val="Compact"/>
       </w:pPr>
       <w:r>
         <w:t xml:space="preserve">Provisioning and login must agree on the identifier; changing IDPs requires a migration plan.</w:t>
@@ -1886,16 +1994,16 @@
     </w:p>
     <w:p>
       <w:pPr>
+        <w:pStyle w:val="Compact"/>
         <w:numPr>
           <w:ilvl w:val="0"/>
           <w:numId w:val="1029"/>
         </w:numPr>
-        <w:pStyle w:val="Compact"/>
-      </w:pPr>
-      <w:r>
-        <w:rPr>
+      </w:pPr>
+      <w:r>
+        <w:rPr>
+          <w:b/>
           <w:bCs/>
-          <w:b/>
         </w:rPr>
         <w:t xml:space="preserve">Best fit:</w:t>
       </w:r>
@@ -1916,7 +2024,7 @@
       <w:r>
         <w:t xml:space="preserve"> </w:t>
       </w:r>
-      <w:hyperlink r:id="rId46">
+      <w:hyperlink r:id="rId37">
         <w:r>
           <w:rPr>
             <w:rStyle w:val="Hyperlink"/>
@@ -1941,7 +2049,7 @@
       <w:r>
         <w:t xml:space="preserve"> </w:t>
       </w:r>
-      <w:hyperlink r:id="rId47">
+      <w:hyperlink r:id="rId38">
         <w:r>
           <w:rPr>
             <w:rStyle w:val="Hyperlink"/>
@@ -1955,7 +2063,7 @@
       <w:r>
         <w:t xml:space="preserve"> </w:t>
       </w:r>
-      <w:hyperlink r:id="rId48">
+      <w:hyperlink r:id="rId39">
         <w:r>
           <w:rPr>
             <w:rStyle w:val="Hyperlink"/>
@@ -1967,9 +2075,9 @@
         <w:t xml:space="preserve">.</w:t>
       </w:r>
     </w:p>
-    <w:bookmarkEnd w:id="49"/>
-    <w:bookmarkEnd w:id="50"/>
-    <w:bookmarkStart w:id="58" w:name="before-you-implement"/>
+    <w:bookmarkEnd w:id="40"/>
+    <w:bookmarkEnd w:id="41"/>
+    <w:bookmarkStart w:id="50" w:name="before-you-implement"/>
     <w:p>
       <w:pPr>
         <w:pStyle w:val="Heading2"/>
@@ -1978,7 +2086,7 @@
         <w:t xml:space="preserve">Before You Implement</w:t>
       </w:r>
     </w:p>
-    <w:bookmarkStart w:id="53" w:name="how-will-users-join-your-application"/>
+    <w:bookmarkStart w:id="44" w:name="how-will-users-join-your-application"/>
     <w:p>
       <w:pPr>
         <w:pStyle w:val="Heading3"/>
@@ -2057,7 +2165,7 @@
       <w:r>
         <w:t xml:space="preserve"> </w:t>
       </w:r>
-      <w:hyperlink r:id="rId45">
+      <w:hyperlink r:id="rId36">
         <w:r>
           <w:rPr>
             <w:rStyle w:val="Hyperlink"/>
@@ -2074,7 +2182,7 @@
       <w:r>
         <w:t xml:space="preserve"> </w:t>
       </w:r>
-      <w:hyperlink r:id="rId46">
+      <w:hyperlink r:id="rId37">
         <w:r>
           <w:rPr>
             <w:rStyle w:val="Hyperlink"/>
@@ -2091,7 +2199,7 @@
       <w:r>
         <w:t xml:space="preserve"> </w:t>
       </w:r>
-      <w:hyperlink r:id="rId51">
+      <w:hyperlink r:id="rId42">
         <w:r>
           <w:rPr>
             <w:rStyle w:val="Hyperlink"/>
@@ -2113,7 +2221,7 @@
       <w:r>
         <w:t xml:space="preserve"> </w:t>
       </w:r>
-      <w:hyperlink r:id="rId52">
+      <w:hyperlink r:id="rId43">
         <w:r>
           <w:rPr>
             <w:rStyle w:val="Hyperlink"/>
@@ -2128,8 +2236,8 @@
         <w:t xml:space="preserve">based on whether identities belong to one project or need access across projects. For patient and caregiver applications, give each person their own identity and explicitly grant access to the appropriate records.</w:t>
       </w:r>
     </w:p>
-    <w:bookmarkEnd w:id="53"/>
-    <w:bookmarkStart w:id="57" w:name="who-manages-mfa-recovery-and-logout"/>
+    <w:bookmarkEnd w:id="44"/>
+    <w:bookmarkStart w:id="49" w:name="who-manages-mfa-recovery-and-logout"/>
     <w:p>
       <w:pPr>
         <w:pStyle w:val="Heading3"/>
@@ -2151,12 +2259,37 @@
         <w:pStyle w:val="BodyText"/>
       </w:pPr>
       <w:r>
+        <w:t xml:space="preserve">Medplum’s</w:t>
+      </w:r>
+      <w:r>
+        <w:t xml:space="preserve"> </w:t>
+      </w:r>
+      <w:hyperlink r:id="rId45">
+        <w:r>
+          <w:rPr>
+            <w:rStyle w:val="Hyperlink"/>
+          </w:rPr>
+          <w:t xml:space="preserve">MFA settings flows</w:t>
+        </w:r>
+      </w:hyperlink>
+      <w:r>
+        <w:t xml:space="preserve"> </w:t>
+      </w:r>
+      <w:r>
+        <w:t xml:space="preserve">require an authenticated human user without SMART resource scopes and do not accept On-Behalf-Of. If the app uses SMART-scoped clinical access, plan a supported user authentication context for account settings. Test both flows separately.</w:t>
+      </w:r>
+    </w:p>
+    <w:p>
+      <w:pPr>
+        <w:pStyle w:val="BodyText"/>
+      </w:pPr>
+      <w:r>
         <w:t xml:space="preserve">Implementation:</w:t>
       </w:r>
       <w:r>
         <w:t xml:space="preserve"> </w:t>
       </w:r>
-      <w:hyperlink r:id="rId54">
+      <w:hyperlink r:id="rId46">
         <w:r>
           <w:rPr>
             <w:rStyle w:val="Hyperlink"/>
@@ -2170,7 +2303,7 @@
       <w:r>
         <w:t xml:space="preserve"> </w:t>
       </w:r>
-      <w:hyperlink r:id="rId55">
+      <w:hyperlink r:id="rId47">
         <w:r>
           <w:rPr>
             <w:rStyle w:val="Hyperlink"/>
@@ -2184,7 +2317,7 @@
       <w:r>
         <w:t xml:space="preserve"> </w:t>
       </w:r>
-      <w:hyperlink r:id="rId56">
+      <w:hyperlink r:id="rId48">
         <w:r>
           <w:rPr>
             <w:rStyle w:val="Hyperlink"/>
@@ -2204,9 +2337,9 @@
         <w:t xml:space="preserve">Record your choices for each population. Test sign-in, account changes, recovery, token expiry, logout, and offboarding. If your backend mediates access, also verify that requests use the correct user’s context and fail when that context is missing.</w:t>
       </w:r>
     </w:p>
-    <w:bookmarkEnd w:id="57"/>
-    <w:bookmarkEnd w:id="58"/>
-    <w:bookmarkEnd w:id="59"/>
+    <w:bookmarkEnd w:id="49"/>
+    <w:bookmarkEnd w:id="50"/>
+    <w:bookmarkEnd w:id="51"/>
     <w:sectPr>
       <w:pgSz w:h="15840" w:w="12240"/>
       <w:pgMar w:bottom="1440" w:footer="720" w:gutter="0" w:header="720" w:left="1440" w:right="1440" w:top="1440"/>
@@ -2244,14 +2377,14 @@
 <file path=word/numbering.xml><?xml version="1.0" encoding="utf-8"?>
 <w:numbering xmlns:w="http://schemas.openxmlformats.org/wordprocessingml/2006/main">
   <w:abstractNum w:abstractNumId="990">
-    <w:nsid w:val="A990"/>
+    <w:nsid w:val="0000A990"/>
     <w:multiLevelType w:val="multilevel"/>
     <w:lvl w:ilvl="0">
       <w:numFmt w:val="bullet"/>
       <w:lvlText w:val=" "/>
       <w:lvlJc w:val="left"/>
       <w:pPr>
-        <w:ind w:left="720" w:hanging="480"/>
+        <w:ind w:left="720" w:hanging="360"/>
       </w:pPr>
     </w:lvl>
     <w:lvl w:ilvl="1">
@@ -2259,7 +2392,7 @@
       <w:lvlText w:val=" "/>
       <w:lvlJc w:val="left"/>
       <w:pPr>
-        <w:ind w:left="1440" w:hanging="480"/>
+        <w:ind w:left="1440" w:hanging="360"/>
       </w:pPr>
     </w:lvl>
     <w:lvl w:ilvl="2">
@@ -2267,7 +2400,7 @@
       <w:lvlText w:val=" "/>
       <w:lvlJc w:val="left"/>
       <w:pPr>
-        <w:ind w:left="2160" w:hanging="480"/>
+        <w:ind w:left="2160" w:hanging="360"/>
       </w:pPr>
     </w:lvl>
     <w:lvl w:ilvl="3">
@@ -2275,7 +2408,7 @@
       <w:lvlText w:val=" "/>
       <w:lvlJc w:val="left"/>
       <w:pPr>
-        <w:ind w:left="2880" w:hanging="480"/>
+        <w:ind w:left="2880" w:hanging="360"/>
       </w:pPr>
     </w:lvl>
     <w:lvl w:ilvl="4">
@@ -2283,7 +2416,7 @@
       <w:lvlText w:val=" "/>
       <w:lvlJc w:val="left"/>
       <w:pPr>
-        <w:ind w:left="3600" w:hanging="480"/>
+        <w:ind w:left="3600" w:hanging="360"/>
       </w:pPr>
     </w:lvl>
     <w:lvl w:ilvl="5">
@@ -2291,7 +2424,7 @@
       <w:lvlText w:val=" "/>
       <w:lvlJc w:val="left"/>
       <w:pPr>
-        <w:ind w:left="4320" w:hanging="480"/>
+        <w:ind w:left="4320" w:hanging="360"/>
       </w:pPr>
     </w:lvl>
     <w:lvl w:ilvl="6">
@@ -2299,7 +2432,7 @@
       <w:lvlText w:val=" "/>
       <w:lvlJc w:val="left"/>
       <w:pPr>
-        <w:ind w:left="5040" w:hanging="480"/>
+        <w:ind w:left="5040" w:hanging="360"/>
       </w:pPr>
     </w:lvl>
     <w:lvl w:ilvl="7">
@@ -2307,7 +2440,7 @@
       <w:lvlText w:val=" "/>
       <w:lvlJc w:val="left"/>
       <w:pPr>
-        <w:ind w:left="5760" w:hanging="480"/>
+        <w:ind w:left="5760" w:hanging="360"/>
       </w:pPr>
     </w:lvl>
     <w:lvl w:ilvl="8">
@@ -2315,12 +2448,12 @@
       <w:lvlText w:val=" "/>
       <w:lvlJc w:val="left"/>
       <w:pPr>
-        <w:ind w:left="6480" w:hanging="480"/>
+        <w:ind w:left="6480" w:hanging="360"/>
       </w:pPr>
     </w:lvl>
   </w:abstractNum>
   <w:abstractNum w:abstractNumId="99411">
-    <w:nsid w:val="A99411"/>
+    <w:nsid w:val="00A99411"/>
     <w:multiLevelType w:val="multilevel"/>
     <w:lvl w:ilvl="0">
       <w:start w:val="1"/>
@@ -2328,7 +2461,7 @@
       <w:lvlText w:val="%1."/>
       <w:lvlJc w:val="left"/>
       <w:pPr>
-        <w:ind w:left="720" w:hanging="480"/>
+        <w:ind w:left="720" w:hanging="360"/>
       </w:pPr>
     </w:lvl>
     <w:lvl w:ilvl="1">
@@ -2337,7 +2470,7 @@
       <w:lvlText w:val="%2."/>
       <w:lvlJc w:val="left"/>
       <w:pPr>
-        <w:ind w:left="1440" w:hanging="480"/>
+        <w:ind w:left="1440" w:hanging="360"/>
       </w:pPr>
     </w:lvl>
     <w:lvl w:ilvl="2">
@@ -2346,7 +2479,7 @@
       <w:lvlText w:val="%3."/>
       <w:lvlJc w:val="left"/>
       <w:pPr>
-        <w:ind w:left="2160" w:hanging="480"/>
+        <w:ind w:left="2160" w:hanging="360"/>
       </w:pPr>
     </w:lvl>
     <w:lvl w:ilvl="3">
@@ -2355,7 +2488,7 @@
       <w:lvlText w:val="%4."/>
       <w:lvlJc w:val="left"/>
       <w:pPr>
-        <w:ind w:left="2880" w:hanging="480"/>
+        <w:ind w:left="2880" w:hanging="360"/>
       </w:pPr>
     </w:lvl>
     <w:lvl w:ilvl="4">
@@ -2364,7 +2497,7 @@
       <w:lvlText w:val="%5."/>
       <w:lvlJc w:val="left"/>
       <w:pPr>
-        <w:ind w:left="3600" w:hanging="480"/>
+        <w:ind w:left="3600" w:hanging="360"/>
       </w:pPr>
     </w:lvl>
     <w:lvl w:ilvl="5">
@@ -2373,7 +2506,7 @@
       <w:lvlText w:val="%6."/>
       <w:lvlJc w:val="left"/>
       <w:pPr>
-        <w:ind w:left="4320" w:hanging="480"/>
+        <w:ind w:left="4320" w:hanging="360"/>
       </w:pPr>
     </w:lvl>
     <w:lvl w:ilvl="6">
@@ -2382,7 +2515,7 @@
       <w:lvlText w:val="%7."/>
       <w:lvlJc w:val="left"/>
       <w:pPr>
-        <w:ind w:left="5040" w:hanging="480"/>
+        <w:ind w:left="5040" w:hanging="360"/>
       </w:pPr>
     </w:lvl>
     <w:lvl w:ilvl="7">
@@ -2391,7 +2524,7 @@
       <w:lvlText w:val="%8."/>
       <w:lvlJc w:val="left"/>
       <w:pPr>
-        <w:ind w:left="5760" w:hanging="480"/>
+        <w:ind w:left="5760" w:hanging="360"/>
       </w:pPr>
     </w:lvl>
     <w:lvl w:ilvl="8">
@@ -2400,84 +2533,111 @@
       <w:lvlText w:val="%9."/>
       <w:lvlJc w:val="left"/>
       <w:pPr>
-        <w:ind w:left="6480" w:hanging="480"/>
+        <w:ind w:left="6480" w:hanging="360"/>
       </w:pPr>
     </w:lvl>
   </w:abstractNum>
   <w:abstractNum w:abstractNumId="991">
-    <w:nsid w:val="A991"/>
+    <w:nsid w:val="0000A991"/>
     <w:multiLevelType w:val="multilevel"/>
     <w:lvl w:ilvl="0">
       <w:numFmt w:val="bullet"/>
-      <w:lvlText w:val="•"/>
+      <w:lvlText w:val=""/>
       <w:lvlJc w:val="left"/>
       <w:pPr>
-        <w:ind w:left="720" w:hanging="480"/>
-      </w:pPr>
+        <w:ind w:left="720" w:hanging="360"/>
+      </w:pPr>
+      <w:rPr>
+        <w:rFonts w:ascii="Symbol" w:hAnsi="Symbol" w:cs="Symbol" w:hint="default"/>
+      </w:rPr>
     </w:lvl>
     <w:lvl w:ilvl="1">
       <w:numFmt w:val="bullet"/>
-      <w:lvlText w:val="–"/>
+      <w:lvlText w:val="o"/>
       <w:lvlJc w:val="left"/>
       <w:pPr>
-        <w:ind w:left="1440" w:hanging="480"/>
-      </w:pPr>
+        <w:ind w:left="1440" w:hanging="360"/>
+      </w:pPr>
+      <w:rPr>
+        <w:rFonts w:ascii="Courier New" w:hAnsi="Courier New" w:cs="Courier New" w:hint="default"/>
+      </w:rPr>
     </w:lvl>
     <w:lvl w:ilvl="2">
       <w:numFmt w:val="bullet"/>
-      <w:lvlText w:val="•"/>
+      <w:lvlText w:val=""/>
       <w:lvlJc w:val="left"/>
       <w:pPr>
-        <w:ind w:left="2160" w:hanging="480"/>
-      </w:pPr>
+        <w:ind w:left="2160" w:hanging="360"/>
+      </w:pPr>
+      <w:rPr>
+        <w:rFonts w:ascii="Wingdings" w:hAnsi="Wingdings" w:cs="Wingdings" w:hint="default"/>
+      </w:rPr>
     </w:lvl>
     <w:lvl w:ilvl="3">
       <w:numFmt w:val="bullet"/>
-      <w:lvlText w:val="–"/>
+      <w:lvlText w:val=""/>
       <w:lvlJc w:val="left"/>
       <w:pPr>
-        <w:ind w:left="2880" w:hanging="480"/>
-      </w:pPr>
+        <w:ind w:left="2880" w:hanging="360"/>
+      </w:pPr>
+      <w:rPr>
+        <w:rFonts w:ascii="Symbol" w:hAnsi="Symbol" w:cs="Symbol" w:hint="default"/>
+      </w:rPr>
     </w:lvl>
     <w:lvl w:ilvl="4">
       <w:numFmt w:val="bullet"/>
-      <w:lvlText w:val="•"/>
+      <w:lvlText w:val="o"/>
       <w:lvlJc w:val="left"/>
       <w:pPr>
-        <w:ind w:left="3600" w:hanging="480"/>
-      </w:pPr>
+        <w:ind w:left="3600" w:hanging="360"/>
+      </w:pPr>
+      <w:rPr>
+        <w:rFonts w:ascii="Courier New" w:hAnsi="Courier New" w:cs="Courier New" w:hint="default"/>
+      </w:rPr>
     </w:lvl>
     <w:lvl w:ilvl="5">
       <w:numFmt w:val="bullet"/>
-      <w:lvlText w:val="–"/>
+      <w:lvlText w:val=""/>
       <w:lvlJc w:val="left"/>
       <w:pPr>
-        <w:ind w:left="4320" w:hanging="480"/>
-      </w:pPr>
+        <w:ind w:left="4320" w:hanging="360"/>
+      </w:pPr>
+      <w:rPr>
+        <w:rFonts w:ascii="Wingdings" w:hAnsi="Wingdings" w:cs="Wingdings" w:hint="default"/>
+      </w:rPr>
     </w:lvl>
     <w:lvl w:ilvl="6">
       <w:numFmt w:val="bullet"/>
-      <w:lvlText w:val="•"/>
+      <w:lvlText w:val=""/>
       <w:lvlJc w:val="left"/>
       <w:pPr>
-        <w:ind w:left="5040" w:hanging="480"/>
-      </w:pPr>
+        <w:ind w:left="5040" w:hanging="360"/>
+      </w:pPr>
+      <w:rPr>
+        <w:rFonts w:ascii="Symbol" w:hAnsi="Symbol" w:cs="Symbol" w:hint="default"/>
+      </w:rPr>
     </w:lvl>
     <w:lvl w:ilvl="7">
       <w:numFmt w:val="bullet"/>
-      <w:lvlText w:val="–"/>
+      <w:lvlText w:val="o"/>
       <w:lvlJc w:val="left"/>
       <w:pPr>
-        <w:ind w:left="5760" w:hanging="480"/>
-      </w:pPr>
+        <w:ind w:left="5760" w:hanging="360"/>
+      </w:pPr>
+      <w:rPr>
+        <w:rFonts w:ascii="Courier New" w:hAnsi="Courier New" w:cs="Courier New" w:hint="default"/>
+      </w:rPr>
     </w:lvl>
     <w:lvl w:ilvl="8">
       <w:numFmt w:val="bullet"/>
-      <w:lvlText w:val="•"/>
+      <w:lvlText w:val=""/>
       <w:lvlJc w:val="left"/>
       <w:pPr>
-        <w:ind w:left="6480" w:hanging="480"/>
-      </w:pPr>
+        <w:ind w:left="6480" w:hanging="360"/>
+      </w:pPr>
+      <w:rPr>
+        <w:rFonts w:ascii="Wingdings" w:hAnsi="Wingdings" w:cs="Wingdings" w:hint="default"/>
+      </w:rPr>
     </w:lvl>
   </w:abstractNum>
   <w:num w:numId="1000">
@@ -3282,8 +3442,8 @@
     <w:name w:val="KeywordTok"/>
     <w:basedOn w:val="VerbatimChar"/>
     <w:rPr>
+      <w:b/>
       <w:color w:val="007020"/>
-      <w:b/>
     </w:rPr>
   </w:style>
   <w:style w:type="character" w:customStyle="1" w:styleId="DataTypeTok">
@@ -3360,42 +3520,42 @@
     <w:name w:val="ImportTok"/>
     <w:basedOn w:val="VerbatimChar"/>
     <w:rPr>
+      <w:b/>
       <w:color w:val="008000"/>
-      <w:b/>
     </w:rPr>
   </w:style>
   <w:style w:type="character" w:customStyle="1" w:styleId="CommentTok">
     <w:name w:val="CommentTok"/>
     <w:basedOn w:val="VerbatimChar"/>
     <w:rPr>
+      <w:i/>
       <w:color w:val="60a0b0"/>
-      <w:i/>
     </w:rPr>
   </w:style>
   <w:style w:type="character" w:customStyle="1" w:styleId="DocumentationTok">
     <w:name w:val="DocumentationTok"/>
     <w:basedOn w:val="VerbatimChar"/>
     <w:rPr>
+      <w:i/>
       <w:color w:val="ba2121"/>
-      <w:i/>
     </w:rPr>
   </w:style>
   <w:style w:type="character" w:customStyle="1" w:styleId="AnnotationTok">
     <w:name w:val="AnnotationTok"/>
     <w:basedOn w:val="VerbatimChar"/>
     <w:rPr>
-      <w:color w:val="60a0b0"/>
       <w:b/>
       <w:i/>
+      <w:color w:val="60a0b0"/>
     </w:rPr>
   </w:style>
   <w:style w:type="character" w:customStyle="1" w:styleId="CommentVarTok">
     <w:name w:val="CommentVarTok"/>
     <w:basedOn w:val="VerbatimChar"/>
     <w:rPr>
-      <w:color w:val="60a0b0"/>
       <w:b/>
       <w:i/>
+      <w:color w:val="60a0b0"/>
     </w:rPr>
   </w:style>
   <w:style w:type="character" w:customStyle="1" w:styleId="OtherTok">
@@ -3423,8 +3583,8 @@
     <w:name w:val="ControlFlowTok"/>
     <w:basedOn w:val="VerbatimChar"/>
     <w:rPr>
+      <w:b/>
       <w:color w:val="007020"/>
-      <w:b/>
     </w:rPr>
   </w:style>
   <w:style w:type="character" w:customStyle="1" w:styleId="OperatorTok">
@@ -3469,34 +3629,34 @@
     <w:name w:val="InformationTok"/>
     <w:basedOn w:val="VerbatimChar"/>
     <w:rPr>
-      <w:color w:val="60a0b0"/>
       <w:b/>
       <w:i/>
+      <w:color w:val="60a0b0"/>
     </w:rPr>
   </w:style>
   <w:style w:type="character" w:customStyle="1" w:styleId="WarningTok">
     <w:name w:val="WarningTok"/>
     <w:basedOn w:val="VerbatimChar"/>
     <w:rPr>
-      <w:color w:val="60a0b0"/>
       <w:b/>
       <w:i/>
+      <w:color w:val="60a0b0"/>
     </w:rPr>
   </w:style>
   <w:style w:type="character" w:customStyle="1" w:styleId="AlertTok">
     <w:name w:val="AlertTok"/>
     <w:basedOn w:val="VerbatimChar"/>
     <w:rPr>
+      <w:b/>
       <w:color w:val="ff0000"/>
-      <w:b/>
     </w:rPr>
   </w:style>
   <w:style w:type="character" w:customStyle="1" w:styleId="ErrorTok">
     <w:name w:val="ErrorTok"/>
     <w:basedOn w:val="VerbatimChar"/>
     <w:rPr>
+      <w:b/>
       <w:color w:val="ff0000"/>
-      <w:b/>
     </w:rPr>
   </w:style>
   <w:style w:type="character" w:customStyle="1" w:styleId="NormalTok">

</xml_diff>